<commit_message>
## MERGE ## BOEJ-4522: Update PBOE forms. ***NO_CI*** Imported from Changeset 4365
</commit_message>
<xml_diff>
--- a/GenBOE/GenBOE.Web/Templates/Export/PBOE_1.docx
+++ b/GenBOE/GenBOE.Web/Templates/Export/PBOE_1.docx
@@ -20,7 +20,7 @@
           <w:noProof/>
         </w:rPr>
         <w:drawing>
-          <wp:inline distT="0" distB="0" distL="0" distR="0" wp14:anchorId="38373488" wp14:editId="38E71881">
+          <wp:inline distT="0" distB="0" distL="0" distR="0" wp14:anchorId="276585DD" wp14:editId="7CCD37BD">
             <wp:extent cx="2105025" cy="419100"/>
             <wp:effectExtent l="19050" t="0" r="9525" b="0"/>
             <wp:docPr id="1" name="Picture 1"/>
@@ -256,99 +256,28 @@
           <w:sz w:val="18"/>
           <w:szCs w:val="18"/>
         </w:rPr>
-        <w:t>To be completed on all procurements</w:t>
+        <w:t xml:space="preserve">To be completed for all subcontracts. – Refer to the </w:t>
       </w:r>
+      <w:hyperlink r:id="rId12" w:history="1">
+        <w:proofErr w:type="spellStart"/>
+        <w:r>
+          <w:rPr>
+            <w:rStyle w:val="Hyperlink"/>
+            <w:rFonts w:ascii="Arial" w:hAnsi="Arial" w:cs="Arial"/>
+            <w:sz w:val="18"/>
+            <w:szCs w:val="18"/>
+          </w:rPr>
+          <w:t>genBOE</w:t>
+        </w:r>
+        <w:proofErr w:type="spellEnd"/>
+      </w:hyperlink>
       <w:r>
         <w:rPr>
           <w:rFonts w:ascii="Arial" w:hAnsi="Arial" w:cs="Arial"/>
           <w:sz w:val="18"/>
           <w:szCs w:val="18"/>
         </w:rPr>
-        <w:t xml:space="preserve"> </w:t>
-      </w:r>
-      <w:r>
-        <w:rPr>
-          <w:rFonts w:ascii="Arial" w:hAnsi="Arial" w:cs="Arial"/>
-          <w:sz w:val="18"/>
-          <w:szCs w:val="18"/>
-        </w:rPr>
-        <w:t>that</w:t>
-      </w:r>
-      <w:r>
-        <w:rPr>
-          <w:rFonts w:ascii="Arial" w:hAnsi="Arial" w:cs="Arial"/>
-          <w:sz w:val="18"/>
-          <w:szCs w:val="18"/>
-        </w:rPr>
-        <w:t xml:space="preserve"> </w:t>
-      </w:r>
-      <w:r>
-        <w:rPr>
-          <w:rFonts w:ascii="Arial" w:hAnsi="Arial" w:cs="Arial"/>
-          <w:b/>
-          <w:sz w:val="18"/>
-          <w:szCs w:val="18"/>
-          <w:u w:val="single"/>
-        </w:rPr>
-        <w:t>meet or</w:t>
-      </w:r>
-      <w:r>
-        <w:rPr>
-          <w:rFonts w:ascii="Arial" w:hAnsi="Arial" w:cs="Arial"/>
-          <w:b/>
-          <w:sz w:val="18"/>
-          <w:szCs w:val="18"/>
-          <w:u w:val="single"/>
-        </w:rPr>
-        <w:t xml:space="preserve"> </w:t>
-      </w:r>
-      <w:r>
-        <w:rPr>
-          <w:rFonts w:ascii="Arial" w:hAnsi="Arial" w:cs="Arial"/>
-          <w:b/>
-          <w:sz w:val="18"/>
-          <w:szCs w:val="18"/>
-          <w:u w:val="single"/>
-        </w:rPr>
-        <w:t>exceed</w:t>
-      </w:r>
-      <w:r>
-        <w:rPr>
-          <w:rFonts w:ascii="Arial" w:hAnsi="Arial" w:cs="Arial"/>
-          <w:b/>
-          <w:sz w:val="18"/>
-          <w:szCs w:val="18"/>
-          <w:u w:val="single"/>
-        </w:rPr>
-        <w:t xml:space="preserve"> the </w:t>
-      </w:r>
-      <w:r>
-        <w:rPr>
-          <w:rFonts w:ascii="Arial" w:hAnsi="Arial" w:cs="Arial"/>
-          <w:b/>
-          <w:sz w:val="18"/>
-          <w:szCs w:val="18"/>
-          <w:u w:val="single"/>
-        </w:rPr>
-        <w:t xml:space="preserve">certified </w:t>
-      </w:r>
-      <w:r>
-        <w:rPr>
-          <w:rFonts w:ascii="Arial" w:hAnsi="Arial" w:cs="Arial"/>
-          <w:b/>
-          <w:sz w:val="18"/>
-          <w:szCs w:val="18"/>
-          <w:u w:val="single"/>
-        </w:rPr>
-        <w:t>cost or pricing data threshold</w:t>
-      </w:r>
-      <w:r>
-        <w:rPr>
-          <w:rFonts w:ascii="Arial" w:hAnsi="Arial" w:cs="Arial"/>
-          <w:sz w:val="18"/>
-          <w:szCs w:val="18"/>
-        </w:rPr>
-        <w:t>.</w:t>
+        <w:t xml:space="preserve"> Integrated Non-Labor (INL) form for the electronic version</w:t>
       </w:r>
     </w:p>
     <w:tbl>
@@ -1503,7 +1432,7 @@
               <w:rPr>
                 <w:sz w:val="20"/>
               </w:rPr>
-              <w:pict>
+              <w:pict w14:anchorId="67E0404C">
                 <v:rect id="_x0000_i1025" style="width:107.35pt;height:1.5pt" o:hralign="center" o:hrstd="t" o:hrnoshade="t" o:hr="t" fillcolor="#7f7f7f [1612]" stroked="f"/>
               </w:pict>
             </w:r>
@@ -3564,6 +3493,8 @@
             </w:sdt>
           </w:p>
         </w:tc>
+        <w:bookmarkStart w:id="17" w:name="_GoBack"/>
+        <w:bookmarkEnd w:id="17"/>
       </w:tr>
       <w:tr>
         <w:trPr>
@@ -5365,12 +5296,7 @@
     <w:p/>
     <w:p/>
     <w:sectPr>
-      <w:headerReference w:type="even" r:id="rId12"/>
-      <w:headerReference w:type="default" r:id="rId13"/>
-      <w:footerReference w:type="even" r:id="rId14"/>
-      <w:footerReference w:type="default" r:id="rId15"/>
-      <w:headerReference w:type="first" r:id="rId16"/>
-      <w:footerReference w:type="first" r:id="rId17"/>
+      <w:footerReference w:type="default" r:id="rId13"/>
       <w:pgSz w:w="12240" w:h="15840" w:code="1"/>
       <w:pgMar w:top="1080" w:right="1080" w:bottom="1080" w:left="1080" w:header="504" w:footer="504" w:gutter="0"/>
       <w:cols w:space="720"/>
@@ -5404,16 +5330,6 @@
 <w:ftr xmlns:wpc="http://schemas.microsoft.com/office/word/2010/wordprocessingCanvas" xmlns:cx="http://schemas.microsoft.com/office/drawing/2014/chartex" xmlns:cx1="http://schemas.microsoft.com/office/drawing/2015/9/8/chartex" xmlns:cx2="http://schemas.microsoft.com/office/drawing/2015/10/21/chartex" xmlns:cx3="http://schemas.microsoft.com/office/drawing/2016/5/9/chartex" xmlns:cx4="http://schemas.microsoft.com/office/drawing/2016/5/10/chartex" xmlns:cx5="http://schemas.microsoft.com/office/drawing/2016/5/11/chartex" xmlns:cx6="http://schemas.microsoft.com/office/drawing/2016/5/12/chartex" xmlns:cx7="http://schemas.microsoft.com/office/drawing/2016/5/13/chartex" xmlns:cx8="http://schemas.microsoft.com/office/drawing/2016/5/14/chartex" xmlns:mc="http://schemas.openxmlformats.org/markup-compatibility/2006" xmlns:aink="http://schemas.microsoft.com/office/drawing/2016/ink" xmlns:am3d="http://schemas.microsoft.com/office/drawing/2017/model3d" xmlns:o="urn:schemas-microsoft-com:office:office" xmlns:r="http://schemas.openxmlformats.org/officeDocument/2006/relationships" xmlns:m="http://schemas.openxmlformats.org/officeDocument/2006/math" xmlns:v="urn:schemas-microsoft-com:vml" xmlns:wp14="http://schemas.microsoft.com/office/word/2010/wordprocessingDrawing" xmlns:wp="http://schemas.openxmlformats.org/drawingml/2006/wordprocessingDrawing" xmlns:w10="urn:schemas-microsoft-com:office:word" xmlns:w="http://schemas.openxmlformats.org/wordprocessingml/2006/main" xmlns:w14="http://schemas.microsoft.com/office/word/2010/wordml" xmlns:w15="http://schemas.microsoft.com/office/word/2012/wordml" xmlns:w16cid="http://schemas.microsoft.com/office/word/2016/wordml/cid" xmlns:w16se="http://schemas.microsoft.com/office/word/2015/wordml/symex" xmlns:wpg="http://schemas.microsoft.com/office/word/2010/wordprocessingGroup" xmlns:wpi="http://schemas.microsoft.com/office/word/2010/wordprocessingInk" xmlns:wne="http://schemas.microsoft.com/office/word/2006/wordml" xmlns:wps="http://schemas.microsoft.com/office/word/2010/wordprocessingShape" mc:Ignorable="w14 w15 w16se w16cid wp14">
   <w:p>
     <w:pPr>
-      <w:pStyle w:val="Footer"/>
-    </w:pPr>
-  </w:p>
-</w:ftr>
-</file>
-
-<file path=word/footer2.xml><?xml version="1.0" encoding="utf-8"?>
-<w:ftr xmlns:wpc="http://schemas.microsoft.com/office/word/2010/wordprocessingCanvas" xmlns:cx="http://schemas.microsoft.com/office/drawing/2014/chartex" xmlns:cx1="http://schemas.microsoft.com/office/drawing/2015/9/8/chartex" xmlns:cx2="http://schemas.microsoft.com/office/drawing/2015/10/21/chartex" xmlns:cx3="http://schemas.microsoft.com/office/drawing/2016/5/9/chartex" xmlns:cx4="http://schemas.microsoft.com/office/drawing/2016/5/10/chartex" xmlns:cx5="http://schemas.microsoft.com/office/drawing/2016/5/11/chartex" xmlns:cx6="http://schemas.microsoft.com/office/drawing/2016/5/12/chartex" xmlns:cx7="http://schemas.microsoft.com/office/drawing/2016/5/13/chartex" xmlns:cx8="http://schemas.microsoft.com/office/drawing/2016/5/14/chartex" xmlns:mc="http://schemas.openxmlformats.org/markup-compatibility/2006" xmlns:aink="http://schemas.microsoft.com/office/drawing/2016/ink" xmlns:am3d="http://schemas.microsoft.com/office/drawing/2017/model3d" xmlns:o="urn:schemas-microsoft-com:office:office" xmlns:r="http://schemas.openxmlformats.org/officeDocument/2006/relationships" xmlns:m="http://schemas.openxmlformats.org/officeDocument/2006/math" xmlns:v="urn:schemas-microsoft-com:vml" xmlns:wp14="http://schemas.microsoft.com/office/word/2010/wordprocessingDrawing" xmlns:wp="http://schemas.openxmlformats.org/drawingml/2006/wordprocessingDrawing" xmlns:w10="urn:schemas-microsoft-com:office:word" xmlns:w="http://schemas.openxmlformats.org/wordprocessingml/2006/main" xmlns:w14="http://schemas.microsoft.com/office/word/2010/wordml" xmlns:w15="http://schemas.microsoft.com/office/word/2012/wordml" xmlns:w16cid="http://schemas.microsoft.com/office/word/2016/wordml/cid" xmlns:w16se="http://schemas.microsoft.com/office/word/2015/wordml/symex" xmlns:wpg="http://schemas.microsoft.com/office/word/2010/wordprocessingGroup" xmlns:wpi="http://schemas.microsoft.com/office/word/2010/wordprocessingInk" xmlns:wne="http://schemas.microsoft.com/office/word/2006/wordml" xmlns:wps="http://schemas.microsoft.com/office/word/2010/wordprocessingShape" mc:Ignorable="w14 w15 w16se w16cid wp14">
-  <w:p>
-    <w:pPr>
       <w:pStyle w:val="FooterTop"/>
       <w:tabs>
         <w:tab w:val="clear" w:pos="10080"/>
@@ -5427,17 +5343,27 @@
       <w:t xml:space="preserve">evision </w:t>
     </w:r>
     <w:r>
-      <w:t>8</w:t>
+      <w:t>9</w:t>
     </w:r>
     <w:r>
       <w:tab/>
       <w:t xml:space="preserve">Effective:  </w:t>
     </w:r>
     <w:r>
-      <w:t>10-22-2019</w:t>
+      <w:t>03</w:t>
     </w:r>
-    <w:bookmarkStart w:id="17" w:name="_GoBack"/>
-    <w:bookmarkEnd w:id="17"/>
+    <w:r>
+      <w:t>-</w:t>
+    </w:r>
+    <w:r>
+      <w:t>16</w:t>
+    </w:r>
+    <w:r>
+      <w:t>-20</w:t>
+    </w:r>
+    <w:r>
+      <w:t>20</w:t>
+    </w:r>
   </w:p>
   <w:p>
     <w:pPr>
@@ -5588,16 +5514,6 @@
 </w:ftr>
 </file>
 
-<file path=word/footer3.xml><?xml version="1.0" encoding="utf-8"?>
-<w:ftr xmlns:wpc="http://schemas.microsoft.com/office/word/2010/wordprocessingCanvas" xmlns:cx="http://schemas.microsoft.com/office/drawing/2014/chartex" xmlns:cx1="http://schemas.microsoft.com/office/drawing/2015/9/8/chartex" xmlns:cx2="http://schemas.microsoft.com/office/drawing/2015/10/21/chartex" xmlns:cx3="http://schemas.microsoft.com/office/drawing/2016/5/9/chartex" xmlns:cx4="http://schemas.microsoft.com/office/drawing/2016/5/10/chartex" xmlns:cx5="http://schemas.microsoft.com/office/drawing/2016/5/11/chartex" xmlns:cx6="http://schemas.microsoft.com/office/drawing/2016/5/12/chartex" xmlns:cx7="http://schemas.microsoft.com/office/drawing/2016/5/13/chartex" xmlns:cx8="http://schemas.microsoft.com/office/drawing/2016/5/14/chartex" xmlns:mc="http://schemas.openxmlformats.org/markup-compatibility/2006" xmlns:aink="http://schemas.microsoft.com/office/drawing/2016/ink" xmlns:am3d="http://schemas.microsoft.com/office/drawing/2017/model3d" xmlns:o="urn:schemas-microsoft-com:office:office" xmlns:r="http://schemas.openxmlformats.org/officeDocument/2006/relationships" xmlns:m="http://schemas.openxmlformats.org/officeDocument/2006/math" xmlns:v="urn:schemas-microsoft-com:vml" xmlns:wp14="http://schemas.microsoft.com/office/word/2010/wordprocessingDrawing" xmlns:wp="http://schemas.openxmlformats.org/drawingml/2006/wordprocessingDrawing" xmlns:w10="urn:schemas-microsoft-com:office:word" xmlns:w="http://schemas.openxmlformats.org/wordprocessingml/2006/main" xmlns:w14="http://schemas.microsoft.com/office/word/2010/wordml" xmlns:w15="http://schemas.microsoft.com/office/word/2012/wordml" xmlns:w16cid="http://schemas.microsoft.com/office/word/2016/wordml/cid" xmlns:w16se="http://schemas.microsoft.com/office/word/2015/wordml/symex" xmlns:wpg="http://schemas.microsoft.com/office/word/2010/wordprocessingGroup" xmlns:wpi="http://schemas.microsoft.com/office/word/2010/wordprocessingInk" xmlns:wne="http://schemas.microsoft.com/office/word/2006/wordml" xmlns:wps="http://schemas.microsoft.com/office/word/2010/wordprocessingShape" mc:Ignorable="w14 w15 w16se w16cid wp14">
-  <w:p>
-    <w:pPr>
-      <w:pStyle w:val="Footer"/>
-    </w:pPr>
-  </w:p>
-</w:ftr>
-</file>
-
 <file path=word/footnotes.xml><?xml version="1.0" encoding="utf-8"?>
 <w:footnotes xmlns:wpc="http://schemas.microsoft.com/office/word/2010/wordprocessingCanvas" xmlns:cx="http://schemas.microsoft.com/office/drawing/2014/chartex" xmlns:cx1="http://schemas.microsoft.com/office/drawing/2015/9/8/chartex" xmlns:cx2="http://schemas.microsoft.com/office/drawing/2015/10/21/chartex" xmlns:cx3="http://schemas.microsoft.com/office/drawing/2016/5/9/chartex" xmlns:cx4="http://schemas.microsoft.com/office/drawing/2016/5/10/chartex" xmlns:cx5="http://schemas.microsoft.com/office/drawing/2016/5/11/chartex" xmlns:cx6="http://schemas.microsoft.com/office/drawing/2016/5/12/chartex" xmlns:cx7="http://schemas.microsoft.com/office/drawing/2016/5/13/chartex" xmlns:cx8="http://schemas.microsoft.com/office/drawing/2016/5/14/chartex" xmlns:mc="http://schemas.openxmlformats.org/markup-compatibility/2006" xmlns:aink="http://schemas.microsoft.com/office/drawing/2016/ink" xmlns:am3d="http://schemas.microsoft.com/office/drawing/2017/model3d" xmlns:o="urn:schemas-microsoft-com:office:office" xmlns:r="http://schemas.openxmlformats.org/officeDocument/2006/relationships" xmlns:m="http://schemas.openxmlformats.org/officeDocument/2006/math" xmlns:v="urn:schemas-microsoft-com:vml" xmlns:wp14="http://schemas.microsoft.com/office/word/2010/wordprocessingDrawing" xmlns:wp="http://schemas.openxmlformats.org/drawingml/2006/wordprocessingDrawing" xmlns:w10="urn:schemas-microsoft-com:office:word" xmlns:w="http://schemas.openxmlformats.org/wordprocessingml/2006/main" xmlns:w14="http://schemas.microsoft.com/office/word/2010/wordml" xmlns:w15="http://schemas.microsoft.com/office/word/2012/wordml" xmlns:w16cid="http://schemas.microsoft.com/office/word/2016/wordml/cid" xmlns:w16se="http://schemas.microsoft.com/office/word/2015/wordml/symex" xmlns:wpg="http://schemas.microsoft.com/office/word/2010/wordprocessingGroup" xmlns:wpi="http://schemas.microsoft.com/office/word/2010/wordprocessingInk" xmlns:wne="http://schemas.microsoft.com/office/word/2006/wordml" xmlns:wps="http://schemas.microsoft.com/office/word/2010/wordprocessingShape" mc:Ignorable="w14 w15 w16se w16cid wp14">
   <w:footnote w:type="separator" w:id="-1">
@@ -5615,36 +5531,6 @@
     </w:p>
   </w:footnote>
 </w:footnotes>
-</file>
-
-<file path=word/header1.xml><?xml version="1.0" encoding="utf-8"?>
-<w:hdr xmlns:wpc="http://schemas.microsoft.com/office/word/2010/wordprocessingCanvas" xmlns:cx="http://schemas.microsoft.com/office/drawing/2014/chartex" xmlns:cx1="http://schemas.microsoft.com/office/drawing/2015/9/8/chartex" xmlns:cx2="http://schemas.microsoft.com/office/drawing/2015/10/21/chartex" xmlns:cx3="http://schemas.microsoft.com/office/drawing/2016/5/9/chartex" xmlns:cx4="http://schemas.microsoft.com/office/drawing/2016/5/10/chartex" xmlns:cx5="http://schemas.microsoft.com/office/drawing/2016/5/11/chartex" xmlns:cx6="http://schemas.microsoft.com/office/drawing/2016/5/12/chartex" xmlns:cx7="http://schemas.microsoft.com/office/drawing/2016/5/13/chartex" xmlns:cx8="http://schemas.microsoft.com/office/drawing/2016/5/14/chartex" xmlns:mc="http://schemas.openxmlformats.org/markup-compatibility/2006" xmlns:aink="http://schemas.microsoft.com/office/drawing/2016/ink" xmlns:am3d="http://schemas.microsoft.com/office/drawing/2017/model3d" xmlns:o="urn:schemas-microsoft-com:office:office" xmlns:r="http://schemas.openxmlformats.org/officeDocument/2006/relationships" xmlns:m="http://schemas.openxmlformats.org/officeDocument/2006/math" xmlns:v="urn:schemas-microsoft-com:vml" xmlns:wp14="http://schemas.microsoft.com/office/word/2010/wordprocessingDrawing" xmlns:wp="http://schemas.openxmlformats.org/drawingml/2006/wordprocessingDrawing" xmlns:w10="urn:schemas-microsoft-com:office:word" xmlns:w="http://schemas.openxmlformats.org/wordprocessingml/2006/main" xmlns:w14="http://schemas.microsoft.com/office/word/2010/wordml" xmlns:w15="http://schemas.microsoft.com/office/word/2012/wordml" xmlns:w16cid="http://schemas.microsoft.com/office/word/2016/wordml/cid" xmlns:w16se="http://schemas.microsoft.com/office/word/2015/wordml/symex" xmlns:wpg="http://schemas.microsoft.com/office/word/2010/wordprocessingGroup" xmlns:wpi="http://schemas.microsoft.com/office/word/2010/wordprocessingInk" xmlns:wne="http://schemas.microsoft.com/office/word/2006/wordml" xmlns:wps="http://schemas.microsoft.com/office/word/2010/wordprocessingShape" mc:Ignorable="w14 w15 w16se w16cid wp14">
-  <w:p>
-    <w:pPr>
-      <w:pStyle w:val="Header"/>
-    </w:pPr>
-  </w:p>
-</w:hdr>
-</file>
-
-<file path=word/header2.xml><?xml version="1.0" encoding="utf-8"?>
-<w:hdr xmlns:wpc="http://schemas.microsoft.com/office/word/2010/wordprocessingCanvas" xmlns:cx="http://schemas.microsoft.com/office/drawing/2014/chartex" xmlns:cx1="http://schemas.microsoft.com/office/drawing/2015/9/8/chartex" xmlns:cx2="http://schemas.microsoft.com/office/drawing/2015/10/21/chartex" xmlns:cx3="http://schemas.microsoft.com/office/drawing/2016/5/9/chartex" xmlns:cx4="http://schemas.microsoft.com/office/drawing/2016/5/10/chartex" xmlns:cx5="http://schemas.microsoft.com/office/drawing/2016/5/11/chartex" xmlns:cx6="http://schemas.microsoft.com/office/drawing/2016/5/12/chartex" xmlns:cx7="http://schemas.microsoft.com/office/drawing/2016/5/13/chartex" xmlns:cx8="http://schemas.microsoft.com/office/drawing/2016/5/14/chartex" xmlns:mc="http://schemas.openxmlformats.org/markup-compatibility/2006" xmlns:aink="http://schemas.microsoft.com/office/drawing/2016/ink" xmlns:am3d="http://schemas.microsoft.com/office/drawing/2017/model3d" xmlns:o="urn:schemas-microsoft-com:office:office" xmlns:r="http://schemas.openxmlformats.org/officeDocument/2006/relationships" xmlns:m="http://schemas.openxmlformats.org/officeDocument/2006/math" xmlns:v="urn:schemas-microsoft-com:vml" xmlns:wp14="http://schemas.microsoft.com/office/word/2010/wordprocessingDrawing" xmlns:wp="http://schemas.openxmlformats.org/drawingml/2006/wordprocessingDrawing" xmlns:w10="urn:schemas-microsoft-com:office:word" xmlns:w="http://schemas.openxmlformats.org/wordprocessingml/2006/main" xmlns:w14="http://schemas.microsoft.com/office/word/2010/wordml" xmlns:w15="http://schemas.microsoft.com/office/word/2012/wordml" xmlns:w16cid="http://schemas.microsoft.com/office/word/2016/wordml/cid" xmlns:w16se="http://schemas.microsoft.com/office/word/2015/wordml/symex" xmlns:wpg="http://schemas.microsoft.com/office/word/2010/wordprocessingGroup" xmlns:wpi="http://schemas.microsoft.com/office/word/2010/wordprocessingInk" xmlns:wne="http://schemas.microsoft.com/office/word/2006/wordml" xmlns:wps="http://schemas.microsoft.com/office/word/2010/wordprocessingShape" mc:Ignorable="w14 w15 w16se w16cid wp14">
-  <w:p>
-    <w:pPr>
-      <w:pStyle w:val="Header"/>
-    </w:pPr>
-  </w:p>
-</w:hdr>
-</file>
-
-<file path=word/header3.xml><?xml version="1.0" encoding="utf-8"?>
-<w:hdr xmlns:wpc="http://schemas.microsoft.com/office/word/2010/wordprocessingCanvas" xmlns:cx="http://schemas.microsoft.com/office/drawing/2014/chartex" xmlns:cx1="http://schemas.microsoft.com/office/drawing/2015/9/8/chartex" xmlns:cx2="http://schemas.microsoft.com/office/drawing/2015/10/21/chartex" xmlns:cx3="http://schemas.microsoft.com/office/drawing/2016/5/9/chartex" xmlns:cx4="http://schemas.microsoft.com/office/drawing/2016/5/10/chartex" xmlns:cx5="http://schemas.microsoft.com/office/drawing/2016/5/11/chartex" xmlns:cx6="http://schemas.microsoft.com/office/drawing/2016/5/12/chartex" xmlns:cx7="http://schemas.microsoft.com/office/drawing/2016/5/13/chartex" xmlns:cx8="http://schemas.microsoft.com/office/drawing/2016/5/14/chartex" xmlns:mc="http://schemas.openxmlformats.org/markup-compatibility/2006" xmlns:aink="http://schemas.microsoft.com/office/drawing/2016/ink" xmlns:am3d="http://schemas.microsoft.com/office/drawing/2017/model3d" xmlns:o="urn:schemas-microsoft-com:office:office" xmlns:r="http://schemas.openxmlformats.org/officeDocument/2006/relationships" xmlns:m="http://schemas.openxmlformats.org/officeDocument/2006/math" xmlns:v="urn:schemas-microsoft-com:vml" xmlns:wp14="http://schemas.microsoft.com/office/word/2010/wordprocessingDrawing" xmlns:wp="http://schemas.openxmlformats.org/drawingml/2006/wordprocessingDrawing" xmlns:w10="urn:schemas-microsoft-com:office:word" xmlns:w="http://schemas.openxmlformats.org/wordprocessingml/2006/main" xmlns:w14="http://schemas.microsoft.com/office/word/2010/wordml" xmlns:w15="http://schemas.microsoft.com/office/word/2012/wordml" xmlns:w16cid="http://schemas.microsoft.com/office/word/2016/wordml/cid" xmlns:w16se="http://schemas.microsoft.com/office/word/2015/wordml/symex" xmlns:wpg="http://schemas.microsoft.com/office/word/2010/wordprocessingGroup" xmlns:wpi="http://schemas.microsoft.com/office/word/2010/wordprocessingInk" xmlns:wne="http://schemas.microsoft.com/office/word/2006/wordml" xmlns:wps="http://schemas.microsoft.com/office/word/2010/wordprocessingShape" mc:Ignorable="w14 w15 w16se w16cid wp14">
-  <w:p>
-    <w:pPr>
-      <w:pStyle w:val="Header"/>
-    </w:pPr>
-  </w:p>
-</w:hdr>
 </file>
 
 <file path=word/numbering.xml><?xml version="1.0" encoding="utf-8"?>
@@ -6461,7 +6347,7 @@
     </w:rPrDefault>
     <w:pPrDefault/>
   </w:docDefaults>
-  <w:latentStyles w:defLockedState="0" w:defUIPriority="0" w:defSemiHidden="0" w:defUnhideWhenUsed="0" w:defQFormat="0" w:count="375">
+  <w:latentStyles w:defLockedState="0" w:defUIPriority="0" w:defSemiHidden="0" w:defUnhideWhenUsed="0" w:defQFormat="0" w:count="377">
     <w:lsdException w:name="Normal" w:qFormat="1"/>
     <w:lsdException w:name="heading 1" w:qFormat="1"/>
     <w:lsdException w:name="heading 2" w:qFormat="1"/>
@@ -6561,7 +6447,6 @@
     <w:lsdException w:name="HTML Sample" w:semiHidden="1" w:unhideWhenUsed="1"/>
     <w:lsdException w:name="HTML Typewriter" w:semiHidden="1" w:unhideWhenUsed="1"/>
     <w:lsdException w:name="HTML Variable" w:semiHidden="1" w:unhideWhenUsed="1"/>
-    <w:lsdException w:name="Normal Table" w:semiHidden="1" w:unhideWhenUsed="1"/>
     <w:lsdException w:name="annotation subject" w:semiHidden="1" w:unhideWhenUsed="1"/>
     <w:lsdException w:name="No List" w:semiHidden="1" w:unhideWhenUsed="1"/>
     <w:lsdException w:name="Outline List 1" w:semiHidden="1" w:unhideWhenUsed="1"/>
@@ -6607,10 +6492,8 @@
     <w:lsdException w:name="Table Subtle 1" w:semiHidden="1" w:unhideWhenUsed="1"/>
     <w:lsdException w:name="Table Subtle 2" w:semiHidden="1" w:unhideWhenUsed="1"/>
     <w:lsdException w:name="Table Web 1" w:semiHidden="1" w:unhideWhenUsed="1"/>
-    <w:lsdException w:name="Table Web 2" w:semiHidden="1" w:unhideWhenUsed="1"/>
     <w:lsdException w:name="Table Web 3" w:semiHidden="1" w:unhideWhenUsed="1"/>
     <w:lsdException w:name="Balloon Text" w:semiHidden="1" w:unhideWhenUsed="1"/>
-    <w:lsdException w:name="Table Theme" w:semiHidden="1" w:unhideWhenUsed="1"/>
     <w:lsdException w:name="Placeholder Text" w:semiHidden="1" w:uiPriority="99"/>
     <w:lsdException w:name="No Spacing" w:uiPriority="1" w:qFormat="1"/>
     <w:lsdException w:name="Light Shading" w:uiPriority="60"/>
@@ -6830,6 +6713,8 @@
     <w:lsdException w:name="Smart Hyperlink" w:semiHidden="1" w:uiPriority="99" w:unhideWhenUsed="1"/>
     <w:lsdException w:name="Hashtag" w:semiHidden="1" w:uiPriority="99" w:unhideWhenUsed="1"/>
     <w:lsdException w:name="Unresolved Mention" w:semiHidden="1" w:uiPriority="99" w:unhideWhenUsed="1"/>
+    <w:lsdException w:name="Smart Link" w:semiHidden="1" w:uiPriority="99" w:unhideWhenUsed="1"/>
+    <w:lsdException w:name="Smart Link Error" w:semiHidden="1" w:uiPriority="99" w:unhideWhenUsed="1"/>
   </w:latentStyles>
   <w:style w:type="paragraph" w:default="1" w:styleId="Normal">
     <w:name w:val="Normal"/>
@@ -6994,7 +6879,6 @@
   <w:style w:type="character" w:default="1" w:styleId="DefaultParagraphFont">
     <w:name w:val="Default Paragraph Font"/>
     <w:uiPriority w:val="1"/>
-    <w:semiHidden/>
     <w:unhideWhenUsed/>
   </w:style>
   <w:style w:type="table" w:default="1" w:styleId="TableNormal">
@@ -7994,6 +7878,18 @@
     <w:rsid w:val="00504006"/>
     <w:rPr>
       <w:color w:val="808080"/>
+    </w:rPr>
+  </w:style>
+  <w:style w:type="character" w:styleId="UnresolvedMention">
+    <w:name w:val="Unresolved Mention"/>
+    <w:basedOn w:val="DefaultParagraphFont"/>
+    <w:uiPriority w:val="99"/>
+    <w:semiHidden/>
+    <w:unhideWhenUsed/>
+    <w:rsid w:val="00580A86"/>
+    <w:rPr>
+      <w:color w:val="605E5C"/>
+      <w:shd w:val="clear" w:color="auto" w:fill="E1DFDD"/>
     </w:rPr>
   </w:style>
 </w:styles>
@@ -9420,6 +9316,7 @@
     <w:rsid w:val="00592770"/>
     <w:rsid w:val="00605A78"/>
     <w:rsid w:val="00671B35"/>
+    <w:rsid w:val="007E593E"/>
     <w:rsid w:val="0080343E"/>
     <w:rsid w:val="00810A8C"/>
     <w:rsid w:val="00813280"/>
@@ -9496,7 +9393,7 @@
       </w:pPr>
     </w:pPrDefault>
   </w:docDefaults>
-  <w:latentStyles w:defLockedState="0" w:defUIPriority="99" w:defSemiHidden="0" w:defUnhideWhenUsed="0" w:defQFormat="0" w:count="375">
+  <w:latentStyles w:defLockedState="0" w:defUIPriority="99" w:defSemiHidden="0" w:defUnhideWhenUsed="0" w:defQFormat="0" w:count="377">
     <w:lsdException w:name="Normal" w:uiPriority="0" w:qFormat="1"/>
     <w:lsdException w:name="heading 1" w:uiPriority="9" w:qFormat="1"/>
     <w:lsdException w:name="heading 2" w:semiHidden="1" w:uiPriority="9" w:unhideWhenUsed="1" w:qFormat="1"/>
@@ -9602,7 +9499,6 @@
     <w:lsdException w:name="HTML Sample" w:semiHidden="1" w:unhideWhenUsed="1"/>
     <w:lsdException w:name="HTML Typewriter" w:semiHidden="1" w:unhideWhenUsed="1"/>
     <w:lsdException w:name="HTML Variable" w:semiHidden="1" w:unhideWhenUsed="1"/>
-    <w:lsdException w:name="Normal Table" w:semiHidden="1" w:unhideWhenUsed="1"/>
     <w:lsdException w:name="annotation subject" w:semiHidden="1" w:unhideWhenUsed="1"/>
     <w:lsdException w:name="No List" w:semiHidden="1" w:unhideWhenUsed="1"/>
     <w:lsdException w:name="Outline List 1" w:semiHidden="1" w:unhideWhenUsed="1"/>
@@ -9648,11 +9544,9 @@
     <w:lsdException w:name="Table Subtle 1" w:semiHidden="1" w:unhideWhenUsed="1"/>
     <w:lsdException w:name="Table Subtle 2" w:semiHidden="1" w:unhideWhenUsed="1"/>
     <w:lsdException w:name="Table Web 1" w:semiHidden="1" w:unhideWhenUsed="1"/>
-    <w:lsdException w:name="Table Web 2" w:semiHidden="1" w:unhideWhenUsed="1"/>
     <w:lsdException w:name="Table Web 3" w:semiHidden="1" w:unhideWhenUsed="1"/>
     <w:lsdException w:name="Balloon Text" w:semiHidden="1" w:unhideWhenUsed="1"/>
     <w:lsdException w:name="Table Grid" w:uiPriority="39"/>
-    <w:lsdException w:name="Table Theme" w:semiHidden="1" w:unhideWhenUsed="1"/>
     <w:lsdException w:name="Placeholder Text" w:semiHidden="1"/>
     <w:lsdException w:name="No Spacing" w:uiPriority="1" w:qFormat="1"/>
     <w:lsdException w:name="Light Shading" w:uiPriority="60"/>
@@ -9872,6 +9766,8 @@
     <w:lsdException w:name="Smart Hyperlink" w:semiHidden="1" w:unhideWhenUsed="1"/>
     <w:lsdException w:name="Hashtag" w:semiHidden="1" w:unhideWhenUsed="1"/>
     <w:lsdException w:name="Unresolved Mention" w:semiHidden="1" w:unhideWhenUsed="1"/>
+    <w:lsdException w:name="Smart Link" w:semiHidden="1" w:unhideWhenUsed="1"/>
+    <w:lsdException w:name="Smart Link Error" w:semiHidden="1" w:unhideWhenUsed="1"/>
   </w:latentStyles>
   <w:style w:type="paragraph" w:default="1" w:styleId="Normal">
     <w:name w:val="Normal"/>
@@ -17203,6 +17099,19 @@
 </file>
 
 <file path=customXml/item1.xml><?xml version="1.0" encoding="utf-8"?>
+<p:properties xmlns:p="http://schemas.microsoft.com/office/2006/metadata/properties" xmlns:xsi="http://www.w3.org/2001/XMLSchema-instance" xmlns:pc="http://schemas.microsoft.com/office/infopath/2007/PartnerControls">
+  <documentManagement>
+    <TaxKeywordTaxHTField xmlns="016c310d-f661-49a6-97ee-540076082437">
+      <Terms xmlns="http://schemas.microsoft.com/office/infopath/2007/PartnerControls"/>
+    </TaxKeywordTaxHTField>
+    <TaxCatchAll xmlns="016c310d-f661-49a6-97ee-540076082437"/>
+    <SIP_Label_Document xmlns="016c310d-f661-49a6-97ee-540076082437">;#0;#Unrestricted;#True;#;#;#;#</SIP_Label_Document>
+    <AverageRating xmlns="http://schemas.microsoft.com/sharepoint/v3" xsi:nil="true"/>
+  </documentManagement>
+</p:properties>
+</file>
+
+<file path=customXml/item2.xml><?xml version="1.0" encoding="utf-8"?>
 <ct:contentTypeSchema xmlns:ct="http://schemas.microsoft.com/office/2006/metadata/contentType" xmlns:ma="http://schemas.microsoft.com/office/2006/metadata/properties/metaAttributes" ct:_="" ma:_="" ma:contentTypeName="Document" ma:contentTypeID="0x010100833E2717D64DEA4FBFABAC416D347394" ma:contentTypeVersion="6" ma:contentTypeDescription="Create a new document." ma:contentTypeScope="" ma:versionID="98a74335b8287497f43df26a30ee6108">
   <xsd:schema xmlns:xsd="http://www.w3.org/2001/XMLSchema" xmlns:xs="http://www.w3.org/2001/XMLSchema" xmlns:p="http://schemas.microsoft.com/office/2006/metadata/properties" xmlns:ns1="http://schemas.microsoft.com/sharepoint/v3" xmlns:ns2="016c310d-f661-49a6-97ee-540076082437" targetNamespace="http://schemas.microsoft.com/office/2006/metadata/properties" ma:root="true" ma:fieldsID="d32ef67c478e261fbf17576a93df92a4" ns1:_="" ns2:_="">
     <xsd:import namespace="http://schemas.microsoft.com/sharepoint/v3"/>
@@ -17365,19 +17274,6 @@
 </ct:contentTypeSchema>
 </file>
 
-<file path=customXml/item2.xml><?xml version="1.0" encoding="utf-8"?>
-<p:properties xmlns:p="http://schemas.microsoft.com/office/2006/metadata/properties" xmlns:xsi="http://www.w3.org/2001/XMLSchema-instance" xmlns:pc="http://schemas.microsoft.com/office/infopath/2007/PartnerControls">
-  <documentManagement>
-    <TaxKeywordTaxHTField xmlns="016c310d-f661-49a6-97ee-540076082437">
-      <Terms xmlns="http://schemas.microsoft.com/office/infopath/2007/PartnerControls"/>
-    </TaxKeywordTaxHTField>
-    <TaxCatchAll xmlns="016c310d-f661-49a6-97ee-540076082437"/>
-    <SIP_Label_Document xmlns="016c310d-f661-49a6-97ee-540076082437">;#0;#Unrestricted;#True;#;#;#;#</SIP_Label_Document>
-    <AverageRating xmlns="http://schemas.microsoft.com/sharepoint/v3" xsi:nil="true"/>
-  </documentManagement>
-</p:properties>
-</file>
-
 <file path=customXml/item3.xml><?xml version="1.0" encoding="utf-8"?>
 <?mso-contentType ?>
 <FormTemplates xmlns="http://schemas.microsoft.com/sharepoint/v3/contenttype/forms">
@@ -17392,6 +17288,17 @@
 </file>
 
 <file path=customXml/itemProps1.xml><?xml version="1.0" encoding="utf-8"?>
+<ds:datastoreItem xmlns:ds="http://schemas.openxmlformats.org/officeDocument/2006/customXml" ds:itemID="{033400F4-1F04-4DBC-9784-C8B3AA89B53C}">
+  <ds:schemaRefs>
+    <ds:schemaRef ds:uri="http://schemas.microsoft.com/office/2006/metadata/properties"/>
+    <ds:schemaRef ds:uri="http://schemas.microsoft.com/office/infopath/2007/PartnerControls"/>
+    <ds:schemaRef ds:uri="016c310d-f661-49a6-97ee-540076082437"/>
+    <ds:schemaRef ds:uri="http://schemas.microsoft.com/sharepoint/v3"/>
+  </ds:schemaRefs>
+</ds:datastoreItem>
+</file>
+
+<file path=customXml/itemProps2.xml><?xml version="1.0" encoding="utf-8"?>
 <ds:datastoreItem xmlns:ds="http://schemas.openxmlformats.org/officeDocument/2006/customXml" ds:itemID="{70D90404-A780-484E-92B9-483A3C532657}">
   <ds:schemaRefs>
     <ds:schemaRef ds:uri="http://schemas.microsoft.com/office/2006/metadata/contentType"/>
@@ -17410,17 +17317,6 @@
 </ds:datastoreItem>
 </file>
 
-<file path=customXml/itemProps2.xml><?xml version="1.0" encoding="utf-8"?>
-<ds:datastoreItem xmlns:ds="http://schemas.openxmlformats.org/officeDocument/2006/customXml" ds:itemID="{033400F4-1F04-4DBC-9784-C8B3AA89B53C}">
-  <ds:schemaRefs>
-    <ds:schemaRef ds:uri="http://schemas.microsoft.com/office/2006/metadata/properties"/>
-    <ds:schemaRef ds:uri="http://schemas.microsoft.com/office/infopath/2007/PartnerControls"/>
-    <ds:schemaRef ds:uri="016c310d-f661-49a6-97ee-540076082437"/>
-    <ds:schemaRef ds:uri="http://schemas.microsoft.com/sharepoint/v3"/>
-  </ds:schemaRefs>
-</ds:datastoreItem>
-</file>
-
 <file path=customXml/itemProps3.xml><?xml version="1.0" encoding="utf-8"?>
 <ds:datastoreItem xmlns:ds="http://schemas.openxmlformats.org/officeDocument/2006/customXml" ds:itemID="{6A21EC55-C1B2-4765-90AC-37A4F1604205}">
   <ds:schemaRefs>
@@ -17430,7 +17326,7 @@
 </file>
 
 <file path=customXml/itemProps4.xml><?xml version="1.0" encoding="utf-8"?>
-<ds:datastoreItem xmlns:ds="http://schemas.openxmlformats.org/officeDocument/2006/customXml" ds:itemID="{98E85D08-1F88-4978-8BD9-5A741B168A96}">
+<ds:datastoreItem xmlns:ds="http://schemas.openxmlformats.org/officeDocument/2006/customXml" ds:itemID="{CD6CF2A3-23DE-48BF-867B-89770F7DA3FE}">
   <ds:schemaRefs>
     <ds:schemaRef ds:uri="http://schemas.openxmlformats.org/officeDocument/2006/bibliography"/>
   </ds:schemaRefs>

</xml_diff>

<commit_message>
IES-142: Update threshold of 13.5 to 15M for INL forms
</commit_message>
<xml_diff>
--- a/GenBOE/GenBOE.Web/Templates/Export/PBOE_1.docx
+++ b/GenBOE/GenBOE.Web/Templates/Export/PBOE_1.docx
@@ -1,6 +1,6 @@
 
 <file path=word/document.xml><?xml version="1.0" encoding="utf-8"?>
-<w:document xmlns:wpc="http://schemas.microsoft.com/office/word/2010/wordprocessingCanvas" xmlns:cx="http://schemas.microsoft.com/office/drawing/2014/chartex" xmlns:cx1="http://schemas.microsoft.com/office/drawing/2015/9/8/chartex" xmlns:cx2="http://schemas.microsoft.com/office/drawing/2015/10/21/chartex" xmlns:cx3="http://schemas.microsoft.com/office/drawing/2016/5/9/chartex" xmlns:cx4="http://schemas.microsoft.com/office/drawing/2016/5/10/chartex" xmlns:cx5="http://schemas.microsoft.com/office/drawing/2016/5/11/chartex" xmlns:cx6="http://schemas.microsoft.com/office/drawing/2016/5/12/chartex" xmlns:cx7="http://schemas.microsoft.com/office/drawing/2016/5/13/chartex" xmlns:cx8="http://schemas.microsoft.com/office/drawing/2016/5/14/chartex" xmlns:mc="http://schemas.openxmlformats.org/markup-compatibility/2006" xmlns:aink="http://schemas.microsoft.com/office/drawing/2016/ink" xmlns:am3d="http://schemas.microsoft.com/office/drawing/2017/model3d" xmlns:o="urn:schemas-microsoft-com:office:office" xmlns:r="http://schemas.openxmlformats.org/officeDocument/2006/relationships" xmlns:m="http://schemas.openxmlformats.org/officeDocument/2006/math" xmlns:v="urn:schemas-microsoft-com:vml" xmlns:wp14="http://schemas.microsoft.com/office/word/2010/wordprocessingDrawing" xmlns:wp="http://schemas.openxmlformats.org/drawingml/2006/wordprocessingDrawing" xmlns:w10="urn:schemas-microsoft-com:office:word" xmlns:w="http://schemas.openxmlformats.org/wordprocessingml/2006/main" xmlns:w14="http://schemas.microsoft.com/office/word/2010/wordml" xmlns:w15="http://schemas.microsoft.com/office/word/2012/wordml" xmlns:w16cid="http://schemas.microsoft.com/office/word/2016/wordml/cid" xmlns:w16se="http://schemas.microsoft.com/office/word/2015/wordml/symex" xmlns:wpg="http://schemas.microsoft.com/office/word/2010/wordprocessingGroup" xmlns:wpi="http://schemas.microsoft.com/office/word/2010/wordprocessingInk" xmlns:wne="http://schemas.microsoft.com/office/word/2006/wordml" xmlns:wps="http://schemas.microsoft.com/office/word/2010/wordprocessingShape" mc:Ignorable="w14 w15 w16se w16cid wp14">
+<w:document xmlns:wpc="http://schemas.microsoft.com/office/word/2010/wordprocessingCanvas" xmlns:cx="http://schemas.microsoft.com/office/drawing/2014/chartex" xmlns:cx1="http://schemas.microsoft.com/office/drawing/2015/9/8/chartex" xmlns:cx2="http://schemas.microsoft.com/office/drawing/2015/10/21/chartex" xmlns:cx3="http://schemas.microsoft.com/office/drawing/2016/5/9/chartex" xmlns:cx4="http://schemas.microsoft.com/office/drawing/2016/5/10/chartex" xmlns:cx5="http://schemas.microsoft.com/office/drawing/2016/5/11/chartex" xmlns:cx6="http://schemas.microsoft.com/office/drawing/2016/5/12/chartex" xmlns:cx7="http://schemas.microsoft.com/office/drawing/2016/5/13/chartex" xmlns:cx8="http://schemas.microsoft.com/office/drawing/2016/5/14/chartex" xmlns:mc="http://schemas.openxmlformats.org/markup-compatibility/2006" xmlns:aink="http://schemas.microsoft.com/office/drawing/2016/ink" xmlns:am3d="http://schemas.microsoft.com/office/drawing/2017/model3d" xmlns:o="urn:schemas-microsoft-com:office:office" xmlns:r="http://schemas.openxmlformats.org/officeDocument/2006/relationships" xmlns:m="http://schemas.openxmlformats.org/officeDocument/2006/math" xmlns:v="urn:schemas-microsoft-com:vml" xmlns:wp14="http://schemas.microsoft.com/office/word/2010/wordprocessingDrawing" xmlns:wp="http://schemas.openxmlformats.org/drawingml/2006/wordprocessingDrawing" xmlns:w10="urn:schemas-microsoft-com:office:word" xmlns:w="http://schemas.openxmlformats.org/wordprocessingml/2006/main" xmlns:w14="http://schemas.microsoft.com/office/word/2010/wordml" xmlns:w15="http://schemas.microsoft.com/office/word/2012/wordml" xmlns:w16cex="http://schemas.microsoft.com/office/word/2018/wordml/cex" xmlns:w16cid="http://schemas.microsoft.com/office/word/2016/wordml/cid" xmlns:w16="http://schemas.microsoft.com/office/word/2018/wordml" xmlns:w16se="http://schemas.microsoft.com/office/word/2015/wordml/symex" xmlns:wpg="http://schemas.microsoft.com/office/word/2010/wordprocessingGroup" xmlns:wpi="http://schemas.microsoft.com/office/word/2010/wordprocessingInk" xmlns:wne="http://schemas.microsoft.com/office/word/2006/wordml" xmlns:wps="http://schemas.microsoft.com/office/word/2010/wordprocessingShape" mc:Ignorable="w14 w15 w16se w16cid w16 w16cex wp14">
   <w:body>
     <w:p>
       <w:pPr>
@@ -259,7 +259,6 @@
         <w:t xml:space="preserve">To be completed for all subcontracts. – Refer to the </w:t>
       </w:r>
       <w:hyperlink r:id="rId12" w:history="1">
-        <w:proofErr w:type="spellStart"/>
         <w:r>
           <w:rPr>
             <w:rStyle w:val="Hyperlink"/>
@@ -269,7 +268,6 @@
           </w:rPr>
           <w:t>genBOE</w:t>
         </w:r>
-        <w:proofErr w:type="spellEnd"/>
       </w:hyperlink>
       <w:r>
         <w:rPr>
@@ -1779,21 +1777,7 @@
               <w:rPr>
                 <w:sz w:val="20"/>
               </w:rPr>
-              <w:t xml:space="preserve"> (</w:t>
-            </w:r>
-            <w:proofErr w:type="spellStart"/>
-            <w:r>
-              <w:rPr>
-                <w:sz w:val="20"/>
-              </w:rPr>
-              <w:t>CCoPD</w:t>
-            </w:r>
-            <w:proofErr w:type="spellEnd"/>
-            <w:r>
-              <w:rPr>
-                <w:sz w:val="20"/>
-              </w:rPr>
-              <w:t>)</w:t>
+              <w:t xml:space="preserve"> (CCoPD)</w:t>
             </w:r>
             <w:r>
               <w:rPr>
@@ -2267,19 +2251,11 @@
               </w:rPr>
               <w:t xml:space="preserve">    </w:t>
             </w:r>
-            <w:proofErr w:type="spellStart"/>
-            <w:r>
-              <w:rPr>
-                <w:sz w:val="20"/>
-              </w:rPr>
-              <w:t>CCoPD</w:t>
-            </w:r>
-            <w:proofErr w:type="spellEnd"/>
-            <w:r>
-              <w:rPr>
-                <w:sz w:val="20"/>
-              </w:rPr>
-              <w:t xml:space="preserve"> applies</w:t>
+            <w:r>
+              <w:rPr>
+                <w:sz w:val="20"/>
+              </w:rPr>
+              <w:t>CCoPD applies</w:t>
             </w:r>
           </w:p>
           <w:p>
@@ -2625,19 +2601,7 @@
               <w:rPr>
                 <w:sz w:val="20"/>
               </w:rPr>
-              <w:t>upplier proposal and supporting data included if &gt;$</w:t>
-            </w:r>
-            <w:r>
-              <w:rPr>
-                <w:sz w:val="20"/>
-              </w:rPr>
-              <w:t>13</w:t>
-            </w:r>
-            <w:r>
-              <w:rPr>
-                <w:sz w:val="20"/>
-              </w:rPr>
-              <w:t xml:space="preserve">.5M or </w:t>
+              <w:t xml:space="preserve">upplier proposal and supporting data included if &gt;$5M or </w:t>
             </w:r>
             <w:r>
               <w:rPr>
@@ -2646,19 +2610,11 @@
               </w:rPr>
               <w:t>&gt;</w:t>
             </w:r>
-            <w:proofErr w:type="spellStart"/>
-            <w:r>
-              <w:rPr>
-                <w:sz w:val="20"/>
-              </w:rPr>
-              <w:t>CCoPD</w:t>
-            </w:r>
-            <w:proofErr w:type="spellEnd"/>
-            <w:r>
-              <w:rPr>
-                <w:sz w:val="20"/>
-              </w:rPr>
-              <w:t xml:space="preserve"> threshold</w:t>
+            <w:r>
+              <w:rPr>
+                <w:sz w:val="20"/>
+              </w:rPr>
+              <w:t>CCoPD threshold</w:t>
             </w:r>
             <w:r>
               <w:rPr>
@@ -3493,8 +3449,6 @@
             </w:sdt>
           </w:p>
         </w:tc>
-        <w:bookmarkStart w:id="17" w:name="_GoBack"/>
-        <w:bookmarkEnd w:id="17"/>
       </w:tr>
       <w:tr>
         <w:trPr>
@@ -4320,21 +4274,7 @@
               <w:rPr>
                 <w:sz w:val="20"/>
               </w:rPr>
-              <w:t xml:space="preserve">Govt. Pricing Assistance for </w:t>
-            </w:r>
-            <w:proofErr w:type="spellStart"/>
-            <w:r>
-              <w:rPr>
-                <w:sz w:val="20"/>
-              </w:rPr>
-              <w:t>CCoPD</w:t>
-            </w:r>
-            <w:proofErr w:type="spellEnd"/>
-            <w:r>
-              <w:rPr>
-                <w:sz w:val="20"/>
-              </w:rPr>
-              <w:t xml:space="preserve"> Review R</w:t>
+              <w:t>Govt. Pricing Assistance for CCoPD Review R</w:t>
             </w:r>
             <w:r>
               <w:rPr>
@@ -4749,14 +4689,7 @@
               <w:rPr>
                 <w:sz w:val="20"/>
               </w:rPr>
-              <w:t xml:space="preserve">Procurement </w:t>
-            </w:r>
-            <w:proofErr w:type="spellStart"/>
-            <w:r>
-              <w:rPr>
-                <w:sz w:val="20"/>
-              </w:rPr>
-              <w:t>Definitiz</w:t>
+              <w:t>Procurement Definitiz</w:t>
             </w:r>
             <w:r>
               <w:rPr>
@@ -4764,7 +4697,6 @@
               </w:rPr>
               <w:t>ation</w:t>
             </w:r>
-            <w:proofErr w:type="spellEnd"/>
           </w:p>
         </w:tc>
         <w:tc>
@@ -5296,7 +5228,12 @@
     <w:p/>
     <w:p/>
     <w:sectPr>
-      <w:footerReference w:type="default" r:id="rId13"/>
+      <w:headerReference w:type="even" r:id="rId13"/>
+      <w:headerReference w:type="default" r:id="rId14"/>
+      <w:footerReference w:type="even" r:id="rId15"/>
+      <w:footerReference w:type="default" r:id="rId16"/>
+      <w:headerReference w:type="first" r:id="rId17"/>
+      <w:footerReference w:type="first" r:id="rId18"/>
       <w:pgSz w:w="12240" w:h="15840" w:code="1"/>
       <w:pgMar w:top="1080" w:right="1080" w:bottom="1080" w:left="1080" w:header="504" w:footer="504" w:gutter="0"/>
       <w:cols w:space="720"/>
@@ -5308,7 +5245,7 @@
 </file>
 
 <file path=word/endnotes.xml><?xml version="1.0" encoding="utf-8"?>
-<w:endnotes xmlns:wpc="http://schemas.microsoft.com/office/word/2010/wordprocessingCanvas" xmlns:cx="http://schemas.microsoft.com/office/drawing/2014/chartex" xmlns:cx1="http://schemas.microsoft.com/office/drawing/2015/9/8/chartex" xmlns:cx2="http://schemas.microsoft.com/office/drawing/2015/10/21/chartex" xmlns:cx3="http://schemas.microsoft.com/office/drawing/2016/5/9/chartex" xmlns:cx4="http://schemas.microsoft.com/office/drawing/2016/5/10/chartex" xmlns:cx5="http://schemas.microsoft.com/office/drawing/2016/5/11/chartex" xmlns:cx6="http://schemas.microsoft.com/office/drawing/2016/5/12/chartex" xmlns:cx7="http://schemas.microsoft.com/office/drawing/2016/5/13/chartex" xmlns:cx8="http://schemas.microsoft.com/office/drawing/2016/5/14/chartex" xmlns:mc="http://schemas.openxmlformats.org/markup-compatibility/2006" xmlns:aink="http://schemas.microsoft.com/office/drawing/2016/ink" xmlns:am3d="http://schemas.microsoft.com/office/drawing/2017/model3d" xmlns:o="urn:schemas-microsoft-com:office:office" xmlns:r="http://schemas.openxmlformats.org/officeDocument/2006/relationships" xmlns:m="http://schemas.openxmlformats.org/officeDocument/2006/math" xmlns:v="urn:schemas-microsoft-com:vml" xmlns:wp14="http://schemas.microsoft.com/office/word/2010/wordprocessingDrawing" xmlns:wp="http://schemas.openxmlformats.org/drawingml/2006/wordprocessingDrawing" xmlns:w10="urn:schemas-microsoft-com:office:word" xmlns:w="http://schemas.openxmlformats.org/wordprocessingml/2006/main" xmlns:w14="http://schemas.microsoft.com/office/word/2010/wordml" xmlns:w15="http://schemas.microsoft.com/office/word/2012/wordml" xmlns:w16cid="http://schemas.microsoft.com/office/word/2016/wordml/cid" xmlns:w16se="http://schemas.microsoft.com/office/word/2015/wordml/symex" xmlns:wpg="http://schemas.microsoft.com/office/word/2010/wordprocessingGroup" xmlns:wpi="http://schemas.microsoft.com/office/word/2010/wordprocessingInk" xmlns:wne="http://schemas.microsoft.com/office/word/2006/wordml" xmlns:wps="http://schemas.microsoft.com/office/word/2010/wordprocessingShape" mc:Ignorable="w14 w15 w16se w16cid wp14">
+<w:endnotes xmlns:wpc="http://schemas.microsoft.com/office/word/2010/wordprocessingCanvas" xmlns:cx="http://schemas.microsoft.com/office/drawing/2014/chartex" xmlns:cx1="http://schemas.microsoft.com/office/drawing/2015/9/8/chartex" xmlns:cx2="http://schemas.microsoft.com/office/drawing/2015/10/21/chartex" xmlns:cx3="http://schemas.microsoft.com/office/drawing/2016/5/9/chartex" xmlns:cx4="http://schemas.microsoft.com/office/drawing/2016/5/10/chartex" xmlns:cx5="http://schemas.microsoft.com/office/drawing/2016/5/11/chartex" xmlns:cx6="http://schemas.microsoft.com/office/drawing/2016/5/12/chartex" xmlns:cx7="http://schemas.microsoft.com/office/drawing/2016/5/13/chartex" xmlns:cx8="http://schemas.microsoft.com/office/drawing/2016/5/14/chartex" xmlns:mc="http://schemas.openxmlformats.org/markup-compatibility/2006" xmlns:aink="http://schemas.microsoft.com/office/drawing/2016/ink" xmlns:am3d="http://schemas.microsoft.com/office/drawing/2017/model3d" xmlns:o="urn:schemas-microsoft-com:office:office" xmlns:r="http://schemas.openxmlformats.org/officeDocument/2006/relationships" xmlns:m="http://schemas.openxmlformats.org/officeDocument/2006/math" xmlns:v="urn:schemas-microsoft-com:vml" xmlns:wp14="http://schemas.microsoft.com/office/word/2010/wordprocessingDrawing" xmlns:wp="http://schemas.openxmlformats.org/drawingml/2006/wordprocessingDrawing" xmlns:w10="urn:schemas-microsoft-com:office:word" xmlns:w="http://schemas.openxmlformats.org/wordprocessingml/2006/main" xmlns:w14="http://schemas.microsoft.com/office/word/2010/wordml" xmlns:w15="http://schemas.microsoft.com/office/word/2012/wordml" xmlns:w16cex="http://schemas.microsoft.com/office/word/2018/wordml/cex" xmlns:w16cid="http://schemas.microsoft.com/office/word/2016/wordml/cid" xmlns:w16="http://schemas.microsoft.com/office/word/2018/wordml" xmlns:w16se="http://schemas.microsoft.com/office/word/2015/wordml/symex" xmlns:wpg="http://schemas.microsoft.com/office/word/2010/wordprocessingGroup" xmlns:wpi="http://schemas.microsoft.com/office/word/2010/wordprocessingInk" xmlns:wne="http://schemas.microsoft.com/office/word/2006/wordml" xmlns:wps="http://schemas.microsoft.com/office/word/2010/wordprocessingShape" mc:Ignorable="w14 w15 w16se w16cid w16 w16cex wp14">
   <w:endnote w:type="separator" w:id="-1">
     <w:p>
       <w:r>
@@ -5327,7 +5264,17 @@
 </file>
 
 <file path=word/footer1.xml><?xml version="1.0" encoding="utf-8"?>
-<w:ftr xmlns:wpc="http://schemas.microsoft.com/office/word/2010/wordprocessingCanvas" xmlns:cx="http://schemas.microsoft.com/office/drawing/2014/chartex" xmlns:cx1="http://schemas.microsoft.com/office/drawing/2015/9/8/chartex" xmlns:cx2="http://schemas.microsoft.com/office/drawing/2015/10/21/chartex" xmlns:cx3="http://schemas.microsoft.com/office/drawing/2016/5/9/chartex" xmlns:cx4="http://schemas.microsoft.com/office/drawing/2016/5/10/chartex" xmlns:cx5="http://schemas.microsoft.com/office/drawing/2016/5/11/chartex" xmlns:cx6="http://schemas.microsoft.com/office/drawing/2016/5/12/chartex" xmlns:cx7="http://schemas.microsoft.com/office/drawing/2016/5/13/chartex" xmlns:cx8="http://schemas.microsoft.com/office/drawing/2016/5/14/chartex" xmlns:mc="http://schemas.openxmlformats.org/markup-compatibility/2006" xmlns:aink="http://schemas.microsoft.com/office/drawing/2016/ink" xmlns:am3d="http://schemas.microsoft.com/office/drawing/2017/model3d" xmlns:o="urn:schemas-microsoft-com:office:office" xmlns:r="http://schemas.openxmlformats.org/officeDocument/2006/relationships" xmlns:m="http://schemas.openxmlformats.org/officeDocument/2006/math" xmlns:v="urn:schemas-microsoft-com:vml" xmlns:wp14="http://schemas.microsoft.com/office/word/2010/wordprocessingDrawing" xmlns:wp="http://schemas.openxmlformats.org/drawingml/2006/wordprocessingDrawing" xmlns:w10="urn:schemas-microsoft-com:office:word" xmlns:w="http://schemas.openxmlformats.org/wordprocessingml/2006/main" xmlns:w14="http://schemas.microsoft.com/office/word/2010/wordml" xmlns:w15="http://schemas.microsoft.com/office/word/2012/wordml" xmlns:w16cid="http://schemas.microsoft.com/office/word/2016/wordml/cid" xmlns:w16se="http://schemas.microsoft.com/office/word/2015/wordml/symex" xmlns:wpg="http://schemas.microsoft.com/office/word/2010/wordprocessingGroup" xmlns:wpi="http://schemas.microsoft.com/office/word/2010/wordprocessingInk" xmlns:wne="http://schemas.microsoft.com/office/word/2006/wordml" xmlns:wps="http://schemas.microsoft.com/office/word/2010/wordprocessingShape" mc:Ignorable="w14 w15 w16se w16cid wp14">
+<w:ftr xmlns:wpc="http://schemas.microsoft.com/office/word/2010/wordprocessingCanvas" xmlns:cx="http://schemas.microsoft.com/office/drawing/2014/chartex" xmlns:cx1="http://schemas.microsoft.com/office/drawing/2015/9/8/chartex" xmlns:cx2="http://schemas.microsoft.com/office/drawing/2015/10/21/chartex" xmlns:cx3="http://schemas.microsoft.com/office/drawing/2016/5/9/chartex" xmlns:cx4="http://schemas.microsoft.com/office/drawing/2016/5/10/chartex" xmlns:cx5="http://schemas.microsoft.com/office/drawing/2016/5/11/chartex" xmlns:cx6="http://schemas.microsoft.com/office/drawing/2016/5/12/chartex" xmlns:cx7="http://schemas.microsoft.com/office/drawing/2016/5/13/chartex" xmlns:cx8="http://schemas.microsoft.com/office/drawing/2016/5/14/chartex" xmlns:mc="http://schemas.openxmlformats.org/markup-compatibility/2006" xmlns:aink="http://schemas.microsoft.com/office/drawing/2016/ink" xmlns:am3d="http://schemas.microsoft.com/office/drawing/2017/model3d" xmlns:o="urn:schemas-microsoft-com:office:office" xmlns:r="http://schemas.openxmlformats.org/officeDocument/2006/relationships" xmlns:m="http://schemas.openxmlformats.org/officeDocument/2006/math" xmlns:v="urn:schemas-microsoft-com:vml" xmlns:wp14="http://schemas.microsoft.com/office/word/2010/wordprocessingDrawing" xmlns:wp="http://schemas.openxmlformats.org/drawingml/2006/wordprocessingDrawing" xmlns:w10="urn:schemas-microsoft-com:office:word" xmlns:w="http://schemas.openxmlformats.org/wordprocessingml/2006/main" xmlns:w14="http://schemas.microsoft.com/office/word/2010/wordml" xmlns:w15="http://schemas.microsoft.com/office/word/2012/wordml" xmlns:w16cex="http://schemas.microsoft.com/office/word/2018/wordml/cex" xmlns:w16cid="http://schemas.microsoft.com/office/word/2016/wordml/cid" xmlns:w16="http://schemas.microsoft.com/office/word/2018/wordml" xmlns:w16se="http://schemas.microsoft.com/office/word/2015/wordml/symex" xmlns:wpg="http://schemas.microsoft.com/office/word/2010/wordprocessingGroup" xmlns:wpi="http://schemas.microsoft.com/office/word/2010/wordprocessingInk" xmlns:wne="http://schemas.microsoft.com/office/word/2006/wordml" xmlns:wps="http://schemas.microsoft.com/office/word/2010/wordprocessingShape" mc:Ignorable="w14 w15 w16se w16cid w16 w16cex wp14">
+  <w:p>
+    <w:pPr>
+      <w:pStyle w:val="Footer"/>
+    </w:pPr>
+  </w:p>
+</w:ftr>
+</file>
+
+<file path=word/footer2.xml><?xml version="1.0" encoding="utf-8"?>
+<w:ftr xmlns:wpc="http://schemas.microsoft.com/office/word/2010/wordprocessingCanvas" xmlns:cx="http://schemas.microsoft.com/office/drawing/2014/chartex" xmlns:cx1="http://schemas.microsoft.com/office/drawing/2015/9/8/chartex" xmlns:cx2="http://schemas.microsoft.com/office/drawing/2015/10/21/chartex" xmlns:cx3="http://schemas.microsoft.com/office/drawing/2016/5/9/chartex" xmlns:cx4="http://schemas.microsoft.com/office/drawing/2016/5/10/chartex" xmlns:cx5="http://schemas.microsoft.com/office/drawing/2016/5/11/chartex" xmlns:cx6="http://schemas.microsoft.com/office/drawing/2016/5/12/chartex" xmlns:cx7="http://schemas.microsoft.com/office/drawing/2016/5/13/chartex" xmlns:cx8="http://schemas.microsoft.com/office/drawing/2016/5/14/chartex" xmlns:mc="http://schemas.openxmlformats.org/markup-compatibility/2006" xmlns:aink="http://schemas.microsoft.com/office/drawing/2016/ink" xmlns:am3d="http://schemas.microsoft.com/office/drawing/2017/model3d" xmlns:o="urn:schemas-microsoft-com:office:office" xmlns:r="http://schemas.openxmlformats.org/officeDocument/2006/relationships" xmlns:m="http://schemas.openxmlformats.org/officeDocument/2006/math" xmlns:v="urn:schemas-microsoft-com:vml" xmlns:wp14="http://schemas.microsoft.com/office/word/2010/wordprocessingDrawing" xmlns:wp="http://schemas.openxmlformats.org/drawingml/2006/wordprocessingDrawing" xmlns:w10="urn:schemas-microsoft-com:office:word" xmlns:w="http://schemas.openxmlformats.org/wordprocessingml/2006/main" xmlns:w14="http://schemas.microsoft.com/office/word/2010/wordml" xmlns:w15="http://schemas.microsoft.com/office/word/2012/wordml" xmlns:w16cex="http://schemas.microsoft.com/office/word/2018/wordml/cex" xmlns:w16cid="http://schemas.microsoft.com/office/word/2016/wordml/cid" xmlns:w16="http://schemas.microsoft.com/office/word/2018/wordml" xmlns:w16se="http://schemas.microsoft.com/office/word/2015/wordml/symex" xmlns:wpg="http://schemas.microsoft.com/office/word/2010/wordprocessingGroup" xmlns:wpi="http://schemas.microsoft.com/office/word/2010/wordprocessingInk" xmlns:wne="http://schemas.microsoft.com/office/word/2006/wordml" xmlns:wps="http://schemas.microsoft.com/office/word/2010/wordprocessingShape" mc:Ignorable="w14 w15 w16se w16cid w16 w16cex wp14">
   <w:p>
     <w:pPr>
       <w:pStyle w:val="FooterTop"/>
@@ -5343,26 +5290,32 @@
       <w:t xml:space="preserve">evision </w:t>
     </w:r>
     <w:r>
-      <w:t>9</w:t>
+      <w:t>10</w:t>
     </w:r>
     <w:r>
       <w:tab/>
       <w:t xml:space="preserve">Effective:  </w:t>
     </w:r>
     <w:r>
-      <w:t>03</w:t>
+      <w:t>0</w:t>
+    </w:r>
+    <w:r>
+      <w:t>7</w:t>
     </w:r>
     <w:r>
       <w:t>-</w:t>
     </w:r>
     <w:r>
-      <w:t>16</w:t>
+      <w:t>19</w:t>
     </w:r>
     <w:r>
       <w:t>-20</w:t>
     </w:r>
     <w:r>
-      <w:t>20</w:t>
+      <w:t>2</w:t>
+    </w:r>
+    <w:r>
+      <w:t>1</w:t>
     </w:r>
   </w:p>
   <w:p>
@@ -5514,8 +5467,18 @@
 </w:ftr>
 </file>
 
+<file path=word/footer3.xml><?xml version="1.0" encoding="utf-8"?>
+<w:ftr xmlns:wpc="http://schemas.microsoft.com/office/word/2010/wordprocessingCanvas" xmlns:cx="http://schemas.microsoft.com/office/drawing/2014/chartex" xmlns:cx1="http://schemas.microsoft.com/office/drawing/2015/9/8/chartex" xmlns:cx2="http://schemas.microsoft.com/office/drawing/2015/10/21/chartex" xmlns:cx3="http://schemas.microsoft.com/office/drawing/2016/5/9/chartex" xmlns:cx4="http://schemas.microsoft.com/office/drawing/2016/5/10/chartex" xmlns:cx5="http://schemas.microsoft.com/office/drawing/2016/5/11/chartex" xmlns:cx6="http://schemas.microsoft.com/office/drawing/2016/5/12/chartex" xmlns:cx7="http://schemas.microsoft.com/office/drawing/2016/5/13/chartex" xmlns:cx8="http://schemas.microsoft.com/office/drawing/2016/5/14/chartex" xmlns:mc="http://schemas.openxmlformats.org/markup-compatibility/2006" xmlns:aink="http://schemas.microsoft.com/office/drawing/2016/ink" xmlns:am3d="http://schemas.microsoft.com/office/drawing/2017/model3d" xmlns:o="urn:schemas-microsoft-com:office:office" xmlns:r="http://schemas.openxmlformats.org/officeDocument/2006/relationships" xmlns:m="http://schemas.openxmlformats.org/officeDocument/2006/math" xmlns:v="urn:schemas-microsoft-com:vml" xmlns:wp14="http://schemas.microsoft.com/office/word/2010/wordprocessingDrawing" xmlns:wp="http://schemas.openxmlformats.org/drawingml/2006/wordprocessingDrawing" xmlns:w10="urn:schemas-microsoft-com:office:word" xmlns:w="http://schemas.openxmlformats.org/wordprocessingml/2006/main" xmlns:w14="http://schemas.microsoft.com/office/word/2010/wordml" xmlns:w15="http://schemas.microsoft.com/office/word/2012/wordml" xmlns:w16cex="http://schemas.microsoft.com/office/word/2018/wordml/cex" xmlns:w16cid="http://schemas.microsoft.com/office/word/2016/wordml/cid" xmlns:w16="http://schemas.microsoft.com/office/word/2018/wordml" xmlns:w16se="http://schemas.microsoft.com/office/word/2015/wordml/symex" xmlns:wpg="http://schemas.microsoft.com/office/word/2010/wordprocessingGroup" xmlns:wpi="http://schemas.microsoft.com/office/word/2010/wordprocessingInk" xmlns:wne="http://schemas.microsoft.com/office/word/2006/wordml" xmlns:wps="http://schemas.microsoft.com/office/word/2010/wordprocessingShape" mc:Ignorable="w14 w15 w16se w16cid w16 w16cex wp14">
+  <w:p>
+    <w:pPr>
+      <w:pStyle w:val="Footer"/>
+    </w:pPr>
+  </w:p>
+</w:ftr>
+</file>
+
 <file path=word/footnotes.xml><?xml version="1.0" encoding="utf-8"?>
-<w:footnotes xmlns:wpc="http://schemas.microsoft.com/office/word/2010/wordprocessingCanvas" xmlns:cx="http://schemas.microsoft.com/office/drawing/2014/chartex" xmlns:cx1="http://schemas.microsoft.com/office/drawing/2015/9/8/chartex" xmlns:cx2="http://schemas.microsoft.com/office/drawing/2015/10/21/chartex" xmlns:cx3="http://schemas.microsoft.com/office/drawing/2016/5/9/chartex" xmlns:cx4="http://schemas.microsoft.com/office/drawing/2016/5/10/chartex" xmlns:cx5="http://schemas.microsoft.com/office/drawing/2016/5/11/chartex" xmlns:cx6="http://schemas.microsoft.com/office/drawing/2016/5/12/chartex" xmlns:cx7="http://schemas.microsoft.com/office/drawing/2016/5/13/chartex" xmlns:cx8="http://schemas.microsoft.com/office/drawing/2016/5/14/chartex" xmlns:mc="http://schemas.openxmlformats.org/markup-compatibility/2006" xmlns:aink="http://schemas.microsoft.com/office/drawing/2016/ink" xmlns:am3d="http://schemas.microsoft.com/office/drawing/2017/model3d" xmlns:o="urn:schemas-microsoft-com:office:office" xmlns:r="http://schemas.openxmlformats.org/officeDocument/2006/relationships" xmlns:m="http://schemas.openxmlformats.org/officeDocument/2006/math" xmlns:v="urn:schemas-microsoft-com:vml" xmlns:wp14="http://schemas.microsoft.com/office/word/2010/wordprocessingDrawing" xmlns:wp="http://schemas.openxmlformats.org/drawingml/2006/wordprocessingDrawing" xmlns:w10="urn:schemas-microsoft-com:office:word" xmlns:w="http://schemas.openxmlformats.org/wordprocessingml/2006/main" xmlns:w14="http://schemas.microsoft.com/office/word/2010/wordml" xmlns:w15="http://schemas.microsoft.com/office/word/2012/wordml" xmlns:w16cid="http://schemas.microsoft.com/office/word/2016/wordml/cid" xmlns:w16se="http://schemas.microsoft.com/office/word/2015/wordml/symex" xmlns:wpg="http://schemas.microsoft.com/office/word/2010/wordprocessingGroup" xmlns:wpi="http://schemas.microsoft.com/office/word/2010/wordprocessingInk" xmlns:wne="http://schemas.microsoft.com/office/word/2006/wordml" xmlns:wps="http://schemas.microsoft.com/office/word/2010/wordprocessingShape" mc:Ignorable="w14 w15 w16se w16cid wp14">
+<w:footnotes xmlns:wpc="http://schemas.microsoft.com/office/word/2010/wordprocessingCanvas" xmlns:cx="http://schemas.microsoft.com/office/drawing/2014/chartex" xmlns:cx1="http://schemas.microsoft.com/office/drawing/2015/9/8/chartex" xmlns:cx2="http://schemas.microsoft.com/office/drawing/2015/10/21/chartex" xmlns:cx3="http://schemas.microsoft.com/office/drawing/2016/5/9/chartex" xmlns:cx4="http://schemas.microsoft.com/office/drawing/2016/5/10/chartex" xmlns:cx5="http://schemas.microsoft.com/office/drawing/2016/5/11/chartex" xmlns:cx6="http://schemas.microsoft.com/office/drawing/2016/5/12/chartex" xmlns:cx7="http://schemas.microsoft.com/office/drawing/2016/5/13/chartex" xmlns:cx8="http://schemas.microsoft.com/office/drawing/2016/5/14/chartex" xmlns:mc="http://schemas.openxmlformats.org/markup-compatibility/2006" xmlns:aink="http://schemas.microsoft.com/office/drawing/2016/ink" xmlns:am3d="http://schemas.microsoft.com/office/drawing/2017/model3d" xmlns:o="urn:schemas-microsoft-com:office:office" xmlns:r="http://schemas.openxmlformats.org/officeDocument/2006/relationships" xmlns:m="http://schemas.openxmlformats.org/officeDocument/2006/math" xmlns:v="urn:schemas-microsoft-com:vml" xmlns:wp14="http://schemas.microsoft.com/office/word/2010/wordprocessingDrawing" xmlns:wp="http://schemas.openxmlformats.org/drawingml/2006/wordprocessingDrawing" xmlns:w10="urn:schemas-microsoft-com:office:word" xmlns:w="http://schemas.openxmlformats.org/wordprocessingml/2006/main" xmlns:w14="http://schemas.microsoft.com/office/word/2010/wordml" xmlns:w15="http://schemas.microsoft.com/office/word/2012/wordml" xmlns:w16cex="http://schemas.microsoft.com/office/word/2018/wordml/cex" xmlns:w16cid="http://schemas.microsoft.com/office/word/2016/wordml/cid" xmlns:w16="http://schemas.microsoft.com/office/word/2018/wordml" xmlns:w16se="http://schemas.microsoft.com/office/word/2015/wordml/symex" xmlns:wpg="http://schemas.microsoft.com/office/word/2010/wordprocessingGroup" xmlns:wpi="http://schemas.microsoft.com/office/word/2010/wordprocessingInk" xmlns:wne="http://schemas.microsoft.com/office/word/2006/wordml" xmlns:wps="http://schemas.microsoft.com/office/word/2010/wordprocessingShape" mc:Ignorable="w14 w15 w16se w16cid w16 w16cex wp14">
   <w:footnote w:type="separator" w:id="-1">
     <w:p>
       <w:r>
@@ -5533,8 +5496,38 @@
 </w:footnotes>
 </file>
 
+<file path=word/header1.xml><?xml version="1.0" encoding="utf-8"?>
+<w:hdr xmlns:wpc="http://schemas.microsoft.com/office/word/2010/wordprocessingCanvas" xmlns:cx="http://schemas.microsoft.com/office/drawing/2014/chartex" xmlns:cx1="http://schemas.microsoft.com/office/drawing/2015/9/8/chartex" xmlns:cx2="http://schemas.microsoft.com/office/drawing/2015/10/21/chartex" xmlns:cx3="http://schemas.microsoft.com/office/drawing/2016/5/9/chartex" xmlns:cx4="http://schemas.microsoft.com/office/drawing/2016/5/10/chartex" xmlns:cx5="http://schemas.microsoft.com/office/drawing/2016/5/11/chartex" xmlns:cx6="http://schemas.microsoft.com/office/drawing/2016/5/12/chartex" xmlns:cx7="http://schemas.microsoft.com/office/drawing/2016/5/13/chartex" xmlns:cx8="http://schemas.microsoft.com/office/drawing/2016/5/14/chartex" xmlns:mc="http://schemas.openxmlformats.org/markup-compatibility/2006" xmlns:aink="http://schemas.microsoft.com/office/drawing/2016/ink" xmlns:am3d="http://schemas.microsoft.com/office/drawing/2017/model3d" xmlns:o="urn:schemas-microsoft-com:office:office" xmlns:r="http://schemas.openxmlformats.org/officeDocument/2006/relationships" xmlns:m="http://schemas.openxmlformats.org/officeDocument/2006/math" xmlns:v="urn:schemas-microsoft-com:vml" xmlns:wp14="http://schemas.microsoft.com/office/word/2010/wordprocessingDrawing" xmlns:wp="http://schemas.openxmlformats.org/drawingml/2006/wordprocessingDrawing" xmlns:w10="urn:schemas-microsoft-com:office:word" xmlns:w="http://schemas.openxmlformats.org/wordprocessingml/2006/main" xmlns:w14="http://schemas.microsoft.com/office/word/2010/wordml" xmlns:w15="http://schemas.microsoft.com/office/word/2012/wordml" xmlns:w16cex="http://schemas.microsoft.com/office/word/2018/wordml/cex" xmlns:w16cid="http://schemas.microsoft.com/office/word/2016/wordml/cid" xmlns:w16="http://schemas.microsoft.com/office/word/2018/wordml" xmlns:w16se="http://schemas.microsoft.com/office/word/2015/wordml/symex" xmlns:wpg="http://schemas.microsoft.com/office/word/2010/wordprocessingGroup" xmlns:wpi="http://schemas.microsoft.com/office/word/2010/wordprocessingInk" xmlns:wne="http://schemas.microsoft.com/office/word/2006/wordml" xmlns:wps="http://schemas.microsoft.com/office/word/2010/wordprocessingShape" mc:Ignorable="w14 w15 w16se w16cid w16 w16cex wp14">
+  <w:p>
+    <w:pPr>
+      <w:pStyle w:val="Header"/>
+    </w:pPr>
+  </w:p>
+</w:hdr>
+</file>
+
+<file path=word/header2.xml><?xml version="1.0" encoding="utf-8"?>
+<w:hdr xmlns:wpc="http://schemas.microsoft.com/office/word/2010/wordprocessingCanvas" xmlns:cx="http://schemas.microsoft.com/office/drawing/2014/chartex" xmlns:cx1="http://schemas.microsoft.com/office/drawing/2015/9/8/chartex" xmlns:cx2="http://schemas.microsoft.com/office/drawing/2015/10/21/chartex" xmlns:cx3="http://schemas.microsoft.com/office/drawing/2016/5/9/chartex" xmlns:cx4="http://schemas.microsoft.com/office/drawing/2016/5/10/chartex" xmlns:cx5="http://schemas.microsoft.com/office/drawing/2016/5/11/chartex" xmlns:cx6="http://schemas.microsoft.com/office/drawing/2016/5/12/chartex" xmlns:cx7="http://schemas.microsoft.com/office/drawing/2016/5/13/chartex" xmlns:cx8="http://schemas.microsoft.com/office/drawing/2016/5/14/chartex" xmlns:mc="http://schemas.openxmlformats.org/markup-compatibility/2006" xmlns:aink="http://schemas.microsoft.com/office/drawing/2016/ink" xmlns:am3d="http://schemas.microsoft.com/office/drawing/2017/model3d" xmlns:o="urn:schemas-microsoft-com:office:office" xmlns:r="http://schemas.openxmlformats.org/officeDocument/2006/relationships" xmlns:m="http://schemas.openxmlformats.org/officeDocument/2006/math" xmlns:v="urn:schemas-microsoft-com:vml" xmlns:wp14="http://schemas.microsoft.com/office/word/2010/wordprocessingDrawing" xmlns:wp="http://schemas.openxmlformats.org/drawingml/2006/wordprocessingDrawing" xmlns:w10="urn:schemas-microsoft-com:office:word" xmlns:w="http://schemas.openxmlformats.org/wordprocessingml/2006/main" xmlns:w14="http://schemas.microsoft.com/office/word/2010/wordml" xmlns:w15="http://schemas.microsoft.com/office/word/2012/wordml" xmlns:w16cex="http://schemas.microsoft.com/office/word/2018/wordml/cex" xmlns:w16cid="http://schemas.microsoft.com/office/word/2016/wordml/cid" xmlns:w16="http://schemas.microsoft.com/office/word/2018/wordml" xmlns:w16se="http://schemas.microsoft.com/office/word/2015/wordml/symex" xmlns:wpg="http://schemas.microsoft.com/office/word/2010/wordprocessingGroup" xmlns:wpi="http://schemas.microsoft.com/office/word/2010/wordprocessingInk" xmlns:wne="http://schemas.microsoft.com/office/word/2006/wordml" xmlns:wps="http://schemas.microsoft.com/office/word/2010/wordprocessingShape" mc:Ignorable="w14 w15 w16se w16cid w16 w16cex wp14">
+  <w:p>
+    <w:pPr>
+      <w:pStyle w:val="Header"/>
+    </w:pPr>
+  </w:p>
+</w:hdr>
+</file>
+
+<file path=word/header3.xml><?xml version="1.0" encoding="utf-8"?>
+<w:hdr xmlns:wpc="http://schemas.microsoft.com/office/word/2010/wordprocessingCanvas" xmlns:cx="http://schemas.microsoft.com/office/drawing/2014/chartex" xmlns:cx1="http://schemas.microsoft.com/office/drawing/2015/9/8/chartex" xmlns:cx2="http://schemas.microsoft.com/office/drawing/2015/10/21/chartex" xmlns:cx3="http://schemas.microsoft.com/office/drawing/2016/5/9/chartex" xmlns:cx4="http://schemas.microsoft.com/office/drawing/2016/5/10/chartex" xmlns:cx5="http://schemas.microsoft.com/office/drawing/2016/5/11/chartex" xmlns:cx6="http://schemas.microsoft.com/office/drawing/2016/5/12/chartex" xmlns:cx7="http://schemas.microsoft.com/office/drawing/2016/5/13/chartex" xmlns:cx8="http://schemas.microsoft.com/office/drawing/2016/5/14/chartex" xmlns:mc="http://schemas.openxmlformats.org/markup-compatibility/2006" xmlns:aink="http://schemas.microsoft.com/office/drawing/2016/ink" xmlns:am3d="http://schemas.microsoft.com/office/drawing/2017/model3d" xmlns:o="urn:schemas-microsoft-com:office:office" xmlns:r="http://schemas.openxmlformats.org/officeDocument/2006/relationships" xmlns:m="http://schemas.openxmlformats.org/officeDocument/2006/math" xmlns:v="urn:schemas-microsoft-com:vml" xmlns:wp14="http://schemas.microsoft.com/office/word/2010/wordprocessingDrawing" xmlns:wp="http://schemas.openxmlformats.org/drawingml/2006/wordprocessingDrawing" xmlns:w10="urn:schemas-microsoft-com:office:word" xmlns:w="http://schemas.openxmlformats.org/wordprocessingml/2006/main" xmlns:w14="http://schemas.microsoft.com/office/word/2010/wordml" xmlns:w15="http://schemas.microsoft.com/office/word/2012/wordml" xmlns:w16cex="http://schemas.microsoft.com/office/word/2018/wordml/cex" xmlns:w16cid="http://schemas.microsoft.com/office/word/2016/wordml/cid" xmlns:w16="http://schemas.microsoft.com/office/word/2018/wordml" xmlns:w16se="http://schemas.microsoft.com/office/word/2015/wordml/symex" xmlns:wpg="http://schemas.microsoft.com/office/word/2010/wordprocessingGroup" xmlns:wpi="http://schemas.microsoft.com/office/word/2010/wordprocessingInk" xmlns:wne="http://schemas.microsoft.com/office/word/2006/wordml" xmlns:wps="http://schemas.microsoft.com/office/word/2010/wordprocessingShape" mc:Ignorable="w14 w15 w16se w16cid w16 w16cex wp14">
+  <w:p>
+    <w:pPr>
+      <w:pStyle w:val="Header"/>
+    </w:pPr>
+  </w:p>
+</w:hdr>
+</file>
+
 <file path=word/numbering.xml><?xml version="1.0" encoding="utf-8"?>
-<w:numbering xmlns:wpc="http://schemas.microsoft.com/office/word/2010/wordprocessingCanvas" xmlns:cx="http://schemas.microsoft.com/office/drawing/2014/chartex" xmlns:cx1="http://schemas.microsoft.com/office/drawing/2015/9/8/chartex" xmlns:cx2="http://schemas.microsoft.com/office/drawing/2015/10/21/chartex" xmlns:cx3="http://schemas.microsoft.com/office/drawing/2016/5/9/chartex" xmlns:cx4="http://schemas.microsoft.com/office/drawing/2016/5/10/chartex" xmlns:cx5="http://schemas.microsoft.com/office/drawing/2016/5/11/chartex" xmlns:cx6="http://schemas.microsoft.com/office/drawing/2016/5/12/chartex" xmlns:cx7="http://schemas.microsoft.com/office/drawing/2016/5/13/chartex" xmlns:cx8="http://schemas.microsoft.com/office/drawing/2016/5/14/chartex" xmlns:mc="http://schemas.openxmlformats.org/markup-compatibility/2006" xmlns:aink="http://schemas.microsoft.com/office/drawing/2016/ink" xmlns:am3d="http://schemas.microsoft.com/office/drawing/2017/model3d" xmlns:o="urn:schemas-microsoft-com:office:office" xmlns:r="http://schemas.openxmlformats.org/officeDocument/2006/relationships" xmlns:m="http://schemas.openxmlformats.org/officeDocument/2006/math" xmlns:v="urn:schemas-microsoft-com:vml" xmlns:wp14="http://schemas.microsoft.com/office/word/2010/wordprocessingDrawing" xmlns:wp="http://schemas.openxmlformats.org/drawingml/2006/wordprocessingDrawing" xmlns:w10="urn:schemas-microsoft-com:office:word" xmlns:w="http://schemas.openxmlformats.org/wordprocessingml/2006/main" xmlns:w14="http://schemas.microsoft.com/office/word/2010/wordml" xmlns:w15="http://schemas.microsoft.com/office/word/2012/wordml" xmlns:w16cid="http://schemas.microsoft.com/office/word/2016/wordml/cid" xmlns:w16se="http://schemas.microsoft.com/office/word/2015/wordml/symex" xmlns:wpg="http://schemas.microsoft.com/office/word/2010/wordprocessingGroup" xmlns:wpi="http://schemas.microsoft.com/office/word/2010/wordprocessingInk" xmlns:wne="http://schemas.microsoft.com/office/word/2006/wordml" xmlns:wps="http://schemas.microsoft.com/office/word/2010/wordprocessingShape" mc:Ignorable="w14 w15 w16se w16cid wp14">
+<w:numbering xmlns:wpc="http://schemas.microsoft.com/office/word/2010/wordprocessingCanvas" xmlns:cx="http://schemas.microsoft.com/office/drawing/2014/chartex" xmlns:cx1="http://schemas.microsoft.com/office/drawing/2015/9/8/chartex" xmlns:cx2="http://schemas.microsoft.com/office/drawing/2015/10/21/chartex" xmlns:cx3="http://schemas.microsoft.com/office/drawing/2016/5/9/chartex" xmlns:cx4="http://schemas.microsoft.com/office/drawing/2016/5/10/chartex" xmlns:cx5="http://schemas.microsoft.com/office/drawing/2016/5/11/chartex" xmlns:cx6="http://schemas.microsoft.com/office/drawing/2016/5/12/chartex" xmlns:cx7="http://schemas.microsoft.com/office/drawing/2016/5/13/chartex" xmlns:cx8="http://schemas.microsoft.com/office/drawing/2016/5/14/chartex" xmlns:mc="http://schemas.openxmlformats.org/markup-compatibility/2006" xmlns:aink="http://schemas.microsoft.com/office/drawing/2016/ink" xmlns:am3d="http://schemas.microsoft.com/office/drawing/2017/model3d" xmlns:o="urn:schemas-microsoft-com:office:office" xmlns:r="http://schemas.openxmlformats.org/officeDocument/2006/relationships" xmlns:m="http://schemas.openxmlformats.org/officeDocument/2006/math" xmlns:v="urn:schemas-microsoft-com:vml" xmlns:wp14="http://schemas.microsoft.com/office/word/2010/wordprocessingDrawing" xmlns:wp="http://schemas.openxmlformats.org/drawingml/2006/wordprocessingDrawing" xmlns:w10="urn:schemas-microsoft-com:office:word" xmlns:w="http://schemas.openxmlformats.org/wordprocessingml/2006/main" xmlns:w14="http://schemas.microsoft.com/office/word/2010/wordml" xmlns:w15="http://schemas.microsoft.com/office/word/2012/wordml" xmlns:w16cex="http://schemas.microsoft.com/office/word/2018/wordml/cex" xmlns:w16cid="http://schemas.microsoft.com/office/word/2016/wordml/cid" xmlns:w16="http://schemas.microsoft.com/office/word/2018/wordml" xmlns:w16se="http://schemas.microsoft.com/office/word/2015/wordml/symex" xmlns:wpg="http://schemas.microsoft.com/office/word/2010/wordprocessingGroup" xmlns:wpi="http://schemas.microsoft.com/office/word/2010/wordprocessingInk" xmlns:wne="http://schemas.microsoft.com/office/word/2006/wordml" xmlns:wps="http://schemas.microsoft.com/office/word/2010/wordprocessingShape" mc:Ignorable="w14 w15 w16se w16cid w16 w16cex wp14">
   <w:abstractNum w:abstractNumId="0" w15:restartNumberingAfterBreak="0">
     <w:nsid w:val="FFFFFF7C"/>
     <w:multiLevelType w:val="singleLevel"/>
@@ -6337,7 +6330,7 @@
 </file>
 
 <file path=word/styles.xml><?xml version="1.0" encoding="utf-8"?>
-<w:styles xmlns:mc="http://schemas.openxmlformats.org/markup-compatibility/2006" xmlns:r="http://schemas.openxmlformats.org/officeDocument/2006/relationships" xmlns:w="http://schemas.openxmlformats.org/wordprocessingml/2006/main" xmlns:w14="http://schemas.microsoft.com/office/word/2010/wordml" xmlns:w15="http://schemas.microsoft.com/office/word/2012/wordml" xmlns:w16cid="http://schemas.microsoft.com/office/word/2016/wordml/cid" xmlns:w16se="http://schemas.microsoft.com/office/word/2015/wordml/symex" mc:Ignorable="w14 w15 w16se w16cid">
+<w:styles xmlns:mc="http://schemas.openxmlformats.org/markup-compatibility/2006" xmlns:r="http://schemas.openxmlformats.org/officeDocument/2006/relationships" xmlns:w="http://schemas.openxmlformats.org/wordprocessingml/2006/main" xmlns:w14="http://schemas.microsoft.com/office/word/2010/wordml" xmlns:w15="http://schemas.microsoft.com/office/word/2012/wordml" xmlns:w16cex="http://schemas.microsoft.com/office/word/2018/wordml/cex" xmlns:w16cid="http://schemas.microsoft.com/office/word/2016/wordml/cid" xmlns:w16="http://schemas.microsoft.com/office/word/2018/wordml" xmlns:w16se="http://schemas.microsoft.com/office/word/2015/wordml/symex" mc:Ignorable="w14 w15 w16se w16cid w16 w16cex">
   <w:docDefaults>
     <w:rPrDefault>
       <w:rPr>
@@ -6347,7 +6340,7 @@
     </w:rPrDefault>
     <w:pPrDefault/>
   </w:docDefaults>
-  <w:latentStyles w:defLockedState="0" w:defUIPriority="0" w:defSemiHidden="0" w:defUnhideWhenUsed="0" w:defQFormat="0" w:count="377">
+  <w:latentStyles w:defLockedState="0" w:defUIPriority="0" w:defSemiHidden="0" w:defUnhideWhenUsed="0" w:defQFormat="0" w:count="376">
     <w:lsdException w:name="Normal" w:qFormat="1"/>
     <w:lsdException w:name="heading 1" w:qFormat="1"/>
     <w:lsdException w:name="heading 2" w:qFormat="1"/>
@@ -6447,6 +6440,7 @@
     <w:lsdException w:name="HTML Sample" w:semiHidden="1" w:unhideWhenUsed="1"/>
     <w:lsdException w:name="HTML Typewriter" w:semiHidden="1" w:unhideWhenUsed="1"/>
     <w:lsdException w:name="HTML Variable" w:semiHidden="1" w:unhideWhenUsed="1"/>
+    <w:lsdException w:name="Normal Table" w:semiHidden="1" w:unhideWhenUsed="1"/>
     <w:lsdException w:name="annotation subject" w:semiHidden="1" w:unhideWhenUsed="1"/>
     <w:lsdException w:name="No List" w:semiHidden="1" w:unhideWhenUsed="1"/>
     <w:lsdException w:name="Outline List 1" w:semiHidden="1" w:unhideWhenUsed="1"/>
@@ -6492,8 +6486,10 @@
     <w:lsdException w:name="Table Subtle 1" w:semiHidden="1" w:unhideWhenUsed="1"/>
     <w:lsdException w:name="Table Subtle 2" w:semiHidden="1" w:unhideWhenUsed="1"/>
     <w:lsdException w:name="Table Web 1" w:semiHidden="1" w:unhideWhenUsed="1"/>
+    <w:lsdException w:name="Table Web 2" w:semiHidden="1" w:unhideWhenUsed="1"/>
     <w:lsdException w:name="Table Web 3" w:semiHidden="1" w:unhideWhenUsed="1"/>
     <w:lsdException w:name="Balloon Text" w:semiHidden="1" w:unhideWhenUsed="1"/>
+    <w:lsdException w:name="Table Theme" w:semiHidden="1" w:unhideWhenUsed="1"/>
     <w:lsdException w:name="Placeholder Text" w:semiHidden="1" w:uiPriority="99"/>
     <w:lsdException w:name="No Spacing" w:uiPriority="1" w:qFormat="1"/>
     <w:lsdException w:name="Light Shading" w:uiPriority="60"/>
@@ -6714,7 +6710,6 @@
     <w:lsdException w:name="Hashtag" w:semiHidden="1" w:uiPriority="99" w:unhideWhenUsed="1"/>
     <w:lsdException w:name="Unresolved Mention" w:semiHidden="1" w:uiPriority="99" w:unhideWhenUsed="1"/>
     <w:lsdException w:name="Smart Link" w:semiHidden="1" w:uiPriority="99" w:unhideWhenUsed="1"/>
-    <w:lsdException w:name="Smart Link Error" w:semiHidden="1" w:uiPriority="99" w:unhideWhenUsed="1"/>
   </w:latentStyles>
   <w:style w:type="paragraph" w:default="1" w:styleId="Normal">
     <w:name w:val="Normal"/>
@@ -6879,6 +6874,7 @@
   <w:style w:type="character" w:default="1" w:styleId="DefaultParagraphFont">
     <w:name w:val="Default Paragraph Font"/>
     <w:uiPriority w:val="1"/>
+    <w:semiHidden/>
     <w:unhideWhenUsed/>
   </w:style>
   <w:style w:type="table" w:default="1" w:styleId="TableNormal">
@@ -7896,7 +7892,7 @@
 </file>
 
 <file path=word/glossary/document.xml><?xml version="1.0" encoding="utf-8"?>
-<w:glossaryDocument xmlns:wpc="http://schemas.microsoft.com/office/word/2010/wordprocessingCanvas" xmlns:cx="http://schemas.microsoft.com/office/drawing/2014/chartex" xmlns:cx1="http://schemas.microsoft.com/office/drawing/2015/9/8/chartex" xmlns:cx2="http://schemas.microsoft.com/office/drawing/2015/10/21/chartex" xmlns:cx3="http://schemas.microsoft.com/office/drawing/2016/5/9/chartex" xmlns:cx4="http://schemas.microsoft.com/office/drawing/2016/5/10/chartex" xmlns:cx5="http://schemas.microsoft.com/office/drawing/2016/5/11/chartex" xmlns:cx6="http://schemas.microsoft.com/office/drawing/2016/5/12/chartex" xmlns:cx7="http://schemas.microsoft.com/office/drawing/2016/5/13/chartex" xmlns:cx8="http://schemas.microsoft.com/office/drawing/2016/5/14/chartex" xmlns:mc="http://schemas.openxmlformats.org/markup-compatibility/2006" xmlns:aink="http://schemas.microsoft.com/office/drawing/2016/ink" xmlns:am3d="http://schemas.microsoft.com/office/drawing/2017/model3d" xmlns:o="urn:schemas-microsoft-com:office:office" xmlns:r="http://schemas.openxmlformats.org/officeDocument/2006/relationships" xmlns:m="http://schemas.openxmlformats.org/officeDocument/2006/math" xmlns:v="urn:schemas-microsoft-com:vml" xmlns:wp14="http://schemas.microsoft.com/office/word/2010/wordprocessingDrawing" xmlns:wp="http://schemas.openxmlformats.org/drawingml/2006/wordprocessingDrawing" xmlns:w10="urn:schemas-microsoft-com:office:word" xmlns:w="http://schemas.openxmlformats.org/wordprocessingml/2006/main" xmlns:w14="http://schemas.microsoft.com/office/word/2010/wordml" xmlns:w15="http://schemas.microsoft.com/office/word/2012/wordml" xmlns:w16cid="http://schemas.microsoft.com/office/word/2016/wordml/cid" xmlns:w16se="http://schemas.microsoft.com/office/word/2015/wordml/symex" xmlns:wpg="http://schemas.microsoft.com/office/word/2010/wordprocessingGroup" xmlns:wpi="http://schemas.microsoft.com/office/word/2010/wordprocessingInk" xmlns:wne="http://schemas.microsoft.com/office/word/2006/wordml" xmlns:wps="http://schemas.microsoft.com/office/word/2010/wordprocessingShape" mc:Ignorable="w14 w15 w16se w16cid wp14">
+<w:glossaryDocument xmlns:wpc="http://schemas.microsoft.com/office/word/2010/wordprocessingCanvas" xmlns:cx="http://schemas.microsoft.com/office/drawing/2014/chartex" xmlns:cx1="http://schemas.microsoft.com/office/drawing/2015/9/8/chartex" xmlns:cx2="http://schemas.microsoft.com/office/drawing/2015/10/21/chartex" xmlns:cx3="http://schemas.microsoft.com/office/drawing/2016/5/9/chartex" xmlns:cx4="http://schemas.microsoft.com/office/drawing/2016/5/10/chartex" xmlns:cx5="http://schemas.microsoft.com/office/drawing/2016/5/11/chartex" xmlns:cx6="http://schemas.microsoft.com/office/drawing/2016/5/12/chartex" xmlns:cx7="http://schemas.microsoft.com/office/drawing/2016/5/13/chartex" xmlns:cx8="http://schemas.microsoft.com/office/drawing/2016/5/14/chartex" xmlns:mc="http://schemas.openxmlformats.org/markup-compatibility/2006" xmlns:aink="http://schemas.microsoft.com/office/drawing/2016/ink" xmlns:am3d="http://schemas.microsoft.com/office/drawing/2017/model3d" xmlns:o="urn:schemas-microsoft-com:office:office" xmlns:r="http://schemas.openxmlformats.org/officeDocument/2006/relationships" xmlns:m="http://schemas.openxmlformats.org/officeDocument/2006/math" xmlns:v="urn:schemas-microsoft-com:vml" xmlns:wp14="http://schemas.microsoft.com/office/word/2010/wordprocessingDrawing" xmlns:wp="http://schemas.openxmlformats.org/drawingml/2006/wordprocessingDrawing" xmlns:w10="urn:schemas-microsoft-com:office:word" xmlns:w="http://schemas.openxmlformats.org/wordprocessingml/2006/main" xmlns:w14="http://schemas.microsoft.com/office/word/2010/wordml" xmlns:w15="http://schemas.microsoft.com/office/word/2012/wordml" xmlns:w16cex="http://schemas.microsoft.com/office/word/2018/wordml/cex" xmlns:w16cid="http://schemas.microsoft.com/office/word/2016/wordml/cid" xmlns:w16="http://schemas.microsoft.com/office/word/2018/wordml" xmlns:w16se="http://schemas.microsoft.com/office/word/2015/wordml/symex" xmlns:wpg="http://schemas.microsoft.com/office/word/2010/wordprocessingGroup" xmlns:wpi="http://schemas.microsoft.com/office/word/2010/wordprocessingInk" xmlns:wne="http://schemas.microsoft.com/office/word/2006/wordml" xmlns:wps="http://schemas.microsoft.com/office/word/2010/wordprocessingShape" mc:Ignorable="w14 w15 w16se w16cid w16 w16cex wp14">
   <w:docParts>
     <w:docPart>
       <w:docPartPr>
@@ -9207,7 +9203,7 @@
 </file>
 
 <file path=word/glossary/fontTable.xml><?xml version="1.0" encoding="utf-8"?>
-<w:fonts xmlns:mc="http://schemas.openxmlformats.org/markup-compatibility/2006" xmlns:r="http://schemas.openxmlformats.org/officeDocument/2006/relationships" xmlns:w="http://schemas.openxmlformats.org/wordprocessingml/2006/main" xmlns:w14="http://schemas.microsoft.com/office/word/2010/wordml" xmlns:w15="http://schemas.microsoft.com/office/word/2012/wordml" xmlns:w16cid="http://schemas.microsoft.com/office/word/2016/wordml/cid" xmlns:w16se="http://schemas.microsoft.com/office/word/2015/wordml/symex" mc:Ignorable="w14 w15 w16se w16cid">
+<w:fonts xmlns:mc="http://schemas.openxmlformats.org/markup-compatibility/2006" xmlns:r="http://schemas.openxmlformats.org/officeDocument/2006/relationships" xmlns:w="http://schemas.openxmlformats.org/wordprocessingml/2006/main" xmlns:w14="http://schemas.microsoft.com/office/word/2010/wordml" xmlns:w15="http://schemas.microsoft.com/office/word/2012/wordml" xmlns:w16cex="http://schemas.microsoft.com/office/word/2018/wordml/cex" xmlns:w16cid="http://schemas.microsoft.com/office/word/2016/wordml/cid" xmlns:w16="http://schemas.microsoft.com/office/word/2018/wordml" xmlns:w16se="http://schemas.microsoft.com/office/word/2015/wordml/symex" mc:Ignorable="w14 w15 w16se w16cid w16 w16cex">
   <w:font w:name="Symbol">
     <w:panose1 w:val="05050102010706020507"/>
     <w:charset w:val="02"/>
@@ -9270,20 +9266,20 @@
     <w:charset w:val="00"/>
     <w:family w:val="swiss"/>
     <w:pitch w:val="variable"/>
-    <w:sig w:usb0="E0002EFF" w:usb1="C000247B" w:usb2="00000009" w:usb3="00000000" w:csb0="000001FF" w:csb1="00000000"/>
+    <w:sig w:usb0="E4002EFF" w:usb1="C000247B" w:usb2="00000009" w:usb3="00000000" w:csb0="000001FF" w:csb1="00000000"/>
   </w:font>
   <w:font w:name="Calibri Light">
     <w:panose1 w:val="020F0302020204030204"/>
     <w:charset w:val="00"/>
     <w:family w:val="swiss"/>
     <w:pitch w:val="variable"/>
-    <w:sig w:usb0="E0002AFF" w:usb1="C000247B" w:usb2="00000009" w:usb3="00000000" w:csb0="000001FF" w:csb1="00000000"/>
+    <w:sig w:usb0="E4002EFF" w:usb1="C000247B" w:usb2="00000009" w:usb3="00000000" w:csb0="000001FF" w:csb1="00000000"/>
   </w:font>
 </w:fonts>
 </file>
 
 <file path=word/glossary/settings.xml><?xml version="1.0" encoding="utf-8"?>
-<w:settings xmlns:mc="http://schemas.openxmlformats.org/markup-compatibility/2006" xmlns:o="urn:schemas-microsoft-com:office:office" xmlns:r="http://schemas.openxmlformats.org/officeDocument/2006/relationships" xmlns:m="http://schemas.openxmlformats.org/officeDocument/2006/math" xmlns:v="urn:schemas-microsoft-com:vml" xmlns:w10="urn:schemas-microsoft-com:office:word" xmlns:w="http://schemas.openxmlformats.org/wordprocessingml/2006/main" xmlns:w14="http://schemas.microsoft.com/office/word/2010/wordml" xmlns:w15="http://schemas.microsoft.com/office/word/2012/wordml" xmlns:w16cid="http://schemas.microsoft.com/office/word/2016/wordml/cid" xmlns:w16se="http://schemas.microsoft.com/office/word/2015/wordml/symex" xmlns:sl="http://schemas.openxmlformats.org/schemaLibrary/2006/main" mc:Ignorable="w14 w15 w16se w16cid">
+<w:settings xmlns:mc="http://schemas.openxmlformats.org/markup-compatibility/2006" xmlns:o="urn:schemas-microsoft-com:office:office" xmlns:r="http://schemas.openxmlformats.org/officeDocument/2006/relationships" xmlns:m="http://schemas.openxmlformats.org/officeDocument/2006/math" xmlns:v="urn:schemas-microsoft-com:vml" xmlns:w10="urn:schemas-microsoft-com:office:word" xmlns:w="http://schemas.openxmlformats.org/wordprocessingml/2006/main" xmlns:w14="http://schemas.microsoft.com/office/word/2010/wordml" xmlns:w15="http://schemas.microsoft.com/office/word/2012/wordml" xmlns:w16cex="http://schemas.microsoft.com/office/word/2018/wordml/cex" xmlns:w16cid="http://schemas.microsoft.com/office/word/2016/wordml/cid" xmlns:w16="http://schemas.microsoft.com/office/word/2018/wordml" xmlns:w16se="http://schemas.microsoft.com/office/word/2015/wordml/symex" xmlns:sl="http://schemas.openxmlformats.org/schemaLibrary/2006/main" mc:Ignorable="w14 w15 w16se w16cid w16 w16cex">
   <w:view w:val="normal"/>
   <w:defaultTabStop w:val="720"/>
   <w:characterSpacingControl w:val="doNotCompress"/>
@@ -9320,6 +9316,7 @@
     <w:rsid w:val="0080343E"/>
     <w:rsid w:val="00810A8C"/>
     <w:rsid w:val="00813280"/>
+    <w:rsid w:val="008402C5"/>
     <w:rsid w:val="00841BE2"/>
     <w:rsid w:val="00883763"/>
     <w:rsid w:val="008952A6"/>
@@ -9377,7 +9374,7 @@
 </file>
 
 <file path=word/glossary/styles.xml><?xml version="1.0" encoding="utf-8"?>
-<w:styles xmlns:mc="http://schemas.openxmlformats.org/markup-compatibility/2006" xmlns:r="http://schemas.openxmlformats.org/officeDocument/2006/relationships" xmlns:w="http://schemas.openxmlformats.org/wordprocessingml/2006/main" xmlns:w14="http://schemas.microsoft.com/office/word/2010/wordml" xmlns:w15="http://schemas.microsoft.com/office/word/2012/wordml" xmlns:w16cid="http://schemas.microsoft.com/office/word/2016/wordml/cid" xmlns:w16se="http://schemas.microsoft.com/office/word/2015/wordml/symex" mc:Ignorable="w14 w15 w16se w16cid">
+<w:styles xmlns:mc="http://schemas.openxmlformats.org/markup-compatibility/2006" xmlns:r="http://schemas.openxmlformats.org/officeDocument/2006/relationships" xmlns:w="http://schemas.openxmlformats.org/wordprocessingml/2006/main" xmlns:w14="http://schemas.microsoft.com/office/word/2010/wordml" xmlns:w15="http://schemas.microsoft.com/office/word/2012/wordml" xmlns:w16cex="http://schemas.microsoft.com/office/word/2018/wordml/cex" xmlns:w16cid="http://schemas.microsoft.com/office/word/2016/wordml/cid" xmlns:w16="http://schemas.microsoft.com/office/word/2018/wordml" xmlns:w16se="http://schemas.microsoft.com/office/word/2015/wordml/symex" mc:Ignorable="w14 w15 w16se w16cid w16 w16cex">
   <w:docDefaults>
     <w:rPrDefault>
       <w:rPr>
@@ -9393,7 +9390,7 @@
       </w:pPr>
     </w:pPrDefault>
   </w:docDefaults>
-  <w:latentStyles w:defLockedState="0" w:defUIPriority="99" w:defSemiHidden="0" w:defUnhideWhenUsed="0" w:defQFormat="0" w:count="377">
+  <w:latentStyles w:defLockedState="0" w:defUIPriority="99" w:defSemiHidden="0" w:defUnhideWhenUsed="0" w:defQFormat="0" w:count="376">
     <w:lsdException w:name="Normal" w:uiPriority="0" w:qFormat="1"/>
     <w:lsdException w:name="heading 1" w:uiPriority="9" w:qFormat="1"/>
     <w:lsdException w:name="heading 2" w:semiHidden="1" w:uiPriority="9" w:unhideWhenUsed="1" w:qFormat="1"/>
@@ -9499,6 +9496,7 @@
     <w:lsdException w:name="HTML Sample" w:semiHidden="1" w:unhideWhenUsed="1"/>
     <w:lsdException w:name="HTML Typewriter" w:semiHidden="1" w:unhideWhenUsed="1"/>
     <w:lsdException w:name="HTML Variable" w:semiHidden="1" w:unhideWhenUsed="1"/>
+    <w:lsdException w:name="Normal Table" w:semiHidden="1" w:unhideWhenUsed="1"/>
     <w:lsdException w:name="annotation subject" w:semiHidden="1" w:unhideWhenUsed="1"/>
     <w:lsdException w:name="No List" w:semiHidden="1" w:unhideWhenUsed="1"/>
     <w:lsdException w:name="Outline List 1" w:semiHidden="1" w:unhideWhenUsed="1"/>
@@ -9544,9 +9542,11 @@
     <w:lsdException w:name="Table Subtle 1" w:semiHidden="1" w:unhideWhenUsed="1"/>
     <w:lsdException w:name="Table Subtle 2" w:semiHidden="1" w:unhideWhenUsed="1"/>
     <w:lsdException w:name="Table Web 1" w:semiHidden="1" w:unhideWhenUsed="1"/>
+    <w:lsdException w:name="Table Web 2" w:semiHidden="1" w:unhideWhenUsed="1"/>
     <w:lsdException w:name="Table Web 3" w:semiHidden="1" w:unhideWhenUsed="1"/>
     <w:lsdException w:name="Balloon Text" w:semiHidden="1" w:unhideWhenUsed="1"/>
     <w:lsdException w:name="Table Grid" w:uiPriority="39"/>
+    <w:lsdException w:name="Table Theme" w:semiHidden="1" w:unhideWhenUsed="1"/>
     <w:lsdException w:name="Placeholder Text" w:semiHidden="1"/>
     <w:lsdException w:name="No Spacing" w:uiPriority="1" w:qFormat="1"/>
     <w:lsdException w:name="Light Shading" w:uiPriority="60"/>
@@ -9767,7 +9767,6 @@
     <w:lsdException w:name="Hashtag" w:semiHidden="1" w:unhideWhenUsed="1"/>
     <w:lsdException w:name="Unresolved Mention" w:semiHidden="1" w:unhideWhenUsed="1"/>
     <w:lsdException w:name="Smart Link" w:semiHidden="1" w:unhideWhenUsed="1"/>
-    <w:lsdException w:name="Smart Link Error" w:semiHidden="1" w:unhideWhenUsed="1"/>
   </w:latentStyles>
   <w:style w:type="paragraph" w:default="1" w:styleId="Normal">
     <w:name w:val="Normal"/>
@@ -16810,7 +16809,7 @@
 </file>
 
 <file path=word/glossary/webSettings.xml><?xml version="1.0" encoding="utf-8"?>
-<w:webSettings xmlns:mc="http://schemas.openxmlformats.org/markup-compatibility/2006" xmlns:r="http://schemas.openxmlformats.org/officeDocument/2006/relationships" xmlns:w="http://schemas.openxmlformats.org/wordprocessingml/2006/main" xmlns:w14="http://schemas.microsoft.com/office/word/2010/wordml" xmlns:w15="http://schemas.microsoft.com/office/word/2012/wordml" xmlns:w16cid="http://schemas.microsoft.com/office/word/2016/wordml/cid" xmlns:w16se="http://schemas.microsoft.com/office/word/2015/wordml/symex" mc:Ignorable="w14 w15 w16se w16cid">
+<w:webSettings xmlns:mc="http://schemas.openxmlformats.org/markup-compatibility/2006" xmlns:r="http://schemas.openxmlformats.org/officeDocument/2006/relationships" xmlns:w="http://schemas.openxmlformats.org/wordprocessingml/2006/main" xmlns:w14="http://schemas.microsoft.com/office/word/2010/wordml" xmlns:w15="http://schemas.microsoft.com/office/word/2012/wordml" xmlns:w16cex="http://schemas.microsoft.com/office/word/2018/wordml/cex" xmlns:w16cid="http://schemas.microsoft.com/office/word/2016/wordml/cid" xmlns:w16="http://schemas.microsoft.com/office/word/2018/wordml" xmlns:w16se="http://schemas.microsoft.com/office/word/2015/wordml/symex" mc:Ignorable="w14 w15 w16se w16cid w16 w16cex">
   <w:optimizeForBrowser/>
 </w:webSettings>
 </file>
@@ -17099,19 +17098,6 @@
 </file>
 
 <file path=customXml/item1.xml><?xml version="1.0" encoding="utf-8"?>
-<p:properties xmlns:p="http://schemas.microsoft.com/office/2006/metadata/properties" xmlns:xsi="http://www.w3.org/2001/XMLSchema-instance" xmlns:pc="http://schemas.microsoft.com/office/infopath/2007/PartnerControls">
-  <documentManagement>
-    <TaxKeywordTaxHTField xmlns="016c310d-f661-49a6-97ee-540076082437">
-      <Terms xmlns="http://schemas.microsoft.com/office/infopath/2007/PartnerControls"/>
-    </TaxKeywordTaxHTField>
-    <TaxCatchAll xmlns="016c310d-f661-49a6-97ee-540076082437"/>
-    <SIP_Label_Document xmlns="016c310d-f661-49a6-97ee-540076082437">;#0;#Unrestricted;#True;#;#;#;#</SIP_Label_Document>
-    <AverageRating xmlns="http://schemas.microsoft.com/sharepoint/v3" xsi:nil="true"/>
-  </documentManagement>
-</p:properties>
-</file>
-
-<file path=customXml/item2.xml><?xml version="1.0" encoding="utf-8"?>
 <ct:contentTypeSchema xmlns:ct="http://schemas.microsoft.com/office/2006/metadata/contentType" xmlns:ma="http://schemas.microsoft.com/office/2006/metadata/properties/metaAttributes" ct:_="" ma:_="" ma:contentTypeName="Document" ma:contentTypeID="0x010100833E2717D64DEA4FBFABAC416D347394" ma:contentTypeVersion="6" ma:contentTypeDescription="Create a new document." ma:contentTypeScope="" ma:versionID="98a74335b8287497f43df26a30ee6108">
   <xsd:schema xmlns:xsd="http://www.w3.org/2001/XMLSchema" xmlns:xs="http://www.w3.org/2001/XMLSchema" xmlns:p="http://schemas.microsoft.com/office/2006/metadata/properties" xmlns:ns1="http://schemas.microsoft.com/sharepoint/v3" xmlns:ns2="016c310d-f661-49a6-97ee-540076082437" targetNamespace="http://schemas.microsoft.com/office/2006/metadata/properties" ma:root="true" ma:fieldsID="d32ef67c478e261fbf17576a93df92a4" ns1:_="" ns2:_="">
     <xsd:import namespace="http://schemas.microsoft.com/sharepoint/v3"/>
@@ -17274,7 +17260,24 @@
 </ct:contentTypeSchema>
 </file>
 
+<file path=customXml/item2.xml><?xml version="1.0" encoding="utf-8"?>
+<p:properties xmlns:p="http://schemas.microsoft.com/office/2006/metadata/properties" xmlns:xsi="http://www.w3.org/2001/XMLSchema-instance" xmlns:pc="http://schemas.microsoft.com/office/infopath/2007/PartnerControls">
+  <documentManagement>
+    <TaxKeywordTaxHTField xmlns="016c310d-f661-49a6-97ee-540076082437">
+      <Terms xmlns="http://schemas.microsoft.com/office/infopath/2007/PartnerControls"/>
+    </TaxKeywordTaxHTField>
+    <TaxCatchAll xmlns="016c310d-f661-49a6-97ee-540076082437"/>
+    <SIP_Label_Document xmlns="016c310d-f661-49a6-97ee-540076082437">;#0;#Unrestricted;#True;#;#;#;#</SIP_Label_Document>
+    <AverageRating xmlns="http://schemas.microsoft.com/sharepoint/v3" xsi:nil="true"/>
+  </documentManagement>
+</p:properties>
+</file>
+
 <file path=customXml/item3.xml><?xml version="1.0" encoding="utf-8"?>
+<b:Sources xmlns:b="http://schemas.openxmlformats.org/officeDocument/2006/bibliography" xmlns="http://schemas.openxmlformats.org/officeDocument/2006/bibliography" SelectedStyle="\APASixthEditionOfficeOnline.xsl" StyleName="APA" Version="6"/>
+</file>
+
+<file path=customXml/item4.xml><?xml version="1.0" encoding="utf-8"?>
 <?mso-contentType ?>
 <FormTemplates xmlns="http://schemas.microsoft.com/sharepoint/v3/contenttype/forms">
   <Display>DocumentLibraryForm</Display>
@@ -17283,22 +17286,7 @@
 </FormTemplates>
 </file>
 
-<file path=customXml/item4.xml><?xml version="1.0" encoding="utf-8"?>
-<b:Sources xmlns:b="http://schemas.openxmlformats.org/officeDocument/2006/bibliography" xmlns="http://schemas.openxmlformats.org/officeDocument/2006/bibliography" SelectedStyle="\APASixthEditionOfficeOnline.xsl" StyleName="APA" Version="6"/>
-</file>
-
 <file path=customXml/itemProps1.xml><?xml version="1.0" encoding="utf-8"?>
-<ds:datastoreItem xmlns:ds="http://schemas.openxmlformats.org/officeDocument/2006/customXml" ds:itemID="{033400F4-1F04-4DBC-9784-C8B3AA89B53C}">
-  <ds:schemaRefs>
-    <ds:schemaRef ds:uri="http://schemas.microsoft.com/office/2006/metadata/properties"/>
-    <ds:schemaRef ds:uri="http://schemas.microsoft.com/office/infopath/2007/PartnerControls"/>
-    <ds:schemaRef ds:uri="016c310d-f661-49a6-97ee-540076082437"/>
-    <ds:schemaRef ds:uri="http://schemas.microsoft.com/sharepoint/v3"/>
-  </ds:schemaRefs>
-</ds:datastoreItem>
-</file>
-
-<file path=customXml/itemProps2.xml><?xml version="1.0" encoding="utf-8"?>
 <ds:datastoreItem xmlns:ds="http://schemas.openxmlformats.org/officeDocument/2006/customXml" ds:itemID="{70D90404-A780-484E-92B9-483A3C532657}">
   <ds:schemaRefs>
     <ds:schemaRef ds:uri="http://schemas.microsoft.com/office/2006/metadata/contentType"/>
@@ -17317,18 +17305,29 @@
 </ds:datastoreItem>
 </file>
 
+<file path=customXml/itemProps2.xml><?xml version="1.0" encoding="utf-8"?>
+<ds:datastoreItem xmlns:ds="http://schemas.openxmlformats.org/officeDocument/2006/customXml" ds:itemID="{033400F4-1F04-4DBC-9784-C8B3AA89B53C}">
+  <ds:schemaRefs>
+    <ds:schemaRef ds:uri="http://schemas.microsoft.com/office/2006/metadata/properties"/>
+    <ds:schemaRef ds:uri="http://schemas.microsoft.com/office/infopath/2007/PartnerControls"/>
+    <ds:schemaRef ds:uri="016c310d-f661-49a6-97ee-540076082437"/>
+    <ds:schemaRef ds:uri="http://schemas.microsoft.com/sharepoint/v3"/>
+  </ds:schemaRefs>
+</ds:datastoreItem>
+</file>
+
 <file path=customXml/itemProps3.xml><?xml version="1.0" encoding="utf-8"?>
+<ds:datastoreItem xmlns:ds="http://schemas.openxmlformats.org/officeDocument/2006/customXml" ds:itemID="{CD6CF2A3-23DE-48BF-867B-89770F7DA3FE}">
+  <ds:schemaRefs>
+    <ds:schemaRef ds:uri="http://schemas.openxmlformats.org/officeDocument/2006/bibliography"/>
+  </ds:schemaRefs>
+</ds:datastoreItem>
+</file>
+
+<file path=customXml/itemProps4.xml><?xml version="1.0" encoding="utf-8"?>
 <ds:datastoreItem xmlns:ds="http://schemas.openxmlformats.org/officeDocument/2006/customXml" ds:itemID="{6A21EC55-C1B2-4765-90AC-37A4F1604205}">
   <ds:schemaRefs>
     <ds:schemaRef ds:uri="http://schemas.microsoft.com/sharepoint/v3/contenttype/forms"/>
   </ds:schemaRefs>
 </ds:datastoreItem>
-</file>
-
-<file path=customXml/itemProps4.xml><?xml version="1.0" encoding="utf-8"?>
-<ds:datastoreItem xmlns:ds="http://schemas.openxmlformats.org/officeDocument/2006/customXml" ds:itemID="{CD6CF2A3-23DE-48BF-867B-89770F7DA3FE}">
-  <ds:schemaRefs>
-    <ds:schemaRef ds:uri="http://schemas.openxmlformats.org/officeDocument/2006/bibliography"/>
-  </ds:schemaRefs>
-</ds:datastoreItem>
 </file>
</xml_diff>

<commit_message>
Fixed an issue w/ the template missing a "1", making instead of stating 15M, it states 5M
</commit_message>
<xml_diff>
--- a/GenBOE/GenBOE.Web/Templates/Export/PBOE_1.docx
+++ b/GenBOE/GenBOE.Web/Templates/Export/PBOE_1.docx
@@ -2601,7 +2601,19 @@
               <w:rPr>
                 <w:sz w:val="20"/>
               </w:rPr>
-              <w:t xml:space="preserve">upplier proposal and supporting data included if &gt;$5M or </w:t>
+              <w:t>upplier proposal and supporting data included if &gt;$</w:t>
+            </w:r>
+            <w:r>
+              <w:rPr>
+                <w:sz w:val="20"/>
+              </w:rPr>
+              <w:t>1</w:t>
+            </w:r>
+            <w:r>
+              <w:rPr>
+                <w:sz w:val="20"/>
+              </w:rPr>
+              <w:t xml:space="preserve">5M or </w:t>
             </w:r>
             <w:r>
               <w:rPr>
@@ -9247,7 +9259,7 @@
     <w:sig w:usb0="E1002EFF" w:usb1="C000605B" w:usb2="00000029" w:usb3="00000000" w:csb0="000101FF" w:csb1="00000000"/>
   </w:font>
   <w:font w:name="MS Mincho">
-    <w:altName w:val="MS Mincho"/>
+    <w:altName w:val="ＭＳ 明朝"/>
     <w:panose1 w:val="02020609040205080304"/>
     <w:charset w:val="80"/>
     <w:family w:val="modern"/>
@@ -9335,6 +9347,7 @@
     <w:rsid w:val="00BA6CA4"/>
     <w:rsid w:val="00BD739D"/>
     <w:rsid w:val="00C1691B"/>
+    <w:rsid w:val="00C22EC5"/>
     <w:rsid w:val="00C75714"/>
     <w:rsid w:val="00CA2B27"/>
     <w:rsid w:val="00CA4852"/>
@@ -17098,6 +17111,19 @@
 </file>
 
 <file path=customXml/item1.xml><?xml version="1.0" encoding="utf-8"?>
+<p:properties xmlns:p="http://schemas.microsoft.com/office/2006/metadata/properties" xmlns:xsi="http://www.w3.org/2001/XMLSchema-instance" xmlns:pc="http://schemas.microsoft.com/office/infopath/2007/PartnerControls">
+  <documentManagement>
+    <TaxKeywordTaxHTField xmlns="016c310d-f661-49a6-97ee-540076082437">
+      <Terms xmlns="http://schemas.microsoft.com/office/infopath/2007/PartnerControls"/>
+    </TaxKeywordTaxHTField>
+    <TaxCatchAll xmlns="016c310d-f661-49a6-97ee-540076082437"/>
+    <SIP_Label_Document xmlns="016c310d-f661-49a6-97ee-540076082437">;#0;#Unrestricted;#True;#;#;#;#</SIP_Label_Document>
+    <AverageRating xmlns="http://schemas.microsoft.com/sharepoint/v3" xsi:nil="true"/>
+  </documentManagement>
+</p:properties>
+</file>
+
+<file path=customXml/item2.xml><?xml version="1.0" encoding="utf-8"?>
 <ct:contentTypeSchema xmlns:ct="http://schemas.microsoft.com/office/2006/metadata/contentType" xmlns:ma="http://schemas.microsoft.com/office/2006/metadata/properties/metaAttributes" ct:_="" ma:_="" ma:contentTypeName="Document" ma:contentTypeID="0x010100833E2717D64DEA4FBFABAC416D347394" ma:contentTypeVersion="6" ma:contentTypeDescription="Create a new document." ma:contentTypeScope="" ma:versionID="98a74335b8287497f43df26a30ee6108">
   <xsd:schema xmlns:xsd="http://www.w3.org/2001/XMLSchema" xmlns:xs="http://www.w3.org/2001/XMLSchema" xmlns:p="http://schemas.microsoft.com/office/2006/metadata/properties" xmlns:ns1="http://schemas.microsoft.com/sharepoint/v3" xmlns:ns2="016c310d-f661-49a6-97ee-540076082437" targetNamespace="http://schemas.microsoft.com/office/2006/metadata/properties" ma:root="true" ma:fieldsID="d32ef67c478e261fbf17576a93df92a4" ns1:_="" ns2:_="">
     <xsd:import namespace="http://schemas.microsoft.com/sharepoint/v3"/>
@@ -17260,24 +17286,7 @@
 </ct:contentTypeSchema>
 </file>
 
-<file path=customXml/item2.xml><?xml version="1.0" encoding="utf-8"?>
-<p:properties xmlns:p="http://schemas.microsoft.com/office/2006/metadata/properties" xmlns:xsi="http://www.w3.org/2001/XMLSchema-instance" xmlns:pc="http://schemas.microsoft.com/office/infopath/2007/PartnerControls">
-  <documentManagement>
-    <TaxKeywordTaxHTField xmlns="016c310d-f661-49a6-97ee-540076082437">
-      <Terms xmlns="http://schemas.microsoft.com/office/infopath/2007/PartnerControls"/>
-    </TaxKeywordTaxHTField>
-    <TaxCatchAll xmlns="016c310d-f661-49a6-97ee-540076082437"/>
-    <SIP_Label_Document xmlns="016c310d-f661-49a6-97ee-540076082437">;#0;#Unrestricted;#True;#;#;#;#</SIP_Label_Document>
-    <AverageRating xmlns="http://schemas.microsoft.com/sharepoint/v3" xsi:nil="true"/>
-  </documentManagement>
-</p:properties>
-</file>
-
 <file path=customXml/item3.xml><?xml version="1.0" encoding="utf-8"?>
-<b:Sources xmlns:b="http://schemas.openxmlformats.org/officeDocument/2006/bibliography" xmlns="http://schemas.openxmlformats.org/officeDocument/2006/bibliography" SelectedStyle="\APASixthEditionOfficeOnline.xsl" StyleName="APA" Version="6"/>
-</file>
-
-<file path=customXml/item4.xml><?xml version="1.0" encoding="utf-8"?>
 <?mso-contentType ?>
 <FormTemplates xmlns="http://schemas.microsoft.com/sharepoint/v3/contenttype/forms">
   <Display>DocumentLibraryForm</Display>
@@ -17286,7 +17295,22 @@
 </FormTemplates>
 </file>
 
+<file path=customXml/item4.xml><?xml version="1.0" encoding="utf-8"?>
+<b:Sources xmlns:b="http://schemas.openxmlformats.org/officeDocument/2006/bibliography" xmlns="http://schemas.openxmlformats.org/officeDocument/2006/bibliography" SelectedStyle="\APASixthEditionOfficeOnline.xsl" StyleName="APA" Version="6"/>
+</file>
+
 <file path=customXml/itemProps1.xml><?xml version="1.0" encoding="utf-8"?>
+<ds:datastoreItem xmlns:ds="http://schemas.openxmlformats.org/officeDocument/2006/customXml" ds:itemID="{033400F4-1F04-4DBC-9784-C8B3AA89B53C}">
+  <ds:schemaRefs>
+    <ds:schemaRef ds:uri="http://schemas.microsoft.com/office/2006/metadata/properties"/>
+    <ds:schemaRef ds:uri="http://schemas.microsoft.com/office/infopath/2007/PartnerControls"/>
+    <ds:schemaRef ds:uri="016c310d-f661-49a6-97ee-540076082437"/>
+    <ds:schemaRef ds:uri="http://schemas.microsoft.com/sharepoint/v3"/>
+  </ds:schemaRefs>
+</ds:datastoreItem>
+</file>
+
+<file path=customXml/itemProps2.xml><?xml version="1.0" encoding="utf-8"?>
 <ds:datastoreItem xmlns:ds="http://schemas.openxmlformats.org/officeDocument/2006/customXml" ds:itemID="{70D90404-A780-484E-92B9-483A3C532657}">
   <ds:schemaRefs>
     <ds:schemaRef ds:uri="http://schemas.microsoft.com/office/2006/metadata/contentType"/>
@@ -17305,29 +17329,18 @@
 </ds:datastoreItem>
 </file>
 
-<file path=customXml/itemProps2.xml><?xml version="1.0" encoding="utf-8"?>
-<ds:datastoreItem xmlns:ds="http://schemas.openxmlformats.org/officeDocument/2006/customXml" ds:itemID="{033400F4-1F04-4DBC-9784-C8B3AA89B53C}">
+<file path=customXml/itemProps3.xml><?xml version="1.0" encoding="utf-8"?>
+<ds:datastoreItem xmlns:ds="http://schemas.openxmlformats.org/officeDocument/2006/customXml" ds:itemID="{6A21EC55-C1B2-4765-90AC-37A4F1604205}">
   <ds:schemaRefs>
-    <ds:schemaRef ds:uri="http://schemas.microsoft.com/office/2006/metadata/properties"/>
-    <ds:schemaRef ds:uri="http://schemas.microsoft.com/office/infopath/2007/PartnerControls"/>
-    <ds:schemaRef ds:uri="016c310d-f661-49a6-97ee-540076082437"/>
-    <ds:schemaRef ds:uri="http://schemas.microsoft.com/sharepoint/v3"/>
+    <ds:schemaRef ds:uri="http://schemas.microsoft.com/sharepoint/v3/contenttype/forms"/>
   </ds:schemaRefs>
 </ds:datastoreItem>
 </file>
 
-<file path=customXml/itemProps3.xml><?xml version="1.0" encoding="utf-8"?>
+<file path=customXml/itemProps4.xml><?xml version="1.0" encoding="utf-8"?>
 <ds:datastoreItem xmlns:ds="http://schemas.openxmlformats.org/officeDocument/2006/customXml" ds:itemID="{CD6CF2A3-23DE-48BF-867B-89770F7DA3FE}">
   <ds:schemaRefs>
     <ds:schemaRef ds:uri="http://schemas.openxmlformats.org/officeDocument/2006/bibliography"/>
   </ds:schemaRefs>
 </ds:datastoreItem>
-</file>
-
-<file path=customXml/itemProps4.xml><?xml version="1.0" encoding="utf-8"?>
-<ds:datastoreItem xmlns:ds="http://schemas.openxmlformats.org/officeDocument/2006/customXml" ds:itemID="{6A21EC55-C1B2-4765-90AC-37A4F1604205}">
-  <ds:schemaRefs>
-    <ds:schemaRef ds:uri="http://schemas.microsoft.com/sharepoint/v3/contenttype/forms"/>
-  </ds:schemaRefs>
-</ds:datastoreItem>
 </file>
</xml_diff>

<commit_message>
Merged PR 678: Merge IES-372-Assess-PTM-Contracts-state to PtmContracts
Updated PtmContracts with latest UAT. Resolved merge conflicts.
</commit_message>
<xml_diff>
--- a/GenBOE/GenBOE.Web/Templates/Export/PBOE_1.docx
+++ b/GenBOE/GenBOE.Web/Templates/Export/PBOE_1.docx
@@ -1,6 +1,6 @@
 
 <file path=word/document.xml><?xml version="1.0" encoding="utf-8"?>
-<w:document xmlns:wpc="http://schemas.microsoft.com/office/word/2010/wordprocessingCanvas" xmlns:cx="http://schemas.microsoft.com/office/drawing/2014/chartex" xmlns:cx1="http://schemas.microsoft.com/office/drawing/2015/9/8/chartex" xmlns:cx2="http://schemas.microsoft.com/office/drawing/2015/10/21/chartex" xmlns:cx3="http://schemas.microsoft.com/office/drawing/2016/5/9/chartex" xmlns:cx4="http://schemas.microsoft.com/office/drawing/2016/5/10/chartex" xmlns:cx5="http://schemas.microsoft.com/office/drawing/2016/5/11/chartex" xmlns:cx6="http://schemas.microsoft.com/office/drawing/2016/5/12/chartex" xmlns:cx7="http://schemas.microsoft.com/office/drawing/2016/5/13/chartex" xmlns:cx8="http://schemas.microsoft.com/office/drawing/2016/5/14/chartex" xmlns:mc="http://schemas.openxmlformats.org/markup-compatibility/2006" xmlns:aink="http://schemas.microsoft.com/office/drawing/2016/ink" xmlns:am3d="http://schemas.microsoft.com/office/drawing/2017/model3d" xmlns:o="urn:schemas-microsoft-com:office:office" xmlns:r="http://schemas.openxmlformats.org/officeDocument/2006/relationships" xmlns:m="http://schemas.openxmlformats.org/officeDocument/2006/math" xmlns:v="urn:schemas-microsoft-com:vml" xmlns:wp14="http://schemas.microsoft.com/office/word/2010/wordprocessingDrawing" xmlns:wp="http://schemas.openxmlformats.org/drawingml/2006/wordprocessingDrawing" xmlns:w10="urn:schemas-microsoft-com:office:word" xmlns:w="http://schemas.openxmlformats.org/wordprocessingml/2006/main" xmlns:w14="http://schemas.microsoft.com/office/word/2010/wordml" xmlns:w15="http://schemas.microsoft.com/office/word/2012/wordml" xmlns:w16cid="http://schemas.microsoft.com/office/word/2016/wordml/cid" xmlns:w16se="http://schemas.microsoft.com/office/word/2015/wordml/symex" xmlns:wpg="http://schemas.microsoft.com/office/word/2010/wordprocessingGroup" xmlns:wpi="http://schemas.microsoft.com/office/word/2010/wordprocessingInk" xmlns:wne="http://schemas.microsoft.com/office/word/2006/wordml" xmlns:wps="http://schemas.microsoft.com/office/word/2010/wordprocessingShape" mc:Ignorable="w14 w15 w16se w16cid wp14">
+<w:document xmlns:wpc="http://schemas.microsoft.com/office/word/2010/wordprocessingCanvas" xmlns:cx="http://schemas.microsoft.com/office/drawing/2014/chartex" xmlns:cx1="http://schemas.microsoft.com/office/drawing/2015/9/8/chartex" xmlns:cx2="http://schemas.microsoft.com/office/drawing/2015/10/21/chartex" xmlns:cx3="http://schemas.microsoft.com/office/drawing/2016/5/9/chartex" xmlns:cx4="http://schemas.microsoft.com/office/drawing/2016/5/10/chartex" xmlns:cx5="http://schemas.microsoft.com/office/drawing/2016/5/11/chartex" xmlns:cx6="http://schemas.microsoft.com/office/drawing/2016/5/12/chartex" xmlns:cx7="http://schemas.microsoft.com/office/drawing/2016/5/13/chartex" xmlns:cx8="http://schemas.microsoft.com/office/drawing/2016/5/14/chartex" xmlns:mc="http://schemas.openxmlformats.org/markup-compatibility/2006" xmlns:aink="http://schemas.microsoft.com/office/drawing/2016/ink" xmlns:am3d="http://schemas.microsoft.com/office/drawing/2017/model3d" xmlns:o="urn:schemas-microsoft-com:office:office" xmlns:r="http://schemas.openxmlformats.org/officeDocument/2006/relationships" xmlns:m="http://schemas.openxmlformats.org/officeDocument/2006/math" xmlns:v="urn:schemas-microsoft-com:vml" xmlns:wp14="http://schemas.microsoft.com/office/word/2010/wordprocessingDrawing" xmlns:wp="http://schemas.openxmlformats.org/drawingml/2006/wordprocessingDrawing" xmlns:w10="urn:schemas-microsoft-com:office:word" xmlns:w="http://schemas.openxmlformats.org/wordprocessingml/2006/main" xmlns:w14="http://schemas.microsoft.com/office/word/2010/wordml" xmlns:w15="http://schemas.microsoft.com/office/word/2012/wordml" xmlns:w16cex="http://schemas.microsoft.com/office/word/2018/wordml/cex" xmlns:w16cid="http://schemas.microsoft.com/office/word/2016/wordml/cid" xmlns:w16="http://schemas.microsoft.com/office/word/2018/wordml" xmlns:w16se="http://schemas.microsoft.com/office/word/2015/wordml/symex" xmlns:wpg="http://schemas.microsoft.com/office/word/2010/wordprocessingGroup" xmlns:wpi="http://schemas.microsoft.com/office/word/2010/wordprocessingInk" xmlns:wne="http://schemas.microsoft.com/office/word/2006/wordml" xmlns:wps="http://schemas.microsoft.com/office/word/2010/wordprocessingShape" mc:Ignorable="w14 w15 w16se w16cid w16 w16cex wp14">
   <w:body>
     <w:p>
       <w:pPr>
@@ -259,7 +259,6 @@
         <w:t xml:space="preserve">To be completed for all subcontracts. – Refer to the </w:t>
       </w:r>
       <w:hyperlink r:id="rId12" w:history="1">
-        <w:proofErr w:type="spellStart"/>
         <w:r>
           <w:rPr>
             <w:rStyle w:val="Hyperlink"/>
@@ -269,7 +268,6 @@
           </w:rPr>
           <w:t>genBOE</w:t>
         </w:r>
-        <w:proofErr w:type="spellEnd"/>
       </w:hyperlink>
       <w:r>
         <w:rPr>
@@ -1779,21 +1777,7 @@
               <w:rPr>
                 <w:sz w:val="20"/>
               </w:rPr>
-              <w:t xml:space="preserve"> (</w:t>
-            </w:r>
-            <w:proofErr w:type="spellStart"/>
-            <w:r>
-              <w:rPr>
-                <w:sz w:val="20"/>
-              </w:rPr>
-              <w:t>CCoPD</w:t>
-            </w:r>
-            <w:proofErr w:type="spellEnd"/>
-            <w:r>
-              <w:rPr>
-                <w:sz w:val="20"/>
-              </w:rPr>
-              <w:t>)</w:t>
+              <w:t xml:space="preserve"> (CCoPD)</w:t>
             </w:r>
             <w:r>
               <w:rPr>
@@ -2267,19 +2251,11 @@
               </w:rPr>
               <w:t xml:space="preserve">    </w:t>
             </w:r>
-            <w:proofErr w:type="spellStart"/>
-            <w:r>
-              <w:rPr>
-                <w:sz w:val="20"/>
-              </w:rPr>
-              <w:t>CCoPD</w:t>
-            </w:r>
-            <w:proofErr w:type="spellEnd"/>
-            <w:r>
-              <w:rPr>
-                <w:sz w:val="20"/>
-              </w:rPr>
-              <w:t xml:space="preserve"> applies</w:t>
+            <w:r>
+              <w:rPr>
+                <w:sz w:val="20"/>
+              </w:rPr>
+              <w:t>CCoPD applies</w:t>
             </w:r>
           </w:p>
           <w:p>
@@ -2631,13 +2607,13 @@
               <w:rPr>
                 <w:sz w:val="20"/>
               </w:rPr>
-              <w:t>13</w:t>
-            </w:r>
-            <w:r>
-              <w:rPr>
-                <w:sz w:val="20"/>
-              </w:rPr>
-              <w:t xml:space="preserve">.5M or </w:t>
+              <w:t>1</w:t>
+            </w:r>
+            <w:r>
+              <w:rPr>
+                <w:sz w:val="20"/>
+              </w:rPr>
+              <w:t xml:space="preserve">5M or </w:t>
             </w:r>
             <w:r>
               <w:rPr>
@@ -2646,19 +2622,11 @@
               </w:rPr>
               <w:t>&gt;</w:t>
             </w:r>
-            <w:proofErr w:type="spellStart"/>
-            <w:r>
-              <w:rPr>
-                <w:sz w:val="20"/>
-              </w:rPr>
-              <w:t>CCoPD</w:t>
-            </w:r>
-            <w:proofErr w:type="spellEnd"/>
-            <w:r>
-              <w:rPr>
-                <w:sz w:val="20"/>
-              </w:rPr>
-              <w:t xml:space="preserve"> threshold</w:t>
+            <w:r>
+              <w:rPr>
+                <w:sz w:val="20"/>
+              </w:rPr>
+              <w:t>CCoPD threshold</w:t>
             </w:r>
             <w:r>
               <w:rPr>
@@ -3493,8 +3461,6 @@
             </w:sdt>
           </w:p>
         </w:tc>
-        <w:bookmarkStart w:id="17" w:name="_GoBack"/>
-        <w:bookmarkEnd w:id="17"/>
       </w:tr>
       <w:tr>
         <w:trPr>
@@ -4320,21 +4286,7 @@
               <w:rPr>
                 <w:sz w:val="20"/>
               </w:rPr>
-              <w:t xml:space="preserve">Govt. Pricing Assistance for </w:t>
-            </w:r>
-            <w:proofErr w:type="spellStart"/>
-            <w:r>
-              <w:rPr>
-                <w:sz w:val="20"/>
-              </w:rPr>
-              <w:t>CCoPD</w:t>
-            </w:r>
-            <w:proofErr w:type="spellEnd"/>
-            <w:r>
-              <w:rPr>
-                <w:sz w:val="20"/>
-              </w:rPr>
-              <w:t xml:space="preserve"> Review R</w:t>
+              <w:t>Govt. Pricing Assistance for CCoPD Review R</w:t>
             </w:r>
             <w:r>
               <w:rPr>
@@ -4749,14 +4701,7 @@
               <w:rPr>
                 <w:sz w:val="20"/>
               </w:rPr>
-              <w:t xml:space="preserve">Procurement </w:t>
-            </w:r>
-            <w:proofErr w:type="spellStart"/>
-            <w:r>
-              <w:rPr>
-                <w:sz w:val="20"/>
-              </w:rPr>
-              <w:t>Definitiz</w:t>
+              <w:t>Procurement Definitiz</w:t>
             </w:r>
             <w:r>
               <w:rPr>
@@ -4764,7 +4709,6 @@
               </w:rPr>
               <w:t>ation</w:t>
             </w:r>
-            <w:proofErr w:type="spellEnd"/>
           </w:p>
         </w:tc>
         <w:tc>
@@ -5296,7 +5240,12 @@
     <w:p/>
     <w:p/>
     <w:sectPr>
-      <w:footerReference w:type="default" r:id="rId13"/>
+      <w:headerReference w:type="even" r:id="rId13"/>
+      <w:headerReference w:type="default" r:id="rId14"/>
+      <w:footerReference w:type="even" r:id="rId15"/>
+      <w:footerReference w:type="default" r:id="rId16"/>
+      <w:headerReference w:type="first" r:id="rId17"/>
+      <w:footerReference w:type="first" r:id="rId18"/>
       <w:pgSz w:w="12240" w:h="15840" w:code="1"/>
       <w:pgMar w:top="1080" w:right="1080" w:bottom="1080" w:left="1080" w:header="504" w:footer="504" w:gutter="0"/>
       <w:cols w:space="720"/>
@@ -5308,7 +5257,7 @@
 </file>
 
 <file path=word/endnotes.xml><?xml version="1.0" encoding="utf-8"?>
-<w:endnotes xmlns:wpc="http://schemas.microsoft.com/office/word/2010/wordprocessingCanvas" xmlns:cx="http://schemas.microsoft.com/office/drawing/2014/chartex" xmlns:cx1="http://schemas.microsoft.com/office/drawing/2015/9/8/chartex" xmlns:cx2="http://schemas.microsoft.com/office/drawing/2015/10/21/chartex" xmlns:cx3="http://schemas.microsoft.com/office/drawing/2016/5/9/chartex" xmlns:cx4="http://schemas.microsoft.com/office/drawing/2016/5/10/chartex" xmlns:cx5="http://schemas.microsoft.com/office/drawing/2016/5/11/chartex" xmlns:cx6="http://schemas.microsoft.com/office/drawing/2016/5/12/chartex" xmlns:cx7="http://schemas.microsoft.com/office/drawing/2016/5/13/chartex" xmlns:cx8="http://schemas.microsoft.com/office/drawing/2016/5/14/chartex" xmlns:mc="http://schemas.openxmlformats.org/markup-compatibility/2006" xmlns:aink="http://schemas.microsoft.com/office/drawing/2016/ink" xmlns:am3d="http://schemas.microsoft.com/office/drawing/2017/model3d" xmlns:o="urn:schemas-microsoft-com:office:office" xmlns:r="http://schemas.openxmlformats.org/officeDocument/2006/relationships" xmlns:m="http://schemas.openxmlformats.org/officeDocument/2006/math" xmlns:v="urn:schemas-microsoft-com:vml" xmlns:wp14="http://schemas.microsoft.com/office/word/2010/wordprocessingDrawing" xmlns:wp="http://schemas.openxmlformats.org/drawingml/2006/wordprocessingDrawing" xmlns:w10="urn:schemas-microsoft-com:office:word" xmlns:w="http://schemas.openxmlformats.org/wordprocessingml/2006/main" xmlns:w14="http://schemas.microsoft.com/office/word/2010/wordml" xmlns:w15="http://schemas.microsoft.com/office/word/2012/wordml" xmlns:w16cid="http://schemas.microsoft.com/office/word/2016/wordml/cid" xmlns:w16se="http://schemas.microsoft.com/office/word/2015/wordml/symex" xmlns:wpg="http://schemas.microsoft.com/office/word/2010/wordprocessingGroup" xmlns:wpi="http://schemas.microsoft.com/office/word/2010/wordprocessingInk" xmlns:wne="http://schemas.microsoft.com/office/word/2006/wordml" xmlns:wps="http://schemas.microsoft.com/office/word/2010/wordprocessingShape" mc:Ignorable="w14 w15 w16se w16cid wp14">
+<w:endnotes xmlns:wpc="http://schemas.microsoft.com/office/word/2010/wordprocessingCanvas" xmlns:cx="http://schemas.microsoft.com/office/drawing/2014/chartex" xmlns:cx1="http://schemas.microsoft.com/office/drawing/2015/9/8/chartex" xmlns:cx2="http://schemas.microsoft.com/office/drawing/2015/10/21/chartex" xmlns:cx3="http://schemas.microsoft.com/office/drawing/2016/5/9/chartex" xmlns:cx4="http://schemas.microsoft.com/office/drawing/2016/5/10/chartex" xmlns:cx5="http://schemas.microsoft.com/office/drawing/2016/5/11/chartex" xmlns:cx6="http://schemas.microsoft.com/office/drawing/2016/5/12/chartex" xmlns:cx7="http://schemas.microsoft.com/office/drawing/2016/5/13/chartex" xmlns:cx8="http://schemas.microsoft.com/office/drawing/2016/5/14/chartex" xmlns:mc="http://schemas.openxmlformats.org/markup-compatibility/2006" xmlns:aink="http://schemas.microsoft.com/office/drawing/2016/ink" xmlns:am3d="http://schemas.microsoft.com/office/drawing/2017/model3d" xmlns:o="urn:schemas-microsoft-com:office:office" xmlns:r="http://schemas.openxmlformats.org/officeDocument/2006/relationships" xmlns:m="http://schemas.openxmlformats.org/officeDocument/2006/math" xmlns:v="urn:schemas-microsoft-com:vml" xmlns:wp14="http://schemas.microsoft.com/office/word/2010/wordprocessingDrawing" xmlns:wp="http://schemas.openxmlformats.org/drawingml/2006/wordprocessingDrawing" xmlns:w10="urn:schemas-microsoft-com:office:word" xmlns:w="http://schemas.openxmlformats.org/wordprocessingml/2006/main" xmlns:w14="http://schemas.microsoft.com/office/word/2010/wordml" xmlns:w15="http://schemas.microsoft.com/office/word/2012/wordml" xmlns:w16cex="http://schemas.microsoft.com/office/word/2018/wordml/cex" xmlns:w16cid="http://schemas.microsoft.com/office/word/2016/wordml/cid" xmlns:w16="http://schemas.microsoft.com/office/word/2018/wordml" xmlns:w16se="http://schemas.microsoft.com/office/word/2015/wordml/symex" xmlns:wpg="http://schemas.microsoft.com/office/word/2010/wordprocessingGroup" xmlns:wpi="http://schemas.microsoft.com/office/word/2010/wordprocessingInk" xmlns:wne="http://schemas.microsoft.com/office/word/2006/wordml" xmlns:wps="http://schemas.microsoft.com/office/word/2010/wordprocessingShape" mc:Ignorable="w14 w15 w16se w16cid w16 w16cex wp14">
   <w:endnote w:type="separator" w:id="-1">
     <w:p>
       <w:r>
@@ -5327,7 +5276,17 @@
 </file>
 
 <file path=word/footer1.xml><?xml version="1.0" encoding="utf-8"?>
-<w:ftr xmlns:wpc="http://schemas.microsoft.com/office/word/2010/wordprocessingCanvas" xmlns:cx="http://schemas.microsoft.com/office/drawing/2014/chartex" xmlns:cx1="http://schemas.microsoft.com/office/drawing/2015/9/8/chartex" xmlns:cx2="http://schemas.microsoft.com/office/drawing/2015/10/21/chartex" xmlns:cx3="http://schemas.microsoft.com/office/drawing/2016/5/9/chartex" xmlns:cx4="http://schemas.microsoft.com/office/drawing/2016/5/10/chartex" xmlns:cx5="http://schemas.microsoft.com/office/drawing/2016/5/11/chartex" xmlns:cx6="http://schemas.microsoft.com/office/drawing/2016/5/12/chartex" xmlns:cx7="http://schemas.microsoft.com/office/drawing/2016/5/13/chartex" xmlns:cx8="http://schemas.microsoft.com/office/drawing/2016/5/14/chartex" xmlns:mc="http://schemas.openxmlformats.org/markup-compatibility/2006" xmlns:aink="http://schemas.microsoft.com/office/drawing/2016/ink" xmlns:am3d="http://schemas.microsoft.com/office/drawing/2017/model3d" xmlns:o="urn:schemas-microsoft-com:office:office" xmlns:r="http://schemas.openxmlformats.org/officeDocument/2006/relationships" xmlns:m="http://schemas.openxmlformats.org/officeDocument/2006/math" xmlns:v="urn:schemas-microsoft-com:vml" xmlns:wp14="http://schemas.microsoft.com/office/word/2010/wordprocessingDrawing" xmlns:wp="http://schemas.openxmlformats.org/drawingml/2006/wordprocessingDrawing" xmlns:w10="urn:schemas-microsoft-com:office:word" xmlns:w="http://schemas.openxmlformats.org/wordprocessingml/2006/main" xmlns:w14="http://schemas.microsoft.com/office/word/2010/wordml" xmlns:w15="http://schemas.microsoft.com/office/word/2012/wordml" xmlns:w16cid="http://schemas.microsoft.com/office/word/2016/wordml/cid" xmlns:w16se="http://schemas.microsoft.com/office/word/2015/wordml/symex" xmlns:wpg="http://schemas.microsoft.com/office/word/2010/wordprocessingGroup" xmlns:wpi="http://schemas.microsoft.com/office/word/2010/wordprocessingInk" xmlns:wne="http://schemas.microsoft.com/office/word/2006/wordml" xmlns:wps="http://schemas.microsoft.com/office/word/2010/wordprocessingShape" mc:Ignorable="w14 w15 w16se w16cid wp14">
+<w:ftr xmlns:wpc="http://schemas.microsoft.com/office/word/2010/wordprocessingCanvas" xmlns:cx="http://schemas.microsoft.com/office/drawing/2014/chartex" xmlns:cx1="http://schemas.microsoft.com/office/drawing/2015/9/8/chartex" xmlns:cx2="http://schemas.microsoft.com/office/drawing/2015/10/21/chartex" xmlns:cx3="http://schemas.microsoft.com/office/drawing/2016/5/9/chartex" xmlns:cx4="http://schemas.microsoft.com/office/drawing/2016/5/10/chartex" xmlns:cx5="http://schemas.microsoft.com/office/drawing/2016/5/11/chartex" xmlns:cx6="http://schemas.microsoft.com/office/drawing/2016/5/12/chartex" xmlns:cx7="http://schemas.microsoft.com/office/drawing/2016/5/13/chartex" xmlns:cx8="http://schemas.microsoft.com/office/drawing/2016/5/14/chartex" xmlns:mc="http://schemas.openxmlformats.org/markup-compatibility/2006" xmlns:aink="http://schemas.microsoft.com/office/drawing/2016/ink" xmlns:am3d="http://schemas.microsoft.com/office/drawing/2017/model3d" xmlns:o="urn:schemas-microsoft-com:office:office" xmlns:r="http://schemas.openxmlformats.org/officeDocument/2006/relationships" xmlns:m="http://schemas.openxmlformats.org/officeDocument/2006/math" xmlns:v="urn:schemas-microsoft-com:vml" xmlns:wp14="http://schemas.microsoft.com/office/word/2010/wordprocessingDrawing" xmlns:wp="http://schemas.openxmlformats.org/drawingml/2006/wordprocessingDrawing" xmlns:w10="urn:schemas-microsoft-com:office:word" xmlns:w="http://schemas.openxmlformats.org/wordprocessingml/2006/main" xmlns:w14="http://schemas.microsoft.com/office/word/2010/wordml" xmlns:w15="http://schemas.microsoft.com/office/word/2012/wordml" xmlns:w16cex="http://schemas.microsoft.com/office/word/2018/wordml/cex" xmlns:w16cid="http://schemas.microsoft.com/office/word/2016/wordml/cid" xmlns:w16="http://schemas.microsoft.com/office/word/2018/wordml" xmlns:w16se="http://schemas.microsoft.com/office/word/2015/wordml/symex" xmlns:wpg="http://schemas.microsoft.com/office/word/2010/wordprocessingGroup" xmlns:wpi="http://schemas.microsoft.com/office/word/2010/wordprocessingInk" xmlns:wne="http://schemas.microsoft.com/office/word/2006/wordml" xmlns:wps="http://schemas.microsoft.com/office/word/2010/wordprocessingShape" mc:Ignorable="w14 w15 w16se w16cid w16 w16cex wp14">
+  <w:p>
+    <w:pPr>
+      <w:pStyle w:val="Footer"/>
+    </w:pPr>
+  </w:p>
+</w:ftr>
+</file>
+
+<file path=word/footer2.xml><?xml version="1.0" encoding="utf-8"?>
+<w:ftr xmlns:wpc="http://schemas.microsoft.com/office/word/2010/wordprocessingCanvas" xmlns:cx="http://schemas.microsoft.com/office/drawing/2014/chartex" xmlns:cx1="http://schemas.microsoft.com/office/drawing/2015/9/8/chartex" xmlns:cx2="http://schemas.microsoft.com/office/drawing/2015/10/21/chartex" xmlns:cx3="http://schemas.microsoft.com/office/drawing/2016/5/9/chartex" xmlns:cx4="http://schemas.microsoft.com/office/drawing/2016/5/10/chartex" xmlns:cx5="http://schemas.microsoft.com/office/drawing/2016/5/11/chartex" xmlns:cx6="http://schemas.microsoft.com/office/drawing/2016/5/12/chartex" xmlns:cx7="http://schemas.microsoft.com/office/drawing/2016/5/13/chartex" xmlns:cx8="http://schemas.microsoft.com/office/drawing/2016/5/14/chartex" xmlns:mc="http://schemas.openxmlformats.org/markup-compatibility/2006" xmlns:aink="http://schemas.microsoft.com/office/drawing/2016/ink" xmlns:am3d="http://schemas.microsoft.com/office/drawing/2017/model3d" xmlns:o="urn:schemas-microsoft-com:office:office" xmlns:r="http://schemas.openxmlformats.org/officeDocument/2006/relationships" xmlns:m="http://schemas.openxmlformats.org/officeDocument/2006/math" xmlns:v="urn:schemas-microsoft-com:vml" xmlns:wp14="http://schemas.microsoft.com/office/word/2010/wordprocessingDrawing" xmlns:wp="http://schemas.openxmlformats.org/drawingml/2006/wordprocessingDrawing" xmlns:w10="urn:schemas-microsoft-com:office:word" xmlns:w="http://schemas.openxmlformats.org/wordprocessingml/2006/main" xmlns:w14="http://schemas.microsoft.com/office/word/2010/wordml" xmlns:w15="http://schemas.microsoft.com/office/word/2012/wordml" xmlns:w16cex="http://schemas.microsoft.com/office/word/2018/wordml/cex" xmlns:w16cid="http://schemas.microsoft.com/office/word/2016/wordml/cid" xmlns:w16="http://schemas.microsoft.com/office/word/2018/wordml" xmlns:w16se="http://schemas.microsoft.com/office/word/2015/wordml/symex" xmlns:wpg="http://schemas.microsoft.com/office/word/2010/wordprocessingGroup" xmlns:wpi="http://schemas.microsoft.com/office/word/2010/wordprocessingInk" xmlns:wne="http://schemas.microsoft.com/office/word/2006/wordml" xmlns:wps="http://schemas.microsoft.com/office/word/2010/wordprocessingShape" mc:Ignorable="w14 w15 w16se w16cid w16 w16cex wp14">
   <w:p>
     <w:pPr>
       <w:pStyle w:val="FooterTop"/>
@@ -5343,26 +5302,32 @@
       <w:t xml:space="preserve">evision </w:t>
     </w:r>
     <w:r>
-      <w:t>9</w:t>
+      <w:t>10</w:t>
     </w:r>
     <w:r>
       <w:tab/>
       <w:t xml:space="preserve">Effective:  </w:t>
     </w:r>
     <w:r>
-      <w:t>03</w:t>
+      <w:t>0</w:t>
+    </w:r>
+    <w:r>
+      <w:t>7</w:t>
     </w:r>
     <w:r>
       <w:t>-</w:t>
     </w:r>
     <w:r>
-      <w:t>16</w:t>
+      <w:t>19</w:t>
     </w:r>
     <w:r>
       <w:t>-20</w:t>
     </w:r>
     <w:r>
-      <w:t>20</w:t>
+      <w:t>2</w:t>
+    </w:r>
+    <w:r>
+      <w:t>1</w:t>
     </w:r>
   </w:p>
   <w:p>
@@ -5514,8 +5479,18 @@
 </w:ftr>
 </file>
 
+<file path=word/footer3.xml><?xml version="1.0" encoding="utf-8"?>
+<w:ftr xmlns:wpc="http://schemas.microsoft.com/office/word/2010/wordprocessingCanvas" xmlns:cx="http://schemas.microsoft.com/office/drawing/2014/chartex" xmlns:cx1="http://schemas.microsoft.com/office/drawing/2015/9/8/chartex" xmlns:cx2="http://schemas.microsoft.com/office/drawing/2015/10/21/chartex" xmlns:cx3="http://schemas.microsoft.com/office/drawing/2016/5/9/chartex" xmlns:cx4="http://schemas.microsoft.com/office/drawing/2016/5/10/chartex" xmlns:cx5="http://schemas.microsoft.com/office/drawing/2016/5/11/chartex" xmlns:cx6="http://schemas.microsoft.com/office/drawing/2016/5/12/chartex" xmlns:cx7="http://schemas.microsoft.com/office/drawing/2016/5/13/chartex" xmlns:cx8="http://schemas.microsoft.com/office/drawing/2016/5/14/chartex" xmlns:mc="http://schemas.openxmlformats.org/markup-compatibility/2006" xmlns:aink="http://schemas.microsoft.com/office/drawing/2016/ink" xmlns:am3d="http://schemas.microsoft.com/office/drawing/2017/model3d" xmlns:o="urn:schemas-microsoft-com:office:office" xmlns:r="http://schemas.openxmlformats.org/officeDocument/2006/relationships" xmlns:m="http://schemas.openxmlformats.org/officeDocument/2006/math" xmlns:v="urn:schemas-microsoft-com:vml" xmlns:wp14="http://schemas.microsoft.com/office/word/2010/wordprocessingDrawing" xmlns:wp="http://schemas.openxmlformats.org/drawingml/2006/wordprocessingDrawing" xmlns:w10="urn:schemas-microsoft-com:office:word" xmlns:w="http://schemas.openxmlformats.org/wordprocessingml/2006/main" xmlns:w14="http://schemas.microsoft.com/office/word/2010/wordml" xmlns:w15="http://schemas.microsoft.com/office/word/2012/wordml" xmlns:w16cex="http://schemas.microsoft.com/office/word/2018/wordml/cex" xmlns:w16cid="http://schemas.microsoft.com/office/word/2016/wordml/cid" xmlns:w16="http://schemas.microsoft.com/office/word/2018/wordml" xmlns:w16se="http://schemas.microsoft.com/office/word/2015/wordml/symex" xmlns:wpg="http://schemas.microsoft.com/office/word/2010/wordprocessingGroup" xmlns:wpi="http://schemas.microsoft.com/office/word/2010/wordprocessingInk" xmlns:wne="http://schemas.microsoft.com/office/word/2006/wordml" xmlns:wps="http://schemas.microsoft.com/office/word/2010/wordprocessingShape" mc:Ignorable="w14 w15 w16se w16cid w16 w16cex wp14">
+  <w:p>
+    <w:pPr>
+      <w:pStyle w:val="Footer"/>
+    </w:pPr>
+  </w:p>
+</w:ftr>
+</file>
+
 <file path=word/footnotes.xml><?xml version="1.0" encoding="utf-8"?>
-<w:footnotes xmlns:wpc="http://schemas.microsoft.com/office/word/2010/wordprocessingCanvas" xmlns:cx="http://schemas.microsoft.com/office/drawing/2014/chartex" xmlns:cx1="http://schemas.microsoft.com/office/drawing/2015/9/8/chartex" xmlns:cx2="http://schemas.microsoft.com/office/drawing/2015/10/21/chartex" xmlns:cx3="http://schemas.microsoft.com/office/drawing/2016/5/9/chartex" xmlns:cx4="http://schemas.microsoft.com/office/drawing/2016/5/10/chartex" xmlns:cx5="http://schemas.microsoft.com/office/drawing/2016/5/11/chartex" xmlns:cx6="http://schemas.microsoft.com/office/drawing/2016/5/12/chartex" xmlns:cx7="http://schemas.microsoft.com/office/drawing/2016/5/13/chartex" xmlns:cx8="http://schemas.microsoft.com/office/drawing/2016/5/14/chartex" xmlns:mc="http://schemas.openxmlformats.org/markup-compatibility/2006" xmlns:aink="http://schemas.microsoft.com/office/drawing/2016/ink" xmlns:am3d="http://schemas.microsoft.com/office/drawing/2017/model3d" xmlns:o="urn:schemas-microsoft-com:office:office" xmlns:r="http://schemas.openxmlformats.org/officeDocument/2006/relationships" xmlns:m="http://schemas.openxmlformats.org/officeDocument/2006/math" xmlns:v="urn:schemas-microsoft-com:vml" xmlns:wp14="http://schemas.microsoft.com/office/word/2010/wordprocessingDrawing" xmlns:wp="http://schemas.openxmlformats.org/drawingml/2006/wordprocessingDrawing" xmlns:w10="urn:schemas-microsoft-com:office:word" xmlns:w="http://schemas.openxmlformats.org/wordprocessingml/2006/main" xmlns:w14="http://schemas.microsoft.com/office/word/2010/wordml" xmlns:w15="http://schemas.microsoft.com/office/word/2012/wordml" xmlns:w16cid="http://schemas.microsoft.com/office/word/2016/wordml/cid" xmlns:w16se="http://schemas.microsoft.com/office/word/2015/wordml/symex" xmlns:wpg="http://schemas.microsoft.com/office/word/2010/wordprocessingGroup" xmlns:wpi="http://schemas.microsoft.com/office/word/2010/wordprocessingInk" xmlns:wne="http://schemas.microsoft.com/office/word/2006/wordml" xmlns:wps="http://schemas.microsoft.com/office/word/2010/wordprocessingShape" mc:Ignorable="w14 w15 w16se w16cid wp14">
+<w:footnotes xmlns:wpc="http://schemas.microsoft.com/office/word/2010/wordprocessingCanvas" xmlns:cx="http://schemas.microsoft.com/office/drawing/2014/chartex" xmlns:cx1="http://schemas.microsoft.com/office/drawing/2015/9/8/chartex" xmlns:cx2="http://schemas.microsoft.com/office/drawing/2015/10/21/chartex" xmlns:cx3="http://schemas.microsoft.com/office/drawing/2016/5/9/chartex" xmlns:cx4="http://schemas.microsoft.com/office/drawing/2016/5/10/chartex" xmlns:cx5="http://schemas.microsoft.com/office/drawing/2016/5/11/chartex" xmlns:cx6="http://schemas.microsoft.com/office/drawing/2016/5/12/chartex" xmlns:cx7="http://schemas.microsoft.com/office/drawing/2016/5/13/chartex" xmlns:cx8="http://schemas.microsoft.com/office/drawing/2016/5/14/chartex" xmlns:mc="http://schemas.openxmlformats.org/markup-compatibility/2006" xmlns:aink="http://schemas.microsoft.com/office/drawing/2016/ink" xmlns:am3d="http://schemas.microsoft.com/office/drawing/2017/model3d" xmlns:o="urn:schemas-microsoft-com:office:office" xmlns:r="http://schemas.openxmlformats.org/officeDocument/2006/relationships" xmlns:m="http://schemas.openxmlformats.org/officeDocument/2006/math" xmlns:v="urn:schemas-microsoft-com:vml" xmlns:wp14="http://schemas.microsoft.com/office/word/2010/wordprocessingDrawing" xmlns:wp="http://schemas.openxmlformats.org/drawingml/2006/wordprocessingDrawing" xmlns:w10="urn:schemas-microsoft-com:office:word" xmlns:w="http://schemas.openxmlformats.org/wordprocessingml/2006/main" xmlns:w14="http://schemas.microsoft.com/office/word/2010/wordml" xmlns:w15="http://schemas.microsoft.com/office/word/2012/wordml" xmlns:w16cex="http://schemas.microsoft.com/office/word/2018/wordml/cex" xmlns:w16cid="http://schemas.microsoft.com/office/word/2016/wordml/cid" xmlns:w16="http://schemas.microsoft.com/office/word/2018/wordml" xmlns:w16se="http://schemas.microsoft.com/office/word/2015/wordml/symex" xmlns:wpg="http://schemas.microsoft.com/office/word/2010/wordprocessingGroup" xmlns:wpi="http://schemas.microsoft.com/office/word/2010/wordprocessingInk" xmlns:wne="http://schemas.microsoft.com/office/word/2006/wordml" xmlns:wps="http://schemas.microsoft.com/office/word/2010/wordprocessingShape" mc:Ignorable="w14 w15 w16se w16cid w16 w16cex wp14">
   <w:footnote w:type="separator" w:id="-1">
     <w:p>
       <w:r>
@@ -5533,8 +5508,38 @@
 </w:footnotes>
 </file>
 
+<file path=word/header1.xml><?xml version="1.0" encoding="utf-8"?>
+<w:hdr xmlns:wpc="http://schemas.microsoft.com/office/word/2010/wordprocessingCanvas" xmlns:cx="http://schemas.microsoft.com/office/drawing/2014/chartex" xmlns:cx1="http://schemas.microsoft.com/office/drawing/2015/9/8/chartex" xmlns:cx2="http://schemas.microsoft.com/office/drawing/2015/10/21/chartex" xmlns:cx3="http://schemas.microsoft.com/office/drawing/2016/5/9/chartex" xmlns:cx4="http://schemas.microsoft.com/office/drawing/2016/5/10/chartex" xmlns:cx5="http://schemas.microsoft.com/office/drawing/2016/5/11/chartex" xmlns:cx6="http://schemas.microsoft.com/office/drawing/2016/5/12/chartex" xmlns:cx7="http://schemas.microsoft.com/office/drawing/2016/5/13/chartex" xmlns:cx8="http://schemas.microsoft.com/office/drawing/2016/5/14/chartex" xmlns:mc="http://schemas.openxmlformats.org/markup-compatibility/2006" xmlns:aink="http://schemas.microsoft.com/office/drawing/2016/ink" xmlns:am3d="http://schemas.microsoft.com/office/drawing/2017/model3d" xmlns:o="urn:schemas-microsoft-com:office:office" xmlns:r="http://schemas.openxmlformats.org/officeDocument/2006/relationships" xmlns:m="http://schemas.openxmlformats.org/officeDocument/2006/math" xmlns:v="urn:schemas-microsoft-com:vml" xmlns:wp14="http://schemas.microsoft.com/office/word/2010/wordprocessingDrawing" xmlns:wp="http://schemas.openxmlformats.org/drawingml/2006/wordprocessingDrawing" xmlns:w10="urn:schemas-microsoft-com:office:word" xmlns:w="http://schemas.openxmlformats.org/wordprocessingml/2006/main" xmlns:w14="http://schemas.microsoft.com/office/word/2010/wordml" xmlns:w15="http://schemas.microsoft.com/office/word/2012/wordml" xmlns:w16cex="http://schemas.microsoft.com/office/word/2018/wordml/cex" xmlns:w16cid="http://schemas.microsoft.com/office/word/2016/wordml/cid" xmlns:w16="http://schemas.microsoft.com/office/word/2018/wordml" xmlns:w16se="http://schemas.microsoft.com/office/word/2015/wordml/symex" xmlns:wpg="http://schemas.microsoft.com/office/word/2010/wordprocessingGroup" xmlns:wpi="http://schemas.microsoft.com/office/word/2010/wordprocessingInk" xmlns:wne="http://schemas.microsoft.com/office/word/2006/wordml" xmlns:wps="http://schemas.microsoft.com/office/word/2010/wordprocessingShape" mc:Ignorable="w14 w15 w16se w16cid w16 w16cex wp14">
+  <w:p>
+    <w:pPr>
+      <w:pStyle w:val="Header"/>
+    </w:pPr>
+  </w:p>
+</w:hdr>
+</file>
+
+<file path=word/header2.xml><?xml version="1.0" encoding="utf-8"?>
+<w:hdr xmlns:wpc="http://schemas.microsoft.com/office/word/2010/wordprocessingCanvas" xmlns:cx="http://schemas.microsoft.com/office/drawing/2014/chartex" xmlns:cx1="http://schemas.microsoft.com/office/drawing/2015/9/8/chartex" xmlns:cx2="http://schemas.microsoft.com/office/drawing/2015/10/21/chartex" xmlns:cx3="http://schemas.microsoft.com/office/drawing/2016/5/9/chartex" xmlns:cx4="http://schemas.microsoft.com/office/drawing/2016/5/10/chartex" xmlns:cx5="http://schemas.microsoft.com/office/drawing/2016/5/11/chartex" xmlns:cx6="http://schemas.microsoft.com/office/drawing/2016/5/12/chartex" xmlns:cx7="http://schemas.microsoft.com/office/drawing/2016/5/13/chartex" xmlns:cx8="http://schemas.microsoft.com/office/drawing/2016/5/14/chartex" xmlns:mc="http://schemas.openxmlformats.org/markup-compatibility/2006" xmlns:aink="http://schemas.microsoft.com/office/drawing/2016/ink" xmlns:am3d="http://schemas.microsoft.com/office/drawing/2017/model3d" xmlns:o="urn:schemas-microsoft-com:office:office" xmlns:r="http://schemas.openxmlformats.org/officeDocument/2006/relationships" xmlns:m="http://schemas.openxmlformats.org/officeDocument/2006/math" xmlns:v="urn:schemas-microsoft-com:vml" xmlns:wp14="http://schemas.microsoft.com/office/word/2010/wordprocessingDrawing" xmlns:wp="http://schemas.openxmlformats.org/drawingml/2006/wordprocessingDrawing" xmlns:w10="urn:schemas-microsoft-com:office:word" xmlns:w="http://schemas.openxmlformats.org/wordprocessingml/2006/main" xmlns:w14="http://schemas.microsoft.com/office/word/2010/wordml" xmlns:w15="http://schemas.microsoft.com/office/word/2012/wordml" xmlns:w16cex="http://schemas.microsoft.com/office/word/2018/wordml/cex" xmlns:w16cid="http://schemas.microsoft.com/office/word/2016/wordml/cid" xmlns:w16="http://schemas.microsoft.com/office/word/2018/wordml" xmlns:w16se="http://schemas.microsoft.com/office/word/2015/wordml/symex" xmlns:wpg="http://schemas.microsoft.com/office/word/2010/wordprocessingGroup" xmlns:wpi="http://schemas.microsoft.com/office/word/2010/wordprocessingInk" xmlns:wne="http://schemas.microsoft.com/office/word/2006/wordml" xmlns:wps="http://schemas.microsoft.com/office/word/2010/wordprocessingShape" mc:Ignorable="w14 w15 w16se w16cid w16 w16cex wp14">
+  <w:p>
+    <w:pPr>
+      <w:pStyle w:val="Header"/>
+    </w:pPr>
+  </w:p>
+</w:hdr>
+</file>
+
+<file path=word/header3.xml><?xml version="1.0" encoding="utf-8"?>
+<w:hdr xmlns:wpc="http://schemas.microsoft.com/office/word/2010/wordprocessingCanvas" xmlns:cx="http://schemas.microsoft.com/office/drawing/2014/chartex" xmlns:cx1="http://schemas.microsoft.com/office/drawing/2015/9/8/chartex" xmlns:cx2="http://schemas.microsoft.com/office/drawing/2015/10/21/chartex" xmlns:cx3="http://schemas.microsoft.com/office/drawing/2016/5/9/chartex" xmlns:cx4="http://schemas.microsoft.com/office/drawing/2016/5/10/chartex" xmlns:cx5="http://schemas.microsoft.com/office/drawing/2016/5/11/chartex" xmlns:cx6="http://schemas.microsoft.com/office/drawing/2016/5/12/chartex" xmlns:cx7="http://schemas.microsoft.com/office/drawing/2016/5/13/chartex" xmlns:cx8="http://schemas.microsoft.com/office/drawing/2016/5/14/chartex" xmlns:mc="http://schemas.openxmlformats.org/markup-compatibility/2006" xmlns:aink="http://schemas.microsoft.com/office/drawing/2016/ink" xmlns:am3d="http://schemas.microsoft.com/office/drawing/2017/model3d" xmlns:o="urn:schemas-microsoft-com:office:office" xmlns:r="http://schemas.openxmlformats.org/officeDocument/2006/relationships" xmlns:m="http://schemas.openxmlformats.org/officeDocument/2006/math" xmlns:v="urn:schemas-microsoft-com:vml" xmlns:wp14="http://schemas.microsoft.com/office/word/2010/wordprocessingDrawing" xmlns:wp="http://schemas.openxmlformats.org/drawingml/2006/wordprocessingDrawing" xmlns:w10="urn:schemas-microsoft-com:office:word" xmlns:w="http://schemas.openxmlformats.org/wordprocessingml/2006/main" xmlns:w14="http://schemas.microsoft.com/office/word/2010/wordml" xmlns:w15="http://schemas.microsoft.com/office/word/2012/wordml" xmlns:w16cex="http://schemas.microsoft.com/office/word/2018/wordml/cex" xmlns:w16cid="http://schemas.microsoft.com/office/word/2016/wordml/cid" xmlns:w16="http://schemas.microsoft.com/office/word/2018/wordml" xmlns:w16se="http://schemas.microsoft.com/office/word/2015/wordml/symex" xmlns:wpg="http://schemas.microsoft.com/office/word/2010/wordprocessingGroup" xmlns:wpi="http://schemas.microsoft.com/office/word/2010/wordprocessingInk" xmlns:wne="http://schemas.microsoft.com/office/word/2006/wordml" xmlns:wps="http://schemas.microsoft.com/office/word/2010/wordprocessingShape" mc:Ignorable="w14 w15 w16se w16cid w16 w16cex wp14">
+  <w:p>
+    <w:pPr>
+      <w:pStyle w:val="Header"/>
+    </w:pPr>
+  </w:p>
+</w:hdr>
+</file>
+
 <file path=word/numbering.xml><?xml version="1.0" encoding="utf-8"?>
-<w:numbering xmlns:wpc="http://schemas.microsoft.com/office/word/2010/wordprocessingCanvas" xmlns:cx="http://schemas.microsoft.com/office/drawing/2014/chartex" xmlns:cx1="http://schemas.microsoft.com/office/drawing/2015/9/8/chartex" xmlns:cx2="http://schemas.microsoft.com/office/drawing/2015/10/21/chartex" xmlns:cx3="http://schemas.microsoft.com/office/drawing/2016/5/9/chartex" xmlns:cx4="http://schemas.microsoft.com/office/drawing/2016/5/10/chartex" xmlns:cx5="http://schemas.microsoft.com/office/drawing/2016/5/11/chartex" xmlns:cx6="http://schemas.microsoft.com/office/drawing/2016/5/12/chartex" xmlns:cx7="http://schemas.microsoft.com/office/drawing/2016/5/13/chartex" xmlns:cx8="http://schemas.microsoft.com/office/drawing/2016/5/14/chartex" xmlns:mc="http://schemas.openxmlformats.org/markup-compatibility/2006" xmlns:aink="http://schemas.microsoft.com/office/drawing/2016/ink" xmlns:am3d="http://schemas.microsoft.com/office/drawing/2017/model3d" xmlns:o="urn:schemas-microsoft-com:office:office" xmlns:r="http://schemas.openxmlformats.org/officeDocument/2006/relationships" xmlns:m="http://schemas.openxmlformats.org/officeDocument/2006/math" xmlns:v="urn:schemas-microsoft-com:vml" xmlns:wp14="http://schemas.microsoft.com/office/word/2010/wordprocessingDrawing" xmlns:wp="http://schemas.openxmlformats.org/drawingml/2006/wordprocessingDrawing" xmlns:w10="urn:schemas-microsoft-com:office:word" xmlns:w="http://schemas.openxmlformats.org/wordprocessingml/2006/main" xmlns:w14="http://schemas.microsoft.com/office/word/2010/wordml" xmlns:w15="http://schemas.microsoft.com/office/word/2012/wordml" xmlns:w16cid="http://schemas.microsoft.com/office/word/2016/wordml/cid" xmlns:w16se="http://schemas.microsoft.com/office/word/2015/wordml/symex" xmlns:wpg="http://schemas.microsoft.com/office/word/2010/wordprocessingGroup" xmlns:wpi="http://schemas.microsoft.com/office/word/2010/wordprocessingInk" xmlns:wne="http://schemas.microsoft.com/office/word/2006/wordml" xmlns:wps="http://schemas.microsoft.com/office/word/2010/wordprocessingShape" mc:Ignorable="w14 w15 w16se w16cid wp14">
+<w:numbering xmlns:wpc="http://schemas.microsoft.com/office/word/2010/wordprocessingCanvas" xmlns:cx="http://schemas.microsoft.com/office/drawing/2014/chartex" xmlns:cx1="http://schemas.microsoft.com/office/drawing/2015/9/8/chartex" xmlns:cx2="http://schemas.microsoft.com/office/drawing/2015/10/21/chartex" xmlns:cx3="http://schemas.microsoft.com/office/drawing/2016/5/9/chartex" xmlns:cx4="http://schemas.microsoft.com/office/drawing/2016/5/10/chartex" xmlns:cx5="http://schemas.microsoft.com/office/drawing/2016/5/11/chartex" xmlns:cx6="http://schemas.microsoft.com/office/drawing/2016/5/12/chartex" xmlns:cx7="http://schemas.microsoft.com/office/drawing/2016/5/13/chartex" xmlns:cx8="http://schemas.microsoft.com/office/drawing/2016/5/14/chartex" xmlns:mc="http://schemas.openxmlformats.org/markup-compatibility/2006" xmlns:aink="http://schemas.microsoft.com/office/drawing/2016/ink" xmlns:am3d="http://schemas.microsoft.com/office/drawing/2017/model3d" xmlns:o="urn:schemas-microsoft-com:office:office" xmlns:r="http://schemas.openxmlformats.org/officeDocument/2006/relationships" xmlns:m="http://schemas.openxmlformats.org/officeDocument/2006/math" xmlns:v="urn:schemas-microsoft-com:vml" xmlns:wp14="http://schemas.microsoft.com/office/word/2010/wordprocessingDrawing" xmlns:wp="http://schemas.openxmlformats.org/drawingml/2006/wordprocessingDrawing" xmlns:w10="urn:schemas-microsoft-com:office:word" xmlns:w="http://schemas.openxmlformats.org/wordprocessingml/2006/main" xmlns:w14="http://schemas.microsoft.com/office/word/2010/wordml" xmlns:w15="http://schemas.microsoft.com/office/word/2012/wordml" xmlns:w16cex="http://schemas.microsoft.com/office/word/2018/wordml/cex" xmlns:w16cid="http://schemas.microsoft.com/office/word/2016/wordml/cid" xmlns:w16="http://schemas.microsoft.com/office/word/2018/wordml" xmlns:w16se="http://schemas.microsoft.com/office/word/2015/wordml/symex" xmlns:wpg="http://schemas.microsoft.com/office/word/2010/wordprocessingGroup" xmlns:wpi="http://schemas.microsoft.com/office/word/2010/wordprocessingInk" xmlns:wne="http://schemas.microsoft.com/office/word/2006/wordml" xmlns:wps="http://schemas.microsoft.com/office/word/2010/wordprocessingShape" mc:Ignorable="w14 w15 w16se w16cid w16 w16cex wp14">
   <w:abstractNum w:abstractNumId="0" w15:restartNumberingAfterBreak="0">
     <w:nsid w:val="FFFFFF7C"/>
     <w:multiLevelType w:val="singleLevel"/>
@@ -6337,7 +6342,7 @@
 </file>
 
 <file path=word/styles.xml><?xml version="1.0" encoding="utf-8"?>
-<w:styles xmlns:mc="http://schemas.openxmlformats.org/markup-compatibility/2006" xmlns:r="http://schemas.openxmlformats.org/officeDocument/2006/relationships" xmlns:w="http://schemas.openxmlformats.org/wordprocessingml/2006/main" xmlns:w14="http://schemas.microsoft.com/office/word/2010/wordml" xmlns:w15="http://schemas.microsoft.com/office/word/2012/wordml" xmlns:w16cid="http://schemas.microsoft.com/office/word/2016/wordml/cid" xmlns:w16se="http://schemas.microsoft.com/office/word/2015/wordml/symex" mc:Ignorable="w14 w15 w16se w16cid">
+<w:styles xmlns:mc="http://schemas.openxmlformats.org/markup-compatibility/2006" xmlns:r="http://schemas.openxmlformats.org/officeDocument/2006/relationships" xmlns:w="http://schemas.openxmlformats.org/wordprocessingml/2006/main" xmlns:w14="http://schemas.microsoft.com/office/word/2010/wordml" xmlns:w15="http://schemas.microsoft.com/office/word/2012/wordml" xmlns:w16cex="http://schemas.microsoft.com/office/word/2018/wordml/cex" xmlns:w16cid="http://schemas.microsoft.com/office/word/2016/wordml/cid" xmlns:w16="http://schemas.microsoft.com/office/word/2018/wordml" xmlns:w16se="http://schemas.microsoft.com/office/word/2015/wordml/symex" mc:Ignorable="w14 w15 w16se w16cid w16 w16cex">
   <w:docDefaults>
     <w:rPrDefault>
       <w:rPr>
@@ -6347,7 +6352,7 @@
     </w:rPrDefault>
     <w:pPrDefault/>
   </w:docDefaults>
-  <w:latentStyles w:defLockedState="0" w:defUIPriority="0" w:defSemiHidden="0" w:defUnhideWhenUsed="0" w:defQFormat="0" w:count="377">
+  <w:latentStyles w:defLockedState="0" w:defUIPriority="0" w:defSemiHidden="0" w:defUnhideWhenUsed="0" w:defQFormat="0" w:count="376">
     <w:lsdException w:name="Normal" w:qFormat="1"/>
     <w:lsdException w:name="heading 1" w:qFormat="1"/>
     <w:lsdException w:name="heading 2" w:qFormat="1"/>
@@ -6447,6 +6452,7 @@
     <w:lsdException w:name="HTML Sample" w:semiHidden="1" w:unhideWhenUsed="1"/>
     <w:lsdException w:name="HTML Typewriter" w:semiHidden="1" w:unhideWhenUsed="1"/>
     <w:lsdException w:name="HTML Variable" w:semiHidden="1" w:unhideWhenUsed="1"/>
+    <w:lsdException w:name="Normal Table" w:semiHidden="1" w:unhideWhenUsed="1"/>
     <w:lsdException w:name="annotation subject" w:semiHidden="1" w:unhideWhenUsed="1"/>
     <w:lsdException w:name="No List" w:semiHidden="1" w:unhideWhenUsed="1"/>
     <w:lsdException w:name="Outline List 1" w:semiHidden="1" w:unhideWhenUsed="1"/>
@@ -6492,8 +6498,10 @@
     <w:lsdException w:name="Table Subtle 1" w:semiHidden="1" w:unhideWhenUsed="1"/>
     <w:lsdException w:name="Table Subtle 2" w:semiHidden="1" w:unhideWhenUsed="1"/>
     <w:lsdException w:name="Table Web 1" w:semiHidden="1" w:unhideWhenUsed="1"/>
+    <w:lsdException w:name="Table Web 2" w:semiHidden="1" w:unhideWhenUsed="1"/>
     <w:lsdException w:name="Table Web 3" w:semiHidden="1" w:unhideWhenUsed="1"/>
     <w:lsdException w:name="Balloon Text" w:semiHidden="1" w:unhideWhenUsed="1"/>
+    <w:lsdException w:name="Table Theme" w:semiHidden="1" w:unhideWhenUsed="1"/>
     <w:lsdException w:name="Placeholder Text" w:semiHidden="1" w:uiPriority="99"/>
     <w:lsdException w:name="No Spacing" w:uiPriority="1" w:qFormat="1"/>
     <w:lsdException w:name="Light Shading" w:uiPriority="60"/>
@@ -6714,7 +6722,6 @@
     <w:lsdException w:name="Hashtag" w:semiHidden="1" w:uiPriority="99" w:unhideWhenUsed="1"/>
     <w:lsdException w:name="Unresolved Mention" w:semiHidden="1" w:uiPriority="99" w:unhideWhenUsed="1"/>
     <w:lsdException w:name="Smart Link" w:semiHidden="1" w:uiPriority="99" w:unhideWhenUsed="1"/>
-    <w:lsdException w:name="Smart Link Error" w:semiHidden="1" w:uiPriority="99" w:unhideWhenUsed="1"/>
   </w:latentStyles>
   <w:style w:type="paragraph" w:default="1" w:styleId="Normal">
     <w:name w:val="Normal"/>
@@ -6879,6 +6886,7 @@
   <w:style w:type="character" w:default="1" w:styleId="DefaultParagraphFont">
     <w:name w:val="Default Paragraph Font"/>
     <w:uiPriority w:val="1"/>
+    <w:semiHidden/>
     <w:unhideWhenUsed/>
   </w:style>
   <w:style w:type="table" w:default="1" w:styleId="TableNormal">
@@ -7896,7 +7904,7 @@
 </file>
 
 <file path=word/glossary/document.xml><?xml version="1.0" encoding="utf-8"?>
-<w:glossaryDocument xmlns:wpc="http://schemas.microsoft.com/office/word/2010/wordprocessingCanvas" xmlns:cx="http://schemas.microsoft.com/office/drawing/2014/chartex" xmlns:cx1="http://schemas.microsoft.com/office/drawing/2015/9/8/chartex" xmlns:cx2="http://schemas.microsoft.com/office/drawing/2015/10/21/chartex" xmlns:cx3="http://schemas.microsoft.com/office/drawing/2016/5/9/chartex" xmlns:cx4="http://schemas.microsoft.com/office/drawing/2016/5/10/chartex" xmlns:cx5="http://schemas.microsoft.com/office/drawing/2016/5/11/chartex" xmlns:cx6="http://schemas.microsoft.com/office/drawing/2016/5/12/chartex" xmlns:cx7="http://schemas.microsoft.com/office/drawing/2016/5/13/chartex" xmlns:cx8="http://schemas.microsoft.com/office/drawing/2016/5/14/chartex" xmlns:mc="http://schemas.openxmlformats.org/markup-compatibility/2006" xmlns:aink="http://schemas.microsoft.com/office/drawing/2016/ink" xmlns:am3d="http://schemas.microsoft.com/office/drawing/2017/model3d" xmlns:o="urn:schemas-microsoft-com:office:office" xmlns:r="http://schemas.openxmlformats.org/officeDocument/2006/relationships" xmlns:m="http://schemas.openxmlformats.org/officeDocument/2006/math" xmlns:v="urn:schemas-microsoft-com:vml" xmlns:wp14="http://schemas.microsoft.com/office/word/2010/wordprocessingDrawing" xmlns:wp="http://schemas.openxmlformats.org/drawingml/2006/wordprocessingDrawing" xmlns:w10="urn:schemas-microsoft-com:office:word" xmlns:w="http://schemas.openxmlformats.org/wordprocessingml/2006/main" xmlns:w14="http://schemas.microsoft.com/office/word/2010/wordml" xmlns:w15="http://schemas.microsoft.com/office/word/2012/wordml" xmlns:w16cid="http://schemas.microsoft.com/office/word/2016/wordml/cid" xmlns:w16se="http://schemas.microsoft.com/office/word/2015/wordml/symex" xmlns:wpg="http://schemas.microsoft.com/office/word/2010/wordprocessingGroup" xmlns:wpi="http://schemas.microsoft.com/office/word/2010/wordprocessingInk" xmlns:wne="http://schemas.microsoft.com/office/word/2006/wordml" xmlns:wps="http://schemas.microsoft.com/office/word/2010/wordprocessingShape" mc:Ignorable="w14 w15 w16se w16cid wp14">
+<w:glossaryDocument xmlns:wpc="http://schemas.microsoft.com/office/word/2010/wordprocessingCanvas" xmlns:cx="http://schemas.microsoft.com/office/drawing/2014/chartex" xmlns:cx1="http://schemas.microsoft.com/office/drawing/2015/9/8/chartex" xmlns:cx2="http://schemas.microsoft.com/office/drawing/2015/10/21/chartex" xmlns:cx3="http://schemas.microsoft.com/office/drawing/2016/5/9/chartex" xmlns:cx4="http://schemas.microsoft.com/office/drawing/2016/5/10/chartex" xmlns:cx5="http://schemas.microsoft.com/office/drawing/2016/5/11/chartex" xmlns:cx6="http://schemas.microsoft.com/office/drawing/2016/5/12/chartex" xmlns:cx7="http://schemas.microsoft.com/office/drawing/2016/5/13/chartex" xmlns:cx8="http://schemas.microsoft.com/office/drawing/2016/5/14/chartex" xmlns:mc="http://schemas.openxmlformats.org/markup-compatibility/2006" xmlns:aink="http://schemas.microsoft.com/office/drawing/2016/ink" xmlns:am3d="http://schemas.microsoft.com/office/drawing/2017/model3d" xmlns:o="urn:schemas-microsoft-com:office:office" xmlns:r="http://schemas.openxmlformats.org/officeDocument/2006/relationships" xmlns:m="http://schemas.openxmlformats.org/officeDocument/2006/math" xmlns:v="urn:schemas-microsoft-com:vml" xmlns:wp14="http://schemas.microsoft.com/office/word/2010/wordprocessingDrawing" xmlns:wp="http://schemas.openxmlformats.org/drawingml/2006/wordprocessingDrawing" xmlns:w10="urn:schemas-microsoft-com:office:word" xmlns:w="http://schemas.openxmlformats.org/wordprocessingml/2006/main" xmlns:w14="http://schemas.microsoft.com/office/word/2010/wordml" xmlns:w15="http://schemas.microsoft.com/office/word/2012/wordml" xmlns:w16cex="http://schemas.microsoft.com/office/word/2018/wordml/cex" xmlns:w16cid="http://schemas.microsoft.com/office/word/2016/wordml/cid" xmlns:w16="http://schemas.microsoft.com/office/word/2018/wordml" xmlns:w16se="http://schemas.microsoft.com/office/word/2015/wordml/symex" xmlns:wpg="http://schemas.microsoft.com/office/word/2010/wordprocessingGroup" xmlns:wpi="http://schemas.microsoft.com/office/word/2010/wordprocessingInk" xmlns:wne="http://schemas.microsoft.com/office/word/2006/wordml" xmlns:wps="http://schemas.microsoft.com/office/word/2010/wordprocessingShape" mc:Ignorable="w14 w15 w16se w16cid w16 w16cex wp14">
   <w:docParts>
     <w:docPart>
       <w:docPartPr>
@@ -9207,7 +9215,7 @@
 </file>
 
 <file path=word/glossary/fontTable.xml><?xml version="1.0" encoding="utf-8"?>
-<w:fonts xmlns:mc="http://schemas.openxmlformats.org/markup-compatibility/2006" xmlns:r="http://schemas.openxmlformats.org/officeDocument/2006/relationships" xmlns:w="http://schemas.openxmlformats.org/wordprocessingml/2006/main" xmlns:w14="http://schemas.microsoft.com/office/word/2010/wordml" xmlns:w15="http://schemas.microsoft.com/office/word/2012/wordml" xmlns:w16cid="http://schemas.microsoft.com/office/word/2016/wordml/cid" xmlns:w16se="http://schemas.microsoft.com/office/word/2015/wordml/symex" mc:Ignorable="w14 w15 w16se w16cid">
+<w:fonts xmlns:mc="http://schemas.openxmlformats.org/markup-compatibility/2006" xmlns:r="http://schemas.openxmlformats.org/officeDocument/2006/relationships" xmlns:w="http://schemas.openxmlformats.org/wordprocessingml/2006/main" xmlns:w14="http://schemas.microsoft.com/office/word/2010/wordml" xmlns:w15="http://schemas.microsoft.com/office/word/2012/wordml" xmlns:w16cex="http://schemas.microsoft.com/office/word/2018/wordml/cex" xmlns:w16cid="http://schemas.microsoft.com/office/word/2016/wordml/cid" xmlns:w16="http://schemas.microsoft.com/office/word/2018/wordml" xmlns:w16se="http://schemas.microsoft.com/office/word/2015/wordml/symex" mc:Ignorable="w14 w15 w16se w16cid w16 w16cex">
   <w:font w:name="Symbol">
     <w:panose1 w:val="05050102010706020507"/>
     <w:charset w:val="02"/>
@@ -9251,7 +9259,7 @@
     <w:sig w:usb0="E1002EFF" w:usb1="C000605B" w:usb2="00000029" w:usb3="00000000" w:csb0="000101FF" w:csb1="00000000"/>
   </w:font>
   <w:font w:name="MS Mincho">
-    <w:altName w:val="MS Mincho"/>
+    <w:altName w:val="ＭＳ 明朝"/>
     <w:panose1 w:val="02020609040205080304"/>
     <w:charset w:val="80"/>
     <w:family w:val="modern"/>
@@ -9270,20 +9278,20 @@
     <w:charset w:val="00"/>
     <w:family w:val="swiss"/>
     <w:pitch w:val="variable"/>
-    <w:sig w:usb0="E0002EFF" w:usb1="C000247B" w:usb2="00000009" w:usb3="00000000" w:csb0="000001FF" w:csb1="00000000"/>
+    <w:sig w:usb0="E4002EFF" w:usb1="C000247B" w:usb2="00000009" w:usb3="00000000" w:csb0="000001FF" w:csb1="00000000"/>
   </w:font>
   <w:font w:name="Calibri Light">
     <w:panose1 w:val="020F0302020204030204"/>
     <w:charset w:val="00"/>
     <w:family w:val="swiss"/>
     <w:pitch w:val="variable"/>
-    <w:sig w:usb0="E0002AFF" w:usb1="C000247B" w:usb2="00000009" w:usb3="00000000" w:csb0="000001FF" w:csb1="00000000"/>
+    <w:sig w:usb0="E4002EFF" w:usb1="C000247B" w:usb2="00000009" w:usb3="00000000" w:csb0="000001FF" w:csb1="00000000"/>
   </w:font>
 </w:fonts>
 </file>
 
 <file path=word/glossary/settings.xml><?xml version="1.0" encoding="utf-8"?>
-<w:settings xmlns:mc="http://schemas.openxmlformats.org/markup-compatibility/2006" xmlns:o="urn:schemas-microsoft-com:office:office" xmlns:r="http://schemas.openxmlformats.org/officeDocument/2006/relationships" xmlns:m="http://schemas.openxmlformats.org/officeDocument/2006/math" xmlns:v="urn:schemas-microsoft-com:vml" xmlns:w10="urn:schemas-microsoft-com:office:word" xmlns:w="http://schemas.openxmlformats.org/wordprocessingml/2006/main" xmlns:w14="http://schemas.microsoft.com/office/word/2010/wordml" xmlns:w15="http://schemas.microsoft.com/office/word/2012/wordml" xmlns:w16cid="http://schemas.microsoft.com/office/word/2016/wordml/cid" xmlns:w16se="http://schemas.microsoft.com/office/word/2015/wordml/symex" xmlns:sl="http://schemas.openxmlformats.org/schemaLibrary/2006/main" mc:Ignorable="w14 w15 w16se w16cid">
+<w:settings xmlns:mc="http://schemas.openxmlformats.org/markup-compatibility/2006" xmlns:o="urn:schemas-microsoft-com:office:office" xmlns:r="http://schemas.openxmlformats.org/officeDocument/2006/relationships" xmlns:m="http://schemas.openxmlformats.org/officeDocument/2006/math" xmlns:v="urn:schemas-microsoft-com:vml" xmlns:w10="urn:schemas-microsoft-com:office:word" xmlns:w="http://schemas.openxmlformats.org/wordprocessingml/2006/main" xmlns:w14="http://schemas.microsoft.com/office/word/2010/wordml" xmlns:w15="http://schemas.microsoft.com/office/word/2012/wordml" xmlns:w16cex="http://schemas.microsoft.com/office/word/2018/wordml/cex" xmlns:w16cid="http://schemas.microsoft.com/office/word/2016/wordml/cid" xmlns:w16="http://schemas.microsoft.com/office/word/2018/wordml" xmlns:w16se="http://schemas.microsoft.com/office/word/2015/wordml/symex" xmlns:sl="http://schemas.openxmlformats.org/schemaLibrary/2006/main" mc:Ignorable="w14 w15 w16se w16cid w16 w16cex">
   <w:view w:val="normal"/>
   <w:defaultTabStop w:val="720"/>
   <w:characterSpacingControl w:val="doNotCompress"/>
@@ -9320,6 +9328,7 @@
     <w:rsid w:val="0080343E"/>
     <w:rsid w:val="00810A8C"/>
     <w:rsid w:val="00813280"/>
+    <w:rsid w:val="008402C5"/>
     <w:rsid w:val="00841BE2"/>
     <w:rsid w:val="00883763"/>
     <w:rsid w:val="008952A6"/>
@@ -9338,6 +9347,7 @@
     <w:rsid w:val="00BA6CA4"/>
     <w:rsid w:val="00BD739D"/>
     <w:rsid w:val="00C1691B"/>
+    <w:rsid w:val="00C22EC5"/>
     <w:rsid w:val="00C75714"/>
     <w:rsid w:val="00CA2B27"/>
     <w:rsid w:val="00CA4852"/>
@@ -9377,7 +9387,7 @@
 </file>
 
 <file path=word/glossary/styles.xml><?xml version="1.0" encoding="utf-8"?>
-<w:styles xmlns:mc="http://schemas.openxmlformats.org/markup-compatibility/2006" xmlns:r="http://schemas.openxmlformats.org/officeDocument/2006/relationships" xmlns:w="http://schemas.openxmlformats.org/wordprocessingml/2006/main" xmlns:w14="http://schemas.microsoft.com/office/word/2010/wordml" xmlns:w15="http://schemas.microsoft.com/office/word/2012/wordml" xmlns:w16cid="http://schemas.microsoft.com/office/word/2016/wordml/cid" xmlns:w16se="http://schemas.microsoft.com/office/word/2015/wordml/symex" mc:Ignorable="w14 w15 w16se w16cid">
+<w:styles xmlns:mc="http://schemas.openxmlformats.org/markup-compatibility/2006" xmlns:r="http://schemas.openxmlformats.org/officeDocument/2006/relationships" xmlns:w="http://schemas.openxmlformats.org/wordprocessingml/2006/main" xmlns:w14="http://schemas.microsoft.com/office/word/2010/wordml" xmlns:w15="http://schemas.microsoft.com/office/word/2012/wordml" xmlns:w16cex="http://schemas.microsoft.com/office/word/2018/wordml/cex" xmlns:w16cid="http://schemas.microsoft.com/office/word/2016/wordml/cid" xmlns:w16="http://schemas.microsoft.com/office/word/2018/wordml" xmlns:w16se="http://schemas.microsoft.com/office/word/2015/wordml/symex" mc:Ignorable="w14 w15 w16se w16cid w16 w16cex">
   <w:docDefaults>
     <w:rPrDefault>
       <w:rPr>
@@ -9393,7 +9403,7 @@
       </w:pPr>
     </w:pPrDefault>
   </w:docDefaults>
-  <w:latentStyles w:defLockedState="0" w:defUIPriority="99" w:defSemiHidden="0" w:defUnhideWhenUsed="0" w:defQFormat="0" w:count="377">
+  <w:latentStyles w:defLockedState="0" w:defUIPriority="99" w:defSemiHidden="0" w:defUnhideWhenUsed="0" w:defQFormat="0" w:count="376">
     <w:lsdException w:name="Normal" w:uiPriority="0" w:qFormat="1"/>
     <w:lsdException w:name="heading 1" w:uiPriority="9" w:qFormat="1"/>
     <w:lsdException w:name="heading 2" w:semiHidden="1" w:uiPriority="9" w:unhideWhenUsed="1" w:qFormat="1"/>
@@ -9499,6 +9509,7 @@
     <w:lsdException w:name="HTML Sample" w:semiHidden="1" w:unhideWhenUsed="1"/>
     <w:lsdException w:name="HTML Typewriter" w:semiHidden="1" w:unhideWhenUsed="1"/>
     <w:lsdException w:name="HTML Variable" w:semiHidden="1" w:unhideWhenUsed="1"/>
+    <w:lsdException w:name="Normal Table" w:semiHidden="1" w:unhideWhenUsed="1"/>
     <w:lsdException w:name="annotation subject" w:semiHidden="1" w:unhideWhenUsed="1"/>
     <w:lsdException w:name="No List" w:semiHidden="1" w:unhideWhenUsed="1"/>
     <w:lsdException w:name="Outline List 1" w:semiHidden="1" w:unhideWhenUsed="1"/>
@@ -9544,9 +9555,11 @@
     <w:lsdException w:name="Table Subtle 1" w:semiHidden="1" w:unhideWhenUsed="1"/>
     <w:lsdException w:name="Table Subtle 2" w:semiHidden="1" w:unhideWhenUsed="1"/>
     <w:lsdException w:name="Table Web 1" w:semiHidden="1" w:unhideWhenUsed="1"/>
+    <w:lsdException w:name="Table Web 2" w:semiHidden="1" w:unhideWhenUsed="1"/>
     <w:lsdException w:name="Table Web 3" w:semiHidden="1" w:unhideWhenUsed="1"/>
     <w:lsdException w:name="Balloon Text" w:semiHidden="1" w:unhideWhenUsed="1"/>
     <w:lsdException w:name="Table Grid" w:uiPriority="39"/>
+    <w:lsdException w:name="Table Theme" w:semiHidden="1" w:unhideWhenUsed="1"/>
     <w:lsdException w:name="Placeholder Text" w:semiHidden="1"/>
     <w:lsdException w:name="No Spacing" w:uiPriority="1" w:qFormat="1"/>
     <w:lsdException w:name="Light Shading" w:uiPriority="60"/>
@@ -9767,7 +9780,6 @@
     <w:lsdException w:name="Hashtag" w:semiHidden="1" w:unhideWhenUsed="1"/>
     <w:lsdException w:name="Unresolved Mention" w:semiHidden="1" w:unhideWhenUsed="1"/>
     <w:lsdException w:name="Smart Link" w:semiHidden="1" w:unhideWhenUsed="1"/>
-    <w:lsdException w:name="Smart Link Error" w:semiHidden="1" w:unhideWhenUsed="1"/>
   </w:latentStyles>
   <w:style w:type="paragraph" w:default="1" w:styleId="Normal">
     <w:name w:val="Normal"/>
@@ -16810,7 +16822,7 @@
 </file>
 
 <file path=word/glossary/webSettings.xml><?xml version="1.0" encoding="utf-8"?>
-<w:webSettings xmlns:mc="http://schemas.openxmlformats.org/markup-compatibility/2006" xmlns:r="http://schemas.openxmlformats.org/officeDocument/2006/relationships" xmlns:w="http://schemas.openxmlformats.org/wordprocessingml/2006/main" xmlns:w14="http://schemas.microsoft.com/office/word/2010/wordml" xmlns:w15="http://schemas.microsoft.com/office/word/2012/wordml" xmlns:w16cid="http://schemas.microsoft.com/office/word/2016/wordml/cid" xmlns:w16se="http://schemas.microsoft.com/office/word/2015/wordml/symex" mc:Ignorable="w14 w15 w16se w16cid">
+<w:webSettings xmlns:mc="http://schemas.openxmlformats.org/markup-compatibility/2006" xmlns:r="http://schemas.openxmlformats.org/officeDocument/2006/relationships" xmlns:w="http://schemas.openxmlformats.org/wordprocessingml/2006/main" xmlns:w14="http://schemas.microsoft.com/office/word/2010/wordml" xmlns:w15="http://schemas.microsoft.com/office/word/2012/wordml" xmlns:w16cex="http://schemas.microsoft.com/office/word/2018/wordml/cex" xmlns:w16cid="http://schemas.microsoft.com/office/word/2016/wordml/cid" xmlns:w16="http://schemas.microsoft.com/office/word/2018/wordml" xmlns:w16se="http://schemas.microsoft.com/office/word/2015/wordml/symex" mc:Ignorable="w14 w15 w16se w16cid w16 w16cex">
   <w:optimizeForBrowser/>
 </w:webSettings>
 </file>

</xml_diff>

<commit_message>
wire up new INL fields, ensure export works
</commit_message>
<xml_diff>
--- a/GenBOE/GenBOE.Web/Templates/Export/PBOE_1.docx
+++ b/GenBOE/GenBOE.Web/Templates/Export/PBOE_1.docx
@@ -986,42 +986,55 @@
         <w:trPr>
           <w:trHeight w:val="360"/>
         </w:trPr>
-        <w:sdt>
-          <w:sdtPr>
-            <w:alias w:val="SupplierContractType"/>
-            <w:tag w:val="SupplierContractType"/>
-            <w:id w:val="-769395444"/>
-            <w:placeholder>
-              <w:docPart w:val="650D63D5E8EE41A4A4DB7D99A1A86B66"/>
-            </w:placeholder>
-            <w:showingPlcHdr/>
-            <w:text/>
-          </w:sdtPr>
-          <w:sdtEndPr/>
-          <w:sdtContent>
-            <w:tc>
-              <w:tcPr>
-                <w:tcW w:w="2430" w:type="dxa"/>
-                <w:tcBorders>
-                  <w:top w:val="nil"/>
-                  <w:bottom w:val="nil"/>
-                </w:tcBorders>
-              </w:tcPr>
-              <w:p>
-                <w:pPr>
-                  <w:pStyle w:val="Table"/>
-                  <w:jc w:val="center"/>
-                </w:pPr>
+        <w:tc>
+          <w:tcPr>
+            <w:tcW w:w="2430" w:type="dxa"/>
+            <w:tcBorders>
+              <w:top w:val="nil"/>
+              <w:bottom w:val="nil"/>
+            </w:tcBorders>
+          </w:tcPr>
+          <w:p>
+            <w:pPr>
+              <w:pStyle w:val="Table"/>
+              <w:jc w:val="center"/>
+            </w:pPr>
+            <w:sdt>
+              <w:sdtPr>
+                <w:alias w:val="SupplierContractType"/>
+                <w:tag w:val="SupplierContractType"/>
+                <w:id w:val="-769395444"/>
+                <w:placeholder>
+                  <w:docPart w:val="650D63D5E8EE41A4A4DB7D99A1A86B66"/>
+                </w:placeholder>
+                <w:showingPlcHdr/>
+                <w:text/>
+              </w:sdtPr>
+              <w:sdtEndPr/>
+              <w:sdtContent>
                 <w:r>
                   <w:rPr>
                     <w:sz w:val="20"/>
                   </w:rPr>
                   <w:t>SupplierContractType</w:t>
                 </w:r>
-              </w:p>
-            </w:tc>
-          </w:sdtContent>
-        </w:sdt>
+              </w:sdtContent>
+            </w:sdt>
+            <w:sdt>
+              <w:sdtPr>
+                <w:alias w:val="Marker-DataRow"/>
+                <w:tag w:val="Marker-DataRow"/>
+                <w:id w:val="838117000"/>
+                <w:placeholder>
+                  <w:docPart w:val="DefaultPlaceholder_-1854013440"/>
+                </w:placeholder>
+                <w:showingPlcHdr/>
+              </w:sdtPr>
+              <w:sdtEndPr/>
+              <w:sdtContent/>
+            </w:sdt>
+          </w:p>
+        </w:tc>
         <w:tc>
           <w:tcPr>
             <w:tcW w:w="1800" w:type="dxa"/>
@@ -1147,21 +1160,35 @@
         <w:trPr>
           <w:trHeight w:val="360"/>
         </w:trPr>
-        <w:tc>
-          <w:tcPr>
-            <w:tcW w:w="2430" w:type="dxa"/>
-            <w:tcBorders>
-              <w:top w:val="nil"/>
-              <w:bottom w:val="nil"/>
-            </w:tcBorders>
-          </w:tcPr>
-          <w:p>
-            <w:pPr>
-              <w:pStyle w:val="Table"/>
-              <w:jc w:val="center"/>
-            </w:pPr>
-          </w:p>
-        </w:tc>
+        <w:sdt>
+          <w:sdtPr>
+            <w:alias w:val="Marker-SubtotalsRow"/>
+            <w:tag w:val="Marker-SubtotalsRow"/>
+            <w:id w:val="1506862351"/>
+            <w:placeholder>
+              <w:docPart w:val="DefaultPlaceholder_-1854013440"/>
+            </w:placeholder>
+            <w:showingPlcHdr/>
+          </w:sdtPr>
+          <w:sdtEndPr/>
+          <w:sdtContent>
+            <w:tc>
+              <w:tcPr>
+                <w:tcW w:w="2430" w:type="dxa"/>
+                <w:tcBorders>
+                  <w:top w:val="nil"/>
+                  <w:bottom w:val="nil"/>
+                </w:tcBorders>
+              </w:tcPr>
+              <w:p>
+                <w:pPr>
+                  <w:pStyle w:val="Table"/>
+                  <w:jc w:val="center"/>
+                </w:pPr>
+              </w:p>
+            </w:tc>
+          </w:sdtContent>
+        </w:sdt>
         <w:tc>
           <w:tcPr>
             <w:tcW w:w="1800" w:type="dxa"/>
@@ -1290,21 +1317,35 @@
         <w:trPr>
           <w:trHeight w:val="360"/>
         </w:trPr>
-        <w:tc>
-          <w:tcPr>
-            <w:tcW w:w="2430" w:type="dxa"/>
-            <w:tcBorders>
-              <w:top w:val="nil"/>
-              <w:bottom w:val="single" w:sz="4" w:space="0" w:color="auto"/>
-            </w:tcBorders>
-          </w:tcPr>
-          <w:p>
-            <w:pPr>
-              <w:pStyle w:val="Table"/>
-              <w:jc w:val="center"/>
-            </w:pPr>
-          </w:p>
-        </w:tc>
+        <w:sdt>
+          <w:sdtPr>
+            <w:alias w:val="Marker-TotalsRow"/>
+            <w:tag w:val="Marker-TotalsRow"/>
+            <w:id w:val="-957183181"/>
+            <w:placeholder>
+              <w:docPart w:val="DefaultPlaceholder_-1854013440"/>
+            </w:placeholder>
+            <w:showingPlcHdr/>
+          </w:sdtPr>
+          <w:sdtEndPr/>
+          <w:sdtContent>
+            <w:tc>
+              <w:tcPr>
+                <w:tcW w:w="2430" w:type="dxa"/>
+                <w:tcBorders>
+                  <w:top w:val="nil"/>
+                  <w:bottom w:val="single" w:sz="4" w:space="0" w:color="auto"/>
+                </w:tcBorders>
+              </w:tcPr>
+              <w:p>
+                <w:pPr>
+                  <w:pStyle w:val="Table"/>
+                  <w:jc w:val="center"/>
+                </w:pPr>
+              </w:p>
+            </w:tc>
+          </w:sdtContent>
+        </w:sdt>
         <w:tc>
           <w:tcPr>
             <w:tcW w:w="1800" w:type="dxa"/>
@@ -1744,17 +1785,17 @@
               </w:rPr>
               <w:fldChar w:fldCharType="begin">
                 <w:ffData>
-                  <w:name w:val="ECCPDYes"/>
+                  <w:name w:val="ccopd_yes"/>
                   <w:enabled/>
                   <w:calcOnExit w:val="0"/>
                   <w:checkBox>
                     <w:sizeAuto/>
-                    <w:default w:val="0"/>
+                    <w:default w:val="1"/>
                   </w:checkBox>
                 </w:ffData>
               </w:fldChar>
             </w:r>
-            <w:bookmarkStart w:id="1" w:name="ECCPDYes"/>
+            <w:bookmarkStart w:id="1" w:name="ccopd_yes"/>
             <w:r>
               <w:rPr>
                 <w:sz w:val="20"/>
@@ -1791,17 +1832,17 @@
               </w:rPr>
               <w:fldChar w:fldCharType="begin">
                 <w:ffData>
-                  <w:name w:val="ECCPDNo"/>
+                  <w:name w:val="ccopd_no"/>
                   <w:enabled/>
                   <w:calcOnExit w:val="0"/>
                   <w:checkBox>
                     <w:sizeAuto/>
-                    <w:default w:val="0"/>
+                    <w:default w:val="1"/>
                   </w:checkBox>
                 </w:ffData>
               </w:fldChar>
             </w:r>
-            <w:bookmarkStart w:id="2" w:name="ECCPDNo"/>
+            <w:bookmarkStart w:id="2" w:name="ccopd_no"/>
             <w:r>
               <w:rPr>
                 <w:sz w:val="20"/>
@@ -1838,17 +1879,17 @@
               </w:rPr>
               <w:fldChar w:fldCharType="begin">
                 <w:ffData>
-                  <w:name w:val="ECCPDNA"/>
+                  <w:name w:val="ccopd_na"/>
                   <w:enabled/>
                   <w:calcOnExit w:val="0"/>
                   <w:checkBox>
                     <w:sizeAuto/>
-                    <w:default w:val="0"/>
+                    <w:default w:val="1"/>
                   </w:checkBox>
                 </w:ffData>
               </w:fldChar>
             </w:r>
-            <w:bookmarkStart w:id="3" w:name="ECCPDNA"/>
+            <w:bookmarkStart w:id="3" w:name="ccopd_na"/>
             <w:r>
               <w:rPr>
                 <w:sz w:val="20"/>
@@ -2236,6 +2277,7 @@
                 <w:bCs/>
                 <w:u w:val="single"/>
               </w:rPr>
+              <w:lastRenderedPageBreak/>
               <w:t>SOURCE SELECTION</w:t>
             </w:r>
           </w:p>
@@ -2259,6 +2301,7 @@
               </w:sdtContent>
             </w:sdt>
           </w:p>
+          <w:p/>
           <w:p>
             <w:pPr>
               <w:rPr>
@@ -2296,6 +2339,7 @@
               </w:sdtContent>
             </w:sdt>
           </w:p>
+          <w:p/>
           <w:p>
             <w:pPr>
               <w:rPr>
@@ -2333,14 +2377,19 @@
               </w:sdtContent>
             </w:sdt>
           </w:p>
+          <w:p/>
           <w:p>
             <w:pPr>
               <w:rPr>
+                <w:b/>
+                <w:bCs/>
                 <w:u w:val="single"/>
               </w:rPr>
             </w:pPr>
             <w:r>
               <w:rPr>
+                <w:b/>
+                <w:bCs/>
                 <w:u w:val="single"/>
               </w:rPr>
               <w:t>PRICE ANALYSIS</w:t>
@@ -2366,6 +2415,7 @@
               </w:sdtContent>
             </w:sdt>
           </w:p>
+          <w:p/>
           <w:p>
             <w:pPr>
               <w:rPr>
@@ -2403,43 +2453,7 @@
               </w:sdtContent>
             </w:sdt>
           </w:p>
-          <w:p>
-            <w:pPr>
-              <w:rPr>
-                <w:b/>
-                <w:bCs/>
-                <w:u w:val="single"/>
-              </w:rPr>
-            </w:pPr>
-            <w:r>
-              <w:rPr>
-                <w:b/>
-                <w:bCs/>
-                <w:u w:val="single"/>
-              </w:rPr>
-              <w:t>LOCKHEED MARTIN PROPOSED VALUE FOR PROCUREMENT</w:t>
-            </w:r>
-          </w:p>
-          <w:p>
-            <w:sdt>
-              <w:sdtPr>
-                <w:alias w:val="ProposedValueProcurement"/>
-                <w:tag w:val="ProposedValueProcurement"/>
-                <w:id w:val="1119024551"/>
-                <w:placeholder>
-                  <w:docPart w:val="9FD21C3D1E004569BB8672EA12AF7374"/>
-                </w:placeholder>
-                <w:showingPlcHdr/>
-                <w:text/>
-              </w:sdtPr>
-              <w:sdtEndPr/>
-              <w:sdtContent>
-                <w:r>
-                  <w:t>LOCKHEED MARTIN PROPOSED VALUE FOR PROCUREMENT</w:t>
-                </w:r>
-              </w:sdtContent>
-            </w:sdt>
-          </w:p>
+          <w:p/>
           <w:p>
             <w:pPr>
               <w:autoSpaceDE w:val="0"/>
@@ -2506,7 +2520,6 @@
                 <w:b/>
                 <w:sz w:val="20"/>
               </w:rPr>
-              <w:lastRenderedPageBreak/>
               <w:t>SCHEDULE OF EVENTS</w:t>
             </w:r>
           </w:p>
@@ -3498,6 +3511,7 @@
           <w:p>
             <w:pPr>
               <w:pStyle w:val="Table"/>
+              <w:jc w:val="center"/>
               <w:rPr>
                 <w:sz w:val="20"/>
               </w:rPr>
@@ -3552,6 +3566,7 @@
               <w:rPr>
                 <w:sz w:val="20"/>
               </w:rPr>
+              <w:lastRenderedPageBreak/>
               <w:t>Technical Evaluation</w:t>
             </w:r>
           </w:p>
@@ -3752,7 +3767,6 @@
               <w:rPr>
                 <w:sz w:val="20"/>
               </w:rPr>
-              <w:lastRenderedPageBreak/>
               <w:t xml:space="preserve">                  b) approved date for submission to customer </w:t>
             </w:r>
             <w:sdt>
@@ -3820,7 +3834,6 @@
                 <w:b/>
                 <w:sz w:val="20"/>
               </w:rPr>
-              <w:lastRenderedPageBreak/>
               <w:t>POINT</w:t>
             </w:r>
             <w:r>
@@ -6866,6 +6879,9 @@
       </w:docPartPr>
       <w:docPartBody>
         <w:p>
+          <w:pPr>
+            <w:pStyle w:val="3C51D371244C4D18AA8A89DB62DED7821"/>
+          </w:pPr>
           <w:r>
             <w:rPr>
               <w:rStyle w:val="PlaceholderText"/>
@@ -6895,6 +6911,9 @@
       </w:docPartPr>
       <w:docPartBody>
         <w:p>
+          <w:pPr>
+            <w:pStyle w:val="DCE06A566B6A4CB3828C398E8B661D831"/>
+          </w:pPr>
           <w:r>
             <w:rPr>
               <w:rFonts w:ascii="Arial" w:hAnsi="Arial" w:cs="Arial"/>
@@ -6923,6 +6942,9 @@
       </w:docPartPr>
       <w:docPartBody>
         <w:p>
+          <w:pPr>
+            <w:pStyle w:val="06B8F59F36A54EC096C3AF659F2ADA191"/>
+          </w:pPr>
           <w:r>
             <w:rPr>
               <w:rStyle w:val="PlaceholderText"/>
@@ -6950,6 +6972,9 @@
       </w:docPartPr>
       <w:docPartBody>
         <w:p>
+          <w:pPr>
+            <w:pStyle w:val="A6983B515BA9432AA6CFEC8362A244781"/>
+          </w:pPr>
           <w:r>
             <w:rPr>
               <w:sz w:val="20"/>
@@ -6976,6 +7001,9 @@
       </w:docPartPr>
       <w:docPartBody>
         <w:p>
+          <w:pPr>
+            <w:pStyle w:val="5C29C54541614AB4B36209C014760B031"/>
+          </w:pPr>
           <w:r>
             <w:rPr>
               <w:rStyle w:val="PlaceholderText"/>
@@ -7003,6 +7031,9 @@
       </w:docPartPr>
       <w:docPartBody>
         <w:p>
+          <w:pPr>
+            <w:pStyle w:val="CF01C4F4D3BE4C58A7642594BBEB44A21"/>
+          </w:pPr>
           <w:r>
             <w:rPr>
               <w:sz w:val="20"/>
@@ -7029,6 +7060,9 @@
       </w:docPartPr>
       <w:docPartBody>
         <w:p>
+          <w:pPr>
+            <w:pStyle w:val="2BCD6F010600463D8BE0146C14CF16D71"/>
+          </w:pPr>
           <w:r>
             <w:rPr>
               <w:rStyle w:val="PlaceholderText"/>
@@ -7056,6 +7090,9 @@
       </w:docPartPr>
       <w:docPartBody>
         <w:p>
+          <w:pPr>
+            <w:pStyle w:val="35C0BB7B77F54014BB468B7A716EBA4D1"/>
+          </w:pPr>
           <w:r>
             <w:rPr>
               <w:b/>
@@ -7084,6 +7121,9 @@
       </w:docPartPr>
       <w:docPartBody>
         <w:p>
+          <w:pPr>
+            <w:pStyle w:val="2D10359A02224706B30FF3D1427A46CC1"/>
+          </w:pPr>
           <w:r>
             <w:rPr>
               <w:sz w:val="20"/>
@@ -7110,6 +7150,9 @@
       </w:docPartPr>
       <w:docPartBody>
         <w:p>
+          <w:pPr>
+            <w:pStyle w:val="9EE6A410E46E484D832EE3D6F458F9131"/>
+          </w:pPr>
           <w:r>
             <w:rPr>
               <w:sz w:val="20"/>
@@ -7136,6 +7179,9 @@
       </w:docPartPr>
       <w:docPartBody>
         <w:p>
+          <w:pPr>
+            <w:pStyle w:val="5A6D68353161404D8020799FA59BD52D1"/>
+          </w:pPr>
           <w:r>
             <w:rPr>
               <w:sz w:val="20"/>
@@ -7162,6 +7208,9 @@
       </w:docPartPr>
       <w:docPartBody>
         <w:p>
+          <w:pPr>
+            <w:pStyle w:val="02ABC3E7E1D84DDD98A3AA83D359A3C11"/>
+          </w:pPr>
           <w:r>
             <w:rPr>
               <w:sz w:val="20"/>
@@ -7188,6 +7237,9 @@
       </w:docPartPr>
       <w:docPartBody>
         <w:p>
+          <w:pPr>
+            <w:pStyle w:val="CA82DD6241384C818C8BF61861CDABE01"/>
+          </w:pPr>
           <w:r>
             <w:rPr>
               <w:sz w:val="20"/>
@@ -7214,6 +7266,9 @@
       </w:docPartPr>
       <w:docPartBody>
         <w:p>
+          <w:pPr>
+            <w:pStyle w:val="DE29BAE756844C0A896C572548D472C01"/>
+          </w:pPr>
           <w:r>
             <w:rPr>
               <w:sz w:val="20"/>
@@ -7240,6 +7295,9 @@
       </w:docPartPr>
       <w:docPartBody>
         <w:p>
+          <w:pPr>
+            <w:pStyle w:val="3CD385EBACBB4BF5A95C1422AC0988891"/>
+          </w:pPr>
           <w:r>
             <w:rPr>
               <w:sz w:val="20"/>
@@ -7266,6 +7324,9 @@
       </w:docPartPr>
       <w:docPartBody>
         <w:p>
+          <w:pPr>
+            <w:pStyle w:val="650D63D5E8EE41A4A4DB7D99A1A86B661"/>
+          </w:pPr>
           <w:r>
             <w:rPr>
               <w:sz w:val="20"/>
@@ -7292,6 +7353,9 @@
       </w:docPartPr>
       <w:docPartBody>
         <w:p>
+          <w:pPr>
+            <w:pStyle w:val="0C083C1E24AF40DF8C7BBD858E651F981"/>
+          </w:pPr>
           <w:r>
             <w:rPr>
               <w:rStyle w:val="PlaceholderText"/>
@@ -7319,6 +7383,9 @@
       </w:docPartPr>
       <w:docPartBody>
         <w:p>
+          <w:pPr>
+            <w:pStyle w:val="960D99237C084AC7A5F3B97D76AA02951"/>
+          </w:pPr>
           <w:r>
             <w:rPr>
               <w:sz w:val="20"/>
@@ -7345,6 +7412,9 @@
       </w:docPartPr>
       <w:docPartBody>
         <w:p>
+          <w:pPr>
+            <w:pStyle w:val="AA4B000B5F044625B216DDE768A270CA1"/>
+          </w:pPr>
           <w:r>
             <w:rPr>
               <w:sz w:val="20"/>
@@ -7371,6 +7441,9 @@
       </w:docPartPr>
       <w:docPartBody>
         <w:p>
+          <w:pPr>
+            <w:pStyle w:val="CE29DF205FAD404FA992B54BCCAAF14F1"/>
+          </w:pPr>
           <w:r>
             <w:rPr>
               <w:b/>
@@ -7399,6 +7472,9 @@
       </w:docPartPr>
       <w:docPartBody>
         <w:p>
+          <w:pPr>
+            <w:pStyle w:val="2B0E99F1A0714AFAAAD2B967640AF6E61"/>
+          </w:pPr>
           <w:r>
             <w:rPr>
               <w:b/>
@@ -7427,6 +7503,9 @@
       </w:docPartPr>
       <w:docPartBody>
         <w:p>
+          <w:pPr>
+            <w:pStyle w:val="E38DBD5D0C2F418096E3BED22BACBEBA1"/>
+          </w:pPr>
           <w:r>
             <w:rPr>
               <w:b/>
@@ -7454,6 +7533,9 @@
       </w:docPartPr>
       <w:docPartBody>
         <w:p>
+          <w:pPr>
+            <w:pStyle w:val="97259849AFB349A3B09A844EE4C5B4661"/>
+          </w:pPr>
           <w:r>
             <w:rPr>
               <w:b/>
@@ -7481,6 +7563,9 @@
       </w:docPartPr>
       <w:docPartBody>
         <w:p>
+          <w:pPr>
+            <w:pStyle w:val="5F1E69B4ABE343E7B3A4886CE0A3B8E61"/>
+          </w:pPr>
           <w:r>
             <w:rPr>
               <w:rStyle w:val="PlaceholderText"/>
@@ -7609,29 +7694,6 @@
     </w:docPart>
     <w:docPart>
       <w:docPartPr>
-        <w:name w:val="9FD21C3D1E004569BB8672EA12AF7374"/>
-        <w:category>
-          <w:name w:val="General"/>
-          <w:gallery w:val="placeholder"/>
-        </w:category>
-        <w:types>
-          <w:type w:val="bbPlcHdr"/>
-        </w:types>
-        <w:behaviors>
-          <w:behavior w:val="content"/>
-        </w:behaviors>
-        <w:guid w:val="{E3C495E5-ADC4-4343-A751-D79882D98B9C}"/>
-      </w:docPartPr>
-      <w:docPartBody>
-        <w:p>
-          <w:r>
-            <w:t>LOCKHEED MARTIN PROPOSED VALUE FOR PROCUREMENT</w:t>
-          </w:r>
-        </w:p>
-      </w:docPartBody>
-    </w:docPart>
-    <w:docPart>
-      <w:docPartPr>
         <w:name w:val="A14730F92CF84C95945019ACD1571FD8"/>
         <w:category>
           <w:name w:val="General"/>
@@ -7670,6 +7732,9 @@
       </w:docPartPr>
       <w:docPartBody>
         <w:p>
+          <w:pPr>
+            <w:pStyle w:val="362DB8B0D56240B292FD8AA345851FB61"/>
+          </w:pPr>
           <w:r>
             <w:rPr>
               <w:rStyle w:val="PlaceholderText"/>
@@ -7697,6 +7762,9 @@
       </w:docPartPr>
       <w:docPartBody>
         <w:p>
+          <w:pPr>
+            <w:pStyle w:val="2EADCBB08BC6479D948516FC0B012D181"/>
+          </w:pPr>
           <w:r>
             <w:rPr>
               <w:sz w:val="20"/>
@@ -7723,6 +7791,9 @@
       </w:docPartPr>
       <w:docPartBody>
         <w:p>
+          <w:pPr>
+            <w:pStyle w:val="6019D068AD7940F6A066B0EBAB40D7BA1"/>
+          </w:pPr>
           <w:r>
             <w:rPr>
               <w:sz w:val="20"/>
@@ -7750,6 +7821,9 @@
       </w:docPartPr>
       <w:docPartBody>
         <w:p>
+          <w:pPr>
+            <w:pStyle w:val="F393672CD99D4555816A23E5886E23271"/>
+          </w:pPr>
           <w:r>
             <w:rPr>
               <w:rStyle w:val="PlaceholderText"/>
@@ -7779,6 +7853,9 @@
       </w:docPartPr>
       <w:docPartBody>
         <w:p>
+          <w:pPr>
+            <w:pStyle w:val="30F99A229E124EE294268C7BB07E79191"/>
+          </w:pPr>
           <w:r>
             <w:rPr>
               <w:rStyle w:val="PlaceholderText"/>
@@ -7806,6 +7883,9 @@
       </w:docPartPr>
       <w:docPartBody>
         <w:p>
+          <w:pPr>
+            <w:pStyle w:val="29F6C8F05FCF47999777CB15AA70B7901"/>
+          </w:pPr>
           <w:r>
             <w:rPr>
               <w:rStyle w:val="PlaceholderText"/>
@@ -7833,6 +7913,9 @@
       </w:docPartPr>
       <w:docPartBody>
         <w:p>
+          <w:pPr>
+            <w:pStyle w:val="C27700D16ED9448787CE1EF74661419C1"/>
+          </w:pPr>
           <w:r>
             <w:rPr>
               <w:rStyle w:val="PlaceholderText"/>
@@ -7860,6 +7943,9 @@
       </w:docPartPr>
       <w:docPartBody>
         <w:p>
+          <w:pPr>
+            <w:pStyle w:val="4B2DF1FDE8B74601B70170992E70A6931"/>
+          </w:pPr>
           <w:r>
             <w:rPr>
               <w:rStyle w:val="PlaceholderText"/>
@@ -7887,6 +7973,9 @@
       </w:docPartPr>
       <w:docPartBody>
         <w:p>
+          <w:pPr>
+            <w:pStyle w:val="5B4F51D3217A49DD952A6A016B67B6B41"/>
+          </w:pPr>
           <w:r>
             <w:rPr>
               <w:sz w:val="20"/>
@@ -7913,6 +8002,9 @@
       </w:docPartPr>
       <w:docPartBody>
         <w:p>
+          <w:pPr>
+            <w:pStyle w:val="1172965E6EB5428B9EEE3697A16A64A21"/>
+          </w:pPr>
           <w:r>
             <w:rPr>
               <w:sz w:val="20"/>
@@ -7939,6 +8031,9 @@
       </w:docPartPr>
       <w:docPartBody>
         <w:p>
+          <w:pPr>
+            <w:pStyle w:val="ED0F1D3A967E44DEACA6FAB777F42C381"/>
+          </w:pPr>
           <w:r>
             <w:rPr>
               <w:sz w:val="20"/>
@@ -7965,6 +8060,9 @@
       </w:docPartPr>
       <w:docPartBody>
         <w:p>
+          <w:pPr>
+            <w:pStyle w:val="74EC21933C7348BEBE4EF4FACE81684C1"/>
+          </w:pPr>
           <w:r>
             <w:rPr>
               <w:sz w:val="20"/>
@@ -7991,6 +8089,9 @@
       </w:docPartPr>
       <w:docPartBody>
         <w:p>
+          <w:pPr>
+            <w:pStyle w:val="3A48DB68078D41DDB3FA347D69C884571"/>
+          </w:pPr>
           <w:r>
             <w:rPr>
               <w:sz w:val="20"/>
@@ -8017,6 +8118,9 @@
       </w:docPartPr>
       <w:docPartBody>
         <w:p>
+          <w:pPr>
+            <w:pStyle w:val="8709F89835BF45559EBBDE082AFEFB131"/>
+          </w:pPr>
           <w:r>
             <w:rPr>
               <w:sz w:val="20"/>
@@ -8043,6 +8147,9 @@
       </w:docPartPr>
       <w:docPartBody>
         <w:p>
+          <w:pPr>
+            <w:pStyle w:val="137428D61C6640268F56BB76B9153C141"/>
+          </w:pPr>
           <w:r>
             <w:rPr>
               <w:sz w:val="20"/>
@@ -8069,12 +8176,41 @@
       </w:docPartPr>
       <w:docPartBody>
         <w:p>
+          <w:pPr>
+            <w:pStyle w:val="109EBDB68ACB4F68AA508E059E90054B1"/>
+          </w:pPr>
           <w:r>
             <w:rPr>
               <w:rStyle w:val="PlaceholderText"/>
               <w:sz w:val="20"/>
             </w:rPr>
             <w:t>MOU</w:t>
+          </w:r>
+        </w:p>
+      </w:docPartBody>
+    </w:docPart>
+    <w:docPart>
+      <w:docPartPr>
+        <w:name w:val="DefaultPlaceholder_-1854013440"/>
+        <w:category>
+          <w:name w:val="General"/>
+          <w:gallery w:val="placeholder"/>
+        </w:category>
+        <w:types>
+          <w:type w:val="bbPlcHdr"/>
+        </w:types>
+        <w:behaviors>
+          <w:behavior w:val="content"/>
+        </w:behaviors>
+        <w:guid w:val="{7372FC5C-B66D-4F1F-A17C-A918B2D3038B}"/>
+      </w:docPartPr>
+      <w:docPartBody>
+        <w:p>
+          <w:r>
+            <w:rPr>
+              <w:rStyle w:val="PlaceholderText"/>
+            </w:rPr>
+            <w:t>Click or tap here to enter text.</w:t>
           </w:r>
         </w:p>
       </w:docPartBody>
@@ -8097,7 +8233,7 @@
     <w:charset w:val="00"/>
     <w:family w:val="roman"/>
     <w:pitch w:val="variable"/>
-    <w:sig w:usb0="E0002EFF" w:usb1="C000785B" w:usb2="00000009" w:usb3="00000000" w:csb0="000001FF" w:csb1="00000000"/>
+    <w:sig w:usb0="E0002AFF" w:usb1="C0007843" w:usb2="00000009" w:usb3="00000000" w:csb0="000001FF" w:csb1="00000000"/>
   </w:font>
   <w:font w:name="Courier New">
     <w:panose1 w:val="02070309020205020404"/>
@@ -8118,7 +8254,7 @@
     <w:charset w:val="00"/>
     <w:family w:val="swiss"/>
     <w:pitch w:val="variable"/>
-    <w:sig w:usb0="E0002EFF" w:usb1="C000785B" w:usb2="00000009" w:usb3="00000000" w:csb0="000001FF" w:csb1="00000000"/>
+    <w:sig w:usb0="E0002AFF" w:usb1="C0007843" w:usb2="00000009" w:usb3="00000000" w:csb0="000001FF" w:csb1="00000000"/>
   </w:font>
   <w:font w:name="Tahoma">
     <w:panose1 w:val="020B0604030504040204"/>
@@ -8147,7 +8283,7 @@
     <w:charset w:val="00"/>
     <w:family w:val="swiss"/>
     <w:pitch w:val="variable"/>
-    <w:sig w:usb0="E4002EFF" w:usb1="C000247B" w:usb2="00000009" w:usb3="00000000" w:csb0="000001FF" w:csb1="00000000"/>
+    <w:sig w:usb0="E0002AFF" w:usb1="4000ACFF" w:usb2="00000001" w:usb3="00000000" w:csb0="000001FF" w:csb1="00000000"/>
   </w:font>
   <w:font w:name="Calibri Light">
     <w:panose1 w:val="020F0302020204030204"/>
@@ -8175,10 +8311,12 @@
   </w:compat>
   <w:rsids>
     <w:rsidRoot w:val="0020346C"/>
+    <w:rsid w:val="000235F4"/>
     <w:rsid w:val="000751D5"/>
     <w:rsid w:val="000B27E0"/>
     <w:rsid w:val="000F7364"/>
     <w:rsid w:val="001157FA"/>
+    <w:rsid w:val="0012754E"/>
     <w:rsid w:val="001339F8"/>
     <w:rsid w:val="00153516"/>
     <w:rsid w:val="00194A82"/>
@@ -8186,14 +8324,19 @@
     <w:rsid w:val="001F05C0"/>
     <w:rsid w:val="0020346C"/>
     <w:rsid w:val="002963C8"/>
+    <w:rsid w:val="0030414E"/>
+    <w:rsid w:val="00307F9A"/>
     <w:rsid w:val="003903D1"/>
     <w:rsid w:val="003E00EE"/>
+    <w:rsid w:val="004901E0"/>
     <w:rsid w:val="004D180E"/>
     <w:rsid w:val="00515CAF"/>
     <w:rsid w:val="005256F5"/>
+    <w:rsid w:val="00545DF2"/>
     <w:rsid w:val="00592770"/>
     <w:rsid w:val="00605A78"/>
     <w:rsid w:val="00671B35"/>
+    <w:rsid w:val="0069327E"/>
     <w:rsid w:val="007E593E"/>
     <w:rsid w:val="0080343E"/>
     <w:rsid w:val="00810A8C"/>
@@ -8202,9 +8345,11 @@
     <w:rsid w:val="00841BE2"/>
     <w:rsid w:val="00883763"/>
     <w:rsid w:val="008952A6"/>
+    <w:rsid w:val="008C7463"/>
     <w:rsid w:val="009116E3"/>
     <w:rsid w:val="00911C6C"/>
     <w:rsid w:val="0091316F"/>
+    <w:rsid w:val="00957A37"/>
     <w:rsid w:val="009B3247"/>
     <w:rsid w:val="009E761A"/>
     <w:rsid w:val="009F2D83"/>
@@ -8213,13 +8358,16 @@
     <w:rsid w:val="00A52318"/>
     <w:rsid w:val="00A9690C"/>
     <w:rsid w:val="00AD31B5"/>
+    <w:rsid w:val="00B33741"/>
     <w:rsid w:val="00B70B98"/>
     <w:rsid w:val="00B76D4F"/>
+    <w:rsid w:val="00BA2557"/>
     <w:rsid w:val="00BA64F6"/>
     <w:rsid w:val="00BA6CA4"/>
     <w:rsid w:val="00BD739D"/>
     <w:rsid w:val="00C1691B"/>
     <w:rsid w:val="00C22EC5"/>
+    <w:rsid w:val="00C730A6"/>
     <w:rsid w:val="00C75714"/>
     <w:rsid w:val="00CA2B27"/>
     <w:rsid w:val="00CA4852"/>
@@ -8227,13 +8375,18 @@
     <w:rsid w:val="00CD068B"/>
     <w:rsid w:val="00CF022D"/>
     <w:rsid w:val="00D35C1F"/>
+    <w:rsid w:val="00D91C33"/>
     <w:rsid w:val="00DA3FA8"/>
+    <w:rsid w:val="00DB3276"/>
     <w:rsid w:val="00DE4142"/>
+    <w:rsid w:val="00DE4C99"/>
     <w:rsid w:val="00DF4E21"/>
+    <w:rsid w:val="00E02324"/>
     <w:rsid w:val="00E1350C"/>
     <w:rsid w:val="00E972B6"/>
     <w:rsid w:val="00EA6E8A"/>
     <w:rsid w:val="00ED5ED7"/>
+    <w:rsid w:val="00F16E8B"/>
     <w:rsid w:val="00F5587B"/>
     <w:rsid w:val="00FC58B0"/>
     <w:rsid w:val="00FD10FA"/>
@@ -8690,9 +8843,489 @@
     <w:basedOn w:val="DefaultParagraphFont"/>
     <w:uiPriority w:val="99"/>
     <w:semiHidden/>
-    <w:rsid w:val="00DF4E21"/>
+    <w:rsid w:val="00DE4C99"/>
     <w:rPr>
       <w:color w:val="808080"/>
+    </w:rPr>
+  </w:style>
+  <w:style w:type="paragraph" w:customStyle="1" w:styleId="3C51D371244C4D18AA8A89DB62DED7821">
+    <w:name w:val="3C51D371244C4D18AA8A89DB62DED7821"/>
+    <w:rsid w:val="00DE4C99"/>
+    <w:pPr>
+      <w:spacing w:after="120" w:line="240" w:lineRule="auto"/>
+    </w:pPr>
+    <w:rPr>
+      <w:rFonts w:ascii="Times New Roman" w:eastAsia="Times New Roman" w:hAnsi="Times New Roman" w:cs="Times New Roman"/>
+      <w:sz w:val="24"/>
+      <w:szCs w:val="24"/>
+    </w:rPr>
+  </w:style>
+  <w:style w:type="paragraph" w:customStyle="1" w:styleId="DCE06A566B6A4CB3828C398E8B661D831">
+    <w:name w:val="DCE06A566B6A4CB3828C398E8B661D831"/>
+    <w:rsid w:val="00DE4C99"/>
+    <w:pPr>
+      <w:spacing w:after="120" w:line="240" w:lineRule="auto"/>
+    </w:pPr>
+    <w:rPr>
+      <w:rFonts w:ascii="Times New Roman" w:eastAsia="Times New Roman" w:hAnsi="Times New Roman" w:cs="Times New Roman"/>
+      <w:sz w:val="24"/>
+      <w:szCs w:val="24"/>
+    </w:rPr>
+  </w:style>
+  <w:style w:type="paragraph" w:customStyle="1" w:styleId="CA82DD6241384C818C8BF61861CDABE01">
+    <w:name w:val="CA82DD6241384C818C8BF61861CDABE01"/>
+    <w:rsid w:val="00DE4C99"/>
+    <w:pPr>
+      <w:spacing w:before="40" w:after="40" w:line="240" w:lineRule="auto"/>
+    </w:pPr>
+    <w:rPr>
+      <w:rFonts w:ascii="Times New Roman" w:eastAsia="Times New Roman" w:hAnsi="Times New Roman" w:cs="Times New Roman"/>
+      <w:sz w:val="24"/>
+      <w:szCs w:val="20"/>
+    </w:rPr>
+  </w:style>
+  <w:style w:type="paragraph" w:customStyle="1" w:styleId="DE29BAE756844C0A896C572548D472C01">
+    <w:name w:val="DE29BAE756844C0A896C572548D472C01"/>
+    <w:rsid w:val="00DE4C99"/>
+    <w:pPr>
+      <w:spacing w:before="40" w:after="40" w:line="240" w:lineRule="auto"/>
+    </w:pPr>
+    <w:rPr>
+      <w:rFonts w:ascii="Times New Roman" w:eastAsia="Times New Roman" w:hAnsi="Times New Roman" w:cs="Times New Roman"/>
+      <w:sz w:val="24"/>
+      <w:szCs w:val="20"/>
+    </w:rPr>
+  </w:style>
+  <w:style w:type="paragraph" w:customStyle="1" w:styleId="3CD385EBACBB4BF5A95C1422AC0988891">
+    <w:name w:val="3CD385EBACBB4BF5A95C1422AC0988891"/>
+    <w:rsid w:val="00DE4C99"/>
+    <w:pPr>
+      <w:spacing w:before="40" w:after="40" w:line="240" w:lineRule="auto"/>
+    </w:pPr>
+    <w:rPr>
+      <w:rFonts w:ascii="Times New Roman" w:eastAsia="Times New Roman" w:hAnsi="Times New Roman" w:cs="Times New Roman"/>
+      <w:sz w:val="24"/>
+      <w:szCs w:val="20"/>
+    </w:rPr>
+  </w:style>
+  <w:style w:type="paragraph" w:customStyle="1" w:styleId="06B8F59F36A54EC096C3AF659F2ADA191">
+    <w:name w:val="06B8F59F36A54EC096C3AF659F2ADA191"/>
+    <w:rsid w:val="00DE4C99"/>
+    <w:pPr>
+      <w:spacing w:before="40" w:after="40" w:line="240" w:lineRule="auto"/>
+    </w:pPr>
+    <w:rPr>
+      <w:rFonts w:ascii="Times New Roman" w:eastAsia="Times New Roman" w:hAnsi="Times New Roman" w:cs="Times New Roman"/>
+      <w:sz w:val="24"/>
+      <w:szCs w:val="20"/>
+    </w:rPr>
+  </w:style>
+  <w:style w:type="paragraph" w:customStyle="1" w:styleId="A6983B515BA9432AA6CFEC8362A244781">
+    <w:name w:val="A6983B515BA9432AA6CFEC8362A244781"/>
+    <w:rsid w:val="00DE4C99"/>
+    <w:pPr>
+      <w:spacing w:before="40" w:after="40" w:line="240" w:lineRule="auto"/>
+    </w:pPr>
+    <w:rPr>
+      <w:rFonts w:ascii="Times New Roman" w:eastAsia="Times New Roman" w:hAnsi="Times New Roman" w:cs="Times New Roman"/>
+      <w:sz w:val="24"/>
+      <w:szCs w:val="20"/>
+    </w:rPr>
+  </w:style>
+  <w:style w:type="paragraph" w:customStyle="1" w:styleId="5C29C54541614AB4B36209C014760B031">
+    <w:name w:val="5C29C54541614AB4B36209C014760B031"/>
+    <w:rsid w:val="00DE4C99"/>
+    <w:pPr>
+      <w:spacing w:before="40" w:after="40" w:line="240" w:lineRule="auto"/>
+    </w:pPr>
+    <w:rPr>
+      <w:rFonts w:ascii="Times New Roman" w:eastAsia="Times New Roman" w:hAnsi="Times New Roman" w:cs="Times New Roman"/>
+      <w:sz w:val="24"/>
+      <w:szCs w:val="20"/>
+    </w:rPr>
+  </w:style>
+  <w:style w:type="paragraph" w:customStyle="1" w:styleId="CF01C4F4D3BE4C58A7642594BBEB44A21">
+    <w:name w:val="CF01C4F4D3BE4C58A7642594BBEB44A21"/>
+    <w:rsid w:val="00DE4C99"/>
+    <w:pPr>
+      <w:spacing w:before="40" w:after="40" w:line="240" w:lineRule="auto"/>
+    </w:pPr>
+    <w:rPr>
+      <w:rFonts w:ascii="Times New Roman" w:eastAsia="Times New Roman" w:hAnsi="Times New Roman" w:cs="Times New Roman"/>
+      <w:sz w:val="24"/>
+      <w:szCs w:val="20"/>
+    </w:rPr>
+  </w:style>
+  <w:style w:type="paragraph" w:customStyle="1" w:styleId="650D63D5E8EE41A4A4DB7D99A1A86B661">
+    <w:name w:val="650D63D5E8EE41A4A4DB7D99A1A86B661"/>
+    <w:rsid w:val="00DE4C99"/>
+    <w:pPr>
+      <w:spacing w:before="40" w:after="40" w:line="240" w:lineRule="auto"/>
+    </w:pPr>
+    <w:rPr>
+      <w:rFonts w:ascii="Times New Roman" w:eastAsia="Times New Roman" w:hAnsi="Times New Roman" w:cs="Times New Roman"/>
+      <w:sz w:val="24"/>
+      <w:szCs w:val="20"/>
+    </w:rPr>
+  </w:style>
+  <w:style w:type="paragraph" w:customStyle="1" w:styleId="0C083C1E24AF40DF8C7BBD858E651F981">
+    <w:name w:val="0C083C1E24AF40DF8C7BBD858E651F981"/>
+    <w:rsid w:val="00DE4C99"/>
+    <w:pPr>
+      <w:spacing w:before="40" w:after="40" w:line="240" w:lineRule="auto"/>
+    </w:pPr>
+    <w:rPr>
+      <w:rFonts w:ascii="Times New Roman" w:eastAsia="Times New Roman" w:hAnsi="Times New Roman" w:cs="Times New Roman"/>
+      <w:sz w:val="24"/>
+      <w:szCs w:val="20"/>
+    </w:rPr>
+  </w:style>
+  <w:style w:type="paragraph" w:customStyle="1" w:styleId="960D99237C084AC7A5F3B97D76AA02951">
+    <w:name w:val="960D99237C084AC7A5F3B97D76AA02951"/>
+    <w:rsid w:val="00DE4C99"/>
+    <w:pPr>
+      <w:spacing w:before="40" w:after="40" w:line="240" w:lineRule="auto"/>
+    </w:pPr>
+    <w:rPr>
+      <w:rFonts w:ascii="Times New Roman" w:eastAsia="Times New Roman" w:hAnsi="Times New Roman" w:cs="Times New Roman"/>
+      <w:sz w:val="24"/>
+      <w:szCs w:val="20"/>
+    </w:rPr>
+  </w:style>
+  <w:style w:type="paragraph" w:customStyle="1" w:styleId="AA4B000B5F044625B216DDE768A270CA1">
+    <w:name w:val="AA4B000B5F044625B216DDE768A270CA1"/>
+    <w:rsid w:val="00DE4C99"/>
+    <w:pPr>
+      <w:spacing w:before="40" w:after="40" w:line="240" w:lineRule="auto"/>
+    </w:pPr>
+    <w:rPr>
+      <w:rFonts w:ascii="Times New Roman" w:eastAsia="Times New Roman" w:hAnsi="Times New Roman" w:cs="Times New Roman"/>
+      <w:sz w:val="24"/>
+      <w:szCs w:val="20"/>
+    </w:rPr>
+  </w:style>
+  <w:style w:type="paragraph" w:customStyle="1" w:styleId="CE29DF205FAD404FA992B54BCCAAF14F1">
+    <w:name w:val="CE29DF205FAD404FA992B54BCCAAF14F1"/>
+    <w:rsid w:val="00DE4C99"/>
+    <w:pPr>
+      <w:spacing w:before="40" w:after="40" w:line="240" w:lineRule="auto"/>
+    </w:pPr>
+    <w:rPr>
+      <w:rFonts w:ascii="Times New Roman" w:eastAsia="Times New Roman" w:hAnsi="Times New Roman" w:cs="Times New Roman"/>
+      <w:sz w:val="24"/>
+      <w:szCs w:val="20"/>
+    </w:rPr>
+  </w:style>
+  <w:style w:type="paragraph" w:customStyle="1" w:styleId="2B0E99F1A0714AFAAAD2B967640AF6E61">
+    <w:name w:val="2B0E99F1A0714AFAAAD2B967640AF6E61"/>
+    <w:rsid w:val="00DE4C99"/>
+    <w:pPr>
+      <w:spacing w:before="40" w:after="40" w:line="240" w:lineRule="auto"/>
+    </w:pPr>
+    <w:rPr>
+      <w:rFonts w:ascii="Times New Roman" w:eastAsia="Times New Roman" w:hAnsi="Times New Roman" w:cs="Times New Roman"/>
+      <w:sz w:val="24"/>
+      <w:szCs w:val="20"/>
+    </w:rPr>
+  </w:style>
+  <w:style w:type="paragraph" w:customStyle="1" w:styleId="E38DBD5D0C2F418096E3BED22BACBEBA1">
+    <w:name w:val="E38DBD5D0C2F418096E3BED22BACBEBA1"/>
+    <w:rsid w:val="00DE4C99"/>
+    <w:pPr>
+      <w:spacing w:before="40" w:after="40" w:line="240" w:lineRule="auto"/>
+    </w:pPr>
+    <w:rPr>
+      <w:rFonts w:ascii="Times New Roman" w:eastAsia="Times New Roman" w:hAnsi="Times New Roman" w:cs="Times New Roman"/>
+      <w:sz w:val="24"/>
+      <w:szCs w:val="20"/>
+    </w:rPr>
+  </w:style>
+  <w:style w:type="paragraph" w:customStyle="1" w:styleId="97259849AFB349A3B09A844EE4C5B4661">
+    <w:name w:val="97259849AFB349A3B09A844EE4C5B4661"/>
+    <w:rsid w:val="00DE4C99"/>
+    <w:pPr>
+      <w:spacing w:before="40" w:after="40" w:line="240" w:lineRule="auto"/>
+    </w:pPr>
+    <w:rPr>
+      <w:rFonts w:ascii="Times New Roman" w:eastAsia="Times New Roman" w:hAnsi="Times New Roman" w:cs="Times New Roman"/>
+      <w:sz w:val="24"/>
+      <w:szCs w:val="20"/>
+    </w:rPr>
+  </w:style>
+  <w:style w:type="paragraph" w:customStyle="1" w:styleId="2BCD6F010600463D8BE0146C14CF16D71">
+    <w:name w:val="2BCD6F010600463D8BE0146C14CF16D71"/>
+    <w:rsid w:val="00DE4C99"/>
+    <w:pPr>
+      <w:spacing w:before="40" w:after="40" w:line="240" w:lineRule="auto"/>
+    </w:pPr>
+    <w:rPr>
+      <w:rFonts w:ascii="Times New Roman" w:eastAsia="Times New Roman" w:hAnsi="Times New Roman" w:cs="Times New Roman"/>
+      <w:sz w:val="24"/>
+      <w:szCs w:val="20"/>
+    </w:rPr>
+  </w:style>
+  <w:style w:type="paragraph" w:customStyle="1" w:styleId="5F1E69B4ABE343E7B3A4886CE0A3B8E61">
+    <w:name w:val="5F1E69B4ABE343E7B3A4886CE0A3B8E61"/>
+    <w:rsid w:val="00DE4C99"/>
+    <w:pPr>
+      <w:spacing w:before="40" w:after="40" w:line="240" w:lineRule="auto"/>
+    </w:pPr>
+    <w:rPr>
+      <w:rFonts w:ascii="Times New Roman" w:eastAsia="Times New Roman" w:hAnsi="Times New Roman" w:cs="Times New Roman"/>
+      <w:sz w:val="24"/>
+      <w:szCs w:val="20"/>
+    </w:rPr>
+  </w:style>
+  <w:style w:type="paragraph" w:customStyle="1" w:styleId="2D10359A02224706B30FF3D1427A46CC1">
+    <w:name w:val="2D10359A02224706B30FF3D1427A46CC1"/>
+    <w:rsid w:val="00DE4C99"/>
+    <w:pPr>
+      <w:spacing w:before="40" w:after="40" w:line="240" w:lineRule="auto"/>
+    </w:pPr>
+    <w:rPr>
+      <w:rFonts w:ascii="Times New Roman" w:eastAsia="Times New Roman" w:hAnsi="Times New Roman" w:cs="Times New Roman"/>
+      <w:sz w:val="24"/>
+      <w:szCs w:val="20"/>
+    </w:rPr>
+  </w:style>
+  <w:style w:type="paragraph" w:customStyle="1" w:styleId="ED0F1D3A967E44DEACA6FAB777F42C381">
+    <w:name w:val="ED0F1D3A967E44DEACA6FAB777F42C381"/>
+    <w:rsid w:val="00DE4C99"/>
+    <w:pPr>
+      <w:spacing w:before="40" w:after="40" w:line="240" w:lineRule="auto"/>
+    </w:pPr>
+    <w:rPr>
+      <w:rFonts w:ascii="Times New Roman" w:eastAsia="Times New Roman" w:hAnsi="Times New Roman" w:cs="Times New Roman"/>
+      <w:sz w:val="24"/>
+      <w:szCs w:val="20"/>
+    </w:rPr>
+  </w:style>
+  <w:style w:type="paragraph" w:customStyle="1" w:styleId="9EE6A410E46E484D832EE3D6F458F9131">
+    <w:name w:val="9EE6A410E46E484D832EE3D6F458F9131"/>
+    <w:rsid w:val="00DE4C99"/>
+    <w:pPr>
+      <w:spacing w:before="40" w:after="40" w:line="240" w:lineRule="auto"/>
+    </w:pPr>
+    <w:rPr>
+      <w:rFonts w:ascii="Times New Roman" w:eastAsia="Times New Roman" w:hAnsi="Times New Roman" w:cs="Times New Roman"/>
+      <w:sz w:val="24"/>
+      <w:szCs w:val="20"/>
+    </w:rPr>
+  </w:style>
+  <w:style w:type="paragraph" w:customStyle="1" w:styleId="1172965E6EB5428B9EEE3697A16A64A21">
+    <w:name w:val="1172965E6EB5428B9EEE3697A16A64A21"/>
+    <w:rsid w:val="00DE4C99"/>
+    <w:pPr>
+      <w:spacing w:before="40" w:after="40" w:line="240" w:lineRule="auto"/>
+    </w:pPr>
+    <w:rPr>
+      <w:rFonts w:ascii="Times New Roman" w:eastAsia="Times New Roman" w:hAnsi="Times New Roman" w:cs="Times New Roman"/>
+      <w:sz w:val="24"/>
+      <w:szCs w:val="20"/>
+    </w:rPr>
+  </w:style>
+  <w:style w:type="paragraph" w:customStyle="1" w:styleId="5A6D68353161404D8020799FA59BD52D1">
+    <w:name w:val="5A6D68353161404D8020799FA59BD52D1"/>
+    <w:rsid w:val="00DE4C99"/>
+    <w:pPr>
+      <w:spacing w:before="40" w:after="40" w:line="240" w:lineRule="auto"/>
+    </w:pPr>
+    <w:rPr>
+      <w:rFonts w:ascii="Times New Roman" w:eastAsia="Times New Roman" w:hAnsi="Times New Roman" w:cs="Times New Roman"/>
+      <w:sz w:val="24"/>
+      <w:szCs w:val="20"/>
+    </w:rPr>
+  </w:style>
+  <w:style w:type="paragraph" w:customStyle="1" w:styleId="74EC21933C7348BEBE4EF4FACE81684C1">
+    <w:name w:val="74EC21933C7348BEBE4EF4FACE81684C1"/>
+    <w:rsid w:val="00DE4C99"/>
+    <w:pPr>
+      <w:spacing w:before="40" w:after="40" w:line="240" w:lineRule="auto"/>
+    </w:pPr>
+    <w:rPr>
+      <w:rFonts w:ascii="Times New Roman" w:eastAsia="Times New Roman" w:hAnsi="Times New Roman" w:cs="Times New Roman"/>
+      <w:sz w:val="24"/>
+      <w:szCs w:val="20"/>
+    </w:rPr>
+  </w:style>
+  <w:style w:type="paragraph" w:customStyle="1" w:styleId="02ABC3E7E1D84DDD98A3AA83D359A3C11">
+    <w:name w:val="02ABC3E7E1D84DDD98A3AA83D359A3C11"/>
+    <w:rsid w:val="00DE4C99"/>
+    <w:pPr>
+      <w:spacing w:before="40" w:after="40" w:line="240" w:lineRule="auto"/>
+    </w:pPr>
+    <w:rPr>
+      <w:rFonts w:ascii="Times New Roman" w:eastAsia="Times New Roman" w:hAnsi="Times New Roman" w:cs="Times New Roman"/>
+      <w:sz w:val="24"/>
+      <w:szCs w:val="20"/>
+    </w:rPr>
+  </w:style>
+  <w:style w:type="paragraph" w:customStyle="1" w:styleId="3A48DB68078D41DDB3FA347D69C884571">
+    <w:name w:val="3A48DB68078D41DDB3FA347D69C884571"/>
+    <w:rsid w:val="00DE4C99"/>
+    <w:pPr>
+      <w:spacing w:before="40" w:after="40" w:line="240" w:lineRule="auto"/>
+    </w:pPr>
+    <w:rPr>
+      <w:rFonts w:ascii="Times New Roman" w:eastAsia="Times New Roman" w:hAnsi="Times New Roman" w:cs="Times New Roman"/>
+      <w:sz w:val="24"/>
+      <w:szCs w:val="20"/>
+    </w:rPr>
+  </w:style>
+  <w:style w:type="paragraph" w:customStyle="1" w:styleId="362DB8B0D56240B292FD8AA345851FB61">
+    <w:name w:val="362DB8B0D56240B292FD8AA345851FB61"/>
+    <w:rsid w:val="00DE4C99"/>
+    <w:pPr>
+      <w:spacing w:before="40" w:after="40" w:line="240" w:lineRule="auto"/>
+    </w:pPr>
+    <w:rPr>
+      <w:rFonts w:ascii="Times New Roman" w:eastAsia="Times New Roman" w:hAnsi="Times New Roman" w:cs="Times New Roman"/>
+      <w:sz w:val="24"/>
+      <w:szCs w:val="20"/>
+    </w:rPr>
+  </w:style>
+  <w:style w:type="paragraph" w:customStyle="1" w:styleId="8709F89835BF45559EBBDE082AFEFB131">
+    <w:name w:val="8709F89835BF45559EBBDE082AFEFB131"/>
+    <w:rsid w:val="00DE4C99"/>
+    <w:pPr>
+      <w:spacing w:before="40" w:after="40" w:line="240" w:lineRule="auto"/>
+    </w:pPr>
+    <w:rPr>
+      <w:rFonts w:ascii="Times New Roman" w:eastAsia="Times New Roman" w:hAnsi="Times New Roman" w:cs="Times New Roman"/>
+      <w:sz w:val="24"/>
+      <w:szCs w:val="20"/>
+    </w:rPr>
+  </w:style>
+  <w:style w:type="paragraph" w:customStyle="1" w:styleId="2EADCBB08BC6479D948516FC0B012D181">
+    <w:name w:val="2EADCBB08BC6479D948516FC0B012D181"/>
+    <w:rsid w:val="00DE4C99"/>
+    <w:pPr>
+      <w:spacing w:before="40" w:after="40" w:line="240" w:lineRule="auto"/>
+    </w:pPr>
+    <w:rPr>
+      <w:rFonts w:ascii="Times New Roman" w:eastAsia="Times New Roman" w:hAnsi="Times New Roman" w:cs="Times New Roman"/>
+      <w:sz w:val="24"/>
+      <w:szCs w:val="20"/>
+    </w:rPr>
+  </w:style>
+  <w:style w:type="paragraph" w:customStyle="1" w:styleId="137428D61C6640268F56BB76B9153C141">
+    <w:name w:val="137428D61C6640268F56BB76B9153C141"/>
+    <w:rsid w:val="00DE4C99"/>
+    <w:pPr>
+      <w:spacing w:before="40" w:after="40" w:line="240" w:lineRule="auto"/>
+    </w:pPr>
+    <w:rPr>
+      <w:rFonts w:ascii="Times New Roman" w:eastAsia="Times New Roman" w:hAnsi="Times New Roman" w:cs="Times New Roman"/>
+      <w:sz w:val="24"/>
+      <w:szCs w:val="20"/>
+    </w:rPr>
+  </w:style>
+  <w:style w:type="paragraph" w:customStyle="1" w:styleId="5B4F51D3217A49DD952A6A016B67B6B41">
+    <w:name w:val="5B4F51D3217A49DD952A6A016B67B6B41"/>
+    <w:rsid w:val="00DE4C99"/>
+    <w:pPr>
+      <w:spacing w:before="40" w:after="40" w:line="240" w:lineRule="auto"/>
+    </w:pPr>
+    <w:rPr>
+      <w:rFonts w:ascii="Times New Roman" w:eastAsia="Times New Roman" w:hAnsi="Times New Roman" w:cs="Times New Roman"/>
+      <w:sz w:val="24"/>
+      <w:szCs w:val="20"/>
+    </w:rPr>
+  </w:style>
+  <w:style w:type="paragraph" w:customStyle="1" w:styleId="109EBDB68ACB4F68AA508E059E90054B1">
+    <w:name w:val="109EBDB68ACB4F68AA508E059E90054B1"/>
+    <w:rsid w:val="00DE4C99"/>
+    <w:pPr>
+      <w:spacing w:before="40" w:after="40" w:line="240" w:lineRule="auto"/>
+    </w:pPr>
+    <w:rPr>
+      <w:rFonts w:ascii="Times New Roman" w:eastAsia="Times New Roman" w:hAnsi="Times New Roman" w:cs="Times New Roman"/>
+      <w:sz w:val="24"/>
+      <w:szCs w:val="20"/>
+    </w:rPr>
+  </w:style>
+  <w:style w:type="paragraph" w:customStyle="1" w:styleId="6019D068AD7940F6A066B0EBAB40D7BA1">
+    <w:name w:val="6019D068AD7940F6A066B0EBAB40D7BA1"/>
+    <w:rsid w:val="00DE4C99"/>
+    <w:pPr>
+      <w:spacing w:before="40" w:after="40" w:line="240" w:lineRule="auto"/>
+    </w:pPr>
+    <w:rPr>
+      <w:rFonts w:ascii="Times New Roman" w:eastAsia="Times New Roman" w:hAnsi="Times New Roman" w:cs="Times New Roman"/>
+      <w:sz w:val="24"/>
+      <w:szCs w:val="20"/>
+    </w:rPr>
+  </w:style>
+  <w:style w:type="paragraph" w:customStyle="1" w:styleId="F393672CD99D4555816A23E5886E23271">
+    <w:name w:val="F393672CD99D4555816A23E5886E23271"/>
+    <w:rsid w:val="00DE4C99"/>
+    <w:pPr>
+      <w:spacing w:after="0" w:line="240" w:lineRule="auto"/>
+    </w:pPr>
+    <w:rPr>
+      <w:rFonts w:ascii="Times New Roman" w:eastAsia="Times New Roman" w:hAnsi="Times New Roman" w:cs="Times New Roman"/>
+      <w:sz w:val="24"/>
+      <w:szCs w:val="24"/>
+    </w:rPr>
+  </w:style>
+  <w:style w:type="paragraph" w:customStyle="1" w:styleId="30F99A229E124EE294268C7BB07E79191">
+    <w:name w:val="30F99A229E124EE294268C7BB07E79191"/>
+    <w:rsid w:val="00DE4C99"/>
+    <w:pPr>
+      <w:spacing w:before="40" w:after="40" w:line="240" w:lineRule="auto"/>
+    </w:pPr>
+    <w:rPr>
+      <w:rFonts w:ascii="Times New Roman" w:eastAsia="Times New Roman" w:hAnsi="Times New Roman" w:cs="Times New Roman"/>
+      <w:sz w:val="24"/>
+      <w:szCs w:val="20"/>
+    </w:rPr>
+  </w:style>
+  <w:style w:type="paragraph" w:customStyle="1" w:styleId="29F6C8F05FCF47999777CB15AA70B7901">
+    <w:name w:val="29F6C8F05FCF47999777CB15AA70B7901"/>
+    <w:rsid w:val="00DE4C99"/>
+    <w:pPr>
+      <w:spacing w:before="40" w:after="40" w:line="240" w:lineRule="auto"/>
+    </w:pPr>
+    <w:rPr>
+      <w:rFonts w:ascii="Times New Roman" w:eastAsia="Times New Roman" w:hAnsi="Times New Roman" w:cs="Times New Roman"/>
+      <w:sz w:val="24"/>
+      <w:szCs w:val="20"/>
+    </w:rPr>
+  </w:style>
+  <w:style w:type="paragraph" w:customStyle="1" w:styleId="C27700D16ED9448787CE1EF74661419C1">
+    <w:name w:val="C27700D16ED9448787CE1EF74661419C1"/>
+    <w:rsid w:val="00DE4C99"/>
+    <w:pPr>
+      <w:spacing w:before="40" w:after="40" w:line="240" w:lineRule="auto"/>
+    </w:pPr>
+    <w:rPr>
+      <w:rFonts w:ascii="Times New Roman" w:eastAsia="Times New Roman" w:hAnsi="Times New Roman" w:cs="Times New Roman"/>
+      <w:sz w:val="24"/>
+      <w:szCs w:val="20"/>
+    </w:rPr>
+  </w:style>
+  <w:style w:type="paragraph" w:customStyle="1" w:styleId="4B2DF1FDE8B74601B70170992E70A6931">
+    <w:name w:val="4B2DF1FDE8B74601B70170992E70A6931"/>
+    <w:rsid w:val="00DE4C99"/>
+    <w:pPr>
+      <w:spacing w:before="40" w:after="40" w:line="240" w:lineRule="auto"/>
+    </w:pPr>
+    <w:rPr>
+      <w:rFonts w:ascii="Times New Roman" w:eastAsia="Times New Roman" w:hAnsi="Times New Roman" w:cs="Times New Roman"/>
+      <w:sz w:val="24"/>
+      <w:szCs w:val="20"/>
+    </w:rPr>
+  </w:style>
+  <w:style w:type="paragraph" w:customStyle="1" w:styleId="35C0BB7B77F54014BB468B7A716EBA4D1">
+    <w:name w:val="35C0BB7B77F54014BB468B7A716EBA4D1"/>
+    <w:rsid w:val="00DE4C99"/>
+    <w:pPr>
+      <w:spacing w:after="0" w:line="240" w:lineRule="auto"/>
+    </w:pPr>
+    <w:rPr>
+      <w:rFonts w:ascii="Times New Roman" w:eastAsia="Times New Roman" w:hAnsi="Times New Roman" w:cs="Times New Roman"/>
+      <w:sz w:val="24"/>
+      <w:szCs w:val="24"/>
     </w:rPr>
   </w:style>
 </w:styles>
@@ -8988,12 +9621,21 @@
 </file>
 
 <file path=customXml/item1.xml><?xml version="1.0" encoding="utf-8"?>
-<?mso-contentType ?>
-<FormTemplates xmlns="http://schemas.microsoft.com/sharepoint/v3/contenttype/forms">
-  <Display>DocumentLibraryForm</Display>
-  <Edit>DocumentLibraryForm</Edit>
-  <New>DocumentLibraryForm</New>
-</FormTemplates>
+<p:properties xmlns:p="http://schemas.microsoft.com/office/2006/metadata/properties" xmlns:xsi="http://www.w3.org/2001/XMLSchema-instance" xmlns:pc="http://schemas.microsoft.com/office/infopath/2007/PartnerControls">
+  <documentManagement>
+    <TaxKeywordTaxHTField xmlns="016c310d-f661-49a6-97ee-540076082437">
+      <Terms xmlns="http://schemas.microsoft.com/office/infopath/2007/PartnerControls">
+        <TermInfo xmlns="http://schemas.microsoft.com/office/infopath/2007/PartnerControls">
+          <TermName xmlns="http://schemas.microsoft.com/office/infopath/2007/PartnerControls">Unrestricted</TermName>
+          <TermId xmlns="http://schemas.microsoft.com/office/infopath/2007/PartnerControls">11111111-1111-1111-1111-111111111111</TermId>
+        </TermInfo>
+      </Terms>
+    </TaxKeywordTaxHTField>
+    <TaxCatchAll xmlns="016c310d-f661-49a6-97ee-540076082437"/>
+    <SIP_Label_Document xmlns="016c310d-f661-49a6-97ee-540076082437">;#0;#Unrestricted;#True;#;#;#;#</SIP_Label_Document>
+    <AverageRating xmlns="http://schemas.microsoft.com/sharepoint/v3" xsi:nil="true"/>
+  </documentManagement>
+</p:properties>
 </file>
 
 <file path=customXml/item2.xml><?xml version="1.0" encoding="utf-8"?>
@@ -9160,21 +9802,12 @@
 </file>
 
 <file path=customXml/item3.xml><?xml version="1.0" encoding="utf-8"?>
-<p:properties xmlns:p="http://schemas.microsoft.com/office/2006/metadata/properties" xmlns:xsi="http://www.w3.org/2001/XMLSchema-instance" xmlns:pc="http://schemas.microsoft.com/office/infopath/2007/PartnerControls">
-  <documentManagement>
-    <TaxKeywordTaxHTField xmlns="016c310d-f661-49a6-97ee-540076082437">
-      <Terms xmlns="http://schemas.microsoft.com/office/infopath/2007/PartnerControls">
-        <TermInfo xmlns="http://schemas.microsoft.com/office/infopath/2007/PartnerControls">
-          <TermName xmlns="http://schemas.microsoft.com/office/infopath/2007/PartnerControls">Unrestricted</TermName>
-          <TermId xmlns="http://schemas.microsoft.com/office/infopath/2007/PartnerControls">11111111-1111-1111-1111-111111111111</TermId>
-        </TermInfo>
-      </Terms>
-    </TaxKeywordTaxHTField>
-    <TaxCatchAll xmlns="016c310d-f661-49a6-97ee-540076082437"/>
-    <SIP_Label_Document xmlns="016c310d-f661-49a6-97ee-540076082437">;#0;#Unrestricted;#True;#;#;#;#</SIP_Label_Document>
-    <AverageRating xmlns="http://schemas.microsoft.com/sharepoint/v3" xsi:nil="true"/>
-  </documentManagement>
-</p:properties>
+<?mso-contentType ?>
+<FormTemplates xmlns="http://schemas.microsoft.com/sharepoint/v3/contenttype/forms">
+  <Display>DocumentLibraryForm</Display>
+  <Edit>DocumentLibraryForm</Edit>
+  <New>DocumentLibraryForm</New>
+</FormTemplates>
 </file>
 
 <file path=customXml/item4.xml><?xml version="1.0" encoding="utf-8"?>
@@ -9182,9 +9815,12 @@
 </file>
 
 <file path=customXml/itemProps1.xml><?xml version="1.0" encoding="utf-8"?>
-<ds:datastoreItem xmlns:ds="http://schemas.openxmlformats.org/officeDocument/2006/customXml" ds:itemID="{6A21EC55-C1B2-4765-90AC-37A4F1604205}">
+<ds:datastoreItem xmlns:ds="http://schemas.openxmlformats.org/officeDocument/2006/customXml" ds:itemID="{033400F4-1F04-4DBC-9784-C8B3AA89B53C}">
   <ds:schemaRefs>
-    <ds:schemaRef ds:uri="http://schemas.microsoft.com/sharepoint/v3/contenttype/forms"/>
+    <ds:schemaRef ds:uri="http://schemas.microsoft.com/office/2006/metadata/properties"/>
+    <ds:schemaRef ds:uri="http://schemas.microsoft.com/office/infopath/2007/PartnerControls"/>
+    <ds:schemaRef ds:uri="016c310d-f661-49a6-97ee-540076082437"/>
+    <ds:schemaRef ds:uri="http://schemas.microsoft.com/sharepoint/v3"/>
   </ds:schemaRefs>
 </ds:datastoreItem>
 </file>
@@ -9209,12 +9845,9 @@
 </file>
 
 <file path=customXml/itemProps3.xml><?xml version="1.0" encoding="utf-8"?>
-<ds:datastoreItem xmlns:ds="http://schemas.openxmlformats.org/officeDocument/2006/customXml" ds:itemID="{033400F4-1F04-4DBC-9784-C8B3AA89B53C}">
+<ds:datastoreItem xmlns:ds="http://schemas.openxmlformats.org/officeDocument/2006/customXml" ds:itemID="{6A21EC55-C1B2-4765-90AC-37A4F1604205}">
   <ds:schemaRefs>
-    <ds:schemaRef ds:uri="http://schemas.microsoft.com/office/2006/metadata/properties"/>
-    <ds:schemaRef ds:uri="http://schemas.microsoft.com/office/infopath/2007/PartnerControls"/>
-    <ds:schemaRef ds:uri="016c310d-f661-49a6-97ee-540076082437"/>
-    <ds:schemaRef ds:uri="http://schemas.microsoft.com/sharepoint/v3"/>
+    <ds:schemaRef ds:uri="http://schemas.microsoft.com/sharepoint/v3/contenttype/forms"/>
   </ds:schemaRefs>
 </ds:datastoreItem>
 </file>

</xml_diff>

<commit_message>
add new PBOE fields, update template layout
</commit_message>
<xml_diff>
--- a/GenBOE/GenBOE.Web/Templates/Export/PBOE_1.docx
+++ b/GenBOE/GenBOE.Web/Templates/Export/PBOE_1.docx
@@ -264,8 +264,9 @@
     </w:p>
     <w:tbl>
       <w:tblPr>
+        <w:tblpPr w:leftFromText="180" w:rightFromText="180" w:vertAnchor="text" w:tblpY="1"/>
+        <w:tblOverlap w:val="never"/>
         <w:tblW w:w="10530" w:type="dxa"/>
-        <w:tblInd w:w="-5" w:type="dxa"/>
         <w:tblBorders>
           <w:top w:val="single" w:sz="4" w:space="0" w:color="auto"/>
           <w:left w:val="single" w:sz="4" w:space="0" w:color="auto"/>
@@ -282,11 +283,11 @@
         <w:gridCol w:w="720"/>
         <w:gridCol w:w="1080"/>
         <w:gridCol w:w="900"/>
+        <w:gridCol w:w="270"/>
+        <w:gridCol w:w="450"/>
+        <w:gridCol w:w="900"/>
         <w:gridCol w:w="990"/>
-        <w:gridCol w:w="23"/>
-        <w:gridCol w:w="607"/>
-        <w:gridCol w:w="517"/>
-        <w:gridCol w:w="3263"/>
+        <w:gridCol w:w="2790"/>
       </w:tblGrid>
       <w:tr>
         <w:trPr>
@@ -335,7 +336,7 @@
                 <w:tag w:val="Supplier"/>
                 <w:id w:val="-948321555"/>
                 <w:placeholder>
-                  <w:docPart w:val="CA82DD6241384C818C8BF61861CDABE0"/>
+                  <w:docPart w:val="A21103D146BE467DA5D7E7C6625735B3"/>
                 </w:placeholder>
                 <w:showingPlcHdr/>
                 <w:text/>
@@ -354,8 +355,75 @@
         </w:tc>
         <w:tc>
           <w:tcPr>
-            <w:tcW w:w="4117" w:type="dxa"/>
-            <w:gridSpan w:val="6"/>
+            <w:tcW w:w="2250" w:type="dxa"/>
+            <w:gridSpan w:val="3"/>
+            <w:tcBorders>
+              <w:bottom w:val="single" w:sz="4" w:space="0" w:color="auto"/>
+            </w:tcBorders>
+          </w:tcPr>
+          <w:p>
+            <w:pPr>
+              <w:pStyle w:val="Table"/>
+              <w:jc w:val="center"/>
+              <w:rPr>
+                <w:b/>
+                <w:sz w:val="20"/>
+              </w:rPr>
+            </w:pPr>
+            <w:r>
+              <w:rPr>
+                <w:b/>
+                <w:sz w:val="20"/>
+              </w:rPr>
+              <w:t>Vendor ID</w:t>
+            </w:r>
+            <w:r>
+              <w:rPr>
+                <w:b/>
+                <w:sz w:val="20"/>
+              </w:rPr>
+              <w:t>:</w:t>
+            </w:r>
+          </w:p>
+          <w:p>
+            <w:pPr>
+              <w:pStyle w:val="Table"/>
+              <w:rPr>
+                <w:b/>
+                <w:szCs w:val="24"/>
+              </w:rPr>
+            </w:pPr>
+            <w:sdt>
+              <w:sdtPr>
+                <w:rPr>
+                  <w:b/>
+                  <w:szCs w:val="24"/>
+                </w:rPr>
+                <w:alias w:val="VendorId"/>
+                <w:tag w:val="VendorId"/>
+                <w:id w:val="-728533909"/>
+                <w:placeholder>
+                  <w:docPart w:val="A19003FFDCED44E6AE75EF497FDA5033"/>
+                </w:placeholder>
+                <w:showingPlcHdr/>
+              </w:sdtPr>
+              <w:sdtEndPr/>
+              <w:sdtContent>
+                <w:r>
+                  <w:rPr>
+                    <w:bCs/>
+                    <w:sz w:val="20"/>
+                  </w:rPr>
+                  <w:t>VendorId</w:t>
+                </w:r>
+              </w:sdtContent>
+            </w:sdt>
+          </w:p>
+        </w:tc>
+        <w:tc>
+          <w:tcPr>
+            <w:tcW w:w="2340" w:type="dxa"/>
+            <w:gridSpan w:val="3"/>
             <w:tcBorders>
               <w:bottom w:val="single" w:sz="4" w:space="0" w:color="auto"/>
             </w:tcBorders>
@@ -401,7 +469,7 @@
                 <w:tag w:val="RFP"/>
                 <w:id w:val="632059734"/>
                 <w:placeholder>
-                  <w:docPart w:val="DE29BAE756844C0A896C572548D472C0"/>
+                  <w:docPart w:val="92A0C0EEDE5C4267A559E59DCE7FFBF7"/>
                 </w:placeholder>
                 <w:showingPlcHdr/>
                 <w:text/>
@@ -420,7 +488,7 @@
         </w:tc>
         <w:tc>
           <w:tcPr>
-            <w:tcW w:w="3263" w:type="dxa"/>
+            <w:tcW w:w="2790" w:type="dxa"/>
             <w:tcBorders>
               <w:bottom w:val="single" w:sz="4" w:space="0" w:color="auto"/>
             </w:tcBorders>
@@ -475,7 +543,7 @@
                 <w:tag w:val="POP"/>
                 <w:id w:val="1472334827"/>
                 <w:placeholder>
-                  <w:docPart w:val="3CD385EBACBB4BF5A95C1422AC098889"/>
+                  <w:docPart w:val="1ADEAB9BA9334CD7BEC907D2E8C9C6A9"/>
                 </w:placeholder>
                 <w:showingPlcHdr/>
                 <w:text/>
@@ -499,7 +567,7 @@
         </w:trPr>
         <w:tc>
           <w:tcPr>
-            <w:tcW w:w="6143" w:type="dxa"/>
+            <w:tcW w:w="5850" w:type="dxa"/>
             <w:gridSpan w:val="6"/>
             <w:tcBorders>
               <w:left w:val="single" w:sz="4" w:space="0" w:color="auto"/>
@@ -551,7 +619,7 @@
         </w:tc>
         <w:tc>
           <w:tcPr>
-            <w:tcW w:w="4387" w:type="dxa"/>
+            <w:tcW w:w="4680" w:type="dxa"/>
             <w:gridSpan w:val="3"/>
             <w:tcBorders>
               <w:left w:val="single" w:sz="4" w:space="0" w:color="auto"/>
@@ -606,7 +674,7 @@
         </w:trPr>
         <w:tc>
           <w:tcPr>
-            <w:tcW w:w="6143" w:type="dxa"/>
+            <w:tcW w:w="5850" w:type="dxa"/>
             <w:gridSpan w:val="6"/>
             <w:tcBorders>
               <w:left w:val="single" w:sz="4" w:space="0" w:color="auto"/>
@@ -679,7 +747,7 @@
         </w:tc>
         <w:tc>
           <w:tcPr>
-            <w:tcW w:w="4387" w:type="dxa"/>
+            <w:tcW w:w="4680" w:type="dxa"/>
             <w:gridSpan w:val="3"/>
             <w:tcBorders>
               <w:left w:val="single" w:sz="4" w:space="0" w:color="auto"/>
@@ -693,6 +761,45 @@
                 <w:sz w:val="20"/>
               </w:rPr>
             </w:pPr>
+            <w:r>
+              <w:rPr>
+                <w:b/>
+                <w:sz w:val="20"/>
+              </w:rPr>
+              <w:t xml:space="preserve">Supplier Proposed Value: </w:t>
+            </w:r>
+            <w:sdt>
+              <w:sdtPr>
+                <w:rPr>
+                  <w:bCs/>
+                  <w:sz w:val="20"/>
+                </w:rPr>
+                <w:alias w:val="SupplierProposedValue"/>
+                <w:tag w:val="SupplierProposedValue"/>
+                <w:id w:val="-1991784785"/>
+                <w:placeholder>
+                  <w:docPart w:val="3F2A188C26EE4B4A89DDD98BEE5C3825"/>
+                </w:placeholder>
+                <w:showingPlcHdr/>
+              </w:sdtPr>
+              <w:sdtEndPr/>
+              <w:sdtContent>
+                <w:r>
+                  <w:rPr>
+                    <w:bCs/>
+                    <w:sz w:val="20"/>
+                  </w:rPr>
+                  <w:t>SP</w:t>
+                </w:r>
+                <w:r>
+                  <w:rPr>
+                    <w:bCs/>
+                    <w:sz w:val="20"/>
+                  </w:rPr>
+                  <w:t>V</w:t>
+                </w:r>
+              </w:sdtContent>
+            </w:sdt>
           </w:p>
         </w:tc>
       </w:tr>
@@ -845,8 +952,8 @@
         </w:tc>
         <w:tc>
           <w:tcPr>
-            <w:tcW w:w="1890" w:type="dxa"/>
-            <w:gridSpan w:val="2"/>
+            <w:tcW w:w="1620" w:type="dxa"/>
+            <w:gridSpan w:val="3"/>
             <w:tcBorders>
               <w:bottom w:val="single" w:sz="4" w:space="0" w:color="auto"/>
             </w:tcBorders>
@@ -871,8 +978,8 @@
         </w:tc>
         <w:tc>
           <w:tcPr>
-            <w:tcW w:w="4410" w:type="dxa"/>
-            <w:gridSpan w:val="4"/>
+            <w:tcW w:w="4680" w:type="dxa"/>
+            <w:gridSpan w:val="3"/>
             <w:tcBorders>
               <w:bottom w:val="single" w:sz="4" w:space="0" w:color="auto"/>
             </w:tcBorders>
@@ -942,8 +1049,8 @@
         </w:tc>
         <w:tc>
           <w:tcPr>
-            <w:tcW w:w="1890" w:type="dxa"/>
-            <w:gridSpan w:val="2"/>
+            <w:tcW w:w="1620" w:type="dxa"/>
+            <w:gridSpan w:val="3"/>
             <w:tcBorders>
               <w:top w:val="single" w:sz="4" w:space="0" w:color="auto"/>
               <w:bottom w:val="nil"/>
@@ -961,8 +1068,8 @@
         </w:tc>
         <w:tc>
           <w:tcPr>
-            <w:tcW w:w="4410" w:type="dxa"/>
-            <w:gridSpan w:val="4"/>
+            <w:tcW w:w="4680" w:type="dxa"/>
+            <w:gridSpan w:val="3"/>
             <w:tcBorders>
               <w:top w:val="single" w:sz="4" w:space="0" w:color="auto"/>
               <w:bottom w:val="nil"/>
@@ -1076,8 +1183,8 @@
         </w:tc>
         <w:tc>
           <w:tcPr>
-            <w:tcW w:w="1890" w:type="dxa"/>
-            <w:gridSpan w:val="2"/>
+            <w:tcW w:w="1620" w:type="dxa"/>
+            <w:gridSpan w:val="3"/>
             <w:tcBorders>
               <w:top w:val="nil"/>
               <w:bottom w:val="nil"/>
@@ -1113,8 +1220,8 @@
         </w:tc>
         <w:tc>
           <w:tcPr>
-            <w:tcW w:w="4410" w:type="dxa"/>
-            <w:gridSpan w:val="4"/>
+            <w:tcW w:w="4680" w:type="dxa"/>
+            <w:gridSpan w:val="3"/>
             <w:tcBorders>
               <w:top w:val="nil"/>
               <w:bottom w:val="nil"/>
@@ -1207,8 +1314,8 @@
         </w:tc>
         <w:tc>
           <w:tcPr>
-            <w:tcW w:w="1890" w:type="dxa"/>
-            <w:gridSpan w:val="2"/>
+            <w:tcW w:w="1620" w:type="dxa"/>
+            <w:gridSpan w:val="3"/>
             <w:tcBorders>
               <w:top w:val="nil"/>
               <w:bottom w:val="nil"/>
@@ -1246,8 +1353,8 @@
         </w:tc>
         <w:tc>
           <w:tcPr>
-            <w:tcW w:w="4410" w:type="dxa"/>
-            <w:gridSpan w:val="4"/>
+            <w:tcW w:w="4680" w:type="dxa"/>
+            <w:gridSpan w:val="3"/>
             <w:tcBorders>
               <w:top w:val="nil"/>
               <w:bottom w:val="nil"/>
@@ -1364,8 +1471,8 @@
         </w:tc>
         <w:tc>
           <w:tcPr>
-            <w:tcW w:w="1890" w:type="dxa"/>
-            <w:gridSpan w:val="2"/>
+            <w:tcW w:w="1620" w:type="dxa"/>
+            <w:gridSpan w:val="3"/>
             <w:tcBorders>
               <w:top w:val="nil"/>
               <w:bottom w:val="single" w:sz="4" w:space="0" w:color="auto"/>
@@ -1402,8 +1509,8 @@
         </w:tc>
         <w:tc>
           <w:tcPr>
-            <w:tcW w:w="4410" w:type="dxa"/>
-            <w:gridSpan w:val="4"/>
+            <w:tcW w:w="4680" w:type="dxa"/>
+            <w:gridSpan w:val="3"/>
             <w:tcBorders>
               <w:top w:val="nil"/>
               <w:bottom w:val="single" w:sz="4" w:space="0" w:color="auto"/>
@@ -1973,21 +2080,7 @@
               <w:rPr>
                 <w:sz w:val="20"/>
               </w:rPr>
-              <w:t xml:space="preserve">    Commercial Item </w:t>
-            </w:r>
-          </w:p>
-          <w:p>
-            <w:pPr>
-              <w:pStyle w:val="Table"/>
-              <w:rPr>
-                <w:sz w:val="20"/>
-              </w:rPr>
-            </w:pPr>
-            <w:r>
-              <w:rPr>
-                <w:sz w:val="20"/>
-              </w:rPr>
-              <w:t xml:space="preserve">       Exception applies</w:t>
+              <w:t xml:space="preserve">    Commercial Item Exception applies</w:t>
             </w:r>
           </w:p>
           <w:p>
@@ -2277,7 +2370,6 @@
                 <w:bCs/>
                 <w:u w:val="single"/>
               </w:rPr>
-              <w:lastRenderedPageBreak/>
               <w:t>SOURCE SELECTION</w:t>
             </w:r>
           </w:p>
@@ -2430,6 +2522,7 @@
                 <w:bCs/>
                 <w:u w:val="single"/>
               </w:rPr>
+              <w:lastRenderedPageBreak/>
               <w:t>COST ANALYSIS (If Applicable)</w:t>
             </w:r>
           </w:p>
@@ -2520,7 +2613,29 @@
                 <w:b/>
                 <w:sz w:val="20"/>
               </w:rPr>
+              <w:lastRenderedPageBreak/>
               <w:t>SCHEDULE OF EVENTS</w:t>
+            </w:r>
+            <w:r>
+              <w:rPr>
+                <w:b/>
+                <w:sz w:val="20"/>
+              </w:rPr>
+              <w:t xml:space="preserve"> (</w:t>
+            </w:r>
+            <w:r>
+              <w:rPr>
+                <w:b/>
+                <w:sz w:val="20"/>
+              </w:rPr>
+              <w:t>date planned if not yet complete; actual date completed; not applicable</w:t>
+            </w:r>
+            <w:r>
+              <w:rPr>
+                <w:b/>
+                <w:sz w:val="20"/>
+              </w:rPr>
+              <w:t>)</w:t>
             </w:r>
           </w:p>
         </w:tc>
@@ -3566,7 +3681,6 @@
               <w:rPr>
                 <w:sz w:val="20"/>
               </w:rPr>
-              <w:lastRenderedPageBreak/>
               <w:t>Technical Evaluation</w:t>
             </w:r>
           </w:p>
@@ -3806,14 +3920,12 @@
           <w:tblLook w:val="0000" w:firstRow="0" w:lastRow="0" w:firstColumn="0" w:lastColumn="0" w:noHBand="0" w:noVBand="0"/>
         </w:tblPrEx>
         <w:trPr>
-          <w:gridAfter w:val="2"/>
-          <w:wAfter w:w="3780" w:type="dxa"/>
           <w:trHeight w:val="360"/>
         </w:trPr>
         <w:tc>
           <w:tcPr>
-            <w:tcW w:w="6750" w:type="dxa"/>
-            <w:gridSpan w:val="7"/>
+            <w:tcW w:w="10530" w:type="dxa"/>
+            <w:gridSpan w:val="9"/>
             <w:tcBorders>
               <w:top w:val="single" w:sz="4" w:space="0" w:color="auto"/>
             </w:tcBorders>
@@ -3978,7 +4090,7 @@
                 <w:tag w:val="POC"/>
                 <w:id w:val="-943071502"/>
                 <w:placeholder>
-                  <w:docPart w:val="30F99A229E124EE294268C7BB07E7919"/>
+                  <w:docPart w:val="4CCCEEE44FAA4C2CA6DCB910D066ECC5"/>
                 </w:placeholder>
                 <w:showingPlcHdr/>
                 <w:text/>
@@ -4012,7 +4124,7 @@
                 <w:tag w:val="Phone"/>
                 <w:id w:val="-555316021"/>
                 <w:placeholder>
-                  <w:docPart w:val="29F6C8F05FCF47999777CB15AA70B790"/>
+                  <w:docPart w:val="19D869DD2C4A457CA357CEBE20BFF6A1"/>
                 </w:placeholder>
                 <w:showingPlcHdr/>
                 <w:text/>
@@ -4046,7 +4158,7 @@
                 <w:tag w:val="Manager"/>
                 <w:id w:val="-1964565742"/>
                 <w:placeholder>
-                  <w:docPart w:val="C27700D16ED9448787CE1EF74661419C"/>
+                  <w:docPart w:val="E0455F61D0864EF291C06B686DD23254"/>
                 </w:placeholder>
                 <w:showingPlcHdr/>
                 <w:text/>
@@ -4080,7 +4192,7 @@
                 <w:tag w:val="ManagerPhone"/>
                 <w:id w:val="-1254809537"/>
                 <w:placeholder>
-                  <w:docPart w:val="4B2DF1FDE8B74601B70170992E70A693"/>
+                  <w:docPart w:val="DB53699693B14054863CA7EF8B0BF1E3"/>
                 </w:placeholder>
                 <w:showingPlcHdr/>
                 <w:text/>
@@ -4101,15 +4213,14 @@
         </w:tc>
       </w:tr>
     </w:tbl>
-    <w:p/>
+    <w:p>
+      <w:r>
+        <w:br w:type="textWrapping" w:clear="all"/>
+      </w:r>
+    </w:p>
     <w:p/>
     <w:sectPr>
-      <w:headerReference w:type="even" r:id="rId12"/>
-      <w:headerReference w:type="default" r:id="rId13"/>
-      <w:footerReference w:type="even" r:id="rId14"/>
-      <w:footerReference w:type="default" r:id="rId15"/>
-      <w:headerReference w:type="first" r:id="rId16"/>
-      <w:footerReference w:type="first" r:id="rId17"/>
+      <w:footerReference w:type="default" r:id="rId12"/>
       <w:pgSz w:w="12240" w:h="15840" w:code="1"/>
       <w:pgMar w:top="1080" w:right="1080" w:bottom="1080" w:left="1080" w:header="504" w:footer="504" w:gutter="0"/>
       <w:cols w:space="720"/>
@@ -4143,16 +4254,6 @@
 <w:ftr xmlns:wpc="http://schemas.microsoft.com/office/word/2010/wordprocessingCanvas" xmlns:cx="http://schemas.microsoft.com/office/drawing/2014/chartex" xmlns:cx1="http://schemas.microsoft.com/office/drawing/2015/9/8/chartex" xmlns:cx2="http://schemas.microsoft.com/office/drawing/2015/10/21/chartex" xmlns:cx3="http://schemas.microsoft.com/office/drawing/2016/5/9/chartex" xmlns:cx4="http://schemas.microsoft.com/office/drawing/2016/5/10/chartex" xmlns:cx5="http://schemas.microsoft.com/office/drawing/2016/5/11/chartex" xmlns:cx6="http://schemas.microsoft.com/office/drawing/2016/5/12/chartex" xmlns:cx7="http://schemas.microsoft.com/office/drawing/2016/5/13/chartex" xmlns:cx8="http://schemas.microsoft.com/office/drawing/2016/5/14/chartex" xmlns:mc="http://schemas.openxmlformats.org/markup-compatibility/2006" xmlns:aink="http://schemas.microsoft.com/office/drawing/2016/ink" xmlns:am3d="http://schemas.microsoft.com/office/drawing/2017/model3d" xmlns:o="urn:schemas-microsoft-com:office:office" xmlns:r="http://schemas.openxmlformats.org/officeDocument/2006/relationships" xmlns:m="http://schemas.openxmlformats.org/officeDocument/2006/math" xmlns:v="urn:schemas-microsoft-com:vml" xmlns:wp14="http://schemas.microsoft.com/office/word/2010/wordprocessingDrawing" xmlns:wp="http://schemas.openxmlformats.org/drawingml/2006/wordprocessingDrawing" xmlns:w10="urn:schemas-microsoft-com:office:word" xmlns:w="http://schemas.openxmlformats.org/wordprocessingml/2006/main" xmlns:w14="http://schemas.microsoft.com/office/word/2010/wordml" xmlns:w15="http://schemas.microsoft.com/office/word/2012/wordml" xmlns:w16cex="http://schemas.microsoft.com/office/word/2018/wordml/cex" xmlns:w16cid="http://schemas.microsoft.com/office/word/2016/wordml/cid" xmlns:w16="http://schemas.microsoft.com/office/word/2018/wordml" xmlns:w16sdtdh="http://schemas.microsoft.com/office/word/2020/wordml/sdtdatahash" xmlns:w16se="http://schemas.microsoft.com/office/word/2015/wordml/symex" xmlns:wpg="http://schemas.microsoft.com/office/word/2010/wordprocessingGroup" xmlns:wpi="http://schemas.microsoft.com/office/word/2010/wordprocessingInk" xmlns:wne="http://schemas.microsoft.com/office/word/2006/wordml" xmlns:wps="http://schemas.microsoft.com/office/word/2010/wordprocessingShape" mc:Ignorable="w14 w15 w16se w16cid w16 w16cex w16sdtdh wp14">
   <w:p>
     <w:pPr>
-      <w:pStyle w:val="Footer"/>
-    </w:pPr>
-  </w:p>
-</w:ftr>
-</file>
-
-<file path=word/footer2.xml><?xml version="1.0" encoding="utf-8"?>
-<w:ftr xmlns:wpc="http://schemas.microsoft.com/office/word/2010/wordprocessingCanvas" xmlns:cx="http://schemas.microsoft.com/office/drawing/2014/chartex" xmlns:cx1="http://schemas.microsoft.com/office/drawing/2015/9/8/chartex" xmlns:cx2="http://schemas.microsoft.com/office/drawing/2015/10/21/chartex" xmlns:cx3="http://schemas.microsoft.com/office/drawing/2016/5/9/chartex" xmlns:cx4="http://schemas.microsoft.com/office/drawing/2016/5/10/chartex" xmlns:cx5="http://schemas.microsoft.com/office/drawing/2016/5/11/chartex" xmlns:cx6="http://schemas.microsoft.com/office/drawing/2016/5/12/chartex" xmlns:cx7="http://schemas.microsoft.com/office/drawing/2016/5/13/chartex" xmlns:cx8="http://schemas.microsoft.com/office/drawing/2016/5/14/chartex" xmlns:mc="http://schemas.openxmlformats.org/markup-compatibility/2006" xmlns:aink="http://schemas.microsoft.com/office/drawing/2016/ink" xmlns:am3d="http://schemas.microsoft.com/office/drawing/2017/model3d" xmlns:o="urn:schemas-microsoft-com:office:office" xmlns:r="http://schemas.openxmlformats.org/officeDocument/2006/relationships" xmlns:m="http://schemas.openxmlformats.org/officeDocument/2006/math" xmlns:v="urn:schemas-microsoft-com:vml" xmlns:wp14="http://schemas.microsoft.com/office/word/2010/wordprocessingDrawing" xmlns:wp="http://schemas.openxmlformats.org/drawingml/2006/wordprocessingDrawing" xmlns:w10="urn:schemas-microsoft-com:office:word" xmlns:w="http://schemas.openxmlformats.org/wordprocessingml/2006/main" xmlns:w14="http://schemas.microsoft.com/office/word/2010/wordml" xmlns:w15="http://schemas.microsoft.com/office/word/2012/wordml" xmlns:w16cex="http://schemas.microsoft.com/office/word/2018/wordml/cex" xmlns:w16cid="http://schemas.microsoft.com/office/word/2016/wordml/cid" xmlns:w16="http://schemas.microsoft.com/office/word/2018/wordml" xmlns:w16sdtdh="http://schemas.microsoft.com/office/word/2020/wordml/sdtdatahash" xmlns:w16se="http://schemas.microsoft.com/office/word/2015/wordml/symex" xmlns:wpg="http://schemas.microsoft.com/office/word/2010/wordprocessingGroup" xmlns:wpi="http://schemas.microsoft.com/office/word/2010/wordprocessingInk" xmlns:wne="http://schemas.microsoft.com/office/word/2006/wordml" xmlns:wps="http://schemas.microsoft.com/office/word/2010/wordprocessingShape" mc:Ignorable="w14 w15 w16se w16cid w16 w16cex w16sdtdh wp14">
-  <w:p>
-    <w:pPr>
       <w:pStyle w:val="FooterTop"/>
       <w:tabs>
         <w:tab w:val="clear" w:pos="10080"/>
@@ -4166,7 +4267,10 @@
       <w:t xml:space="preserve">evision </w:t>
     </w:r>
     <w:r>
-      <w:t>10</w:t>
+      <w:t>1</w:t>
+    </w:r>
+    <w:r>
+      <w:t>2</w:t>
     </w:r>
     <w:r>
       <w:tab/>
@@ -4176,13 +4280,13 @@
       <w:t>0</w:t>
     </w:r>
     <w:r>
-      <w:t>7</w:t>
+      <w:t>4</w:t>
     </w:r>
     <w:r>
       <w:t>-</w:t>
     </w:r>
     <w:r>
-      <w:t>19</w:t>
+      <w:t>21</w:t>
     </w:r>
     <w:r>
       <w:t>-20</w:t>
@@ -4191,7 +4295,7 @@
       <w:t>2</w:t>
     </w:r>
     <w:r>
-      <w:t>1</w:t>
+      <w:t>2</w:t>
     </w:r>
   </w:p>
   <w:p>
@@ -4343,16 +4447,6 @@
 </w:ftr>
 </file>
 
-<file path=word/footer3.xml><?xml version="1.0" encoding="utf-8"?>
-<w:ftr xmlns:wpc="http://schemas.microsoft.com/office/word/2010/wordprocessingCanvas" xmlns:cx="http://schemas.microsoft.com/office/drawing/2014/chartex" xmlns:cx1="http://schemas.microsoft.com/office/drawing/2015/9/8/chartex" xmlns:cx2="http://schemas.microsoft.com/office/drawing/2015/10/21/chartex" xmlns:cx3="http://schemas.microsoft.com/office/drawing/2016/5/9/chartex" xmlns:cx4="http://schemas.microsoft.com/office/drawing/2016/5/10/chartex" xmlns:cx5="http://schemas.microsoft.com/office/drawing/2016/5/11/chartex" xmlns:cx6="http://schemas.microsoft.com/office/drawing/2016/5/12/chartex" xmlns:cx7="http://schemas.microsoft.com/office/drawing/2016/5/13/chartex" xmlns:cx8="http://schemas.microsoft.com/office/drawing/2016/5/14/chartex" xmlns:mc="http://schemas.openxmlformats.org/markup-compatibility/2006" xmlns:aink="http://schemas.microsoft.com/office/drawing/2016/ink" xmlns:am3d="http://schemas.microsoft.com/office/drawing/2017/model3d" xmlns:o="urn:schemas-microsoft-com:office:office" xmlns:r="http://schemas.openxmlformats.org/officeDocument/2006/relationships" xmlns:m="http://schemas.openxmlformats.org/officeDocument/2006/math" xmlns:v="urn:schemas-microsoft-com:vml" xmlns:wp14="http://schemas.microsoft.com/office/word/2010/wordprocessingDrawing" xmlns:wp="http://schemas.openxmlformats.org/drawingml/2006/wordprocessingDrawing" xmlns:w10="urn:schemas-microsoft-com:office:word" xmlns:w="http://schemas.openxmlformats.org/wordprocessingml/2006/main" xmlns:w14="http://schemas.microsoft.com/office/word/2010/wordml" xmlns:w15="http://schemas.microsoft.com/office/word/2012/wordml" xmlns:w16cex="http://schemas.microsoft.com/office/word/2018/wordml/cex" xmlns:w16cid="http://schemas.microsoft.com/office/word/2016/wordml/cid" xmlns:w16="http://schemas.microsoft.com/office/word/2018/wordml" xmlns:w16sdtdh="http://schemas.microsoft.com/office/word/2020/wordml/sdtdatahash" xmlns:w16se="http://schemas.microsoft.com/office/word/2015/wordml/symex" xmlns:wpg="http://schemas.microsoft.com/office/word/2010/wordprocessingGroup" xmlns:wpi="http://schemas.microsoft.com/office/word/2010/wordprocessingInk" xmlns:wne="http://schemas.microsoft.com/office/word/2006/wordml" xmlns:wps="http://schemas.microsoft.com/office/word/2010/wordprocessingShape" mc:Ignorable="w14 w15 w16se w16cid w16 w16cex w16sdtdh wp14">
-  <w:p>
-    <w:pPr>
-      <w:pStyle w:val="Footer"/>
-    </w:pPr>
-  </w:p>
-</w:ftr>
-</file>
-
 <file path=word/footnotes.xml><?xml version="1.0" encoding="utf-8"?>
 <w:footnotes xmlns:wpc="http://schemas.microsoft.com/office/word/2010/wordprocessingCanvas" xmlns:cx="http://schemas.microsoft.com/office/drawing/2014/chartex" xmlns:cx1="http://schemas.microsoft.com/office/drawing/2015/9/8/chartex" xmlns:cx2="http://schemas.microsoft.com/office/drawing/2015/10/21/chartex" xmlns:cx3="http://schemas.microsoft.com/office/drawing/2016/5/9/chartex" xmlns:cx4="http://schemas.microsoft.com/office/drawing/2016/5/10/chartex" xmlns:cx5="http://schemas.microsoft.com/office/drawing/2016/5/11/chartex" xmlns:cx6="http://schemas.microsoft.com/office/drawing/2016/5/12/chartex" xmlns:cx7="http://schemas.microsoft.com/office/drawing/2016/5/13/chartex" xmlns:cx8="http://schemas.microsoft.com/office/drawing/2016/5/14/chartex" xmlns:mc="http://schemas.openxmlformats.org/markup-compatibility/2006" xmlns:aink="http://schemas.microsoft.com/office/drawing/2016/ink" xmlns:am3d="http://schemas.microsoft.com/office/drawing/2017/model3d" xmlns:o="urn:schemas-microsoft-com:office:office" xmlns:r="http://schemas.openxmlformats.org/officeDocument/2006/relationships" xmlns:m="http://schemas.openxmlformats.org/officeDocument/2006/math" xmlns:v="urn:schemas-microsoft-com:vml" xmlns:wp14="http://schemas.microsoft.com/office/word/2010/wordprocessingDrawing" xmlns:wp="http://schemas.openxmlformats.org/drawingml/2006/wordprocessingDrawing" xmlns:w10="urn:schemas-microsoft-com:office:word" xmlns:w="http://schemas.openxmlformats.org/wordprocessingml/2006/main" xmlns:w14="http://schemas.microsoft.com/office/word/2010/wordml" xmlns:w15="http://schemas.microsoft.com/office/word/2012/wordml" xmlns:w16cex="http://schemas.microsoft.com/office/word/2018/wordml/cex" xmlns:w16cid="http://schemas.microsoft.com/office/word/2016/wordml/cid" xmlns:w16="http://schemas.microsoft.com/office/word/2018/wordml" xmlns:w16sdtdh="http://schemas.microsoft.com/office/word/2020/wordml/sdtdatahash" xmlns:w16se="http://schemas.microsoft.com/office/word/2015/wordml/symex" xmlns:wpg="http://schemas.microsoft.com/office/word/2010/wordprocessingGroup" xmlns:wpi="http://schemas.microsoft.com/office/word/2010/wordprocessingInk" xmlns:wne="http://schemas.microsoft.com/office/word/2006/wordml" xmlns:wps="http://schemas.microsoft.com/office/word/2010/wordprocessingShape" mc:Ignorable="w14 w15 w16se w16cid w16 w16cex w16sdtdh wp14">
   <w:footnote w:type="separator" w:id="-1">
@@ -4370,36 +4464,6 @@
     </w:p>
   </w:footnote>
 </w:footnotes>
-</file>
-
-<file path=word/header1.xml><?xml version="1.0" encoding="utf-8"?>
-<w:hdr xmlns:wpc="http://schemas.microsoft.com/office/word/2010/wordprocessingCanvas" xmlns:cx="http://schemas.microsoft.com/office/drawing/2014/chartex" xmlns:cx1="http://schemas.microsoft.com/office/drawing/2015/9/8/chartex" xmlns:cx2="http://schemas.microsoft.com/office/drawing/2015/10/21/chartex" xmlns:cx3="http://schemas.microsoft.com/office/drawing/2016/5/9/chartex" xmlns:cx4="http://schemas.microsoft.com/office/drawing/2016/5/10/chartex" xmlns:cx5="http://schemas.microsoft.com/office/drawing/2016/5/11/chartex" xmlns:cx6="http://schemas.microsoft.com/office/drawing/2016/5/12/chartex" xmlns:cx7="http://schemas.microsoft.com/office/drawing/2016/5/13/chartex" xmlns:cx8="http://schemas.microsoft.com/office/drawing/2016/5/14/chartex" xmlns:mc="http://schemas.openxmlformats.org/markup-compatibility/2006" xmlns:aink="http://schemas.microsoft.com/office/drawing/2016/ink" xmlns:am3d="http://schemas.microsoft.com/office/drawing/2017/model3d" xmlns:o="urn:schemas-microsoft-com:office:office" xmlns:r="http://schemas.openxmlformats.org/officeDocument/2006/relationships" xmlns:m="http://schemas.openxmlformats.org/officeDocument/2006/math" xmlns:v="urn:schemas-microsoft-com:vml" xmlns:wp14="http://schemas.microsoft.com/office/word/2010/wordprocessingDrawing" xmlns:wp="http://schemas.openxmlformats.org/drawingml/2006/wordprocessingDrawing" xmlns:w10="urn:schemas-microsoft-com:office:word" xmlns:w="http://schemas.openxmlformats.org/wordprocessingml/2006/main" xmlns:w14="http://schemas.microsoft.com/office/word/2010/wordml" xmlns:w15="http://schemas.microsoft.com/office/word/2012/wordml" xmlns:w16cex="http://schemas.microsoft.com/office/word/2018/wordml/cex" xmlns:w16cid="http://schemas.microsoft.com/office/word/2016/wordml/cid" xmlns:w16="http://schemas.microsoft.com/office/word/2018/wordml" xmlns:w16sdtdh="http://schemas.microsoft.com/office/word/2020/wordml/sdtdatahash" xmlns:w16se="http://schemas.microsoft.com/office/word/2015/wordml/symex" xmlns:wpg="http://schemas.microsoft.com/office/word/2010/wordprocessingGroup" xmlns:wpi="http://schemas.microsoft.com/office/word/2010/wordprocessingInk" xmlns:wne="http://schemas.microsoft.com/office/word/2006/wordml" xmlns:wps="http://schemas.microsoft.com/office/word/2010/wordprocessingShape" mc:Ignorable="w14 w15 w16se w16cid w16 w16cex w16sdtdh wp14">
-  <w:p>
-    <w:pPr>
-      <w:pStyle w:val="Header"/>
-    </w:pPr>
-  </w:p>
-</w:hdr>
-</file>
-
-<file path=word/header2.xml><?xml version="1.0" encoding="utf-8"?>
-<w:hdr xmlns:wpc="http://schemas.microsoft.com/office/word/2010/wordprocessingCanvas" xmlns:cx="http://schemas.microsoft.com/office/drawing/2014/chartex" xmlns:cx1="http://schemas.microsoft.com/office/drawing/2015/9/8/chartex" xmlns:cx2="http://schemas.microsoft.com/office/drawing/2015/10/21/chartex" xmlns:cx3="http://schemas.microsoft.com/office/drawing/2016/5/9/chartex" xmlns:cx4="http://schemas.microsoft.com/office/drawing/2016/5/10/chartex" xmlns:cx5="http://schemas.microsoft.com/office/drawing/2016/5/11/chartex" xmlns:cx6="http://schemas.microsoft.com/office/drawing/2016/5/12/chartex" xmlns:cx7="http://schemas.microsoft.com/office/drawing/2016/5/13/chartex" xmlns:cx8="http://schemas.microsoft.com/office/drawing/2016/5/14/chartex" xmlns:mc="http://schemas.openxmlformats.org/markup-compatibility/2006" xmlns:aink="http://schemas.microsoft.com/office/drawing/2016/ink" xmlns:am3d="http://schemas.microsoft.com/office/drawing/2017/model3d" xmlns:o="urn:schemas-microsoft-com:office:office" xmlns:r="http://schemas.openxmlformats.org/officeDocument/2006/relationships" xmlns:m="http://schemas.openxmlformats.org/officeDocument/2006/math" xmlns:v="urn:schemas-microsoft-com:vml" xmlns:wp14="http://schemas.microsoft.com/office/word/2010/wordprocessingDrawing" xmlns:wp="http://schemas.openxmlformats.org/drawingml/2006/wordprocessingDrawing" xmlns:w10="urn:schemas-microsoft-com:office:word" xmlns:w="http://schemas.openxmlformats.org/wordprocessingml/2006/main" xmlns:w14="http://schemas.microsoft.com/office/word/2010/wordml" xmlns:w15="http://schemas.microsoft.com/office/word/2012/wordml" xmlns:w16cex="http://schemas.microsoft.com/office/word/2018/wordml/cex" xmlns:w16cid="http://schemas.microsoft.com/office/word/2016/wordml/cid" xmlns:w16="http://schemas.microsoft.com/office/word/2018/wordml" xmlns:w16sdtdh="http://schemas.microsoft.com/office/word/2020/wordml/sdtdatahash" xmlns:w16se="http://schemas.microsoft.com/office/word/2015/wordml/symex" xmlns:wpg="http://schemas.microsoft.com/office/word/2010/wordprocessingGroup" xmlns:wpi="http://schemas.microsoft.com/office/word/2010/wordprocessingInk" xmlns:wne="http://schemas.microsoft.com/office/word/2006/wordml" xmlns:wps="http://schemas.microsoft.com/office/word/2010/wordprocessingShape" mc:Ignorable="w14 w15 w16se w16cid w16 w16cex w16sdtdh wp14">
-  <w:p>
-    <w:pPr>
-      <w:pStyle w:val="Header"/>
-    </w:pPr>
-  </w:p>
-</w:hdr>
-</file>
-
-<file path=word/header3.xml><?xml version="1.0" encoding="utf-8"?>
-<w:hdr xmlns:wpc="http://schemas.microsoft.com/office/word/2010/wordprocessingCanvas" xmlns:cx="http://schemas.microsoft.com/office/drawing/2014/chartex" xmlns:cx1="http://schemas.microsoft.com/office/drawing/2015/9/8/chartex" xmlns:cx2="http://schemas.microsoft.com/office/drawing/2015/10/21/chartex" xmlns:cx3="http://schemas.microsoft.com/office/drawing/2016/5/9/chartex" xmlns:cx4="http://schemas.microsoft.com/office/drawing/2016/5/10/chartex" xmlns:cx5="http://schemas.microsoft.com/office/drawing/2016/5/11/chartex" xmlns:cx6="http://schemas.microsoft.com/office/drawing/2016/5/12/chartex" xmlns:cx7="http://schemas.microsoft.com/office/drawing/2016/5/13/chartex" xmlns:cx8="http://schemas.microsoft.com/office/drawing/2016/5/14/chartex" xmlns:mc="http://schemas.openxmlformats.org/markup-compatibility/2006" xmlns:aink="http://schemas.microsoft.com/office/drawing/2016/ink" xmlns:am3d="http://schemas.microsoft.com/office/drawing/2017/model3d" xmlns:o="urn:schemas-microsoft-com:office:office" xmlns:r="http://schemas.openxmlformats.org/officeDocument/2006/relationships" xmlns:m="http://schemas.openxmlformats.org/officeDocument/2006/math" xmlns:v="urn:schemas-microsoft-com:vml" xmlns:wp14="http://schemas.microsoft.com/office/word/2010/wordprocessingDrawing" xmlns:wp="http://schemas.openxmlformats.org/drawingml/2006/wordprocessingDrawing" xmlns:w10="urn:schemas-microsoft-com:office:word" xmlns:w="http://schemas.openxmlformats.org/wordprocessingml/2006/main" xmlns:w14="http://schemas.microsoft.com/office/word/2010/wordml" xmlns:w15="http://schemas.microsoft.com/office/word/2012/wordml" xmlns:w16cex="http://schemas.microsoft.com/office/word/2018/wordml/cex" xmlns:w16cid="http://schemas.microsoft.com/office/word/2016/wordml/cid" xmlns:w16="http://schemas.microsoft.com/office/word/2018/wordml" xmlns:w16sdtdh="http://schemas.microsoft.com/office/word/2020/wordml/sdtdatahash" xmlns:w16se="http://schemas.microsoft.com/office/word/2015/wordml/symex" xmlns:wpg="http://schemas.microsoft.com/office/word/2010/wordprocessingGroup" xmlns:wpi="http://schemas.microsoft.com/office/word/2010/wordprocessingInk" xmlns:wne="http://schemas.microsoft.com/office/word/2006/wordml" xmlns:wps="http://schemas.microsoft.com/office/word/2010/wordprocessingShape" mc:Ignorable="w14 w15 w16se w16cid w16 w16cex w16sdtdh wp14">
-  <w:p>
-    <w:pPr>
-      <w:pStyle w:val="Header"/>
-    </w:pPr>
-  </w:p>
-</w:hdr>
 </file>
 
 <file path=word/numbering.xml><?xml version="1.0" encoding="utf-8"?>
@@ -6880,7 +6944,7 @@
       <w:docPartBody>
         <w:p>
           <w:pPr>
-            <w:pStyle w:val="3C51D371244C4D18AA8A89DB62DED7821"/>
+            <w:pStyle w:val="3C51D371244C4D18AA8A89DB62DED782"/>
           </w:pPr>
           <w:r>
             <w:rPr>
@@ -6912,7 +6976,7 @@
       <w:docPartBody>
         <w:p>
           <w:pPr>
-            <w:pStyle w:val="DCE06A566B6A4CB3828C398E8B661D831"/>
+            <w:pStyle w:val="DCE06A566B6A4CB3828C398E8B661D83"/>
           </w:pPr>
           <w:r>
             <w:rPr>
@@ -6943,7 +7007,7 @@
       <w:docPartBody>
         <w:p>
           <w:pPr>
-            <w:pStyle w:val="06B8F59F36A54EC096C3AF659F2ADA191"/>
+            <w:pStyle w:val="06B8F59F36A54EC096C3AF659F2ADA19"/>
           </w:pPr>
           <w:r>
             <w:rPr>
@@ -6973,7 +7037,7 @@
       <w:docPartBody>
         <w:p>
           <w:pPr>
-            <w:pStyle w:val="A6983B515BA9432AA6CFEC8362A244781"/>
+            <w:pStyle w:val="A6983B515BA9432AA6CFEC8362A24478"/>
           </w:pPr>
           <w:r>
             <w:rPr>
@@ -7002,7 +7066,7 @@
       <w:docPartBody>
         <w:p>
           <w:pPr>
-            <w:pStyle w:val="5C29C54541614AB4B36209C014760B031"/>
+            <w:pStyle w:val="5C29C54541614AB4B36209C014760B03"/>
           </w:pPr>
           <w:r>
             <w:rPr>
@@ -7032,7 +7096,7 @@
       <w:docPartBody>
         <w:p>
           <w:pPr>
-            <w:pStyle w:val="CF01C4F4D3BE4C58A7642594BBEB44A21"/>
+            <w:pStyle w:val="CF01C4F4D3BE4C58A7642594BBEB44A2"/>
           </w:pPr>
           <w:r>
             <w:rPr>
@@ -7061,7 +7125,7 @@
       <w:docPartBody>
         <w:p>
           <w:pPr>
-            <w:pStyle w:val="2BCD6F010600463D8BE0146C14CF16D71"/>
+            <w:pStyle w:val="2BCD6F010600463D8BE0146C14CF16D7"/>
           </w:pPr>
           <w:r>
             <w:rPr>
@@ -7091,7 +7155,7 @@
       <w:docPartBody>
         <w:p>
           <w:pPr>
-            <w:pStyle w:val="35C0BB7B77F54014BB468B7A716EBA4D1"/>
+            <w:pStyle w:val="35C0BB7B77F54014BB468B7A716EBA4D"/>
           </w:pPr>
           <w:r>
             <w:rPr>
@@ -7122,7 +7186,7 @@
       <w:docPartBody>
         <w:p>
           <w:pPr>
-            <w:pStyle w:val="2D10359A02224706B30FF3D1427A46CC1"/>
+            <w:pStyle w:val="2D10359A02224706B30FF3D1427A46CC"/>
           </w:pPr>
           <w:r>
             <w:rPr>
@@ -7151,7 +7215,7 @@
       <w:docPartBody>
         <w:p>
           <w:pPr>
-            <w:pStyle w:val="9EE6A410E46E484D832EE3D6F458F9131"/>
+            <w:pStyle w:val="9EE6A410E46E484D832EE3D6F458F913"/>
           </w:pPr>
           <w:r>
             <w:rPr>
@@ -7180,7 +7244,7 @@
       <w:docPartBody>
         <w:p>
           <w:pPr>
-            <w:pStyle w:val="5A6D68353161404D8020799FA59BD52D1"/>
+            <w:pStyle w:val="5A6D68353161404D8020799FA59BD52D"/>
           </w:pPr>
           <w:r>
             <w:rPr>
@@ -7209,100 +7273,13 @@
       <w:docPartBody>
         <w:p>
           <w:pPr>
-            <w:pStyle w:val="02ABC3E7E1D84DDD98A3AA83D359A3C11"/>
+            <w:pStyle w:val="02ABC3E7E1D84DDD98A3AA83D359A3C1"/>
           </w:pPr>
           <w:r>
             <w:rPr>
               <w:sz w:val="20"/>
             </w:rPr>
             <w:t>SourceSelection</w:t>
-          </w:r>
-        </w:p>
-      </w:docPartBody>
-    </w:docPart>
-    <w:docPart>
-      <w:docPartPr>
-        <w:name w:val="CA82DD6241384C818C8BF61861CDABE0"/>
-        <w:category>
-          <w:name w:val="General"/>
-          <w:gallery w:val="placeholder"/>
-        </w:category>
-        <w:types>
-          <w:type w:val="bbPlcHdr"/>
-        </w:types>
-        <w:behaviors>
-          <w:behavior w:val="content"/>
-        </w:behaviors>
-        <w:guid w:val="{53C34FFE-CB58-472B-9ED3-9F259B5D8079}"/>
-      </w:docPartPr>
-      <w:docPartBody>
-        <w:p>
-          <w:pPr>
-            <w:pStyle w:val="CA82DD6241384C818C8BF61861CDABE01"/>
-          </w:pPr>
-          <w:r>
-            <w:rPr>
-              <w:sz w:val="20"/>
-            </w:rPr>
-            <w:t>Supplier</w:t>
-          </w:r>
-        </w:p>
-      </w:docPartBody>
-    </w:docPart>
-    <w:docPart>
-      <w:docPartPr>
-        <w:name w:val="DE29BAE756844C0A896C572548D472C0"/>
-        <w:category>
-          <w:name w:val="General"/>
-          <w:gallery w:val="placeholder"/>
-        </w:category>
-        <w:types>
-          <w:type w:val="bbPlcHdr"/>
-        </w:types>
-        <w:behaviors>
-          <w:behavior w:val="content"/>
-        </w:behaviors>
-        <w:guid w:val="{5ABAFED7-FD5F-4F23-BA96-CB475BBE5CEB}"/>
-      </w:docPartPr>
-      <w:docPartBody>
-        <w:p>
-          <w:pPr>
-            <w:pStyle w:val="DE29BAE756844C0A896C572548D472C01"/>
-          </w:pPr>
-          <w:r>
-            <w:rPr>
-              <w:sz w:val="20"/>
-            </w:rPr>
-            <w:t>RFP</w:t>
-          </w:r>
-        </w:p>
-      </w:docPartBody>
-    </w:docPart>
-    <w:docPart>
-      <w:docPartPr>
-        <w:name w:val="3CD385EBACBB4BF5A95C1422AC098889"/>
-        <w:category>
-          <w:name w:val="General"/>
-          <w:gallery w:val="placeholder"/>
-        </w:category>
-        <w:types>
-          <w:type w:val="bbPlcHdr"/>
-        </w:types>
-        <w:behaviors>
-          <w:behavior w:val="content"/>
-        </w:behaviors>
-        <w:guid w:val="{380E055D-8F46-478C-947B-9502E9400C0A}"/>
-      </w:docPartPr>
-      <w:docPartBody>
-        <w:p>
-          <w:pPr>
-            <w:pStyle w:val="3CD385EBACBB4BF5A95C1422AC0988891"/>
-          </w:pPr>
-          <w:r>
-            <w:rPr>
-              <w:sz w:val="20"/>
-            </w:rPr>
-            <w:t>POP</w:t>
           </w:r>
         </w:p>
       </w:docPartBody>
@@ -7325,7 +7302,7 @@
       <w:docPartBody>
         <w:p>
           <w:pPr>
-            <w:pStyle w:val="650D63D5E8EE41A4A4DB7D99A1A86B661"/>
+            <w:pStyle w:val="650D63D5E8EE41A4A4DB7D99A1A86B66"/>
           </w:pPr>
           <w:r>
             <w:rPr>
@@ -7354,7 +7331,7 @@
       <w:docPartBody>
         <w:p>
           <w:pPr>
-            <w:pStyle w:val="0C083C1E24AF40DF8C7BBD858E651F981"/>
+            <w:pStyle w:val="0C083C1E24AF40DF8C7BBD858E651F98"/>
           </w:pPr>
           <w:r>
             <w:rPr>
@@ -7384,7 +7361,7 @@
       <w:docPartBody>
         <w:p>
           <w:pPr>
-            <w:pStyle w:val="960D99237C084AC7A5F3B97D76AA02951"/>
+            <w:pStyle w:val="960D99237C084AC7A5F3B97D76AA0295"/>
           </w:pPr>
           <w:r>
             <w:rPr>
@@ -7413,7 +7390,7 @@
       <w:docPartBody>
         <w:p>
           <w:pPr>
-            <w:pStyle w:val="AA4B000B5F044625B216DDE768A270CA1"/>
+            <w:pStyle w:val="AA4B000B5F044625B216DDE768A270CA"/>
           </w:pPr>
           <w:r>
             <w:rPr>
@@ -7442,7 +7419,7 @@
       <w:docPartBody>
         <w:p>
           <w:pPr>
-            <w:pStyle w:val="CE29DF205FAD404FA992B54BCCAAF14F1"/>
+            <w:pStyle w:val="CE29DF205FAD404FA992B54BCCAAF14F"/>
           </w:pPr>
           <w:r>
             <w:rPr>
@@ -7473,7 +7450,7 @@
       <w:docPartBody>
         <w:p>
           <w:pPr>
-            <w:pStyle w:val="2B0E99F1A0714AFAAAD2B967640AF6E61"/>
+            <w:pStyle w:val="2B0E99F1A0714AFAAAD2B967640AF6E6"/>
           </w:pPr>
           <w:r>
             <w:rPr>
@@ -7504,7 +7481,7 @@
       <w:docPartBody>
         <w:p>
           <w:pPr>
-            <w:pStyle w:val="E38DBD5D0C2F418096E3BED22BACBEBA1"/>
+            <w:pStyle w:val="E38DBD5D0C2F418096E3BED22BACBEBA"/>
           </w:pPr>
           <w:r>
             <w:rPr>
@@ -7534,7 +7511,7 @@
       <w:docPartBody>
         <w:p>
           <w:pPr>
-            <w:pStyle w:val="97259849AFB349A3B09A844EE4C5B4661"/>
+            <w:pStyle w:val="97259849AFB349A3B09A844EE4C5B466"/>
           </w:pPr>
           <w:r>
             <w:rPr>
@@ -7564,7 +7541,7 @@
       <w:docPartBody>
         <w:p>
           <w:pPr>
-            <w:pStyle w:val="5F1E69B4ABE343E7B3A4886CE0A3B8E61"/>
+            <w:pStyle w:val="5F1E69B4ABE343E7B3A4886CE0A3B8E6"/>
           </w:pPr>
           <w:r>
             <w:rPr>
@@ -7733,7 +7710,7 @@
       <w:docPartBody>
         <w:p>
           <w:pPr>
-            <w:pStyle w:val="362DB8B0D56240B292FD8AA345851FB61"/>
+            <w:pStyle w:val="362DB8B0D56240B292FD8AA345851FB6"/>
           </w:pPr>
           <w:r>
             <w:rPr>
@@ -7763,7 +7740,7 @@
       <w:docPartBody>
         <w:p>
           <w:pPr>
-            <w:pStyle w:val="2EADCBB08BC6479D948516FC0B012D181"/>
+            <w:pStyle w:val="2EADCBB08BC6479D948516FC0B012D18"/>
           </w:pPr>
           <w:r>
             <w:rPr>
@@ -7792,7 +7769,7 @@
       <w:docPartBody>
         <w:p>
           <w:pPr>
-            <w:pStyle w:val="6019D068AD7940F6A066B0EBAB40D7BA1"/>
+            <w:pStyle w:val="6019D068AD7940F6A066B0EBAB40D7BA"/>
           </w:pPr>
           <w:r>
             <w:rPr>
@@ -7822,7 +7799,7 @@
       <w:docPartBody>
         <w:p>
           <w:pPr>
-            <w:pStyle w:val="F393672CD99D4555816A23E5886E23271"/>
+            <w:pStyle w:val="F393672CD99D4555816A23E5886E2327"/>
           </w:pPr>
           <w:r>
             <w:rPr>
@@ -7832,126 +7809,6 @@
               <w:u w:val="single"/>
             </w:rPr>
             <w:t>PlannedDate_B</w:t>
-          </w:r>
-        </w:p>
-      </w:docPartBody>
-    </w:docPart>
-    <w:docPart>
-      <w:docPartPr>
-        <w:name w:val="30F99A229E124EE294268C7BB07E7919"/>
-        <w:category>
-          <w:name w:val="General"/>
-          <w:gallery w:val="placeholder"/>
-        </w:category>
-        <w:types>
-          <w:type w:val="bbPlcHdr"/>
-        </w:types>
-        <w:behaviors>
-          <w:behavior w:val="content"/>
-        </w:behaviors>
-        <w:guid w:val="{3DC42FEC-7AB0-489E-A4B8-24FF7B9DE0E4}"/>
-      </w:docPartPr>
-      <w:docPartBody>
-        <w:p>
-          <w:pPr>
-            <w:pStyle w:val="30F99A229E124EE294268C7BB07E79191"/>
-          </w:pPr>
-          <w:r>
-            <w:rPr>
-              <w:rStyle w:val="PlaceholderText"/>
-              <w:sz w:val="20"/>
-            </w:rPr>
-            <w:t>POC</w:t>
-          </w:r>
-        </w:p>
-      </w:docPartBody>
-    </w:docPart>
-    <w:docPart>
-      <w:docPartPr>
-        <w:name w:val="29F6C8F05FCF47999777CB15AA70B790"/>
-        <w:category>
-          <w:name w:val="General"/>
-          <w:gallery w:val="placeholder"/>
-        </w:category>
-        <w:types>
-          <w:type w:val="bbPlcHdr"/>
-        </w:types>
-        <w:behaviors>
-          <w:behavior w:val="content"/>
-        </w:behaviors>
-        <w:guid w:val="{94E6E496-AAFA-4C97-BAB4-138BB5D32C45}"/>
-      </w:docPartPr>
-      <w:docPartBody>
-        <w:p>
-          <w:pPr>
-            <w:pStyle w:val="29F6C8F05FCF47999777CB15AA70B7901"/>
-          </w:pPr>
-          <w:r>
-            <w:rPr>
-              <w:rStyle w:val="PlaceholderText"/>
-              <w:sz w:val="20"/>
-            </w:rPr>
-            <w:t>Phone</w:t>
-          </w:r>
-        </w:p>
-      </w:docPartBody>
-    </w:docPart>
-    <w:docPart>
-      <w:docPartPr>
-        <w:name w:val="C27700D16ED9448787CE1EF74661419C"/>
-        <w:category>
-          <w:name w:val="General"/>
-          <w:gallery w:val="placeholder"/>
-        </w:category>
-        <w:types>
-          <w:type w:val="bbPlcHdr"/>
-        </w:types>
-        <w:behaviors>
-          <w:behavior w:val="content"/>
-        </w:behaviors>
-        <w:guid w:val="{3054C7D6-0203-4A00-82B4-20D74485874B}"/>
-      </w:docPartPr>
-      <w:docPartBody>
-        <w:p>
-          <w:pPr>
-            <w:pStyle w:val="C27700D16ED9448787CE1EF74661419C1"/>
-          </w:pPr>
-          <w:r>
-            <w:rPr>
-              <w:rStyle w:val="PlaceholderText"/>
-              <w:sz w:val="20"/>
-            </w:rPr>
-            <w:t>Manager</w:t>
-          </w:r>
-        </w:p>
-      </w:docPartBody>
-    </w:docPart>
-    <w:docPart>
-      <w:docPartPr>
-        <w:name w:val="4B2DF1FDE8B74601B70170992E70A693"/>
-        <w:category>
-          <w:name w:val="General"/>
-          <w:gallery w:val="placeholder"/>
-        </w:category>
-        <w:types>
-          <w:type w:val="bbPlcHdr"/>
-        </w:types>
-        <w:behaviors>
-          <w:behavior w:val="content"/>
-        </w:behaviors>
-        <w:guid w:val="{BB5EE73A-0062-476E-B341-C3C9CBE2715F}"/>
-      </w:docPartPr>
-      <w:docPartBody>
-        <w:p>
-          <w:pPr>
-            <w:pStyle w:val="4B2DF1FDE8B74601B70170992E70A6931"/>
-          </w:pPr>
-          <w:r>
-            <w:rPr>
-              <w:rStyle w:val="PlaceholderText"/>
-              <w:sz w:val="20"/>
-            </w:rPr>
-            <w:t>ManagerPhone</w:t>
           </w:r>
         </w:p>
       </w:docPartBody>
@@ -7974,7 +7831,7 @@
       <w:docPartBody>
         <w:p>
           <w:pPr>
-            <w:pStyle w:val="5B4F51D3217A49DD952A6A016B67B6B41"/>
+            <w:pStyle w:val="5B4F51D3217A49DD952A6A016B67B6B4"/>
           </w:pPr>
           <w:r>
             <w:rPr>
@@ -8003,7 +7860,7 @@
       <w:docPartBody>
         <w:p>
           <w:pPr>
-            <w:pStyle w:val="1172965E6EB5428B9EEE3697A16A64A21"/>
+            <w:pStyle w:val="1172965E6EB5428B9EEE3697A16A64A2"/>
           </w:pPr>
           <w:r>
             <w:rPr>
@@ -8032,7 +7889,7 @@
       <w:docPartBody>
         <w:p>
           <w:pPr>
-            <w:pStyle w:val="ED0F1D3A967E44DEACA6FAB777F42C381"/>
+            <w:pStyle w:val="ED0F1D3A967E44DEACA6FAB777F42C38"/>
           </w:pPr>
           <w:r>
             <w:rPr>
@@ -8061,7 +7918,7 @@
       <w:docPartBody>
         <w:p>
           <w:pPr>
-            <w:pStyle w:val="74EC21933C7348BEBE4EF4FACE81684C1"/>
+            <w:pStyle w:val="74EC21933C7348BEBE4EF4FACE81684C"/>
           </w:pPr>
           <w:r>
             <w:rPr>
@@ -8090,7 +7947,7 @@
       <w:docPartBody>
         <w:p>
           <w:pPr>
-            <w:pStyle w:val="3A48DB68078D41DDB3FA347D69C884571"/>
+            <w:pStyle w:val="3A48DB68078D41DDB3FA347D69C88457"/>
           </w:pPr>
           <w:r>
             <w:rPr>
@@ -8119,7 +7976,7 @@
       <w:docPartBody>
         <w:p>
           <w:pPr>
-            <w:pStyle w:val="8709F89835BF45559EBBDE082AFEFB131"/>
+            <w:pStyle w:val="8709F89835BF45559EBBDE082AFEFB13"/>
           </w:pPr>
           <w:r>
             <w:rPr>
@@ -8148,7 +8005,7 @@
       <w:docPartBody>
         <w:p>
           <w:pPr>
-            <w:pStyle w:val="137428D61C6640268F56BB76B9153C141"/>
+            <w:pStyle w:val="137428D61C6640268F56BB76B9153C14"/>
           </w:pPr>
           <w:r>
             <w:rPr>
@@ -8177,7 +8034,7 @@
       <w:docPartBody>
         <w:p>
           <w:pPr>
-            <w:pStyle w:val="109EBDB68ACB4F68AA508E059E90054B1"/>
+            <w:pStyle w:val="109EBDB68ACB4F68AA508E059E90054B"/>
           </w:pPr>
           <w:r>
             <w:rPr>
@@ -8215,6 +8072,280 @@
         </w:p>
       </w:docPartBody>
     </w:docPart>
+    <w:docPart>
+      <w:docPartPr>
+        <w:name w:val="A21103D146BE467DA5D7E7C6625735B3"/>
+        <w:category>
+          <w:name w:val="General"/>
+          <w:gallery w:val="placeholder"/>
+        </w:category>
+        <w:types>
+          <w:type w:val="bbPlcHdr"/>
+        </w:types>
+        <w:behaviors>
+          <w:behavior w:val="content"/>
+        </w:behaviors>
+        <w:guid w:val="{225CF649-DE5F-4120-B60D-48E797CDF310}"/>
+      </w:docPartPr>
+      <w:docPartBody>
+        <w:p>
+          <w:pPr>
+            <w:pStyle w:val="A21103D146BE467DA5D7E7C6625735B3"/>
+          </w:pPr>
+          <w:r>
+            <w:rPr>
+              <w:sz w:val="20"/>
+            </w:rPr>
+            <w:t>Supplier</w:t>
+          </w:r>
+        </w:p>
+      </w:docPartBody>
+    </w:docPart>
+    <w:docPart>
+      <w:docPartPr>
+        <w:name w:val="92A0C0EEDE5C4267A559E59DCE7FFBF7"/>
+        <w:category>
+          <w:name w:val="General"/>
+          <w:gallery w:val="placeholder"/>
+        </w:category>
+        <w:types>
+          <w:type w:val="bbPlcHdr"/>
+        </w:types>
+        <w:behaviors>
+          <w:behavior w:val="content"/>
+        </w:behaviors>
+        <w:guid w:val="{E87D9DCF-3D7E-45B1-813A-F21A612C6726}"/>
+      </w:docPartPr>
+      <w:docPartBody>
+        <w:p>
+          <w:pPr>
+            <w:pStyle w:val="92A0C0EEDE5C4267A559E59DCE7FFBF7"/>
+          </w:pPr>
+          <w:r>
+            <w:rPr>
+              <w:sz w:val="20"/>
+            </w:rPr>
+            <w:t>RFP</w:t>
+          </w:r>
+        </w:p>
+      </w:docPartBody>
+    </w:docPart>
+    <w:docPart>
+      <w:docPartPr>
+        <w:name w:val="1ADEAB9BA9334CD7BEC907D2E8C9C6A9"/>
+        <w:category>
+          <w:name w:val="General"/>
+          <w:gallery w:val="placeholder"/>
+        </w:category>
+        <w:types>
+          <w:type w:val="bbPlcHdr"/>
+        </w:types>
+        <w:behaviors>
+          <w:behavior w:val="content"/>
+        </w:behaviors>
+        <w:guid w:val="{9F738770-09CA-49B3-973A-8BFD8D6EC74E}"/>
+      </w:docPartPr>
+      <w:docPartBody>
+        <w:p>
+          <w:pPr>
+            <w:pStyle w:val="1ADEAB9BA9334CD7BEC907D2E8C9C6A9"/>
+          </w:pPr>
+          <w:r>
+            <w:rPr>
+              <w:sz w:val="20"/>
+            </w:rPr>
+            <w:t>POP</w:t>
+          </w:r>
+        </w:p>
+      </w:docPartBody>
+    </w:docPart>
+    <w:docPart>
+      <w:docPartPr>
+        <w:name w:val="A19003FFDCED44E6AE75EF497FDA5033"/>
+        <w:category>
+          <w:name w:val="General"/>
+          <w:gallery w:val="placeholder"/>
+        </w:category>
+        <w:types>
+          <w:type w:val="bbPlcHdr"/>
+        </w:types>
+        <w:behaviors>
+          <w:behavior w:val="content"/>
+        </w:behaviors>
+        <w:guid w:val="{61873D1B-E94E-46BB-979F-E8097A53D5DF}"/>
+      </w:docPartPr>
+      <w:docPartBody>
+        <w:p>
+          <w:pPr>
+            <w:pStyle w:val="A19003FFDCED44E6AE75EF497FDA50331"/>
+          </w:pPr>
+          <w:r>
+            <w:rPr>
+              <w:bCs/>
+              <w:sz w:val="20"/>
+            </w:rPr>
+            <w:t>VendorId</w:t>
+          </w:r>
+        </w:p>
+      </w:docPartBody>
+    </w:docPart>
+    <w:docPart>
+      <w:docPartPr>
+        <w:name w:val="3F2A188C26EE4B4A89DDD98BEE5C3825"/>
+        <w:category>
+          <w:name w:val="General"/>
+          <w:gallery w:val="placeholder"/>
+        </w:category>
+        <w:types>
+          <w:type w:val="bbPlcHdr"/>
+        </w:types>
+        <w:behaviors>
+          <w:behavior w:val="content"/>
+        </w:behaviors>
+        <w:guid w:val="{53547C0E-42EB-48B6-9D45-8960EA6F56A7}"/>
+      </w:docPartPr>
+      <w:docPartBody>
+        <w:p>
+          <w:pPr>
+            <w:pStyle w:val="3F2A188C26EE4B4A89DDD98BEE5C38251"/>
+          </w:pPr>
+          <w:r>
+            <w:rPr>
+              <w:bCs/>
+              <w:sz w:val="20"/>
+            </w:rPr>
+            <w:t>SP</w:t>
+          </w:r>
+          <w:r>
+            <w:rPr>
+              <w:bCs/>
+              <w:sz w:val="20"/>
+            </w:rPr>
+            <w:t>V</w:t>
+          </w:r>
+        </w:p>
+      </w:docPartBody>
+    </w:docPart>
+    <w:docPart>
+      <w:docPartPr>
+        <w:name w:val="4CCCEEE44FAA4C2CA6DCB910D066ECC5"/>
+        <w:category>
+          <w:name w:val="General"/>
+          <w:gallery w:val="placeholder"/>
+        </w:category>
+        <w:types>
+          <w:type w:val="bbPlcHdr"/>
+        </w:types>
+        <w:behaviors>
+          <w:behavior w:val="content"/>
+        </w:behaviors>
+        <w:guid w:val="{28A9BFDB-B09F-42C1-9302-D11837BF0D29}"/>
+      </w:docPartPr>
+      <w:docPartBody>
+        <w:p>
+          <w:pPr>
+            <w:pStyle w:val="4CCCEEE44FAA4C2CA6DCB910D066ECC51"/>
+          </w:pPr>
+          <w:r>
+            <w:rPr>
+              <w:rStyle w:val="PlaceholderText"/>
+              <w:sz w:val="20"/>
+            </w:rPr>
+            <w:t>POC</w:t>
+          </w:r>
+        </w:p>
+      </w:docPartBody>
+    </w:docPart>
+    <w:docPart>
+      <w:docPartPr>
+        <w:name w:val="19D869DD2C4A457CA357CEBE20BFF6A1"/>
+        <w:category>
+          <w:name w:val="General"/>
+          <w:gallery w:val="placeholder"/>
+        </w:category>
+        <w:types>
+          <w:type w:val="bbPlcHdr"/>
+        </w:types>
+        <w:behaviors>
+          <w:behavior w:val="content"/>
+        </w:behaviors>
+        <w:guid w:val="{52E8CA18-F361-47A9-815E-306BAB3FD1E5}"/>
+      </w:docPartPr>
+      <w:docPartBody>
+        <w:p>
+          <w:pPr>
+            <w:pStyle w:val="19D869DD2C4A457CA357CEBE20BFF6A11"/>
+          </w:pPr>
+          <w:r>
+            <w:rPr>
+              <w:rStyle w:val="PlaceholderText"/>
+              <w:sz w:val="20"/>
+            </w:rPr>
+            <w:t>Phone</w:t>
+          </w:r>
+        </w:p>
+      </w:docPartBody>
+    </w:docPart>
+    <w:docPart>
+      <w:docPartPr>
+        <w:name w:val="E0455F61D0864EF291C06B686DD23254"/>
+        <w:category>
+          <w:name w:val="General"/>
+          <w:gallery w:val="placeholder"/>
+        </w:category>
+        <w:types>
+          <w:type w:val="bbPlcHdr"/>
+        </w:types>
+        <w:behaviors>
+          <w:behavior w:val="content"/>
+        </w:behaviors>
+        <w:guid w:val="{39369F67-6D3D-4040-9D13-37F6EC2B04E8}"/>
+      </w:docPartPr>
+      <w:docPartBody>
+        <w:p>
+          <w:pPr>
+            <w:pStyle w:val="E0455F61D0864EF291C06B686DD232541"/>
+          </w:pPr>
+          <w:r>
+            <w:rPr>
+              <w:rStyle w:val="PlaceholderText"/>
+              <w:sz w:val="20"/>
+            </w:rPr>
+            <w:t>Manager</w:t>
+          </w:r>
+        </w:p>
+      </w:docPartBody>
+    </w:docPart>
+    <w:docPart>
+      <w:docPartPr>
+        <w:name w:val="DB53699693B14054863CA7EF8B0BF1E3"/>
+        <w:category>
+          <w:name w:val="General"/>
+          <w:gallery w:val="placeholder"/>
+        </w:category>
+        <w:types>
+          <w:type w:val="bbPlcHdr"/>
+        </w:types>
+        <w:behaviors>
+          <w:behavior w:val="content"/>
+        </w:behaviors>
+        <w:guid w:val="{E29045AB-7465-4857-A959-E5A5F772A0B0}"/>
+      </w:docPartPr>
+      <w:docPartBody>
+        <w:p>
+          <w:pPr>
+            <w:pStyle w:val="DB53699693B14054863CA7EF8B0BF1E31"/>
+          </w:pPr>
+          <w:r>
+            <w:rPr>
+              <w:rStyle w:val="PlaceholderText"/>
+              <w:sz w:val="20"/>
+            </w:rPr>
+            <w:t>ManagerPhone</w:t>
+          </w:r>
+        </w:p>
+      </w:docPartBody>
+    </w:docPart>
   </w:docParts>
 </w:glossaryDocument>
 </file>
@@ -8233,7 +8364,7 @@
     <w:charset w:val="00"/>
     <w:family w:val="roman"/>
     <w:pitch w:val="variable"/>
-    <w:sig w:usb0="E0002AFF" w:usb1="C0007843" w:usb2="00000009" w:usb3="00000000" w:csb0="000001FF" w:csb1="00000000"/>
+    <w:sig w:usb0="E0002EFF" w:usb1="C000785B" w:usb2="00000009" w:usb3="00000000" w:csb0="000001FF" w:csb1="00000000"/>
   </w:font>
   <w:font w:name="Courier New">
     <w:panose1 w:val="02070309020205020404"/>
@@ -8254,7 +8385,7 @@
     <w:charset w:val="00"/>
     <w:family w:val="swiss"/>
     <w:pitch w:val="variable"/>
-    <w:sig w:usb0="E0002AFF" w:usb1="C0007843" w:usb2="00000009" w:usb3="00000000" w:csb0="000001FF" w:csb1="00000000"/>
+    <w:sig w:usb0="E0002EFF" w:usb1="C000785B" w:usb2="00000009" w:usb3="00000000" w:csb0="000001FF" w:csb1="00000000"/>
   </w:font>
   <w:font w:name="Tahoma">
     <w:panose1 w:val="020B0604030504040204"/>
@@ -8264,7 +8395,7 @@
     <w:sig w:usb0="E1002EFF" w:usb1="C000605B" w:usb2="00000029" w:usb3="00000000" w:csb0="000101FF" w:csb1="00000000"/>
   </w:font>
   <w:font w:name="MS Mincho">
-    <w:altName w:val="ＭＳ 明朝"/>
+    <w:altName w:val="MS Mincho"/>
     <w:panose1 w:val="02020609040205080304"/>
     <w:charset w:val="80"/>
     <w:family w:val="modern"/>
@@ -8283,7 +8414,7 @@
     <w:charset w:val="00"/>
     <w:family w:val="swiss"/>
     <w:pitch w:val="variable"/>
-    <w:sig w:usb0="E0002AFF" w:usb1="4000ACFF" w:usb2="00000001" w:usb3="00000000" w:csb0="000001FF" w:csb1="00000000"/>
+    <w:sig w:usb0="E4002EFF" w:usb1="C000247B" w:usb2="00000009" w:usb3="00000000" w:csb0="000001FF" w:csb1="00000000"/>
   </w:font>
   <w:font w:name="Calibri Light">
     <w:panose1 w:val="020F0302020204030204"/>
@@ -8319,20 +8450,24 @@
     <w:rsid w:val="0012754E"/>
     <w:rsid w:val="001339F8"/>
     <w:rsid w:val="00153516"/>
+    <w:rsid w:val="0017110F"/>
     <w:rsid w:val="00194A82"/>
     <w:rsid w:val="001E6F94"/>
     <w:rsid w:val="001F05C0"/>
     <w:rsid w:val="0020346C"/>
+    <w:rsid w:val="002668F4"/>
     <w:rsid w:val="002963C8"/>
     <w:rsid w:val="0030414E"/>
     <w:rsid w:val="00307F9A"/>
     <w:rsid w:val="003903D1"/>
+    <w:rsid w:val="003D6D36"/>
     <w:rsid w:val="003E00EE"/>
     <w:rsid w:val="004901E0"/>
     <w:rsid w:val="004D180E"/>
     <w:rsid w:val="00515CAF"/>
     <w:rsid w:val="005256F5"/>
     <w:rsid w:val="00545DF2"/>
+    <w:rsid w:val="00557CFA"/>
     <w:rsid w:val="00592770"/>
     <w:rsid w:val="00605A78"/>
     <w:rsid w:val="00671B35"/>
@@ -8384,10 +8519,12 @@
     <w:rsid w:val="00E02324"/>
     <w:rsid w:val="00E1350C"/>
     <w:rsid w:val="00E972B6"/>
+    <w:rsid w:val="00EA2828"/>
     <w:rsid w:val="00EA6E8A"/>
     <w:rsid w:val="00ED5ED7"/>
     <w:rsid w:val="00F16E8B"/>
     <w:rsid w:val="00F5587B"/>
+    <w:rsid w:val="00F80718"/>
     <w:rsid w:val="00FC58B0"/>
     <w:rsid w:val="00FD10FA"/>
   </w:rsids>
@@ -8843,14 +8980,14 @@
     <w:basedOn w:val="DefaultParagraphFont"/>
     <w:uiPriority w:val="99"/>
     <w:semiHidden/>
-    <w:rsid w:val="00DE4C99"/>
+    <w:rsid w:val="00557CFA"/>
     <w:rPr>
       <w:color w:val="808080"/>
     </w:rPr>
   </w:style>
-  <w:style w:type="paragraph" w:customStyle="1" w:styleId="3C51D371244C4D18AA8A89DB62DED7821">
-    <w:name w:val="3C51D371244C4D18AA8A89DB62DED7821"/>
-    <w:rsid w:val="00DE4C99"/>
+  <w:style w:type="paragraph" w:customStyle="1" w:styleId="3C51D371244C4D18AA8A89DB62DED782">
+    <w:name w:val="3C51D371244C4D18AA8A89DB62DED782"/>
+    <w:rsid w:val="00557CFA"/>
     <w:pPr>
       <w:spacing w:after="120" w:line="240" w:lineRule="auto"/>
     </w:pPr>
@@ -8860,9 +8997,9 @@
       <w:szCs w:val="24"/>
     </w:rPr>
   </w:style>
-  <w:style w:type="paragraph" w:customStyle="1" w:styleId="DCE06A566B6A4CB3828C398E8B661D831">
-    <w:name w:val="DCE06A566B6A4CB3828C398E8B661D831"/>
-    <w:rsid w:val="00DE4C99"/>
+  <w:style w:type="paragraph" w:customStyle="1" w:styleId="DCE06A566B6A4CB3828C398E8B661D83">
+    <w:name w:val="DCE06A566B6A4CB3828C398E8B661D83"/>
+    <w:rsid w:val="00557CFA"/>
     <w:pPr>
       <w:spacing w:after="120" w:line="240" w:lineRule="auto"/>
     </w:pPr>
@@ -8872,9 +9009,9 @@
       <w:szCs w:val="24"/>
     </w:rPr>
   </w:style>
-  <w:style w:type="paragraph" w:customStyle="1" w:styleId="CA82DD6241384C818C8BF61861CDABE01">
-    <w:name w:val="CA82DD6241384C818C8BF61861CDABE01"/>
-    <w:rsid w:val="00DE4C99"/>
+  <w:style w:type="paragraph" w:customStyle="1" w:styleId="A21103D146BE467DA5D7E7C6625735B3">
+    <w:name w:val="A21103D146BE467DA5D7E7C6625735B3"/>
+    <w:rsid w:val="00557CFA"/>
     <w:pPr>
       <w:spacing w:before="40" w:after="40" w:line="240" w:lineRule="auto"/>
     </w:pPr>
@@ -8884,9 +9021,9 @@
       <w:szCs w:val="20"/>
     </w:rPr>
   </w:style>
-  <w:style w:type="paragraph" w:customStyle="1" w:styleId="DE29BAE756844C0A896C572548D472C01">
-    <w:name w:val="DE29BAE756844C0A896C572548D472C01"/>
-    <w:rsid w:val="00DE4C99"/>
+  <w:style w:type="paragraph" w:customStyle="1" w:styleId="A19003FFDCED44E6AE75EF497FDA50331">
+    <w:name w:val="A19003FFDCED44E6AE75EF497FDA50331"/>
+    <w:rsid w:val="00557CFA"/>
     <w:pPr>
       <w:spacing w:before="40" w:after="40" w:line="240" w:lineRule="auto"/>
     </w:pPr>
@@ -8896,9 +9033,9 @@
       <w:szCs w:val="20"/>
     </w:rPr>
   </w:style>
-  <w:style w:type="paragraph" w:customStyle="1" w:styleId="3CD385EBACBB4BF5A95C1422AC0988891">
-    <w:name w:val="3CD385EBACBB4BF5A95C1422AC0988891"/>
-    <w:rsid w:val="00DE4C99"/>
+  <w:style w:type="paragraph" w:customStyle="1" w:styleId="92A0C0EEDE5C4267A559E59DCE7FFBF7">
+    <w:name w:val="92A0C0EEDE5C4267A559E59DCE7FFBF7"/>
+    <w:rsid w:val="00557CFA"/>
     <w:pPr>
       <w:spacing w:before="40" w:after="40" w:line="240" w:lineRule="auto"/>
     </w:pPr>
@@ -8908,9 +9045,9 @@
       <w:szCs w:val="20"/>
     </w:rPr>
   </w:style>
-  <w:style w:type="paragraph" w:customStyle="1" w:styleId="06B8F59F36A54EC096C3AF659F2ADA191">
-    <w:name w:val="06B8F59F36A54EC096C3AF659F2ADA191"/>
-    <w:rsid w:val="00DE4C99"/>
+  <w:style w:type="paragraph" w:customStyle="1" w:styleId="1ADEAB9BA9334CD7BEC907D2E8C9C6A9">
+    <w:name w:val="1ADEAB9BA9334CD7BEC907D2E8C9C6A9"/>
+    <w:rsid w:val="00557CFA"/>
     <w:pPr>
       <w:spacing w:before="40" w:after="40" w:line="240" w:lineRule="auto"/>
     </w:pPr>
@@ -8920,9 +9057,9 @@
       <w:szCs w:val="20"/>
     </w:rPr>
   </w:style>
-  <w:style w:type="paragraph" w:customStyle="1" w:styleId="A6983B515BA9432AA6CFEC8362A244781">
-    <w:name w:val="A6983B515BA9432AA6CFEC8362A244781"/>
-    <w:rsid w:val="00DE4C99"/>
+  <w:style w:type="paragraph" w:customStyle="1" w:styleId="06B8F59F36A54EC096C3AF659F2ADA19">
+    <w:name w:val="06B8F59F36A54EC096C3AF659F2ADA19"/>
+    <w:rsid w:val="00557CFA"/>
     <w:pPr>
       <w:spacing w:before="40" w:after="40" w:line="240" w:lineRule="auto"/>
     </w:pPr>
@@ -8932,9 +9069,9 @@
       <w:szCs w:val="20"/>
     </w:rPr>
   </w:style>
-  <w:style w:type="paragraph" w:customStyle="1" w:styleId="5C29C54541614AB4B36209C014760B031">
-    <w:name w:val="5C29C54541614AB4B36209C014760B031"/>
-    <w:rsid w:val="00DE4C99"/>
+  <w:style w:type="paragraph" w:customStyle="1" w:styleId="A6983B515BA9432AA6CFEC8362A24478">
+    <w:name w:val="A6983B515BA9432AA6CFEC8362A24478"/>
+    <w:rsid w:val="00557CFA"/>
     <w:pPr>
       <w:spacing w:before="40" w:after="40" w:line="240" w:lineRule="auto"/>
     </w:pPr>
@@ -8944,9 +9081,9 @@
       <w:szCs w:val="20"/>
     </w:rPr>
   </w:style>
-  <w:style w:type="paragraph" w:customStyle="1" w:styleId="CF01C4F4D3BE4C58A7642594BBEB44A21">
-    <w:name w:val="CF01C4F4D3BE4C58A7642594BBEB44A21"/>
-    <w:rsid w:val="00DE4C99"/>
+  <w:style w:type="paragraph" w:customStyle="1" w:styleId="5C29C54541614AB4B36209C014760B03">
+    <w:name w:val="5C29C54541614AB4B36209C014760B03"/>
+    <w:rsid w:val="00557CFA"/>
     <w:pPr>
       <w:spacing w:before="40" w:after="40" w:line="240" w:lineRule="auto"/>
     </w:pPr>
@@ -8956,9 +9093,9 @@
       <w:szCs w:val="20"/>
     </w:rPr>
   </w:style>
-  <w:style w:type="paragraph" w:customStyle="1" w:styleId="650D63D5E8EE41A4A4DB7D99A1A86B661">
-    <w:name w:val="650D63D5E8EE41A4A4DB7D99A1A86B661"/>
-    <w:rsid w:val="00DE4C99"/>
+  <w:style w:type="paragraph" w:customStyle="1" w:styleId="3F2A188C26EE4B4A89DDD98BEE5C38251">
+    <w:name w:val="3F2A188C26EE4B4A89DDD98BEE5C38251"/>
+    <w:rsid w:val="00557CFA"/>
     <w:pPr>
       <w:spacing w:before="40" w:after="40" w:line="240" w:lineRule="auto"/>
     </w:pPr>
@@ -8968,9 +9105,9 @@
       <w:szCs w:val="20"/>
     </w:rPr>
   </w:style>
-  <w:style w:type="paragraph" w:customStyle="1" w:styleId="0C083C1E24AF40DF8C7BBD858E651F981">
-    <w:name w:val="0C083C1E24AF40DF8C7BBD858E651F981"/>
-    <w:rsid w:val="00DE4C99"/>
+  <w:style w:type="paragraph" w:customStyle="1" w:styleId="CF01C4F4D3BE4C58A7642594BBEB44A2">
+    <w:name w:val="CF01C4F4D3BE4C58A7642594BBEB44A2"/>
+    <w:rsid w:val="00557CFA"/>
     <w:pPr>
       <w:spacing w:before="40" w:after="40" w:line="240" w:lineRule="auto"/>
     </w:pPr>
@@ -8980,9 +9117,9 @@
       <w:szCs w:val="20"/>
     </w:rPr>
   </w:style>
-  <w:style w:type="paragraph" w:customStyle="1" w:styleId="960D99237C084AC7A5F3B97D76AA02951">
-    <w:name w:val="960D99237C084AC7A5F3B97D76AA02951"/>
-    <w:rsid w:val="00DE4C99"/>
+  <w:style w:type="paragraph" w:customStyle="1" w:styleId="650D63D5E8EE41A4A4DB7D99A1A86B66">
+    <w:name w:val="650D63D5E8EE41A4A4DB7D99A1A86B66"/>
+    <w:rsid w:val="00557CFA"/>
     <w:pPr>
       <w:spacing w:before="40" w:after="40" w:line="240" w:lineRule="auto"/>
     </w:pPr>
@@ -8992,9 +9129,9 @@
       <w:szCs w:val="20"/>
     </w:rPr>
   </w:style>
-  <w:style w:type="paragraph" w:customStyle="1" w:styleId="AA4B000B5F044625B216DDE768A270CA1">
-    <w:name w:val="AA4B000B5F044625B216DDE768A270CA1"/>
-    <w:rsid w:val="00DE4C99"/>
+  <w:style w:type="paragraph" w:customStyle="1" w:styleId="0C083C1E24AF40DF8C7BBD858E651F98">
+    <w:name w:val="0C083C1E24AF40DF8C7BBD858E651F98"/>
+    <w:rsid w:val="00557CFA"/>
     <w:pPr>
       <w:spacing w:before="40" w:after="40" w:line="240" w:lineRule="auto"/>
     </w:pPr>
@@ -9004,9 +9141,9 @@
       <w:szCs w:val="20"/>
     </w:rPr>
   </w:style>
-  <w:style w:type="paragraph" w:customStyle="1" w:styleId="CE29DF205FAD404FA992B54BCCAAF14F1">
-    <w:name w:val="CE29DF205FAD404FA992B54BCCAAF14F1"/>
-    <w:rsid w:val="00DE4C99"/>
+  <w:style w:type="paragraph" w:customStyle="1" w:styleId="960D99237C084AC7A5F3B97D76AA0295">
+    <w:name w:val="960D99237C084AC7A5F3B97D76AA0295"/>
+    <w:rsid w:val="00557CFA"/>
     <w:pPr>
       <w:spacing w:before="40" w:after="40" w:line="240" w:lineRule="auto"/>
     </w:pPr>
@@ -9016,9 +9153,9 @@
       <w:szCs w:val="20"/>
     </w:rPr>
   </w:style>
-  <w:style w:type="paragraph" w:customStyle="1" w:styleId="2B0E99F1A0714AFAAAD2B967640AF6E61">
-    <w:name w:val="2B0E99F1A0714AFAAAD2B967640AF6E61"/>
-    <w:rsid w:val="00DE4C99"/>
+  <w:style w:type="paragraph" w:customStyle="1" w:styleId="AA4B000B5F044625B216DDE768A270CA">
+    <w:name w:val="AA4B000B5F044625B216DDE768A270CA"/>
+    <w:rsid w:val="00557CFA"/>
     <w:pPr>
       <w:spacing w:before="40" w:after="40" w:line="240" w:lineRule="auto"/>
     </w:pPr>
@@ -9028,9 +9165,9 @@
       <w:szCs w:val="20"/>
     </w:rPr>
   </w:style>
-  <w:style w:type="paragraph" w:customStyle="1" w:styleId="E38DBD5D0C2F418096E3BED22BACBEBA1">
-    <w:name w:val="E38DBD5D0C2F418096E3BED22BACBEBA1"/>
-    <w:rsid w:val="00DE4C99"/>
+  <w:style w:type="paragraph" w:customStyle="1" w:styleId="CE29DF205FAD404FA992B54BCCAAF14F">
+    <w:name w:val="CE29DF205FAD404FA992B54BCCAAF14F"/>
+    <w:rsid w:val="00557CFA"/>
     <w:pPr>
       <w:spacing w:before="40" w:after="40" w:line="240" w:lineRule="auto"/>
     </w:pPr>
@@ -9040,9 +9177,9 @@
       <w:szCs w:val="20"/>
     </w:rPr>
   </w:style>
-  <w:style w:type="paragraph" w:customStyle="1" w:styleId="97259849AFB349A3B09A844EE4C5B4661">
-    <w:name w:val="97259849AFB349A3B09A844EE4C5B4661"/>
-    <w:rsid w:val="00DE4C99"/>
+  <w:style w:type="paragraph" w:customStyle="1" w:styleId="2B0E99F1A0714AFAAAD2B967640AF6E6">
+    <w:name w:val="2B0E99F1A0714AFAAAD2B967640AF6E6"/>
+    <w:rsid w:val="00557CFA"/>
     <w:pPr>
       <w:spacing w:before="40" w:after="40" w:line="240" w:lineRule="auto"/>
     </w:pPr>
@@ -9052,9 +9189,9 @@
       <w:szCs w:val="20"/>
     </w:rPr>
   </w:style>
-  <w:style w:type="paragraph" w:customStyle="1" w:styleId="2BCD6F010600463D8BE0146C14CF16D71">
-    <w:name w:val="2BCD6F010600463D8BE0146C14CF16D71"/>
-    <w:rsid w:val="00DE4C99"/>
+  <w:style w:type="paragraph" w:customStyle="1" w:styleId="E38DBD5D0C2F418096E3BED22BACBEBA">
+    <w:name w:val="E38DBD5D0C2F418096E3BED22BACBEBA"/>
+    <w:rsid w:val="00557CFA"/>
     <w:pPr>
       <w:spacing w:before="40" w:after="40" w:line="240" w:lineRule="auto"/>
     </w:pPr>
@@ -9064,9 +9201,9 @@
       <w:szCs w:val="20"/>
     </w:rPr>
   </w:style>
-  <w:style w:type="paragraph" w:customStyle="1" w:styleId="5F1E69B4ABE343E7B3A4886CE0A3B8E61">
-    <w:name w:val="5F1E69B4ABE343E7B3A4886CE0A3B8E61"/>
-    <w:rsid w:val="00DE4C99"/>
+  <w:style w:type="paragraph" w:customStyle="1" w:styleId="97259849AFB349A3B09A844EE4C5B466">
+    <w:name w:val="97259849AFB349A3B09A844EE4C5B466"/>
+    <w:rsid w:val="00557CFA"/>
     <w:pPr>
       <w:spacing w:before="40" w:after="40" w:line="240" w:lineRule="auto"/>
     </w:pPr>
@@ -9076,9 +9213,9 @@
       <w:szCs w:val="20"/>
     </w:rPr>
   </w:style>
-  <w:style w:type="paragraph" w:customStyle="1" w:styleId="2D10359A02224706B30FF3D1427A46CC1">
-    <w:name w:val="2D10359A02224706B30FF3D1427A46CC1"/>
-    <w:rsid w:val="00DE4C99"/>
+  <w:style w:type="paragraph" w:customStyle="1" w:styleId="2BCD6F010600463D8BE0146C14CF16D7">
+    <w:name w:val="2BCD6F010600463D8BE0146C14CF16D7"/>
+    <w:rsid w:val="00557CFA"/>
     <w:pPr>
       <w:spacing w:before="40" w:after="40" w:line="240" w:lineRule="auto"/>
     </w:pPr>
@@ -9088,9 +9225,9 @@
       <w:szCs w:val="20"/>
     </w:rPr>
   </w:style>
-  <w:style w:type="paragraph" w:customStyle="1" w:styleId="ED0F1D3A967E44DEACA6FAB777F42C381">
-    <w:name w:val="ED0F1D3A967E44DEACA6FAB777F42C381"/>
-    <w:rsid w:val="00DE4C99"/>
+  <w:style w:type="paragraph" w:customStyle="1" w:styleId="5F1E69B4ABE343E7B3A4886CE0A3B8E6">
+    <w:name w:val="5F1E69B4ABE343E7B3A4886CE0A3B8E6"/>
+    <w:rsid w:val="00557CFA"/>
     <w:pPr>
       <w:spacing w:before="40" w:after="40" w:line="240" w:lineRule="auto"/>
     </w:pPr>
@@ -9100,9 +9237,9 @@
       <w:szCs w:val="20"/>
     </w:rPr>
   </w:style>
-  <w:style w:type="paragraph" w:customStyle="1" w:styleId="9EE6A410E46E484D832EE3D6F458F9131">
-    <w:name w:val="9EE6A410E46E484D832EE3D6F458F9131"/>
-    <w:rsid w:val="00DE4C99"/>
+  <w:style w:type="paragraph" w:customStyle="1" w:styleId="2D10359A02224706B30FF3D1427A46CC">
+    <w:name w:val="2D10359A02224706B30FF3D1427A46CC"/>
+    <w:rsid w:val="00557CFA"/>
     <w:pPr>
       <w:spacing w:before="40" w:after="40" w:line="240" w:lineRule="auto"/>
     </w:pPr>
@@ -9112,9 +9249,9 @@
       <w:szCs w:val="20"/>
     </w:rPr>
   </w:style>
-  <w:style w:type="paragraph" w:customStyle="1" w:styleId="1172965E6EB5428B9EEE3697A16A64A21">
-    <w:name w:val="1172965E6EB5428B9EEE3697A16A64A21"/>
-    <w:rsid w:val="00DE4C99"/>
+  <w:style w:type="paragraph" w:customStyle="1" w:styleId="ED0F1D3A967E44DEACA6FAB777F42C38">
+    <w:name w:val="ED0F1D3A967E44DEACA6FAB777F42C38"/>
+    <w:rsid w:val="00557CFA"/>
     <w:pPr>
       <w:spacing w:before="40" w:after="40" w:line="240" w:lineRule="auto"/>
     </w:pPr>
@@ -9124,9 +9261,9 @@
       <w:szCs w:val="20"/>
     </w:rPr>
   </w:style>
-  <w:style w:type="paragraph" w:customStyle="1" w:styleId="5A6D68353161404D8020799FA59BD52D1">
-    <w:name w:val="5A6D68353161404D8020799FA59BD52D1"/>
-    <w:rsid w:val="00DE4C99"/>
+  <w:style w:type="paragraph" w:customStyle="1" w:styleId="9EE6A410E46E484D832EE3D6F458F913">
+    <w:name w:val="9EE6A410E46E484D832EE3D6F458F913"/>
+    <w:rsid w:val="00557CFA"/>
     <w:pPr>
       <w:spacing w:before="40" w:after="40" w:line="240" w:lineRule="auto"/>
     </w:pPr>
@@ -9136,9 +9273,9 @@
       <w:szCs w:val="20"/>
     </w:rPr>
   </w:style>
-  <w:style w:type="paragraph" w:customStyle="1" w:styleId="74EC21933C7348BEBE4EF4FACE81684C1">
-    <w:name w:val="74EC21933C7348BEBE4EF4FACE81684C1"/>
-    <w:rsid w:val="00DE4C99"/>
+  <w:style w:type="paragraph" w:customStyle="1" w:styleId="1172965E6EB5428B9EEE3697A16A64A2">
+    <w:name w:val="1172965E6EB5428B9EEE3697A16A64A2"/>
+    <w:rsid w:val="00557CFA"/>
     <w:pPr>
       <w:spacing w:before="40" w:after="40" w:line="240" w:lineRule="auto"/>
     </w:pPr>
@@ -9148,9 +9285,9 @@
       <w:szCs w:val="20"/>
     </w:rPr>
   </w:style>
-  <w:style w:type="paragraph" w:customStyle="1" w:styleId="02ABC3E7E1D84DDD98A3AA83D359A3C11">
-    <w:name w:val="02ABC3E7E1D84DDD98A3AA83D359A3C11"/>
-    <w:rsid w:val="00DE4C99"/>
+  <w:style w:type="paragraph" w:customStyle="1" w:styleId="5A6D68353161404D8020799FA59BD52D">
+    <w:name w:val="5A6D68353161404D8020799FA59BD52D"/>
+    <w:rsid w:val="00557CFA"/>
     <w:pPr>
       <w:spacing w:before="40" w:after="40" w:line="240" w:lineRule="auto"/>
     </w:pPr>
@@ -9160,9 +9297,9 @@
       <w:szCs w:val="20"/>
     </w:rPr>
   </w:style>
-  <w:style w:type="paragraph" w:customStyle="1" w:styleId="3A48DB68078D41DDB3FA347D69C884571">
-    <w:name w:val="3A48DB68078D41DDB3FA347D69C884571"/>
-    <w:rsid w:val="00DE4C99"/>
+  <w:style w:type="paragraph" w:customStyle="1" w:styleId="74EC21933C7348BEBE4EF4FACE81684C">
+    <w:name w:val="74EC21933C7348BEBE4EF4FACE81684C"/>
+    <w:rsid w:val="00557CFA"/>
     <w:pPr>
       <w:spacing w:before="40" w:after="40" w:line="240" w:lineRule="auto"/>
     </w:pPr>
@@ -9172,9 +9309,9 @@
       <w:szCs w:val="20"/>
     </w:rPr>
   </w:style>
-  <w:style w:type="paragraph" w:customStyle="1" w:styleId="362DB8B0D56240B292FD8AA345851FB61">
-    <w:name w:val="362DB8B0D56240B292FD8AA345851FB61"/>
-    <w:rsid w:val="00DE4C99"/>
+  <w:style w:type="paragraph" w:customStyle="1" w:styleId="02ABC3E7E1D84DDD98A3AA83D359A3C1">
+    <w:name w:val="02ABC3E7E1D84DDD98A3AA83D359A3C1"/>
+    <w:rsid w:val="00557CFA"/>
     <w:pPr>
       <w:spacing w:before="40" w:after="40" w:line="240" w:lineRule="auto"/>
     </w:pPr>
@@ -9184,9 +9321,9 @@
       <w:szCs w:val="20"/>
     </w:rPr>
   </w:style>
-  <w:style w:type="paragraph" w:customStyle="1" w:styleId="8709F89835BF45559EBBDE082AFEFB131">
-    <w:name w:val="8709F89835BF45559EBBDE082AFEFB131"/>
-    <w:rsid w:val="00DE4C99"/>
+  <w:style w:type="paragraph" w:customStyle="1" w:styleId="3A48DB68078D41DDB3FA347D69C88457">
+    <w:name w:val="3A48DB68078D41DDB3FA347D69C88457"/>
+    <w:rsid w:val="00557CFA"/>
     <w:pPr>
       <w:spacing w:before="40" w:after="40" w:line="240" w:lineRule="auto"/>
     </w:pPr>
@@ -9196,9 +9333,9 @@
       <w:szCs w:val="20"/>
     </w:rPr>
   </w:style>
-  <w:style w:type="paragraph" w:customStyle="1" w:styleId="2EADCBB08BC6479D948516FC0B012D181">
-    <w:name w:val="2EADCBB08BC6479D948516FC0B012D181"/>
-    <w:rsid w:val="00DE4C99"/>
+  <w:style w:type="paragraph" w:customStyle="1" w:styleId="362DB8B0D56240B292FD8AA345851FB6">
+    <w:name w:val="362DB8B0D56240B292FD8AA345851FB6"/>
+    <w:rsid w:val="00557CFA"/>
     <w:pPr>
       <w:spacing w:before="40" w:after="40" w:line="240" w:lineRule="auto"/>
     </w:pPr>
@@ -9208,9 +9345,9 @@
       <w:szCs w:val="20"/>
     </w:rPr>
   </w:style>
-  <w:style w:type="paragraph" w:customStyle="1" w:styleId="137428D61C6640268F56BB76B9153C141">
-    <w:name w:val="137428D61C6640268F56BB76B9153C141"/>
-    <w:rsid w:val="00DE4C99"/>
+  <w:style w:type="paragraph" w:customStyle="1" w:styleId="8709F89835BF45559EBBDE082AFEFB13">
+    <w:name w:val="8709F89835BF45559EBBDE082AFEFB13"/>
+    <w:rsid w:val="00557CFA"/>
     <w:pPr>
       <w:spacing w:before="40" w:after="40" w:line="240" w:lineRule="auto"/>
     </w:pPr>
@@ -9220,9 +9357,9 @@
       <w:szCs w:val="20"/>
     </w:rPr>
   </w:style>
-  <w:style w:type="paragraph" w:customStyle="1" w:styleId="5B4F51D3217A49DD952A6A016B67B6B41">
-    <w:name w:val="5B4F51D3217A49DD952A6A016B67B6B41"/>
-    <w:rsid w:val="00DE4C99"/>
+  <w:style w:type="paragraph" w:customStyle="1" w:styleId="2EADCBB08BC6479D948516FC0B012D18">
+    <w:name w:val="2EADCBB08BC6479D948516FC0B012D18"/>
+    <w:rsid w:val="00557CFA"/>
     <w:pPr>
       <w:spacing w:before="40" w:after="40" w:line="240" w:lineRule="auto"/>
     </w:pPr>
@@ -9232,9 +9369,9 @@
       <w:szCs w:val="20"/>
     </w:rPr>
   </w:style>
-  <w:style w:type="paragraph" w:customStyle="1" w:styleId="109EBDB68ACB4F68AA508E059E90054B1">
-    <w:name w:val="109EBDB68ACB4F68AA508E059E90054B1"/>
-    <w:rsid w:val="00DE4C99"/>
+  <w:style w:type="paragraph" w:customStyle="1" w:styleId="137428D61C6640268F56BB76B9153C14">
+    <w:name w:val="137428D61C6640268F56BB76B9153C14"/>
+    <w:rsid w:val="00557CFA"/>
     <w:pPr>
       <w:spacing w:before="40" w:after="40" w:line="240" w:lineRule="auto"/>
     </w:pPr>
@@ -9244,9 +9381,9 @@
       <w:szCs w:val="20"/>
     </w:rPr>
   </w:style>
-  <w:style w:type="paragraph" w:customStyle="1" w:styleId="6019D068AD7940F6A066B0EBAB40D7BA1">
-    <w:name w:val="6019D068AD7940F6A066B0EBAB40D7BA1"/>
-    <w:rsid w:val="00DE4C99"/>
+  <w:style w:type="paragraph" w:customStyle="1" w:styleId="5B4F51D3217A49DD952A6A016B67B6B4">
+    <w:name w:val="5B4F51D3217A49DD952A6A016B67B6B4"/>
+    <w:rsid w:val="00557CFA"/>
     <w:pPr>
       <w:spacing w:before="40" w:after="40" w:line="240" w:lineRule="auto"/>
     </w:pPr>
@@ -9256,9 +9393,33 @@
       <w:szCs w:val="20"/>
     </w:rPr>
   </w:style>
-  <w:style w:type="paragraph" w:customStyle="1" w:styleId="F393672CD99D4555816A23E5886E23271">
-    <w:name w:val="F393672CD99D4555816A23E5886E23271"/>
-    <w:rsid w:val="00DE4C99"/>
+  <w:style w:type="paragraph" w:customStyle="1" w:styleId="109EBDB68ACB4F68AA508E059E90054B">
+    <w:name w:val="109EBDB68ACB4F68AA508E059E90054B"/>
+    <w:rsid w:val="00557CFA"/>
+    <w:pPr>
+      <w:spacing w:before="40" w:after="40" w:line="240" w:lineRule="auto"/>
+    </w:pPr>
+    <w:rPr>
+      <w:rFonts w:ascii="Times New Roman" w:eastAsia="Times New Roman" w:hAnsi="Times New Roman" w:cs="Times New Roman"/>
+      <w:sz w:val="24"/>
+      <w:szCs w:val="20"/>
+    </w:rPr>
+  </w:style>
+  <w:style w:type="paragraph" w:customStyle="1" w:styleId="6019D068AD7940F6A066B0EBAB40D7BA">
+    <w:name w:val="6019D068AD7940F6A066B0EBAB40D7BA"/>
+    <w:rsid w:val="00557CFA"/>
+    <w:pPr>
+      <w:spacing w:before="40" w:after="40" w:line="240" w:lineRule="auto"/>
+    </w:pPr>
+    <w:rPr>
+      <w:rFonts w:ascii="Times New Roman" w:eastAsia="Times New Roman" w:hAnsi="Times New Roman" w:cs="Times New Roman"/>
+      <w:sz w:val="24"/>
+      <w:szCs w:val="20"/>
+    </w:rPr>
+  </w:style>
+  <w:style w:type="paragraph" w:customStyle="1" w:styleId="F393672CD99D4555816A23E5886E2327">
+    <w:name w:val="F393672CD99D4555816A23E5886E2327"/>
+    <w:rsid w:val="00557CFA"/>
     <w:pPr>
       <w:spacing w:after="0" w:line="240" w:lineRule="auto"/>
     </w:pPr>
@@ -9268,9 +9429,9 @@
       <w:szCs w:val="24"/>
     </w:rPr>
   </w:style>
-  <w:style w:type="paragraph" w:customStyle="1" w:styleId="30F99A229E124EE294268C7BB07E79191">
-    <w:name w:val="30F99A229E124EE294268C7BB07E79191"/>
-    <w:rsid w:val="00DE4C99"/>
+  <w:style w:type="paragraph" w:customStyle="1" w:styleId="4CCCEEE44FAA4C2CA6DCB910D066ECC51">
+    <w:name w:val="4CCCEEE44FAA4C2CA6DCB910D066ECC51"/>
+    <w:rsid w:val="00557CFA"/>
     <w:pPr>
       <w:spacing w:before="40" w:after="40" w:line="240" w:lineRule="auto"/>
     </w:pPr>
@@ -9280,9 +9441,9 @@
       <w:szCs w:val="20"/>
     </w:rPr>
   </w:style>
-  <w:style w:type="paragraph" w:customStyle="1" w:styleId="29F6C8F05FCF47999777CB15AA70B7901">
-    <w:name w:val="29F6C8F05FCF47999777CB15AA70B7901"/>
-    <w:rsid w:val="00DE4C99"/>
+  <w:style w:type="paragraph" w:customStyle="1" w:styleId="19D869DD2C4A457CA357CEBE20BFF6A11">
+    <w:name w:val="19D869DD2C4A457CA357CEBE20BFF6A11"/>
+    <w:rsid w:val="00557CFA"/>
     <w:pPr>
       <w:spacing w:before="40" w:after="40" w:line="240" w:lineRule="auto"/>
     </w:pPr>
@@ -9292,9 +9453,9 @@
       <w:szCs w:val="20"/>
     </w:rPr>
   </w:style>
-  <w:style w:type="paragraph" w:customStyle="1" w:styleId="C27700D16ED9448787CE1EF74661419C1">
-    <w:name w:val="C27700D16ED9448787CE1EF74661419C1"/>
-    <w:rsid w:val="00DE4C99"/>
+  <w:style w:type="paragraph" w:customStyle="1" w:styleId="E0455F61D0864EF291C06B686DD232541">
+    <w:name w:val="E0455F61D0864EF291C06B686DD232541"/>
+    <w:rsid w:val="00557CFA"/>
     <w:pPr>
       <w:spacing w:before="40" w:after="40" w:line="240" w:lineRule="auto"/>
     </w:pPr>
@@ -9304,9 +9465,9 @@
       <w:szCs w:val="20"/>
     </w:rPr>
   </w:style>
-  <w:style w:type="paragraph" w:customStyle="1" w:styleId="4B2DF1FDE8B74601B70170992E70A6931">
-    <w:name w:val="4B2DF1FDE8B74601B70170992E70A6931"/>
-    <w:rsid w:val="00DE4C99"/>
+  <w:style w:type="paragraph" w:customStyle="1" w:styleId="DB53699693B14054863CA7EF8B0BF1E31">
+    <w:name w:val="DB53699693B14054863CA7EF8B0BF1E31"/>
+    <w:rsid w:val="00557CFA"/>
     <w:pPr>
       <w:spacing w:before="40" w:after="40" w:line="240" w:lineRule="auto"/>
     </w:pPr>
@@ -9316,9 +9477,9 @@
       <w:szCs w:val="20"/>
     </w:rPr>
   </w:style>
-  <w:style w:type="paragraph" w:customStyle="1" w:styleId="35C0BB7B77F54014BB468B7A716EBA4D1">
-    <w:name w:val="35C0BB7B77F54014BB468B7A716EBA4D1"/>
-    <w:rsid w:val="00DE4C99"/>
+  <w:style w:type="paragraph" w:customStyle="1" w:styleId="35C0BB7B77F54014BB468B7A716EBA4D">
+    <w:name w:val="35C0BB7B77F54014BB468B7A716EBA4D"/>
+    <w:rsid w:val="00557CFA"/>
     <w:pPr>
       <w:spacing w:after="0" w:line="240" w:lineRule="auto"/>
     </w:pPr>
@@ -9621,24 +9782,19 @@
 </file>
 
 <file path=customXml/item1.xml><?xml version="1.0" encoding="utf-8"?>
-<p:properties xmlns:p="http://schemas.microsoft.com/office/2006/metadata/properties" xmlns:xsi="http://www.w3.org/2001/XMLSchema-instance" xmlns:pc="http://schemas.microsoft.com/office/infopath/2007/PartnerControls">
-  <documentManagement>
-    <TaxKeywordTaxHTField xmlns="016c310d-f661-49a6-97ee-540076082437">
-      <Terms xmlns="http://schemas.microsoft.com/office/infopath/2007/PartnerControls">
-        <TermInfo xmlns="http://schemas.microsoft.com/office/infopath/2007/PartnerControls">
-          <TermName xmlns="http://schemas.microsoft.com/office/infopath/2007/PartnerControls">Unrestricted</TermName>
-          <TermId xmlns="http://schemas.microsoft.com/office/infopath/2007/PartnerControls">11111111-1111-1111-1111-111111111111</TermId>
-        </TermInfo>
-      </Terms>
-    </TaxKeywordTaxHTField>
-    <TaxCatchAll xmlns="016c310d-f661-49a6-97ee-540076082437"/>
-    <SIP_Label_Document xmlns="016c310d-f661-49a6-97ee-540076082437">;#0;#Unrestricted;#True;#;#;#;#</SIP_Label_Document>
-    <AverageRating xmlns="http://schemas.microsoft.com/sharepoint/v3" xsi:nil="true"/>
-  </documentManagement>
-</p:properties>
+<b:Sources xmlns:b="http://schemas.openxmlformats.org/officeDocument/2006/bibliography" xmlns="http://schemas.openxmlformats.org/officeDocument/2006/bibliography" SelectedStyle="\APASixthEditionOfficeOnline.xsl" StyleName="APA" Version="6"/>
 </file>
 
 <file path=customXml/item2.xml><?xml version="1.0" encoding="utf-8"?>
+<?mso-contentType ?>
+<FormTemplates xmlns="http://schemas.microsoft.com/sharepoint/v3/contenttype/forms">
+  <Display>DocumentLibraryForm</Display>
+  <Edit>DocumentLibraryForm</Edit>
+  <New>DocumentLibraryForm</New>
+</FormTemplates>
+</file>
+
+<file path=customXml/item3.xml><?xml version="1.0" encoding="utf-8"?>
 <ct:contentTypeSchema xmlns:ct="http://schemas.microsoft.com/office/2006/metadata/contentType" xmlns:ma="http://schemas.microsoft.com/office/2006/metadata/properties/metaAttributes" ct:_="" ma:_="" ma:contentTypeName="Document" ma:contentTypeID="0x010100833E2717D64DEA4FBFABAC416D347394" ma:contentTypeVersion="6" ma:contentTypeDescription="Create a new document." ma:contentTypeScope="" ma:versionID="98a74335b8287497f43df26a30ee6108">
   <xsd:schema xmlns:xsd="http://www.w3.org/2001/XMLSchema" xmlns:xs="http://www.w3.org/2001/XMLSchema" xmlns:p="http://schemas.microsoft.com/office/2006/metadata/properties" xmlns:ns1="http://schemas.microsoft.com/sharepoint/v3" xmlns:ns2="016c310d-f661-49a6-97ee-540076082437" targetNamespace="http://schemas.microsoft.com/office/2006/metadata/properties" ma:root="true" ma:fieldsID="d32ef67c478e261fbf17576a93df92a4" ns1:_="" ns2:_="">
     <xsd:import namespace="http://schemas.microsoft.com/sharepoint/v3"/>
@@ -9801,31 +9957,41 @@
 </ct:contentTypeSchema>
 </file>
 
-<file path=customXml/item3.xml><?xml version="1.0" encoding="utf-8"?>
-<?mso-contentType ?>
-<FormTemplates xmlns="http://schemas.microsoft.com/sharepoint/v3/contenttype/forms">
-  <Display>DocumentLibraryForm</Display>
-  <Edit>DocumentLibraryForm</Edit>
-  <New>DocumentLibraryForm</New>
-</FormTemplates>
-</file>
-
 <file path=customXml/item4.xml><?xml version="1.0" encoding="utf-8"?>
-<b:Sources xmlns:b="http://schemas.openxmlformats.org/officeDocument/2006/bibliography" xmlns="http://schemas.openxmlformats.org/officeDocument/2006/bibliography" SelectedStyle="\APASixthEditionOfficeOnline.xsl" StyleName="APA" Version="6"/>
+<p:properties xmlns:p="http://schemas.microsoft.com/office/2006/metadata/properties" xmlns:xsi="http://www.w3.org/2001/XMLSchema-instance" xmlns:pc="http://schemas.microsoft.com/office/infopath/2007/PartnerControls">
+  <documentManagement>
+    <TaxKeywordTaxHTField xmlns="016c310d-f661-49a6-97ee-540076082437">
+      <Terms xmlns="http://schemas.microsoft.com/office/infopath/2007/PartnerControls">
+        <TermInfo xmlns="http://schemas.microsoft.com/office/infopath/2007/PartnerControls">
+          <TermName xmlns="http://schemas.microsoft.com/office/infopath/2007/PartnerControls">Unrestricted</TermName>
+          <TermId xmlns="http://schemas.microsoft.com/office/infopath/2007/PartnerControls">11111111-1111-1111-1111-111111111111</TermId>
+        </TermInfo>
+      </Terms>
+    </TaxKeywordTaxHTField>
+    <TaxCatchAll xmlns="016c310d-f661-49a6-97ee-540076082437"/>
+    <SIP_Label_Document xmlns="016c310d-f661-49a6-97ee-540076082437">;#0;#Unrestricted;#True;#;#;#;#</SIP_Label_Document>
+    <AverageRating xmlns="http://schemas.microsoft.com/sharepoint/v3" xsi:nil="true"/>
+  </documentManagement>
+</p:properties>
 </file>
 
 <file path=customXml/itemProps1.xml><?xml version="1.0" encoding="utf-8"?>
-<ds:datastoreItem xmlns:ds="http://schemas.openxmlformats.org/officeDocument/2006/customXml" ds:itemID="{033400F4-1F04-4DBC-9784-C8B3AA89B53C}">
+<ds:datastoreItem xmlns:ds="http://schemas.openxmlformats.org/officeDocument/2006/customXml" ds:itemID="{CD6CF2A3-23DE-48BF-867B-89770F7DA3FE}">
   <ds:schemaRefs>
-    <ds:schemaRef ds:uri="http://schemas.microsoft.com/office/2006/metadata/properties"/>
-    <ds:schemaRef ds:uri="http://schemas.microsoft.com/office/infopath/2007/PartnerControls"/>
-    <ds:schemaRef ds:uri="016c310d-f661-49a6-97ee-540076082437"/>
-    <ds:schemaRef ds:uri="http://schemas.microsoft.com/sharepoint/v3"/>
+    <ds:schemaRef ds:uri="http://schemas.openxmlformats.org/officeDocument/2006/bibliography"/>
   </ds:schemaRefs>
 </ds:datastoreItem>
 </file>
 
 <file path=customXml/itemProps2.xml><?xml version="1.0" encoding="utf-8"?>
+<ds:datastoreItem xmlns:ds="http://schemas.openxmlformats.org/officeDocument/2006/customXml" ds:itemID="{6A21EC55-C1B2-4765-90AC-37A4F1604205}">
+  <ds:schemaRefs>
+    <ds:schemaRef ds:uri="http://schemas.microsoft.com/sharepoint/v3/contenttype/forms"/>
+  </ds:schemaRefs>
+</ds:datastoreItem>
+</file>
+
+<file path=customXml/itemProps3.xml><?xml version="1.0" encoding="utf-8"?>
 <ds:datastoreItem xmlns:ds="http://schemas.openxmlformats.org/officeDocument/2006/customXml" ds:itemID="{70D90404-A780-484E-92B9-483A3C532657}">
   <ds:schemaRefs>
     <ds:schemaRef ds:uri="http://schemas.microsoft.com/office/2006/metadata/contentType"/>
@@ -9844,18 +10010,13 @@
 </ds:datastoreItem>
 </file>
 
-<file path=customXml/itemProps3.xml><?xml version="1.0" encoding="utf-8"?>
-<ds:datastoreItem xmlns:ds="http://schemas.openxmlformats.org/officeDocument/2006/customXml" ds:itemID="{6A21EC55-C1B2-4765-90AC-37A4F1604205}">
+<file path=customXml/itemProps4.xml><?xml version="1.0" encoding="utf-8"?>
+<ds:datastoreItem xmlns:ds="http://schemas.openxmlformats.org/officeDocument/2006/customXml" ds:itemID="{033400F4-1F04-4DBC-9784-C8B3AA89B53C}">
   <ds:schemaRefs>
-    <ds:schemaRef ds:uri="http://schemas.microsoft.com/sharepoint/v3/contenttype/forms"/>
-  </ds:schemaRefs>
-</ds:datastoreItem>
-</file>
-
-<file path=customXml/itemProps4.xml><?xml version="1.0" encoding="utf-8"?>
-<ds:datastoreItem xmlns:ds="http://schemas.openxmlformats.org/officeDocument/2006/customXml" ds:itemID="{CD6CF2A3-23DE-48BF-867B-89770F7DA3FE}">
-  <ds:schemaRefs>
-    <ds:schemaRef ds:uri="http://schemas.openxmlformats.org/officeDocument/2006/bibliography"/>
+    <ds:schemaRef ds:uri="http://schemas.microsoft.com/office/2006/metadata/properties"/>
+    <ds:schemaRef ds:uri="http://schemas.microsoft.com/office/infopath/2007/PartnerControls"/>
+    <ds:schemaRef ds:uri="016c310d-f661-49a6-97ee-540076082437"/>
+    <ds:schemaRef ds:uri="http://schemas.microsoft.com/sharepoint/v3"/>
   </ds:schemaRefs>
 </ds:datastoreItem>
 </file>
</xml_diff>

<commit_message>
IES-1597 - fix for CCoPD Checkbox in PBOE export
</commit_message>
<xml_diff>
--- a/GenBOE/GenBOE.Web/Templates/Export/PBOE_1.docx
+++ b/GenBOE/GenBOE.Web/Templates/Export/PBOE_1.docx
@@ -842,15 +842,24 @@
                 <w:b/>
                 <w:sz w:val="20"/>
               </w:rPr>
-              <w:t xml:space="preserve"> / CUSTOMER RFP No. </w:t>
-            </w:r>
+              <w:t xml:space="preserve"> / CUSTOMER RFP </w:t>
+            </w:r>
+            <w:proofErr w:type="gramStart"/>
             <w:r>
               <w:rPr>
                 <w:b/>
                 <w:sz w:val="20"/>
               </w:rPr>
+              <w:t xml:space="preserve">No. </w:t>
+            </w:r>
+            <w:r>
+              <w:rPr>
+                <w:b/>
+                <w:sz w:val="20"/>
+              </w:rPr>
               <w:t>:</w:t>
             </w:r>
+            <w:proofErr w:type="gramEnd"/>
             <w:r>
               <w:rPr>
                 <w:b/>
@@ -2151,7 +2160,7 @@
               </w:rPr>
               <w:fldChar w:fldCharType="begin">
                 <w:ffData>
-                  <w:name w:val="CCoPD_Threshold"/>
+                  <w:name w:val="ccopd_threshold"/>
                   <w:enabled/>
                   <w:calcOnExit w:val="0"/>
                   <w:checkBox>
@@ -2161,7 +2170,7 @@
                 </w:ffData>
               </w:fldChar>
             </w:r>
-            <w:bookmarkStart w:id="6" w:name="CCoPD_Threshold"/>
+            <w:bookmarkStart w:id="6" w:name="ccopd_threshold"/>
             <w:r>
               <w:rPr>
                 <w:sz w:val="20"/>
@@ -2172,12 +2181,6 @@
               <w:rPr>
                 <w:sz w:val="20"/>
               </w:rPr>
-            </w:r>
-            <w:r>
-              <w:rPr>
-                <w:sz w:val="20"/>
-              </w:rPr>
-              <w:fldChar w:fldCharType="separate"/>
             </w:r>
             <w:r>
               <w:rPr>
@@ -2259,7 +2262,21 @@
               <w:rPr>
                 <w:sz w:val="20"/>
               </w:rPr>
-              <w:t xml:space="preserve">    Other Exception applies  (explain)</w:t>
+              <w:t xml:space="preserve">    Other Exception </w:t>
+            </w:r>
+            <w:proofErr w:type="gramStart"/>
+            <w:r>
+              <w:rPr>
+                <w:sz w:val="20"/>
+              </w:rPr>
+              <w:t>applies  (</w:t>
+            </w:r>
+            <w:proofErr w:type="gramEnd"/>
+            <w:r>
+              <w:rPr>
+                <w:sz w:val="20"/>
+              </w:rPr>
+              <w:t>explain)</w:t>
             </w:r>
             <w:r>
               <w:rPr>
@@ -8395,7 +8412,7 @@
     <w:sig w:usb0="E1002EFF" w:usb1="C000605B" w:usb2="00000029" w:usb3="00000000" w:csb0="000101FF" w:csb1="00000000"/>
   </w:font>
   <w:font w:name="MS Mincho">
-    <w:altName w:val="MS Mincho"/>
+    <w:altName w:val="ＭＳ 明朝"/>
     <w:panose1 w:val="02020609040205080304"/>
     <w:charset w:val="80"/>
     <w:family w:val="modern"/>
@@ -8493,6 +8510,7 @@
     <w:rsid w:val="00A52318"/>
     <w:rsid w:val="00A9690C"/>
     <w:rsid w:val="00AD31B5"/>
+    <w:rsid w:val="00B238B9"/>
     <w:rsid w:val="00B33741"/>
     <w:rsid w:val="00B70B98"/>
     <w:rsid w:val="00B76D4F"/>
@@ -9782,19 +9800,24 @@
 </file>
 
 <file path=customXml/item1.xml><?xml version="1.0" encoding="utf-8"?>
-<b:Sources xmlns:b="http://schemas.openxmlformats.org/officeDocument/2006/bibliography" xmlns="http://schemas.openxmlformats.org/officeDocument/2006/bibliography" SelectedStyle="\APASixthEditionOfficeOnline.xsl" StyleName="APA" Version="6"/>
+<p:properties xmlns:p="http://schemas.microsoft.com/office/2006/metadata/properties" xmlns:xsi="http://www.w3.org/2001/XMLSchema-instance" xmlns:pc="http://schemas.microsoft.com/office/infopath/2007/PartnerControls">
+  <documentManagement>
+    <TaxKeywordTaxHTField xmlns="016c310d-f661-49a6-97ee-540076082437">
+      <Terms xmlns="http://schemas.microsoft.com/office/infopath/2007/PartnerControls">
+        <TermInfo xmlns="http://schemas.microsoft.com/office/infopath/2007/PartnerControls">
+          <TermName xmlns="http://schemas.microsoft.com/office/infopath/2007/PartnerControls">Unrestricted</TermName>
+          <TermId xmlns="http://schemas.microsoft.com/office/infopath/2007/PartnerControls">11111111-1111-1111-1111-111111111111</TermId>
+        </TermInfo>
+      </Terms>
+    </TaxKeywordTaxHTField>
+    <TaxCatchAll xmlns="016c310d-f661-49a6-97ee-540076082437"/>
+    <SIP_Label_Document xmlns="016c310d-f661-49a6-97ee-540076082437">;#0;#Unrestricted;#True;#;#;#;#</SIP_Label_Document>
+    <AverageRating xmlns="http://schemas.microsoft.com/sharepoint/v3" xsi:nil="true"/>
+  </documentManagement>
+</p:properties>
 </file>
 
 <file path=customXml/item2.xml><?xml version="1.0" encoding="utf-8"?>
-<?mso-contentType ?>
-<FormTemplates xmlns="http://schemas.microsoft.com/sharepoint/v3/contenttype/forms">
-  <Display>DocumentLibraryForm</Display>
-  <Edit>DocumentLibraryForm</Edit>
-  <New>DocumentLibraryForm</New>
-</FormTemplates>
-</file>
-
-<file path=customXml/item3.xml><?xml version="1.0" encoding="utf-8"?>
 <ct:contentTypeSchema xmlns:ct="http://schemas.microsoft.com/office/2006/metadata/contentType" xmlns:ma="http://schemas.microsoft.com/office/2006/metadata/properties/metaAttributes" ct:_="" ma:_="" ma:contentTypeName="Document" ma:contentTypeID="0x010100833E2717D64DEA4FBFABAC416D347394" ma:contentTypeVersion="6" ma:contentTypeDescription="Create a new document." ma:contentTypeScope="" ma:versionID="98a74335b8287497f43df26a30ee6108">
   <xsd:schema xmlns:xsd="http://www.w3.org/2001/XMLSchema" xmlns:xs="http://www.w3.org/2001/XMLSchema" xmlns:p="http://schemas.microsoft.com/office/2006/metadata/properties" xmlns:ns1="http://schemas.microsoft.com/sharepoint/v3" xmlns:ns2="016c310d-f661-49a6-97ee-540076082437" targetNamespace="http://schemas.microsoft.com/office/2006/metadata/properties" ma:root="true" ma:fieldsID="d32ef67c478e261fbf17576a93df92a4" ns1:_="" ns2:_="">
     <xsd:import namespace="http://schemas.microsoft.com/sharepoint/v3"/>
@@ -9957,41 +9980,31 @@
 </ct:contentTypeSchema>
 </file>
 
+<file path=customXml/item3.xml><?xml version="1.0" encoding="utf-8"?>
+<?mso-contentType ?>
+<FormTemplates xmlns="http://schemas.microsoft.com/sharepoint/v3/contenttype/forms">
+  <Display>DocumentLibraryForm</Display>
+  <Edit>DocumentLibraryForm</Edit>
+  <New>DocumentLibraryForm</New>
+</FormTemplates>
+</file>
+
 <file path=customXml/item4.xml><?xml version="1.0" encoding="utf-8"?>
-<p:properties xmlns:p="http://schemas.microsoft.com/office/2006/metadata/properties" xmlns:xsi="http://www.w3.org/2001/XMLSchema-instance" xmlns:pc="http://schemas.microsoft.com/office/infopath/2007/PartnerControls">
-  <documentManagement>
-    <TaxKeywordTaxHTField xmlns="016c310d-f661-49a6-97ee-540076082437">
-      <Terms xmlns="http://schemas.microsoft.com/office/infopath/2007/PartnerControls">
-        <TermInfo xmlns="http://schemas.microsoft.com/office/infopath/2007/PartnerControls">
-          <TermName xmlns="http://schemas.microsoft.com/office/infopath/2007/PartnerControls">Unrestricted</TermName>
-          <TermId xmlns="http://schemas.microsoft.com/office/infopath/2007/PartnerControls">11111111-1111-1111-1111-111111111111</TermId>
-        </TermInfo>
-      </Terms>
-    </TaxKeywordTaxHTField>
-    <TaxCatchAll xmlns="016c310d-f661-49a6-97ee-540076082437"/>
-    <SIP_Label_Document xmlns="016c310d-f661-49a6-97ee-540076082437">;#0;#Unrestricted;#True;#;#;#;#</SIP_Label_Document>
-    <AverageRating xmlns="http://schemas.microsoft.com/sharepoint/v3" xsi:nil="true"/>
-  </documentManagement>
-</p:properties>
+<b:Sources xmlns:b="http://schemas.openxmlformats.org/officeDocument/2006/bibliography" xmlns="http://schemas.openxmlformats.org/officeDocument/2006/bibliography" SelectedStyle="\APASixthEditionOfficeOnline.xsl" StyleName="APA" Version="6"/>
 </file>
 
 <file path=customXml/itemProps1.xml><?xml version="1.0" encoding="utf-8"?>
-<ds:datastoreItem xmlns:ds="http://schemas.openxmlformats.org/officeDocument/2006/customXml" ds:itemID="{CD6CF2A3-23DE-48BF-867B-89770F7DA3FE}">
+<ds:datastoreItem xmlns:ds="http://schemas.openxmlformats.org/officeDocument/2006/customXml" ds:itemID="{033400F4-1F04-4DBC-9784-C8B3AA89B53C}">
   <ds:schemaRefs>
-    <ds:schemaRef ds:uri="http://schemas.openxmlformats.org/officeDocument/2006/bibliography"/>
+    <ds:schemaRef ds:uri="http://schemas.microsoft.com/office/2006/metadata/properties"/>
+    <ds:schemaRef ds:uri="http://schemas.microsoft.com/office/infopath/2007/PartnerControls"/>
+    <ds:schemaRef ds:uri="016c310d-f661-49a6-97ee-540076082437"/>
+    <ds:schemaRef ds:uri="http://schemas.microsoft.com/sharepoint/v3"/>
   </ds:schemaRefs>
 </ds:datastoreItem>
 </file>
 
 <file path=customXml/itemProps2.xml><?xml version="1.0" encoding="utf-8"?>
-<ds:datastoreItem xmlns:ds="http://schemas.openxmlformats.org/officeDocument/2006/customXml" ds:itemID="{6A21EC55-C1B2-4765-90AC-37A4F1604205}">
-  <ds:schemaRefs>
-    <ds:schemaRef ds:uri="http://schemas.microsoft.com/sharepoint/v3/contenttype/forms"/>
-  </ds:schemaRefs>
-</ds:datastoreItem>
-</file>
-
-<file path=customXml/itemProps3.xml><?xml version="1.0" encoding="utf-8"?>
 <ds:datastoreItem xmlns:ds="http://schemas.openxmlformats.org/officeDocument/2006/customXml" ds:itemID="{70D90404-A780-484E-92B9-483A3C532657}">
   <ds:schemaRefs>
     <ds:schemaRef ds:uri="http://schemas.microsoft.com/office/2006/metadata/contentType"/>
@@ -10010,13 +10023,18 @@
 </ds:datastoreItem>
 </file>
 
+<file path=customXml/itemProps3.xml><?xml version="1.0" encoding="utf-8"?>
+<ds:datastoreItem xmlns:ds="http://schemas.openxmlformats.org/officeDocument/2006/customXml" ds:itemID="{6A21EC55-C1B2-4765-90AC-37A4F1604205}">
+  <ds:schemaRefs>
+    <ds:schemaRef ds:uri="http://schemas.microsoft.com/sharepoint/v3/contenttype/forms"/>
+  </ds:schemaRefs>
+</ds:datastoreItem>
+</file>
+
 <file path=customXml/itemProps4.xml><?xml version="1.0" encoding="utf-8"?>
-<ds:datastoreItem xmlns:ds="http://schemas.openxmlformats.org/officeDocument/2006/customXml" ds:itemID="{033400F4-1F04-4DBC-9784-C8B3AA89B53C}">
+<ds:datastoreItem xmlns:ds="http://schemas.openxmlformats.org/officeDocument/2006/customXml" ds:itemID="{CD6CF2A3-23DE-48BF-867B-89770F7DA3FE}">
   <ds:schemaRefs>
-    <ds:schemaRef ds:uri="http://schemas.microsoft.com/office/2006/metadata/properties"/>
-    <ds:schemaRef ds:uri="http://schemas.microsoft.com/office/infopath/2007/PartnerControls"/>
-    <ds:schemaRef ds:uri="016c310d-f661-49a6-97ee-540076082437"/>
-    <ds:schemaRef ds:uri="http://schemas.microsoft.com/sharepoint/v3"/>
+    <ds:schemaRef ds:uri="http://schemas.openxmlformats.org/officeDocument/2006/bibliography"/>
   </ds:schemaRefs>
 </ds:datastoreItem>
 </file>
</xml_diff>

<commit_message>
PROPH-610, PROPH-611 - PBOE label changes and some additional minor details;
</commit_message>
<xml_diff>
--- a/GenBOE/GenBOE.Web/Templates/Export/PBOE_1.docx
+++ b/GenBOE/GenBOE.Web/Templates/Export/PBOE_1.docx
@@ -1,6 +1,6 @@
 
 <file path=word/document.xml><?xml version="1.0" encoding="utf-8"?>
-<w:document xmlns:wpc="http://schemas.microsoft.com/office/word/2010/wordprocessingCanvas" xmlns:cx="http://schemas.microsoft.com/office/drawing/2014/chartex" xmlns:cx1="http://schemas.microsoft.com/office/drawing/2015/9/8/chartex" xmlns:cx2="http://schemas.microsoft.com/office/drawing/2015/10/21/chartex" xmlns:cx3="http://schemas.microsoft.com/office/drawing/2016/5/9/chartex" xmlns:cx4="http://schemas.microsoft.com/office/drawing/2016/5/10/chartex" xmlns:cx5="http://schemas.microsoft.com/office/drawing/2016/5/11/chartex" xmlns:cx6="http://schemas.microsoft.com/office/drawing/2016/5/12/chartex" xmlns:cx7="http://schemas.microsoft.com/office/drawing/2016/5/13/chartex" xmlns:cx8="http://schemas.microsoft.com/office/drawing/2016/5/14/chartex" xmlns:mc="http://schemas.openxmlformats.org/markup-compatibility/2006" xmlns:aink="http://schemas.microsoft.com/office/drawing/2016/ink" xmlns:am3d="http://schemas.microsoft.com/office/drawing/2017/model3d" xmlns:o="urn:schemas-microsoft-com:office:office" xmlns:r="http://schemas.openxmlformats.org/officeDocument/2006/relationships" xmlns:m="http://schemas.openxmlformats.org/officeDocument/2006/math" xmlns:v="urn:schemas-microsoft-com:vml" xmlns:wp14="http://schemas.microsoft.com/office/word/2010/wordprocessingDrawing" xmlns:wp="http://schemas.openxmlformats.org/drawingml/2006/wordprocessingDrawing" xmlns:w10="urn:schemas-microsoft-com:office:word" xmlns:w="http://schemas.openxmlformats.org/wordprocessingml/2006/main" xmlns:w14="http://schemas.microsoft.com/office/word/2010/wordml" xmlns:w15="http://schemas.microsoft.com/office/word/2012/wordml" xmlns:w16cex="http://schemas.microsoft.com/office/word/2018/wordml/cex" xmlns:w16cid="http://schemas.microsoft.com/office/word/2016/wordml/cid" xmlns:w16="http://schemas.microsoft.com/office/word/2018/wordml" xmlns:w16sdtdh="http://schemas.microsoft.com/office/word/2020/wordml/sdtdatahash" xmlns:w16se="http://schemas.microsoft.com/office/word/2015/wordml/symex" xmlns:wpg="http://schemas.microsoft.com/office/word/2010/wordprocessingGroup" xmlns:wpi="http://schemas.microsoft.com/office/word/2010/wordprocessingInk" xmlns:wne="http://schemas.microsoft.com/office/word/2006/wordml" xmlns:wps="http://schemas.microsoft.com/office/word/2010/wordprocessingShape" mc:Ignorable="w14 w15 w16se w16cid w16 w16cex w16sdtdh wp14">
+<w:document xmlns:wpc="http://schemas.microsoft.com/office/word/2010/wordprocessingCanvas" xmlns:cx="http://schemas.microsoft.com/office/drawing/2014/chartex" xmlns:cx1="http://schemas.microsoft.com/office/drawing/2015/9/8/chartex" xmlns:cx2="http://schemas.microsoft.com/office/drawing/2015/10/21/chartex" xmlns:cx3="http://schemas.microsoft.com/office/drawing/2016/5/9/chartex" xmlns:cx4="http://schemas.microsoft.com/office/drawing/2016/5/10/chartex" xmlns:cx5="http://schemas.microsoft.com/office/drawing/2016/5/11/chartex" xmlns:cx6="http://schemas.microsoft.com/office/drawing/2016/5/12/chartex" xmlns:cx7="http://schemas.microsoft.com/office/drawing/2016/5/13/chartex" xmlns:cx8="http://schemas.microsoft.com/office/drawing/2016/5/14/chartex" xmlns:mc="http://schemas.openxmlformats.org/markup-compatibility/2006" xmlns:aink="http://schemas.microsoft.com/office/drawing/2016/ink" xmlns:am3d="http://schemas.microsoft.com/office/drawing/2017/model3d" xmlns:o="urn:schemas-microsoft-com:office:office" xmlns:oel="http://schemas.microsoft.com/office/2019/extlst" xmlns:r="http://schemas.openxmlformats.org/officeDocument/2006/relationships" xmlns:m="http://schemas.openxmlformats.org/officeDocument/2006/math" xmlns:v="urn:schemas-microsoft-com:vml" xmlns:wp14="http://schemas.microsoft.com/office/word/2010/wordprocessingDrawing" xmlns:wp="http://schemas.openxmlformats.org/drawingml/2006/wordprocessingDrawing" xmlns:w10="urn:schemas-microsoft-com:office:word" xmlns:w="http://schemas.openxmlformats.org/wordprocessingml/2006/main" xmlns:w14="http://schemas.microsoft.com/office/word/2010/wordml" xmlns:w15="http://schemas.microsoft.com/office/word/2012/wordml" xmlns:w16cex="http://schemas.microsoft.com/office/word/2018/wordml/cex" xmlns:w16cid="http://schemas.microsoft.com/office/word/2016/wordml/cid" xmlns:w16="http://schemas.microsoft.com/office/word/2018/wordml" xmlns:w16sdtdh="http://schemas.microsoft.com/office/word/2020/wordml/sdtdatahash" xmlns:w16se="http://schemas.microsoft.com/office/word/2015/wordml/symex" xmlns:wpg="http://schemas.microsoft.com/office/word/2010/wordprocessingGroup" xmlns:wpi="http://schemas.microsoft.com/office/word/2010/wordprocessingInk" xmlns:wne="http://schemas.microsoft.com/office/word/2006/wordml" xmlns:wps="http://schemas.microsoft.com/office/word/2010/wordprocessingShape" mc:Ignorable="w14 w15 w16se w16cid w16 w16cex w16sdtdh wp14">
   <w:body>
     <w:p>
       <w:pPr>
@@ -170,7 +170,6 @@
           <w:showingPlcHdr/>
           <w:text/>
         </w:sdtPr>
-        <w:sdtEndPr/>
         <w:sdtContent>
           <w:r>
             <w:rPr>
@@ -225,7 +224,6 @@
           <w:showingPlcHdr/>
           <w:text/>
         </w:sdtPr>
-        <w:sdtEndPr/>
         <w:sdtContent>
           <w:r>
             <w:rPr>
@@ -341,7 +339,6 @@
                 <w:showingPlcHdr/>
                 <w:text/>
               </w:sdtPr>
-              <w:sdtEndPr/>
               <w:sdtContent>
                 <w:r>
                   <w:rPr>
@@ -407,7 +404,6 @@
                 </w:placeholder>
                 <w:showingPlcHdr/>
               </w:sdtPr>
-              <w:sdtEndPr/>
               <w:sdtContent>
                 <w:r>
                   <w:rPr>
@@ -474,7 +470,6 @@
                 <w:showingPlcHdr/>
                 <w:text/>
               </w:sdtPr>
-              <w:sdtEndPr/>
               <w:sdtContent>
                 <w:r>
                   <w:rPr>
@@ -548,7 +543,6 @@
                 <w:showingPlcHdr/>
                 <w:text/>
               </w:sdtPr>
-              <w:sdtEndPr/>
               <w:sdtContent>
                 <w:r>
                   <w:rPr>
@@ -603,7 +597,6 @@
                 <w:showingPlcHdr/>
                 <w:text/>
               </w:sdtPr>
-              <w:sdtEndPr/>
               <w:sdtContent>
                 <w:r>
                   <w:rPr>
@@ -655,7 +648,6 @@
                 <w:showingPlcHdr/>
                 <w:text/>
               </w:sdtPr>
-              <w:sdtEndPr/>
               <w:sdtContent>
                 <w:r>
                   <w:rPr>
@@ -731,7 +723,6 @@
                 <w:showingPlcHdr/>
                 <w:text/>
               </w:sdtPr>
-              <w:sdtEndPr/>
               <w:sdtContent>
                 <w:r>
                   <w:rPr>
@@ -782,7 +773,6 @@
                 </w:placeholder>
                 <w:showingPlcHdr/>
               </w:sdtPr>
-              <w:sdtEndPr/>
               <w:sdtContent>
                 <w:r>
                   <w:rPr>
@@ -842,24 +832,15 @@
                 <w:b/>
                 <w:sz w:val="20"/>
               </w:rPr>
-              <w:t xml:space="preserve"> / CUSTOMER RFP </w:t>
-            </w:r>
-            <w:proofErr w:type="gramStart"/>
+              <w:t xml:space="preserve"> / CUSTOMER RFP No. </w:t>
+            </w:r>
             <w:r>
               <w:rPr>
                 <w:b/>
                 <w:sz w:val="20"/>
               </w:rPr>
-              <w:t xml:space="preserve">No. </w:t>
-            </w:r>
-            <w:r>
-              <w:rPr>
-                <w:b/>
-                <w:sz w:val="20"/>
-              </w:rPr>
               <w:t>:</w:t>
             </w:r>
-            <w:proofErr w:type="gramEnd"/>
             <w:r>
               <w:rPr>
                 <w:b/>
@@ -882,7 +863,6 @@
                 <w:showingPlcHdr/>
                 <w:text/>
               </w:sdtPr>
-              <w:sdtEndPr/>
               <w:sdtContent>
                 <w:r>
                   <w:rPr>
@@ -1126,7 +1106,6 @@
                 <w:showingPlcHdr/>
                 <w:text/>
               </w:sdtPr>
-              <w:sdtEndPr/>
               <w:sdtContent>
                 <w:r>
                   <w:rPr>
@@ -1146,7 +1125,6 @@
                 </w:placeholder>
                 <w:showingPlcHdr/>
               </w:sdtPr>
-              <w:sdtEndPr/>
               <w:sdtContent/>
             </w:sdt>
           </w:p>
@@ -1176,7 +1154,6 @@
                 <w:showingPlcHdr/>
                 <w:text/>
               </w:sdtPr>
-              <w:sdtEndPr/>
               <w:sdtContent>
                 <w:r>
                   <w:rPr>
@@ -1215,7 +1192,6 @@
                 <w:showingPlcHdr/>
                 <w:text/>
               </w:sdtPr>
-              <w:sdtEndPr/>
               <w:sdtContent>
                 <w:r>
                   <w:rPr>
@@ -1256,7 +1232,6 @@
                 <w:showingPlcHdr/>
                 <w:text/>
               </w:sdtPr>
-              <w:sdtEndPr/>
               <w:sdtContent>
                 <w:r>
                   <w:rPr>
@@ -1286,7 +1261,6 @@
             </w:placeholder>
             <w:showingPlcHdr/>
           </w:sdtPr>
-          <w:sdtEndPr/>
           <w:sdtContent>
             <w:tc>
               <w:tcPr>
@@ -1346,7 +1320,6 @@
                 <w:showingPlcHdr/>
                 <w:text/>
               </w:sdtPr>
-              <w:sdtEndPr/>
               <w:sdtContent>
                 <w:r>
                   <w:rPr>
@@ -1393,7 +1366,6 @@
                 <w:showingPlcHdr/>
                 <w:text/>
               </w:sdtPr>
-              <w:sdtEndPr/>
               <w:sdtContent>
                 <w:r>
                   <w:rPr>
@@ -1443,7 +1415,6 @@
             </w:placeholder>
             <w:showingPlcHdr/>
           </w:sdtPr>
-          <w:sdtEndPr/>
           <w:sdtContent>
             <w:tc>
               <w:tcPr>
@@ -1503,7 +1474,6 @@
                 <w:showingPlcHdr/>
                 <w:text/>
               </w:sdtPr>
-              <w:sdtEndPr/>
               <w:sdtContent>
                 <w:r>
                   <w:rPr>
@@ -1549,7 +1519,6 @@
                 <w:showingPlcHdr/>
                 <w:text/>
               </w:sdtPr>
-              <w:sdtEndPr/>
               <w:sdtContent>
                 <w:r>
                   <w:rPr>
@@ -1659,7 +1628,6 @@
                 <w:showingPlcHdr/>
                 <w:text/>
               </w:sdtPr>
-              <w:sdtEndPr/>
               <w:sdtContent>
                 <w:r>
                   <w:rPr>
@@ -2186,6 +2154,12 @@
               <w:rPr>
                 <w:sz w:val="20"/>
               </w:rPr>
+              <w:fldChar w:fldCharType="separate"/>
+            </w:r>
+            <w:r>
+              <w:rPr>
+                <w:sz w:val="20"/>
+              </w:rPr>
               <w:fldChar w:fldCharType="end"/>
             </w:r>
             <w:bookmarkEnd w:id="6"/>
@@ -2262,21 +2236,7 @@
               <w:rPr>
                 <w:sz w:val="20"/>
               </w:rPr>
-              <w:t xml:space="preserve">    Other Exception </w:t>
-            </w:r>
-            <w:proofErr w:type="gramStart"/>
-            <w:r>
-              <w:rPr>
-                <w:sz w:val="20"/>
-              </w:rPr>
-              <w:t>applies  (</w:t>
-            </w:r>
-            <w:proofErr w:type="gramEnd"/>
-            <w:r>
-              <w:rPr>
-                <w:sz w:val="20"/>
-              </w:rPr>
-              <w:t>explain)</w:t>
+              <w:t xml:space="preserve">    Other Exception applies  (explain)</w:t>
             </w:r>
             <w:r>
               <w:rPr>
@@ -2303,7 +2263,6 @@
                 <w:showingPlcHdr/>
                 <w:text/>
               </w:sdtPr>
-              <w:sdtEndPr/>
               <w:sdtContent>
                 <w:r>
                   <w:rPr>
@@ -2402,7 +2361,6 @@
                 <w:showingPlcHdr/>
                 <w:text/>
               </w:sdtPr>
-              <w:sdtEndPr/>
               <w:sdtContent>
                 <w:r>
                   <w:t>SOURCE SELECTION</w:t>
@@ -2440,7 +2398,6 @@
                 <w:showingPlcHdr/>
                 <w:text/>
               </w:sdtPr>
-              <w:sdtEndPr/>
               <w:sdtContent>
                 <w:r>
                   <w:t>COMMERCIALITY (If Applicable)</w:t>
@@ -2478,7 +2435,6 @@
                 <w:showingPlcHdr/>
                 <w:text/>
               </w:sdtPr>
-              <w:sdtEndPr/>
               <w:sdtContent>
                 <w:r>
                   <w:t>TECHNICAL EVALUATION (If Applicable)</w:t>
@@ -2516,7 +2472,6 @@
                 <w:showingPlcHdr/>
                 <w:text/>
               </w:sdtPr>
-              <w:sdtEndPr/>
               <w:sdtContent>
                 <w:r>
                   <w:t>PRICE ANALYSIS</w:t>
@@ -2555,7 +2510,6 @@
                 <w:showingPlcHdr/>
                 <w:text/>
               </w:sdtPr>
-              <w:sdtEndPr/>
               <w:sdtContent>
                 <w:r>
                   <w:t>COST ANALYSIS (If Applicable)</w:t>
@@ -2572,6 +2526,7 @@
               <w:rPr>
                 <w:b/>
                 <w:bCs/>
+                <w:caps/>
                 <w:u w:val="single"/>
               </w:rPr>
             </w:pPr>
@@ -2581,7 +2536,24 @@
                 <w:bCs/>
                 <w:u w:val="single"/>
               </w:rPr>
-              <w:t>RATIONALE FOR LM PROPOSED VALUE SUMMARY</w:t>
+              <w:t>INCLUDE RATIONALE WHY</w:t>
+            </w:r>
+            <w:r>
+              <w:rPr>
+                <w:b/>
+                <w:bCs/>
+                <w:u w:val="single"/>
+              </w:rPr>
+              <w:t xml:space="preserve"> LM </w:t>
+            </w:r>
+            <w:r>
+              <w:rPr>
+                <w:b/>
+                <w:bCs/>
+                <w:caps/>
+                <w:u w:val="single"/>
+              </w:rPr>
+              <w:t>Proposed Value for Procurement has been determined to be Fair &amp; Reasonable</w:t>
             </w:r>
           </w:p>
           <w:p>
@@ -2596,7 +2568,6 @@
                 <w:showingPlcHdr/>
                 <w:text/>
               </w:sdtPr>
-              <w:sdtEndPr/>
               <w:sdtContent>
                 <w:r>
                   <w:t>SUMMARY</w:t>
@@ -2604,7 +2575,6 @@
               </w:sdtContent>
             </w:sdt>
           </w:p>
-          <w:p/>
           <w:p/>
         </w:tc>
       </w:tr>
@@ -2630,7 +2600,6 @@
                 <w:b/>
                 <w:sz w:val="20"/>
               </w:rPr>
-              <w:lastRenderedPageBreak/>
               <w:t>SCHEDULE OF EVENTS</w:t>
             </w:r>
             <w:r>
@@ -2853,7 +2822,6 @@
                 <w:showingPlcHdr/>
                 <w:text/>
               </w:sdtPr>
-              <w:sdtEndPr/>
               <w:sdtContent>
                 <w:r>
                   <w:rPr>
@@ -2912,7 +2880,6 @@
                 <w:showingPlcHdr/>
                 <w:text/>
               </w:sdtPr>
-              <w:sdtEndPr/>
               <w:sdtContent>
                 <w:r>
                   <w:rPr>
@@ -3000,7 +2967,6 @@
                 <w:showingPlcHdr/>
                 <w:text/>
               </w:sdtPr>
-              <w:sdtEndPr/>
               <w:sdtContent>
                 <w:r>
                   <w:rPr>
@@ -3059,7 +3025,6 @@
                 <w:showingPlcHdr/>
                 <w:text/>
               </w:sdtPr>
-              <w:sdtEndPr/>
               <w:sdtContent>
                 <w:r>
                   <w:rPr>
@@ -3168,7 +3133,6 @@
                 <w:showingPlcHdr/>
                 <w:text/>
               </w:sdtPr>
-              <w:sdtEndPr/>
               <w:sdtContent>
                 <w:r>
                   <w:rPr>
@@ -3241,7 +3205,6 @@
                 <w:showingPlcHdr/>
                 <w:text/>
               </w:sdtPr>
-              <w:sdtEndPr/>
               <w:sdtContent>
                 <w:r>
                   <w:rPr>
@@ -3308,7 +3271,6 @@
                 <w:showingPlcHdr/>
                 <w:text/>
               </w:sdtPr>
-              <w:sdtEndPr/>
               <w:sdtContent>
                 <w:r>
                   <w:rPr>
@@ -3378,7 +3340,6 @@
                 <w:showingPlcHdr/>
                 <w:text/>
               </w:sdtPr>
-              <w:sdtEndPr/>
               <w:sdtContent>
                 <w:r>
                   <w:rPr>
@@ -3457,7 +3418,6 @@
                 <w:showingPlcHdr/>
                 <w:text/>
               </w:sdtPr>
-              <w:sdtEndPr/>
               <w:sdtContent>
                 <w:r>
                   <w:rPr>
@@ -3524,7 +3484,6 @@
                 <w:showingPlcHdr/>
                 <w:text/>
               </w:sdtPr>
-              <w:sdtEndPr/>
               <w:sdtContent>
                 <w:r>
                   <w:rPr>
@@ -3591,7 +3550,6 @@
                 <w:showingPlcHdr/>
                 <w:text/>
               </w:sdtPr>
-              <w:sdtEndPr/>
               <w:sdtContent>
                 <w:r>
                   <w:rPr>
@@ -3662,7 +3620,6 @@
                 <w:showingPlcHdr/>
                 <w:text/>
               </w:sdtPr>
-              <w:sdtEndPr/>
               <w:sdtContent>
                 <w:r>
                   <w:rPr>
@@ -3729,7 +3686,6 @@
                 <w:showingPlcHdr/>
                 <w:text/>
               </w:sdtPr>
-              <w:sdtEndPr/>
               <w:sdtContent>
                 <w:r>
                   <w:rPr>
@@ -3788,7 +3744,6 @@
                 <w:showingPlcHdr/>
                 <w:text/>
               </w:sdtPr>
-              <w:sdtEndPr/>
               <w:sdtContent>
                 <w:r>
                   <w:rPr>
@@ -3876,7 +3831,6 @@
                 <w:showingPlcHdr/>
                 <w:text/>
               </w:sdtPr>
-              <w:sdtEndPr/>
               <w:sdtContent>
                 <w:r>
                   <w:rPr>
@@ -3914,7 +3868,6 @@
                 <w:showingPlcHdr/>
                 <w:text/>
               </w:sdtPr>
-              <w:sdtEndPr/>
               <w:sdtContent>
                 <w:r>
                   <w:rPr>
@@ -3998,14 +3951,15 @@
         </w:trPr>
         <w:tc>
           <w:tcPr>
-            <w:tcW w:w="3150" w:type="dxa"/>
-            <w:gridSpan w:val="2"/>
+            <w:tcW w:w="6750" w:type="dxa"/>
+            <w:gridSpan w:val="7"/>
             <w:shd w:val="clear" w:color="auto" w:fill="C0C0C0"/>
             <w:vAlign w:val="bottom"/>
           </w:tcPr>
           <w:p>
             <w:pPr>
               <w:pStyle w:val="Table"/>
+              <w:jc w:val="center"/>
               <w:rPr>
                 <w:sz w:val="20"/>
               </w:rPr>
@@ -4015,50 +3969,6 @@
                 <w:sz w:val="20"/>
               </w:rPr>
               <w:t>Subcontract Administrator / Buyer Name</w:t>
-            </w:r>
-          </w:p>
-        </w:tc>
-        <w:tc>
-          <w:tcPr>
-            <w:tcW w:w="1980" w:type="dxa"/>
-            <w:gridSpan w:val="2"/>
-            <w:shd w:val="clear" w:color="auto" w:fill="C0C0C0"/>
-            <w:vAlign w:val="bottom"/>
-          </w:tcPr>
-          <w:p>
-            <w:pPr>
-              <w:pStyle w:val="Table"/>
-              <w:rPr>
-                <w:sz w:val="20"/>
-              </w:rPr>
-            </w:pPr>
-            <w:r>
-              <w:rPr>
-                <w:sz w:val="20"/>
-              </w:rPr>
-              <w:t>Phone</w:t>
-            </w:r>
-          </w:p>
-        </w:tc>
-        <w:tc>
-          <w:tcPr>
-            <w:tcW w:w="1620" w:type="dxa"/>
-            <w:gridSpan w:val="3"/>
-            <w:shd w:val="clear" w:color="auto" w:fill="C0C0C0"/>
-            <w:vAlign w:val="bottom"/>
-          </w:tcPr>
-          <w:p>
-            <w:pPr>
-              <w:pStyle w:val="Table"/>
-              <w:rPr>
-                <w:sz w:val="20"/>
-              </w:rPr>
-            </w:pPr>
-            <w:r>
-              <w:rPr>
-                <w:sz w:val="20"/>
-              </w:rPr>
-              <w:t>Subcontract Proposal Manager Name</w:t>
             </w:r>
           </w:p>
         </w:tc>
@@ -4072,6 +3982,7 @@
           <w:p>
             <w:pPr>
               <w:pStyle w:val="Table"/>
+              <w:jc w:val="center"/>
               <w:rPr>
                 <w:sz w:val="20"/>
               </w:rPr>
@@ -4094,8 +4005,8 @@
         </w:trPr>
         <w:tc>
           <w:tcPr>
-            <w:tcW w:w="3150" w:type="dxa"/>
-            <w:gridSpan w:val="2"/>
+            <w:tcW w:w="6750" w:type="dxa"/>
+            <w:gridSpan w:val="7"/>
           </w:tcPr>
           <w:p>
             <w:pPr>
@@ -4107,12 +4018,11 @@
                 <w:tag w:val="POC"/>
                 <w:id w:val="-943071502"/>
                 <w:placeholder>
-                  <w:docPart w:val="4CCCEEE44FAA4C2CA6DCB910D066ECC5"/>
+                  <w:docPart w:val="193AFF28144E4C5F8FFD728E3A51B8A9"/>
                 </w:placeholder>
                 <w:showingPlcHdr/>
                 <w:text/>
               </w:sdtPr>
-              <w:sdtEndPr/>
               <w:sdtContent>
                 <w:r>
                   <w:rPr>
@@ -4128,12 +4038,13 @@
         </w:tc>
         <w:tc>
           <w:tcPr>
-            <w:tcW w:w="1980" w:type="dxa"/>
+            <w:tcW w:w="3780" w:type="dxa"/>
             <w:gridSpan w:val="2"/>
           </w:tcPr>
           <w:p>
             <w:pPr>
               <w:pStyle w:val="Table"/>
+              <w:jc w:val="center"/>
             </w:pPr>
             <w:sdt>
               <w:sdtPr>
@@ -4141,12 +4052,11 @@
                 <w:tag w:val="Phone"/>
                 <w:id w:val="-555316021"/>
                 <w:placeholder>
-                  <w:docPart w:val="19D869DD2C4A457CA357CEBE20BFF6A1"/>
+                  <w:docPart w:val="88D05480EB4D4157A74B4B045331A73E"/>
                 </w:placeholder>
                 <w:showingPlcHdr/>
                 <w:text/>
               </w:sdtPr>
-              <w:sdtEndPr/>
               <w:sdtContent>
                 <w:r>
                   <w:rPr>
@@ -4160,10 +4070,105 @@
             </w:sdt>
           </w:p>
         </w:tc>
+      </w:tr>
+    </w:tbl>
+    <w:p/>
+    <w:tbl>
+      <w:tblPr>
+        <w:tblpPr w:leftFromText="180" w:rightFromText="180" w:vertAnchor="text" w:tblpY="1"/>
+        <w:tblOverlap w:val="never"/>
+        <w:tblW w:w="10530" w:type="dxa"/>
+        <w:tblBorders>
+          <w:top w:val="single" w:sz="4" w:space="0" w:color="auto"/>
+          <w:left w:val="single" w:sz="4" w:space="0" w:color="auto"/>
+          <w:bottom w:val="single" w:sz="4" w:space="0" w:color="auto"/>
+          <w:right w:val="single" w:sz="4" w:space="0" w:color="auto"/>
+          <w:insideH w:val="single" w:sz="4" w:space="0" w:color="auto"/>
+          <w:insideV w:val="single" w:sz="4" w:space="0" w:color="auto"/>
+        </w:tblBorders>
+        <w:tblLayout w:type="fixed"/>
+        <w:tblLook w:val="0000" w:firstRow="0" w:lastRow="0" w:firstColumn="0" w:lastColumn="0" w:noHBand="0" w:noVBand="0"/>
+      </w:tblPr>
+      <w:tblGrid>
+        <w:gridCol w:w="6750"/>
+        <w:gridCol w:w="3780"/>
+      </w:tblGrid>
+      <w:tr>
+        <w:trPr>
+          <w:trHeight w:val="360"/>
+        </w:trPr>
         <w:tc>
           <w:tcPr>
-            <w:tcW w:w="1620" w:type="dxa"/>
-            <w:gridSpan w:val="3"/>
+            <w:tcW w:w="6750" w:type="dxa"/>
+            <w:shd w:val="clear" w:color="auto" w:fill="C0C0C0"/>
+            <w:vAlign w:val="bottom"/>
+          </w:tcPr>
+          <w:p>
+            <w:pPr>
+              <w:pStyle w:val="Table"/>
+              <w:jc w:val="center"/>
+              <w:rPr>
+                <w:sz w:val="20"/>
+              </w:rPr>
+            </w:pPr>
+            <w:r>
+              <w:rPr>
+                <w:sz w:val="20"/>
+              </w:rPr>
+              <w:t xml:space="preserve">Subcontract Proposal Manager </w:t>
+            </w:r>
+            <w:r>
+              <w:rPr>
+                <w:sz w:val="20"/>
+              </w:rPr>
+              <w:t>Signature</w:t>
+            </w:r>
+          </w:p>
+          <w:p>
+            <w:pPr>
+              <w:pStyle w:val="Table"/>
+              <w:rPr>
+                <w:sz w:val="20"/>
+              </w:rPr>
+            </w:pPr>
+            <w:r>
+              <w:rPr>
+                <w:sz w:val="20"/>
+              </w:rPr>
+              <w:t>By signing this form, I have reviewed the form content and required supporting documents in its entirety, agree with the data and accuracy of the data as proposed.</w:t>
+            </w:r>
+          </w:p>
+        </w:tc>
+        <w:tc>
+          <w:tcPr>
+            <w:tcW w:w="3780" w:type="dxa"/>
+            <w:shd w:val="clear" w:color="auto" w:fill="C0C0C0"/>
+            <w:vAlign w:val="bottom"/>
+          </w:tcPr>
+          <w:p>
+            <w:pPr>
+              <w:pStyle w:val="Table"/>
+              <w:jc w:val="center"/>
+              <w:rPr>
+                <w:sz w:val="20"/>
+              </w:rPr>
+            </w:pPr>
+            <w:r>
+              <w:rPr>
+                <w:sz w:val="20"/>
+              </w:rPr>
+              <w:t>Phone</w:t>
+            </w:r>
+          </w:p>
+        </w:tc>
+      </w:tr>
+      <w:tr>
+        <w:trPr>
+          <w:trHeight w:val="360"/>
+        </w:trPr>
+        <w:tc>
+          <w:tcPr>
+            <w:tcW w:w="6750" w:type="dxa"/>
           </w:tcPr>
           <w:p>
             <w:pPr>
@@ -4173,14 +4178,13 @@
               <w:sdtPr>
                 <w:alias w:val="Manager"/>
                 <w:tag w:val="Manager"/>
-                <w:id w:val="-1964565742"/>
+                <w:id w:val="-1158155503"/>
                 <w:placeholder>
-                  <w:docPart w:val="E0455F61D0864EF291C06B686DD23254"/>
+                  <w:docPart w:val="EBDC9745DC4D4FA4871B1AEE51B6A998"/>
                 </w:placeholder>
                 <w:showingPlcHdr/>
                 <w:text/>
               </w:sdtPr>
-              <w:sdtEndPr/>
               <w:sdtContent>
                 <w:r>
                   <w:rPr>
@@ -4197,24 +4201,23 @@
         <w:tc>
           <w:tcPr>
             <w:tcW w:w="3780" w:type="dxa"/>
-            <w:gridSpan w:val="2"/>
           </w:tcPr>
           <w:p>
             <w:pPr>
               <w:pStyle w:val="Table"/>
+              <w:jc w:val="center"/>
             </w:pPr>
             <w:sdt>
               <w:sdtPr>
                 <w:alias w:val="ManagerPhone"/>
                 <w:tag w:val="ManagerPhone"/>
-                <w:id w:val="-1254809537"/>
+                <w:id w:val="1266965915"/>
                 <w:placeholder>
-                  <w:docPart w:val="DB53699693B14054863CA7EF8B0BF1E3"/>
+                  <w:docPart w:val="8FFD697BB0E741918AB26E3A788261DC"/>
                 </w:placeholder>
                 <w:showingPlcHdr/>
                 <w:text/>
               </w:sdtPr>
-              <w:sdtEndPr/>
               <w:sdtContent>
                 <w:r>
                   <w:rPr>
@@ -4230,11 +4233,6 @@
         </w:tc>
       </w:tr>
     </w:tbl>
-    <w:p>
-      <w:r>
-        <w:br w:type="textWrapping" w:clear="all"/>
-      </w:r>
-    </w:p>
     <w:p/>
     <w:sectPr>
       <w:footerReference w:type="default" r:id="rId12"/>
@@ -4249,7 +4247,7 @@
 </file>
 
 <file path=word/endnotes.xml><?xml version="1.0" encoding="utf-8"?>
-<w:endnotes xmlns:wpc="http://schemas.microsoft.com/office/word/2010/wordprocessingCanvas" xmlns:cx="http://schemas.microsoft.com/office/drawing/2014/chartex" xmlns:cx1="http://schemas.microsoft.com/office/drawing/2015/9/8/chartex" xmlns:cx2="http://schemas.microsoft.com/office/drawing/2015/10/21/chartex" xmlns:cx3="http://schemas.microsoft.com/office/drawing/2016/5/9/chartex" xmlns:cx4="http://schemas.microsoft.com/office/drawing/2016/5/10/chartex" xmlns:cx5="http://schemas.microsoft.com/office/drawing/2016/5/11/chartex" xmlns:cx6="http://schemas.microsoft.com/office/drawing/2016/5/12/chartex" xmlns:cx7="http://schemas.microsoft.com/office/drawing/2016/5/13/chartex" xmlns:cx8="http://schemas.microsoft.com/office/drawing/2016/5/14/chartex" xmlns:mc="http://schemas.openxmlformats.org/markup-compatibility/2006" xmlns:aink="http://schemas.microsoft.com/office/drawing/2016/ink" xmlns:am3d="http://schemas.microsoft.com/office/drawing/2017/model3d" xmlns:o="urn:schemas-microsoft-com:office:office" xmlns:r="http://schemas.openxmlformats.org/officeDocument/2006/relationships" xmlns:m="http://schemas.openxmlformats.org/officeDocument/2006/math" xmlns:v="urn:schemas-microsoft-com:vml" xmlns:wp14="http://schemas.microsoft.com/office/word/2010/wordprocessingDrawing" xmlns:wp="http://schemas.openxmlformats.org/drawingml/2006/wordprocessingDrawing" xmlns:w10="urn:schemas-microsoft-com:office:word" xmlns:w="http://schemas.openxmlformats.org/wordprocessingml/2006/main" xmlns:w14="http://schemas.microsoft.com/office/word/2010/wordml" xmlns:w15="http://schemas.microsoft.com/office/word/2012/wordml" xmlns:w16cex="http://schemas.microsoft.com/office/word/2018/wordml/cex" xmlns:w16cid="http://schemas.microsoft.com/office/word/2016/wordml/cid" xmlns:w16="http://schemas.microsoft.com/office/word/2018/wordml" xmlns:w16sdtdh="http://schemas.microsoft.com/office/word/2020/wordml/sdtdatahash" xmlns:w16se="http://schemas.microsoft.com/office/word/2015/wordml/symex" xmlns:wpg="http://schemas.microsoft.com/office/word/2010/wordprocessingGroup" xmlns:wpi="http://schemas.microsoft.com/office/word/2010/wordprocessingInk" xmlns:wne="http://schemas.microsoft.com/office/word/2006/wordml" xmlns:wps="http://schemas.microsoft.com/office/word/2010/wordprocessingShape" mc:Ignorable="w14 w15 w16se w16cid w16 w16cex w16sdtdh wp14">
+<w:endnotes xmlns:wpc="http://schemas.microsoft.com/office/word/2010/wordprocessingCanvas" xmlns:cx="http://schemas.microsoft.com/office/drawing/2014/chartex" xmlns:cx1="http://schemas.microsoft.com/office/drawing/2015/9/8/chartex" xmlns:cx2="http://schemas.microsoft.com/office/drawing/2015/10/21/chartex" xmlns:cx3="http://schemas.microsoft.com/office/drawing/2016/5/9/chartex" xmlns:cx4="http://schemas.microsoft.com/office/drawing/2016/5/10/chartex" xmlns:cx5="http://schemas.microsoft.com/office/drawing/2016/5/11/chartex" xmlns:cx6="http://schemas.microsoft.com/office/drawing/2016/5/12/chartex" xmlns:cx7="http://schemas.microsoft.com/office/drawing/2016/5/13/chartex" xmlns:cx8="http://schemas.microsoft.com/office/drawing/2016/5/14/chartex" xmlns:mc="http://schemas.openxmlformats.org/markup-compatibility/2006" xmlns:aink="http://schemas.microsoft.com/office/drawing/2016/ink" xmlns:am3d="http://schemas.microsoft.com/office/drawing/2017/model3d" xmlns:o="urn:schemas-microsoft-com:office:office" xmlns:oel="http://schemas.microsoft.com/office/2019/extlst" xmlns:r="http://schemas.openxmlformats.org/officeDocument/2006/relationships" xmlns:m="http://schemas.openxmlformats.org/officeDocument/2006/math" xmlns:v="urn:schemas-microsoft-com:vml" xmlns:wp14="http://schemas.microsoft.com/office/word/2010/wordprocessingDrawing" xmlns:wp="http://schemas.openxmlformats.org/drawingml/2006/wordprocessingDrawing" xmlns:w10="urn:schemas-microsoft-com:office:word" xmlns:w="http://schemas.openxmlformats.org/wordprocessingml/2006/main" xmlns:w14="http://schemas.microsoft.com/office/word/2010/wordml" xmlns:w15="http://schemas.microsoft.com/office/word/2012/wordml" xmlns:w16cex="http://schemas.microsoft.com/office/word/2018/wordml/cex" xmlns:w16cid="http://schemas.microsoft.com/office/word/2016/wordml/cid" xmlns:w16="http://schemas.microsoft.com/office/word/2018/wordml" xmlns:w16sdtdh="http://schemas.microsoft.com/office/word/2020/wordml/sdtdatahash" xmlns:w16se="http://schemas.microsoft.com/office/word/2015/wordml/symex" xmlns:wpg="http://schemas.microsoft.com/office/word/2010/wordprocessingGroup" xmlns:wpi="http://schemas.microsoft.com/office/word/2010/wordprocessingInk" xmlns:wne="http://schemas.microsoft.com/office/word/2006/wordml" xmlns:wps="http://schemas.microsoft.com/office/word/2010/wordprocessingShape" mc:Ignorable="w14 w15 w16se w16cid w16 w16cex w16sdtdh wp14">
   <w:endnote w:type="separator" w:id="-1">
     <w:p>
       <w:r>
@@ -4268,7 +4266,7 @@
 </file>
 
 <file path=word/footer1.xml><?xml version="1.0" encoding="utf-8"?>
-<w:ftr xmlns:wpc="http://schemas.microsoft.com/office/word/2010/wordprocessingCanvas" xmlns:cx="http://schemas.microsoft.com/office/drawing/2014/chartex" xmlns:cx1="http://schemas.microsoft.com/office/drawing/2015/9/8/chartex" xmlns:cx2="http://schemas.microsoft.com/office/drawing/2015/10/21/chartex" xmlns:cx3="http://schemas.microsoft.com/office/drawing/2016/5/9/chartex" xmlns:cx4="http://schemas.microsoft.com/office/drawing/2016/5/10/chartex" xmlns:cx5="http://schemas.microsoft.com/office/drawing/2016/5/11/chartex" xmlns:cx6="http://schemas.microsoft.com/office/drawing/2016/5/12/chartex" xmlns:cx7="http://schemas.microsoft.com/office/drawing/2016/5/13/chartex" xmlns:cx8="http://schemas.microsoft.com/office/drawing/2016/5/14/chartex" xmlns:mc="http://schemas.openxmlformats.org/markup-compatibility/2006" xmlns:aink="http://schemas.microsoft.com/office/drawing/2016/ink" xmlns:am3d="http://schemas.microsoft.com/office/drawing/2017/model3d" xmlns:o="urn:schemas-microsoft-com:office:office" xmlns:r="http://schemas.openxmlformats.org/officeDocument/2006/relationships" xmlns:m="http://schemas.openxmlformats.org/officeDocument/2006/math" xmlns:v="urn:schemas-microsoft-com:vml" xmlns:wp14="http://schemas.microsoft.com/office/word/2010/wordprocessingDrawing" xmlns:wp="http://schemas.openxmlformats.org/drawingml/2006/wordprocessingDrawing" xmlns:w10="urn:schemas-microsoft-com:office:word" xmlns:w="http://schemas.openxmlformats.org/wordprocessingml/2006/main" xmlns:w14="http://schemas.microsoft.com/office/word/2010/wordml" xmlns:w15="http://schemas.microsoft.com/office/word/2012/wordml" xmlns:w16cex="http://schemas.microsoft.com/office/word/2018/wordml/cex" xmlns:w16cid="http://schemas.microsoft.com/office/word/2016/wordml/cid" xmlns:w16="http://schemas.microsoft.com/office/word/2018/wordml" xmlns:w16sdtdh="http://schemas.microsoft.com/office/word/2020/wordml/sdtdatahash" xmlns:w16se="http://schemas.microsoft.com/office/word/2015/wordml/symex" xmlns:wpg="http://schemas.microsoft.com/office/word/2010/wordprocessingGroup" xmlns:wpi="http://schemas.microsoft.com/office/word/2010/wordprocessingInk" xmlns:wne="http://schemas.microsoft.com/office/word/2006/wordml" xmlns:wps="http://schemas.microsoft.com/office/word/2010/wordprocessingShape" mc:Ignorable="w14 w15 w16se w16cid w16 w16cex w16sdtdh wp14">
+<w:ftr xmlns:wpc="http://schemas.microsoft.com/office/word/2010/wordprocessingCanvas" xmlns:cx="http://schemas.microsoft.com/office/drawing/2014/chartex" xmlns:cx1="http://schemas.microsoft.com/office/drawing/2015/9/8/chartex" xmlns:cx2="http://schemas.microsoft.com/office/drawing/2015/10/21/chartex" xmlns:cx3="http://schemas.microsoft.com/office/drawing/2016/5/9/chartex" xmlns:cx4="http://schemas.microsoft.com/office/drawing/2016/5/10/chartex" xmlns:cx5="http://schemas.microsoft.com/office/drawing/2016/5/11/chartex" xmlns:cx6="http://schemas.microsoft.com/office/drawing/2016/5/12/chartex" xmlns:cx7="http://schemas.microsoft.com/office/drawing/2016/5/13/chartex" xmlns:cx8="http://schemas.microsoft.com/office/drawing/2016/5/14/chartex" xmlns:mc="http://schemas.openxmlformats.org/markup-compatibility/2006" xmlns:aink="http://schemas.microsoft.com/office/drawing/2016/ink" xmlns:am3d="http://schemas.microsoft.com/office/drawing/2017/model3d" xmlns:o="urn:schemas-microsoft-com:office:office" xmlns:oel="http://schemas.microsoft.com/office/2019/extlst" xmlns:r="http://schemas.openxmlformats.org/officeDocument/2006/relationships" xmlns:m="http://schemas.openxmlformats.org/officeDocument/2006/math" xmlns:v="urn:schemas-microsoft-com:vml" xmlns:wp14="http://schemas.microsoft.com/office/word/2010/wordprocessingDrawing" xmlns:wp="http://schemas.openxmlformats.org/drawingml/2006/wordprocessingDrawing" xmlns:w10="urn:schemas-microsoft-com:office:word" xmlns:w="http://schemas.openxmlformats.org/wordprocessingml/2006/main" xmlns:w14="http://schemas.microsoft.com/office/word/2010/wordml" xmlns:w15="http://schemas.microsoft.com/office/word/2012/wordml" xmlns:w16cex="http://schemas.microsoft.com/office/word/2018/wordml/cex" xmlns:w16cid="http://schemas.microsoft.com/office/word/2016/wordml/cid" xmlns:w16="http://schemas.microsoft.com/office/word/2018/wordml" xmlns:w16sdtdh="http://schemas.microsoft.com/office/word/2020/wordml/sdtdatahash" xmlns:w16se="http://schemas.microsoft.com/office/word/2015/wordml/symex" xmlns:wpg="http://schemas.microsoft.com/office/word/2010/wordprocessingGroup" xmlns:wpi="http://schemas.microsoft.com/office/word/2010/wordprocessingInk" xmlns:wne="http://schemas.microsoft.com/office/word/2006/wordml" xmlns:wps="http://schemas.microsoft.com/office/word/2010/wordprocessingShape" mc:Ignorable="w14 w15 w16se w16cid w16 w16cex w16sdtdh wp14">
   <w:p>
     <w:pPr>
       <w:pStyle w:val="FooterTop"/>
@@ -4287,7 +4285,7 @@
       <w:t>1</w:t>
     </w:r>
     <w:r>
-      <w:t>2</w:t>
+      <w:t>3</w:t>
     </w:r>
     <w:r>
       <w:tab/>
@@ -4297,13 +4295,16 @@
       <w:t>0</w:t>
     </w:r>
     <w:r>
-      <w:t>4</w:t>
+      <w:t>5</w:t>
     </w:r>
     <w:r>
       <w:t>-</w:t>
     </w:r>
     <w:r>
-      <w:t>21</w:t>
+      <w:t>1</w:t>
+    </w:r>
+    <w:r>
+      <w:t>8</w:t>
     </w:r>
     <w:r>
       <w:t>-20</w:t>
@@ -4312,7 +4313,7 @@
       <w:t>2</w:t>
     </w:r>
     <w:r>
-      <w:t>2</w:t>
+      <w:t>3</w:t>
     </w:r>
   </w:p>
   <w:p>
@@ -4424,7 +4425,6 @@
         <w:showingPlcHdr/>
         <w:text/>
       </w:sdtPr>
-      <w:sdtEndPr/>
       <w:sdtContent>
         <w:r>
           <w:rPr>
@@ -4465,7 +4465,7 @@
 </file>
 
 <file path=word/footnotes.xml><?xml version="1.0" encoding="utf-8"?>
-<w:footnotes xmlns:wpc="http://schemas.microsoft.com/office/word/2010/wordprocessingCanvas" xmlns:cx="http://schemas.microsoft.com/office/drawing/2014/chartex" xmlns:cx1="http://schemas.microsoft.com/office/drawing/2015/9/8/chartex" xmlns:cx2="http://schemas.microsoft.com/office/drawing/2015/10/21/chartex" xmlns:cx3="http://schemas.microsoft.com/office/drawing/2016/5/9/chartex" xmlns:cx4="http://schemas.microsoft.com/office/drawing/2016/5/10/chartex" xmlns:cx5="http://schemas.microsoft.com/office/drawing/2016/5/11/chartex" xmlns:cx6="http://schemas.microsoft.com/office/drawing/2016/5/12/chartex" xmlns:cx7="http://schemas.microsoft.com/office/drawing/2016/5/13/chartex" xmlns:cx8="http://schemas.microsoft.com/office/drawing/2016/5/14/chartex" xmlns:mc="http://schemas.openxmlformats.org/markup-compatibility/2006" xmlns:aink="http://schemas.microsoft.com/office/drawing/2016/ink" xmlns:am3d="http://schemas.microsoft.com/office/drawing/2017/model3d" xmlns:o="urn:schemas-microsoft-com:office:office" xmlns:r="http://schemas.openxmlformats.org/officeDocument/2006/relationships" xmlns:m="http://schemas.openxmlformats.org/officeDocument/2006/math" xmlns:v="urn:schemas-microsoft-com:vml" xmlns:wp14="http://schemas.microsoft.com/office/word/2010/wordprocessingDrawing" xmlns:wp="http://schemas.openxmlformats.org/drawingml/2006/wordprocessingDrawing" xmlns:w10="urn:schemas-microsoft-com:office:word" xmlns:w="http://schemas.openxmlformats.org/wordprocessingml/2006/main" xmlns:w14="http://schemas.microsoft.com/office/word/2010/wordml" xmlns:w15="http://schemas.microsoft.com/office/word/2012/wordml" xmlns:w16cex="http://schemas.microsoft.com/office/word/2018/wordml/cex" xmlns:w16cid="http://schemas.microsoft.com/office/word/2016/wordml/cid" xmlns:w16="http://schemas.microsoft.com/office/word/2018/wordml" xmlns:w16sdtdh="http://schemas.microsoft.com/office/word/2020/wordml/sdtdatahash" xmlns:w16se="http://schemas.microsoft.com/office/word/2015/wordml/symex" xmlns:wpg="http://schemas.microsoft.com/office/word/2010/wordprocessingGroup" xmlns:wpi="http://schemas.microsoft.com/office/word/2010/wordprocessingInk" xmlns:wne="http://schemas.microsoft.com/office/word/2006/wordml" xmlns:wps="http://schemas.microsoft.com/office/word/2010/wordprocessingShape" mc:Ignorable="w14 w15 w16se w16cid w16 w16cex w16sdtdh wp14">
+<w:footnotes xmlns:wpc="http://schemas.microsoft.com/office/word/2010/wordprocessingCanvas" xmlns:cx="http://schemas.microsoft.com/office/drawing/2014/chartex" xmlns:cx1="http://schemas.microsoft.com/office/drawing/2015/9/8/chartex" xmlns:cx2="http://schemas.microsoft.com/office/drawing/2015/10/21/chartex" xmlns:cx3="http://schemas.microsoft.com/office/drawing/2016/5/9/chartex" xmlns:cx4="http://schemas.microsoft.com/office/drawing/2016/5/10/chartex" xmlns:cx5="http://schemas.microsoft.com/office/drawing/2016/5/11/chartex" xmlns:cx6="http://schemas.microsoft.com/office/drawing/2016/5/12/chartex" xmlns:cx7="http://schemas.microsoft.com/office/drawing/2016/5/13/chartex" xmlns:cx8="http://schemas.microsoft.com/office/drawing/2016/5/14/chartex" xmlns:mc="http://schemas.openxmlformats.org/markup-compatibility/2006" xmlns:aink="http://schemas.microsoft.com/office/drawing/2016/ink" xmlns:am3d="http://schemas.microsoft.com/office/drawing/2017/model3d" xmlns:o="urn:schemas-microsoft-com:office:office" xmlns:oel="http://schemas.microsoft.com/office/2019/extlst" xmlns:r="http://schemas.openxmlformats.org/officeDocument/2006/relationships" xmlns:m="http://schemas.openxmlformats.org/officeDocument/2006/math" xmlns:v="urn:schemas-microsoft-com:vml" xmlns:wp14="http://schemas.microsoft.com/office/word/2010/wordprocessingDrawing" xmlns:wp="http://schemas.openxmlformats.org/drawingml/2006/wordprocessingDrawing" xmlns:w10="urn:schemas-microsoft-com:office:word" xmlns:w="http://schemas.openxmlformats.org/wordprocessingml/2006/main" xmlns:w14="http://schemas.microsoft.com/office/word/2010/wordml" xmlns:w15="http://schemas.microsoft.com/office/word/2012/wordml" xmlns:w16cex="http://schemas.microsoft.com/office/word/2018/wordml/cex" xmlns:w16cid="http://schemas.microsoft.com/office/word/2016/wordml/cid" xmlns:w16="http://schemas.microsoft.com/office/word/2018/wordml" xmlns:w16sdtdh="http://schemas.microsoft.com/office/word/2020/wordml/sdtdatahash" xmlns:w16se="http://schemas.microsoft.com/office/word/2015/wordml/symex" xmlns:wpg="http://schemas.microsoft.com/office/word/2010/wordprocessingGroup" xmlns:wpi="http://schemas.microsoft.com/office/word/2010/wordprocessingInk" xmlns:wne="http://schemas.microsoft.com/office/word/2006/wordml" xmlns:wps="http://schemas.microsoft.com/office/word/2010/wordprocessingShape" mc:Ignorable="w14 w15 w16se w16cid w16 w16cex w16sdtdh wp14">
   <w:footnote w:type="separator" w:id="-1">
     <w:p>
       <w:r>
@@ -4484,7 +4484,7 @@
 </file>
 
 <file path=word/numbering.xml><?xml version="1.0" encoding="utf-8"?>
-<w:numbering xmlns:wpc="http://schemas.microsoft.com/office/word/2010/wordprocessingCanvas" xmlns:cx="http://schemas.microsoft.com/office/drawing/2014/chartex" xmlns:cx1="http://schemas.microsoft.com/office/drawing/2015/9/8/chartex" xmlns:cx2="http://schemas.microsoft.com/office/drawing/2015/10/21/chartex" xmlns:cx3="http://schemas.microsoft.com/office/drawing/2016/5/9/chartex" xmlns:cx4="http://schemas.microsoft.com/office/drawing/2016/5/10/chartex" xmlns:cx5="http://schemas.microsoft.com/office/drawing/2016/5/11/chartex" xmlns:cx6="http://schemas.microsoft.com/office/drawing/2016/5/12/chartex" xmlns:cx7="http://schemas.microsoft.com/office/drawing/2016/5/13/chartex" xmlns:cx8="http://schemas.microsoft.com/office/drawing/2016/5/14/chartex" xmlns:mc="http://schemas.openxmlformats.org/markup-compatibility/2006" xmlns:aink="http://schemas.microsoft.com/office/drawing/2016/ink" xmlns:am3d="http://schemas.microsoft.com/office/drawing/2017/model3d" xmlns:o="urn:schemas-microsoft-com:office:office" xmlns:r="http://schemas.openxmlformats.org/officeDocument/2006/relationships" xmlns:m="http://schemas.openxmlformats.org/officeDocument/2006/math" xmlns:v="urn:schemas-microsoft-com:vml" xmlns:wp14="http://schemas.microsoft.com/office/word/2010/wordprocessingDrawing" xmlns:wp="http://schemas.openxmlformats.org/drawingml/2006/wordprocessingDrawing" xmlns:w10="urn:schemas-microsoft-com:office:word" xmlns:w="http://schemas.openxmlformats.org/wordprocessingml/2006/main" xmlns:w14="http://schemas.microsoft.com/office/word/2010/wordml" xmlns:w15="http://schemas.microsoft.com/office/word/2012/wordml" xmlns:w16cex="http://schemas.microsoft.com/office/word/2018/wordml/cex" xmlns:w16cid="http://schemas.microsoft.com/office/word/2016/wordml/cid" xmlns:w16="http://schemas.microsoft.com/office/word/2018/wordml" xmlns:w16sdtdh="http://schemas.microsoft.com/office/word/2020/wordml/sdtdatahash" xmlns:w16se="http://schemas.microsoft.com/office/word/2015/wordml/symex" xmlns:wpg="http://schemas.microsoft.com/office/word/2010/wordprocessingGroup" xmlns:wpi="http://schemas.microsoft.com/office/word/2010/wordprocessingInk" xmlns:wne="http://schemas.microsoft.com/office/word/2006/wordml" xmlns:wps="http://schemas.microsoft.com/office/word/2010/wordprocessingShape" mc:Ignorable="w14 w15 w16se w16cid w16 w16cex w16sdtdh wp14">
+<w:numbering xmlns:wpc="http://schemas.microsoft.com/office/word/2010/wordprocessingCanvas" xmlns:cx="http://schemas.microsoft.com/office/drawing/2014/chartex" xmlns:cx1="http://schemas.microsoft.com/office/drawing/2015/9/8/chartex" xmlns:cx2="http://schemas.microsoft.com/office/drawing/2015/10/21/chartex" xmlns:cx3="http://schemas.microsoft.com/office/drawing/2016/5/9/chartex" xmlns:cx4="http://schemas.microsoft.com/office/drawing/2016/5/10/chartex" xmlns:cx5="http://schemas.microsoft.com/office/drawing/2016/5/11/chartex" xmlns:cx6="http://schemas.microsoft.com/office/drawing/2016/5/12/chartex" xmlns:cx7="http://schemas.microsoft.com/office/drawing/2016/5/13/chartex" xmlns:cx8="http://schemas.microsoft.com/office/drawing/2016/5/14/chartex" xmlns:mc="http://schemas.openxmlformats.org/markup-compatibility/2006" xmlns:aink="http://schemas.microsoft.com/office/drawing/2016/ink" xmlns:am3d="http://schemas.microsoft.com/office/drawing/2017/model3d" xmlns:o="urn:schemas-microsoft-com:office:office" xmlns:oel="http://schemas.microsoft.com/office/2019/extlst" xmlns:r="http://schemas.openxmlformats.org/officeDocument/2006/relationships" xmlns:m="http://schemas.openxmlformats.org/officeDocument/2006/math" xmlns:v="urn:schemas-microsoft-com:vml" xmlns:wp14="http://schemas.microsoft.com/office/word/2010/wordprocessingDrawing" xmlns:wp="http://schemas.openxmlformats.org/drawingml/2006/wordprocessingDrawing" xmlns:w10="urn:schemas-microsoft-com:office:word" xmlns:w="http://schemas.openxmlformats.org/wordprocessingml/2006/main" xmlns:w14="http://schemas.microsoft.com/office/word/2010/wordml" xmlns:w15="http://schemas.microsoft.com/office/word/2012/wordml" xmlns:w16cex="http://schemas.microsoft.com/office/word/2018/wordml/cex" xmlns:w16cid="http://schemas.microsoft.com/office/word/2016/wordml/cid" xmlns:w16="http://schemas.microsoft.com/office/word/2018/wordml" xmlns:w16sdtdh="http://schemas.microsoft.com/office/word/2020/wordml/sdtdatahash" xmlns:w16se="http://schemas.microsoft.com/office/word/2015/wordml/symex" xmlns:wpg="http://schemas.microsoft.com/office/word/2010/wordprocessingGroup" xmlns:wpi="http://schemas.microsoft.com/office/word/2010/wordprocessingInk" xmlns:wne="http://schemas.microsoft.com/office/word/2006/wordml" xmlns:wps="http://schemas.microsoft.com/office/word/2010/wordprocessingShape" mc:Ignorable="w14 w15 w16se w16cid w16 w16cex w16sdtdh wp14">
   <w:abstractNum w:abstractNumId="0" w15:restartNumberingAfterBreak="0">
     <w:nsid w:val="FFFFFF7C"/>
     <w:multiLevelType w:val="singleLevel"/>
@@ -5261,118 +5261,118 @@
       </w:pPr>
     </w:lvl>
   </w:abstractNum>
-  <w:num w:numId="1">
+  <w:num w:numId="1" w16cid:durableId="248462193">
     <w:abstractNumId w:val="9"/>
   </w:num>
-  <w:num w:numId="2">
+  <w:num w:numId="2" w16cid:durableId="2146118078">
     <w:abstractNumId w:val="7"/>
   </w:num>
-  <w:num w:numId="3">
+  <w:num w:numId="3" w16cid:durableId="1181894817">
     <w:abstractNumId w:val="6"/>
   </w:num>
-  <w:num w:numId="4">
+  <w:num w:numId="4" w16cid:durableId="648366484">
     <w:abstractNumId w:val="5"/>
   </w:num>
-  <w:num w:numId="5">
+  <w:num w:numId="5" w16cid:durableId="1706830098">
     <w:abstractNumId w:val="4"/>
   </w:num>
-  <w:num w:numId="6">
+  <w:num w:numId="6" w16cid:durableId="1852865561">
     <w:abstractNumId w:val="8"/>
   </w:num>
-  <w:num w:numId="7">
+  <w:num w:numId="7" w16cid:durableId="1372728027">
     <w:abstractNumId w:val="3"/>
   </w:num>
-  <w:num w:numId="8">
+  <w:num w:numId="8" w16cid:durableId="1851290489">
     <w:abstractNumId w:val="2"/>
   </w:num>
-  <w:num w:numId="9">
+  <w:num w:numId="9" w16cid:durableId="565919582">
     <w:abstractNumId w:val="1"/>
   </w:num>
-  <w:num w:numId="10">
+  <w:num w:numId="10" w16cid:durableId="786894823">
     <w:abstractNumId w:val="0"/>
   </w:num>
-  <w:num w:numId="11">
+  <w:num w:numId="11" w16cid:durableId="398988596">
     <w:abstractNumId w:val="12"/>
   </w:num>
-  <w:num w:numId="12">
+  <w:num w:numId="12" w16cid:durableId="741831791">
     <w:abstractNumId w:val="12"/>
   </w:num>
-  <w:num w:numId="13">
+  <w:num w:numId="13" w16cid:durableId="270548891">
     <w:abstractNumId w:val="12"/>
   </w:num>
-  <w:num w:numId="14">
+  <w:num w:numId="14" w16cid:durableId="988905317">
     <w:abstractNumId w:val="12"/>
   </w:num>
-  <w:num w:numId="15">
+  <w:num w:numId="15" w16cid:durableId="655186245">
     <w:abstractNumId w:val="12"/>
   </w:num>
-  <w:num w:numId="16">
+  <w:num w:numId="16" w16cid:durableId="356348281">
     <w:abstractNumId w:val="12"/>
   </w:num>
-  <w:num w:numId="17">
+  <w:num w:numId="17" w16cid:durableId="574050074">
     <w:abstractNumId w:val="12"/>
   </w:num>
-  <w:num w:numId="18">
+  <w:num w:numId="18" w16cid:durableId="1002898361">
     <w:abstractNumId w:val="12"/>
   </w:num>
-  <w:num w:numId="19">
+  <w:num w:numId="19" w16cid:durableId="2031444890">
     <w:abstractNumId w:val="12"/>
   </w:num>
-  <w:num w:numId="20">
+  <w:num w:numId="20" w16cid:durableId="1277521831">
     <w:abstractNumId w:val="12"/>
   </w:num>
-  <w:num w:numId="21">
+  <w:num w:numId="21" w16cid:durableId="2018917984">
     <w:abstractNumId w:val="12"/>
   </w:num>
-  <w:num w:numId="22">
+  <w:num w:numId="22" w16cid:durableId="1823884959">
     <w:abstractNumId w:val="12"/>
   </w:num>
-  <w:num w:numId="23">
+  <w:num w:numId="23" w16cid:durableId="1200817459">
     <w:abstractNumId w:val="12"/>
   </w:num>
-  <w:num w:numId="24">
+  <w:num w:numId="24" w16cid:durableId="609120550">
     <w:abstractNumId w:val="12"/>
   </w:num>
-  <w:num w:numId="25">
+  <w:num w:numId="25" w16cid:durableId="608926389">
     <w:abstractNumId w:val="9"/>
   </w:num>
-  <w:num w:numId="26">
+  <w:num w:numId="26" w16cid:durableId="724644454">
     <w:abstractNumId w:val="7"/>
   </w:num>
-  <w:num w:numId="27">
+  <w:num w:numId="27" w16cid:durableId="237709296">
     <w:abstractNumId w:val="6"/>
   </w:num>
-  <w:num w:numId="28">
+  <w:num w:numId="28" w16cid:durableId="679700730">
     <w:abstractNumId w:val="5"/>
   </w:num>
-  <w:num w:numId="29">
+  <w:num w:numId="29" w16cid:durableId="76365903">
     <w:abstractNumId w:val="4"/>
   </w:num>
-  <w:num w:numId="30">
+  <w:num w:numId="30" w16cid:durableId="857818684">
     <w:abstractNumId w:val="8"/>
   </w:num>
-  <w:num w:numId="31">
+  <w:num w:numId="31" w16cid:durableId="508174778">
     <w:abstractNumId w:val="3"/>
   </w:num>
-  <w:num w:numId="32">
+  <w:num w:numId="32" w16cid:durableId="1880050174">
     <w:abstractNumId w:val="2"/>
   </w:num>
-  <w:num w:numId="33">
+  <w:num w:numId="33" w16cid:durableId="723986614">
     <w:abstractNumId w:val="1"/>
   </w:num>
-  <w:num w:numId="34">
+  <w:num w:numId="34" w16cid:durableId="208689074">
     <w:abstractNumId w:val="0"/>
   </w:num>
-  <w:num w:numId="35">
+  <w:num w:numId="35" w16cid:durableId="2103794123">
     <w:abstractNumId w:val="13"/>
   </w:num>
-  <w:num w:numId="36">
+  <w:num w:numId="36" w16cid:durableId="1624773134">
     <w:abstractNumId w:val="14"/>
   </w:num>
-  <w:num w:numId="37">
+  <w:num w:numId="37" w16cid:durableId="1289775585">
     <w:abstractNumId w:val="10"/>
   </w:num>
-  <w:num w:numId="38">
+  <w:num w:numId="38" w16cid:durableId="405104503">
     <w:abstractNumId w:val="11"/>
   </w:num>
 </w:numbering>
@@ -6941,7 +6941,7 @@
 </file>
 
 <file path=word/glossary/document.xml><?xml version="1.0" encoding="utf-8"?>
-<w:glossaryDocument xmlns:wpc="http://schemas.microsoft.com/office/word/2010/wordprocessingCanvas" xmlns:cx="http://schemas.microsoft.com/office/drawing/2014/chartex" xmlns:cx1="http://schemas.microsoft.com/office/drawing/2015/9/8/chartex" xmlns:cx2="http://schemas.microsoft.com/office/drawing/2015/10/21/chartex" xmlns:cx3="http://schemas.microsoft.com/office/drawing/2016/5/9/chartex" xmlns:cx4="http://schemas.microsoft.com/office/drawing/2016/5/10/chartex" xmlns:cx5="http://schemas.microsoft.com/office/drawing/2016/5/11/chartex" xmlns:cx6="http://schemas.microsoft.com/office/drawing/2016/5/12/chartex" xmlns:cx7="http://schemas.microsoft.com/office/drawing/2016/5/13/chartex" xmlns:cx8="http://schemas.microsoft.com/office/drawing/2016/5/14/chartex" xmlns:mc="http://schemas.openxmlformats.org/markup-compatibility/2006" xmlns:aink="http://schemas.microsoft.com/office/drawing/2016/ink" xmlns:am3d="http://schemas.microsoft.com/office/drawing/2017/model3d" xmlns:o="urn:schemas-microsoft-com:office:office" xmlns:r="http://schemas.openxmlformats.org/officeDocument/2006/relationships" xmlns:m="http://schemas.openxmlformats.org/officeDocument/2006/math" xmlns:v="urn:schemas-microsoft-com:vml" xmlns:wp14="http://schemas.microsoft.com/office/word/2010/wordprocessingDrawing" xmlns:wp="http://schemas.openxmlformats.org/drawingml/2006/wordprocessingDrawing" xmlns:w10="urn:schemas-microsoft-com:office:word" xmlns:w="http://schemas.openxmlformats.org/wordprocessingml/2006/main" xmlns:w14="http://schemas.microsoft.com/office/word/2010/wordml" xmlns:w15="http://schemas.microsoft.com/office/word/2012/wordml" xmlns:w16cex="http://schemas.microsoft.com/office/word/2018/wordml/cex" xmlns:w16cid="http://schemas.microsoft.com/office/word/2016/wordml/cid" xmlns:w16="http://schemas.microsoft.com/office/word/2018/wordml" xmlns:w16sdtdh="http://schemas.microsoft.com/office/word/2020/wordml/sdtdatahash" xmlns:w16se="http://schemas.microsoft.com/office/word/2015/wordml/symex" xmlns:wpg="http://schemas.microsoft.com/office/word/2010/wordprocessingGroup" xmlns:wpi="http://schemas.microsoft.com/office/word/2010/wordprocessingInk" xmlns:wne="http://schemas.microsoft.com/office/word/2006/wordml" xmlns:wps="http://schemas.microsoft.com/office/word/2010/wordprocessingShape" mc:Ignorable="w14 w15 w16se w16cid w16 w16cex w16sdtdh wp14">
+<w:glossaryDocument xmlns:wpc="http://schemas.microsoft.com/office/word/2010/wordprocessingCanvas" xmlns:cx="http://schemas.microsoft.com/office/drawing/2014/chartex" xmlns:cx1="http://schemas.microsoft.com/office/drawing/2015/9/8/chartex" xmlns:cx2="http://schemas.microsoft.com/office/drawing/2015/10/21/chartex" xmlns:cx3="http://schemas.microsoft.com/office/drawing/2016/5/9/chartex" xmlns:cx4="http://schemas.microsoft.com/office/drawing/2016/5/10/chartex" xmlns:cx5="http://schemas.microsoft.com/office/drawing/2016/5/11/chartex" xmlns:cx6="http://schemas.microsoft.com/office/drawing/2016/5/12/chartex" xmlns:cx7="http://schemas.microsoft.com/office/drawing/2016/5/13/chartex" xmlns:cx8="http://schemas.microsoft.com/office/drawing/2016/5/14/chartex" xmlns:mc="http://schemas.openxmlformats.org/markup-compatibility/2006" xmlns:aink="http://schemas.microsoft.com/office/drawing/2016/ink" xmlns:am3d="http://schemas.microsoft.com/office/drawing/2017/model3d" xmlns:o="urn:schemas-microsoft-com:office:office" xmlns:oel="http://schemas.microsoft.com/office/2019/extlst" xmlns:r="http://schemas.openxmlformats.org/officeDocument/2006/relationships" xmlns:m="http://schemas.openxmlformats.org/officeDocument/2006/math" xmlns:v="urn:schemas-microsoft-com:vml" xmlns:wp14="http://schemas.microsoft.com/office/word/2010/wordprocessingDrawing" xmlns:wp="http://schemas.openxmlformats.org/drawingml/2006/wordprocessingDrawing" xmlns:w10="urn:schemas-microsoft-com:office:word" xmlns:w="http://schemas.openxmlformats.org/wordprocessingml/2006/main" xmlns:w14="http://schemas.microsoft.com/office/word/2010/wordml" xmlns:w15="http://schemas.microsoft.com/office/word/2012/wordml" xmlns:w16cex="http://schemas.microsoft.com/office/word/2018/wordml/cex" xmlns:w16cid="http://schemas.microsoft.com/office/word/2016/wordml/cid" xmlns:w16="http://schemas.microsoft.com/office/word/2018/wordml" xmlns:w16sdtdh="http://schemas.microsoft.com/office/word/2020/wordml/sdtdatahash" xmlns:w16se="http://schemas.microsoft.com/office/word/2015/wordml/symex" xmlns:wpg="http://schemas.microsoft.com/office/word/2010/wordprocessingGroup" xmlns:wpi="http://schemas.microsoft.com/office/word/2010/wordprocessingInk" xmlns:wne="http://schemas.microsoft.com/office/word/2006/wordml" xmlns:wps="http://schemas.microsoft.com/office/word/2010/wordprocessingShape" mc:Ignorable="w14 w15 w16se w16cid w16 w16cex w16sdtdh wp14">
   <w:docParts>
     <w:docPart>
       <w:docPartPr>
@@ -8245,7 +8245,7 @@
     </w:docPart>
     <w:docPart>
       <w:docPartPr>
-        <w:name w:val="4CCCEEE44FAA4C2CA6DCB910D066ECC5"/>
+        <w:name w:val="193AFF28144E4C5F8FFD728E3A51B8A9"/>
         <w:category>
           <w:name w:val="General"/>
           <w:gallery w:val="placeholder"/>
@@ -8256,12 +8256,12 @@
         <w:behaviors>
           <w:behavior w:val="content"/>
         </w:behaviors>
-        <w:guid w:val="{28A9BFDB-B09F-42C1-9302-D11837BF0D29}"/>
+        <w:guid w:val="{449BBBF8-5225-48D0-A7E4-235655D6755E}"/>
       </w:docPartPr>
       <w:docPartBody>
         <w:p>
           <w:pPr>
-            <w:pStyle w:val="4CCCEEE44FAA4C2CA6DCB910D066ECC51"/>
+            <w:pStyle w:val="193AFF28144E4C5F8FFD728E3A51B8A9"/>
           </w:pPr>
           <w:r>
             <w:rPr>
@@ -8275,7 +8275,7 @@
     </w:docPart>
     <w:docPart>
       <w:docPartPr>
-        <w:name w:val="19D869DD2C4A457CA357CEBE20BFF6A1"/>
+        <w:name w:val="88D05480EB4D4157A74B4B045331A73E"/>
         <w:category>
           <w:name w:val="General"/>
           <w:gallery w:val="placeholder"/>
@@ -8286,12 +8286,12 @@
         <w:behaviors>
           <w:behavior w:val="content"/>
         </w:behaviors>
-        <w:guid w:val="{52E8CA18-F361-47A9-815E-306BAB3FD1E5}"/>
+        <w:guid w:val="{CE9F3DE0-D5FA-4E49-A9B2-8C995F83FCB6}"/>
       </w:docPartPr>
       <w:docPartBody>
         <w:p>
           <w:pPr>
-            <w:pStyle w:val="19D869DD2C4A457CA357CEBE20BFF6A11"/>
+            <w:pStyle w:val="88D05480EB4D4157A74B4B045331A73E"/>
           </w:pPr>
           <w:r>
             <w:rPr>
@@ -8305,7 +8305,7 @@
     </w:docPart>
     <w:docPart>
       <w:docPartPr>
-        <w:name w:val="E0455F61D0864EF291C06B686DD23254"/>
+        <w:name w:val="EBDC9745DC4D4FA4871B1AEE51B6A998"/>
         <w:category>
           <w:name w:val="General"/>
           <w:gallery w:val="placeholder"/>
@@ -8316,12 +8316,12 @@
         <w:behaviors>
           <w:behavior w:val="content"/>
         </w:behaviors>
-        <w:guid w:val="{39369F67-6D3D-4040-9D13-37F6EC2B04E8}"/>
+        <w:guid w:val="{E6F7925C-5467-479A-AE8E-5458A286D5B4}"/>
       </w:docPartPr>
       <w:docPartBody>
         <w:p>
           <w:pPr>
-            <w:pStyle w:val="E0455F61D0864EF291C06B686DD232541"/>
+            <w:pStyle w:val="EBDC9745DC4D4FA4871B1AEE51B6A998"/>
           </w:pPr>
           <w:r>
             <w:rPr>
@@ -8335,7 +8335,7 @@
     </w:docPart>
     <w:docPart>
       <w:docPartPr>
-        <w:name w:val="DB53699693B14054863CA7EF8B0BF1E3"/>
+        <w:name w:val="8FFD697BB0E741918AB26E3A788261DC"/>
         <w:category>
           <w:name w:val="General"/>
           <w:gallery w:val="placeholder"/>
@@ -8346,12 +8346,12 @@
         <w:behaviors>
           <w:behavior w:val="content"/>
         </w:behaviors>
-        <w:guid w:val="{E29045AB-7465-4857-A959-E5A5F772A0B0}"/>
+        <w:guid w:val="{1E8152B8-C965-4E6A-A29A-DDC2F6094B32}"/>
       </w:docPartPr>
       <w:docPartBody>
         <w:p>
           <w:pPr>
-            <w:pStyle w:val="DB53699693B14054863CA7EF8B0BF1E31"/>
+            <w:pStyle w:val="8FFD697BB0E741918AB26E3A788261DC"/>
           </w:pPr>
           <w:r>
             <w:rPr>
@@ -8412,7 +8412,7 @@
     <w:sig w:usb0="E1002EFF" w:usb1="C000605B" w:usb2="00000029" w:usb3="00000000" w:csb0="000101FF" w:csb1="00000000"/>
   </w:font>
   <w:font w:name="MS Mincho">
-    <w:altName w:val="ＭＳ 明朝"/>
+    <w:altName w:val="MS Mincho"/>
     <w:panose1 w:val="02020609040205080304"/>
     <w:charset w:val="80"/>
     <w:family w:val="modern"/>
@@ -8481,6 +8481,7 @@
     <w:rsid w:val="003E00EE"/>
     <w:rsid w:val="004901E0"/>
     <w:rsid w:val="004D180E"/>
+    <w:rsid w:val="0050799D"/>
     <w:rsid w:val="00515CAF"/>
     <w:rsid w:val="005256F5"/>
     <w:rsid w:val="00545DF2"/>
@@ -8495,6 +8496,7 @@
     <w:rsid w:val="00813280"/>
     <w:rsid w:val="008402C5"/>
     <w:rsid w:val="00841BE2"/>
+    <w:rsid w:val="008721EA"/>
     <w:rsid w:val="00883763"/>
     <w:rsid w:val="008952A6"/>
     <w:rsid w:val="008C7463"/>
@@ -8508,6 +8510,7 @@
     <w:rsid w:val="00A140EE"/>
     <w:rsid w:val="00A477E4"/>
     <w:rsid w:val="00A52318"/>
+    <w:rsid w:val="00A82AF3"/>
     <w:rsid w:val="00A9690C"/>
     <w:rsid w:val="00AD31B5"/>
     <w:rsid w:val="00B238B9"/>
@@ -8536,6 +8539,7 @@
     <w:rsid w:val="00DF4E21"/>
     <w:rsid w:val="00E02324"/>
     <w:rsid w:val="00E1350C"/>
+    <w:rsid w:val="00E87D82"/>
     <w:rsid w:val="00E972B6"/>
     <w:rsid w:val="00EA2828"/>
     <w:rsid w:val="00EA6E8A"/>
@@ -8998,7 +9002,7 @@
     <w:basedOn w:val="DefaultParagraphFont"/>
     <w:uiPriority w:val="99"/>
     <w:semiHidden/>
-    <w:rsid w:val="00557CFA"/>
+    <w:rsid w:val="0050799D"/>
     <w:rPr>
       <w:color w:val="808080"/>
     </w:rPr>
@@ -9447,54 +9451,6 @@
       <w:szCs w:val="24"/>
     </w:rPr>
   </w:style>
-  <w:style w:type="paragraph" w:customStyle="1" w:styleId="4CCCEEE44FAA4C2CA6DCB910D066ECC51">
-    <w:name w:val="4CCCEEE44FAA4C2CA6DCB910D066ECC51"/>
-    <w:rsid w:val="00557CFA"/>
-    <w:pPr>
-      <w:spacing w:before="40" w:after="40" w:line="240" w:lineRule="auto"/>
-    </w:pPr>
-    <w:rPr>
-      <w:rFonts w:ascii="Times New Roman" w:eastAsia="Times New Roman" w:hAnsi="Times New Roman" w:cs="Times New Roman"/>
-      <w:sz w:val="24"/>
-      <w:szCs w:val="20"/>
-    </w:rPr>
-  </w:style>
-  <w:style w:type="paragraph" w:customStyle="1" w:styleId="19D869DD2C4A457CA357CEBE20BFF6A11">
-    <w:name w:val="19D869DD2C4A457CA357CEBE20BFF6A11"/>
-    <w:rsid w:val="00557CFA"/>
-    <w:pPr>
-      <w:spacing w:before="40" w:after="40" w:line="240" w:lineRule="auto"/>
-    </w:pPr>
-    <w:rPr>
-      <w:rFonts w:ascii="Times New Roman" w:eastAsia="Times New Roman" w:hAnsi="Times New Roman" w:cs="Times New Roman"/>
-      <w:sz w:val="24"/>
-      <w:szCs w:val="20"/>
-    </w:rPr>
-  </w:style>
-  <w:style w:type="paragraph" w:customStyle="1" w:styleId="E0455F61D0864EF291C06B686DD232541">
-    <w:name w:val="E0455F61D0864EF291C06B686DD232541"/>
-    <w:rsid w:val="00557CFA"/>
-    <w:pPr>
-      <w:spacing w:before="40" w:after="40" w:line="240" w:lineRule="auto"/>
-    </w:pPr>
-    <w:rPr>
-      <w:rFonts w:ascii="Times New Roman" w:eastAsia="Times New Roman" w:hAnsi="Times New Roman" w:cs="Times New Roman"/>
-      <w:sz w:val="24"/>
-      <w:szCs w:val="20"/>
-    </w:rPr>
-  </w:style>
-  <w:style w:type="paragraph" w:customStyle="1" w:styleId="DB53699693B14054863CA7EF8B0BF1E31">
-    <w:name w:val="DB53699693B14054863CA7EF8B0BF1E31"/>
-    <w:rsid w:val="00557CFA"/>
-    <w:pPr>
-      <w:spacing w:before="40" w:after="40" w:line="240" w:lineRule="auto"/>
-    </w:pPr>
-    <w:rPr>
-      <w:rFonts w:ascii="Times New Roman" w:eastAsia="Times New Roman" w:hAnsi="Times New Roman" w:cs="Times New Roman"/>
-      <w:sz w:val="24"/>
-      <w:szCs w:val="20"/>
-    </w:rPr>
-  </w:style>
   <w:style w:type="paragraph" w:customStyle="1" w:styleId="35C0BB7B77F54014BB468B7A716EBA4D">
     <w:name w:val="35C0BB7B77F54014BB468B7A716EBA4D"/>
     <w:rsid w:val="00557CFA"/>
@@ -9506,6 +9462,22 @@
       <w:sz w:val="24"/>
       <w:szCs w:val="24"/>
     </w:rPr>
+  </w:style>
+  <w:style w:type="paragraph" w:customStyle="1" w:styleId="193AFF28144E4C5F8FFD728E3A51B8A9">
+    <w:name w:val="193AFF28144E4C5F8FFD728E3A51B8A9"/>
+    <w:rsid w:val="0050799D"/>
+  </w:style>
+  <w:style w:type="paragraph" w:customStyle="1" w:styleId="88D05480EB4D4157A74B4B045331A73E">
+    <w:name w:val="88D05480EB4D4157A74B4B045331A73E"/>
+    <w:rsid w:val="0050799D"/>
+  </w:style>
+  <w:style w:type="paragraph" w:customStyle="1" w:styleId="EBDC9745DC4D4FA4871B1AEE51B6A998">
+    <w:name w:val="EBDC9745DC4D4FA4871B1AEE51B6A998"/>
+    <w:rsid w:val="0050799D"/>
+  </w:style>
+  <w:style w:type="paragraph" w:customStyle="1" w:styleId="8FFD697BB0E741918AB26E3A788261DC">
+    <w:name w:val="8FFD697BB0E741918AB26E3A788261DC"/>
+    <w:rsid w:val="0050799D"/>
   </w:style>
 </w:styles>
 </file>
@@ -9800,6 +9772,10 @@
 </file>
 
 <file path=customXml/item1.xml><?xml version="1.0" encoding="utf-8"?>
+<b:Sources xmlns:b="http://schemas.openxmlformats.org/officeDocument/2006/bibliography" xmlns="http://schemas.openxmlformats.org/officeDocument/2006/bibliography" SelectedStyle="\APASixthEditionOfficeOnline.xsl" StyleName="APA" Version="6"/>
+</file>
+
+<file path=customXml/item2.xml><?xml version="1.0" encoding="utf-8"?>
 <p:properties xmlns:p="http://schemas.microsoft.com/office/2006/metadata/properties" xmlns:xsi="http://www.w3.org/2001/XMLSchema-instance" xmlns:pc="http://schemas.microsoft.com/office/infopath/2007/PartnerControls">
   <documentManagement>
     <TaxKeywordTaxHTField xmlns="016c310d-f661-49a6-97ee-540076082437">
@@ -9817,7 +9793,7 @@
 </p:properties>
 </file>
 
-<file path=customXml/item2.xml><?xml version="1.0" encoding="utf-8"?>
+<file path=customXml/item3.xml><?xml version="1.0" encoding="utf-8"?>
 <ct:contentTypeSchema xmlns:ct="http://schemas.microsoft.com/office/2006/metadata/contentType" xmlns:ma="http://schemas.microsoft.com/office/2006/metadata/properties/metaAttributes" ct:_="" ma:_="" ma:contentTypeName="Document" ma:contentTypeID="0x010100833E2717D64DEA4FBFABAC416D347394" ma:contentTypeVersion="6" ma:contentTypeDescription="Create a new document." ma:contentTypeScope="" ma:versionID="98a74335b8287497f43df26a30ee6108">
   <xsd:schema xmlns:xsd="http://www.w3.org/2001/XMLSchema" xmlns:xs="http://www.w3.org/2001/XMLSchema" xmlns:p="http://schemas.microsoft.com/office/2006/metadata/properties" xmlns:ns1="http://schemas.microsoft.com/sharepoint/v3" xmlns:ns2="016c310d-f661-49a6-97ee-540076082437" targetNamespace="http://schemas.microsoft.com/office/2006/metadata/properties" ma:root="true" ma:fieldsID="d32ef67c478e261fbf17576a93df92a4" ns1:_="" ns2:_="">
     <xsd:import namespace="http://schemas.microsoft.com/sharepoint/v3"/>
@@ -9980,7 +9956,7 @@
 </ct:contentTypeSchema>
 </file>
 
-<file path=customXml/item3.xml><?xml version="1.0" encoding="utf-8"?>
+<file path=customXml/item4.xml><?xml version="1.0" encoding="utf-8"?>
 <?mso-contentType ?>
 <FormTemplates xmlns="http://schemas.microsoft.com/sharepoint/v3/contenttype/forms">
   <Display>DocumentLibraryForm</Display>
@@ -9989,11 +9965,15 @@
 </FormTemplates>
 </file>
 
-<file path=customXml/item4.xml><?xml version="1.0" encoding="utf-8"?>
-<b:Sources xmlns:b="http://schemas.openxmlformats.org/officeDocument/2006/bibliography" xmlns="http://schemas.openxmlformats.org/officeDocument/2006/bibliography" SelectedStyle="\APASixthEditionOfficeOnline.xsl" StyleName="APA" Version="6"/>
+<file path=customXml/itemProps1.xml><?xml version="1.0" encoding="utf-8"?>
+<ds:datastoreItem xmlns:ds="http://schemas.openxmlformats.org/officeDocument/2006/customXml" ds:itemID="{CD6CF2A3-23DE-48BF-867B-89770F7DA3FE}">
+  <ds:schemaRefs>
+    <ds:schemaRef ds:uri="http://schemas.openxmlformats.org/officeDocument/2006/bibliography"/>
+  </ds:schemaRefs>
+</ds:datastoreItem>
 </file>
 
-<file path=customXml/itemProps1.xml><?xml version="1.0" encoding="utf-8"?>
+<file path=customXml/itemProps2.xml><?xml version="1.0" encoding="utf-8"?>
 <ds:datastoreItem xmlns:ds="http://schemas.openxmlformats.org/officeDocument/2006/customXml" ds:itemID="{033400F4-1F04-4DBC-9784-C8B3AA89B53C}">
   <ds:schemaRefs>
     <ds:schemaRef ds:uri="http://schemas.microsoft.com/office/2006/metadata/properties"/>
@@ -10004,7 +9984,7 @@
 </ds:datastoreItem>
 </file>
 
-<file path=customXml/itemProps2.xml><?xml version="1.0" encoding="utf-8"?>
+<file path=customXml/itemProps3.xml><?xml version="1.0" encoding="utf-8"?>
 <ds:datastoreItem xmlns:ds="http://schemas.openxmlformats.org/officeDocument/2006/customXml" ds:itemID="{70D90404-A780-484E-92B9-483A3C532657}">
   <ds:schemaRefs>
     <ds:schemaRef ds:uri="http://schemas.microsoft.com/office/2006/metadata/contentType"/>
@@ -10023,18 +10003,10 @@
 </ds:datastoreItem>
 </file>
 
-<file path=customXml/itemProps3.xml><?xml version="1.0" encoding="utf-8"?>
+<file path=customXml/itemProps4.xml><?xml version="1.0" encoding="utf-8"?>
 <ds:datastoreItem xmlns:ds="http://schemas.openxmlformats.org/officeDocument/2006/customXml" ds:itemID="{6A21EC55-C1B2-4765-90AC-37A4F1604205}">
   <ds:schemaRefs>
     <ds:schemaRef ds:uri="http://schemas.microsoft.com/sharepoint/v3/contenttype/forms"/>
   </ds:schemaRefs>
 </ds:datastoreItem>
-</file>
-
-<file path=customXml/itemProps4.xml><?xml version="1.0" encoding="utf-8"?>
-<ds:datastoreItem xmlns:ds="http://schemas.openxmlformats.org/officeDocument/2006/customXml" ds:itemID="{CD6CF2A3-23DE-48BF-867B-89770F7DA3FE}">
-  <ds:schemaRefs>
-    <ds:schemaRef ds:uri="http://schemas.openxmlformats.org/officeDocument/2006/bibliography"/>
-  </ds:schemaRefs>
-</ds:datastoreItem>
 </file>
</xml_diff>